<commit_message>
Draft_124: correct Part III Table 7/8 sequence
</commit_message>
<xml_diff>
--- a/thesis/003_ThesisProposal_Draft_124_body.docx
+++ b/thesis/003_ThesisProposal_Draft_124_body.docx
@@ -8058,548 +8058,6 @@
         <w:t xml:space="preserve">Linguistically, the profile shows English in these abstracts adjusting the epistemic weight of findings and implications. It does not show retained hedges doing interpersonal softening of those claims. As an account of ratified undergraduate abstracts, the result is a functionally narrow stance repertoire centered on the proposition.</w:t>
       </w:r>
     </w:p>
-    <w:tbl>
-      <w:tblPr>
-        <w:tblStyle w:val="Table4"/>
-        <w:tblW w:w="8355" w:type="dxa"/>
-        <w:jc w:val="left"/>
-        <w:tblInd w:w="-115" w:type="dxa"/>
-        <w:tblLayout w:type="fixed"/>
-        <w:tblLook w:val="0400"/>
-        <w:tblBorders>
-          <w:top w:val="single" w:color="000000" w:space="0" w:sz="18"/>
-          <w:left w:val="nil" w:color="000000" w:space="0" w:sz="0"/>
-          <w:bottom w:val="single" w:color="000000" w:space="0" w:sz="18"/>
-          <w:right w:val="nil" w:color="000000" w:space="0" w:sz="0"/>
-          <w:insideH w:val="nil" w:color="000000" w:space="0" w:sz="0"/>
-          <w:insideV w:val="nil" w:color="000000" w:space="0" w:sz="0"/>
-        </w:tblBorders>
-      </w:tblPr>
-      <w:tblGrid>
-        <w:gridCol w:w="2076"/>
-        <w:gridCol w:w="2076"/>
-        <w:gridCol w:w="2076"/>
-        <w:gridCol w:w="2076"/>
-      </w:tblGrid>
-      <w:tr>
-        <w:tc>
-          <w:tcPr>
-            <w:tcW w:type="dxa" w:w="2076"/>
-            <w:tcBorders>
-              <w:top w:val="single" w:sz="18" w:space="0" w:color="000000"/>
-              <w:bottom w:val="single" w:sz="4" w:space="0" w:color="000000"/>
-            </w:tcBorders>
-          </w:tcPr>
-          <w:p>
-            <w:pPr>
-              <w:spacing w:before="0" w:after="0"/>
-            </w:pPr>
-            <w:r>
-              <w:rPr>
-                <w:b/>
-                <w:sz w:val="16"/>
-              </w:rPr>
-              <w:t>Discipline</w:t>
-            </w:r>
-          </w:p>
-        </w:tc>
-        <w:tc>
-          <w:tcPr>
-            <w:tcW w:type="dxa" w:w="2076"/>
-            <w:tcBorders>
-              <w:top w:val="single" w:sz="18" w:space="0" w:color="000000"/>
-              <w:bottom w:val="single" w:sz="4" w:space="0" w:color="000000"/>
-            </w:tcBorders>
-          </w:tcPr>
-          <w:p>
-            <w:pPr>
-              <w:spacing w:before="0" w:after="0"/>
-            </w:pPr>
-            <w:r>
-              <w:rPr>
-                <w:b/>
-                <w:sz w:val="16"/>
-              </w:rPr>
-              <w:t>ID</w:t>
-            </w:r>
-          </w:p>
-        </w:tc>
-        <w:tc>
-          <w:tcPr>
-            <w:tcW w:type="dxa" w:w="2076"/>
-            <w:tcBorders>
-              <w:top w:val="single" w:sz="18" w:space="0" w:color="000000"/>
-              <w:bottom w:val="single" w:sz="4" w:space="0" w:color="000000"/>
-            </w:tcBorders>
-          </w:tcPr>
-          <w:p>
-            <w:pPr>
-              <w:spacing w:before="0" w:after="0"/>
-            </w:pPr>
-            <w:r>
-              <w:rPr>
-                <w:b/>
-                <w:sz w:val="16"/>
-              </w:rPr>
-              <w:t>Token</w:t>
-            </w:r>
-          </w:p>
-        </w:tc>
-        <w:tc>
-          <w:tcPr>
-            <w:tcW w:type="dxa" w:w="2076"/>
-            <w:tcBorders>
-              <w:top w:val="single" w:sz="18" w:space="0" w:color="000000"/>
-              <w:bottom w:val="single" w:sz="4" w:space="0" w:color="000000"/>
-            </w:tcBorders>
-          </w:tcPr>
-          <w:p>
-            <w:pPr>
-              <w:spacing w:before="0" w:after="0"/>
-            </w:pPr>
-            <w:r>
-              <w:rPr>
-                <w:b/>
-                <w:sz w:val="16"/>
-              </w:rPr>
-              <w:t>Excerpt</w:t>
-            </w:r>
-          </w:p>
-        </w:tc>
-      </w:tr>
-      <w:tr>
-        <w:tc>
-          <w:tcPr>
-            <w:tcW w:type="dxa" w:w="2076"/>
-          </w:tcPr>
-          <w:p>
-            <w:pPr>
-              <w:spacing w:before="0" w:after="0"/>
-            </w:pPr>
-            <w:r>
-              <w:rPr>
-                <w:b w:val="0"/>
-                <w:sz w:val="16"/>
-              </w:rPr>
-              <w:t>Agriculture</w:t>
-            </w:r>
-          </w:p>
-        </w:tc>
-        <w:tc>
-          <w:tcPr>
-            <w:tcW w:type="dxa" w:w="2076"/>
-          </w:tcPr>
-          <w:p>
-            <w:pPr>
-              <w:spacing w:before="0" w:after="0"/>
-            </w:pPr>
-            <w:r>
-              <w:rPr>
-                <w:b w:val="0"/>
-                <w:sz w:val="16"/>
-              </w:rPr>
-              <w:t>Acs1</w:t>
-            </w:r>
-          </w:p>
-        </w:tc>
-        <w:tc>
-          <w:tcPr>
-            <w:tcW w:type="dxa" w:w="2076"/>
-          </w:tcPr>
-          <w:p>
-            <w:pPr>
-              <w:spacing w:before="0" w:after="0"/>
-            </w:pPr>
-            <w:r>
-              <w:rPr>
-                <w:b w:val="0"/>
-                <w:sz w:val="16"/>
-              </w:rPr>
-              <w:t>suggest</w:t>
-            </w:r>
-          </w:p>
-        </w:tc>
-        <w:tc>
-          <w:tcPr>
-            <w:tcW w:type="dxa" w:w="2076"/>
-          </w:tcPr>
-          <w:p>
-            <w:pPr>
-              <w:spacing w:before="0" w:after="0"/>
-            </w:pPr>
-            <w:r>
-              <w:rPr>
-                <w:b w:val="0"/>
-                <w:sz w:val="16"/>
-              </w:rPr>
-              <w:t>These findings suggest that fermented banana peel…</w:t>
-            </w:r>
-          </w:p>
-        </w:tc>
-      </w:tr>
-      <w:tr>
-        <w:tc>
-          <w:tcPr>
-            <w:tcW w:type="dxa" w:w="2076"/>
-          </w:tcPr>
-          <w:p>
-            <w:pPr>
-              <w:spacing w:before="0" w:after="0"/>
-            </w:pPr>
-            <w:r>
-              <w:rPr>
-                <w:b w:val="0"/>
-                <w:sz w:val="16"/>
-              </w:rPr>
-              <w:t>Agriculture</w:t>
-            </w:r>
-          </w:p>
-        </w:tc>
-        <w:tc>
-          <w:tcPr>
-            <w:tcW w:type="dxa" w:w="2076"/>
-          </w:tcPr>
-          <w:p>
-            <w:pPr>
-              <w:spacing w:before="0" w:after="0"/>
-            </w:pPr>
-            <w:r>
-              <w:rPr>
-                <w:b w:val="0"/>
-                <w:sz w:val="16"/>
-              </w:rPr>
-              <w:t>Acs2</w:t>
-            </w:r>
-          </w:p>
-        </w:tc>
-        <w:tc>
-          <w:tcPr>
-            <w:tcW w:type="dxa" w:w="2076"/>
-          </w:tcPr>
-          <w:p>
-            <w:pPr>
-              <w:spacing w:before="0" w:after="0"/>
-            </w:pPr>
-            <w:r>
-              <w:rPr>
-                <w:b w:val="0"/>
-                <w:sz w:val="16"/>
-              </w:rPr>
-              <w:t>could / potential</w:t>
-            </w:r>
-          </w:p>
-        </w:tc>
-        <w:tc>
-          <w:tcPr>
-            <w:tcW w:type="dxa" w:w="2076"/>
-          </w:tcPr>
-          <w:p>
-            <w:pPr>
-              <w:spacing w:before="0" w:after="0"/>
-            </w:pPr>
-            <w:r>
-              <w:rPr>
-                <w:b w:val="0"/>
-                <w:sz w:val="16"/>
-              </w:rPr>
-              <w:t>…the mycorrhiza treatment could still offer potential benefits…</w:t>
-            </w:r>
-          </w:p>
-        </w:tc>
-      </w:tr>
-      <w:tr>
-        <w:tc>
-          <w:tcPr>
-            <w:tcW w:type="dxa" w:w="2076"/>
-          </w:tcPr>
-          <w:p>
-            <w:pPr>
-              <w:spacing w:before="0" w:after="0"/>
-            </w:pPr>
-            <w:r>
-              <w:rPr>
-                <w:b w:val="0"/>
-                <w:sz w:val="16"/>
-              </w:rPr>
-              <w:t>Biology</w:t>
-            </w:r>
-          </w:p>
-        </w:tc>
-        <w:tc>
-          <w:tcPr>
-            <w:tcW w:type="dxa" w:w="2076"/>
-          </w:tcPr>
-          <w:p>
-            <w:pPr>
-              <w:spacing w:before="0" w:after="0"/>
-            </w:pPr>
-            <w:r>
-              <w:rPr>
-                <w:b w:val="0"/>
-                <w:sz w:val="16"/>
-              </w:rPr>
-              <w:t>B1</w:t>
-            </w:r>
-          </w:p>
-        </w:tc>
-        <w:tc>
-          <w:tcPr>
-            <w:tcW w:type="dxa" w:w="2076"/>
-          </w:tcPr>
-          <w:p>
-            <w:pPr>
-              <w:spacing w:before="0" w:after="0"/>
-            </w:pPr>
-            <w:r>
-              <w:rPr>
-                <w:b w:val="0"/>
-                <w:sz w:val="16"/>
-              </w:rPr>
-              <w:t>implies</w:t>
-            </w:r>
-          </w:p>
-        </w:tc>
-        <w:tc>
-          <w:tcPr>
-            <w:tcW w:type="dxa" w:w="2076"/>
-          </w:tcPr>
-          <w:p>
-            <w:pPr>
-              <w:spacing w:before="0" w:after="0"/>
-            </w:pPr>
-            <w:r>
-              <w:rPr>
-                <w:b w:val="0"/>
-                <w:sz w:val="16"/>
-              </w:rPr>
-              <w:t>This implies that the use of low concentration of B. subtilis…</w:t>
-            </w:r>
-          </w:p>
-        </w:tc>
-      </w:tr>
-      <w:tr>
-        <w:tc>
-          <w:tcPr>
-            <w:tcW w:type="dxa" w:w="2076"/>
-          </w:tcPr>
-          <w:p>
-            <w:pPr>
-              <w:spacing w:before="0" w:after="0"/>
-            </w:pPr>
-            <w:r>
-              <w:rPr>
-                <w:b w:val="0"/>
-                <w:sz w:val="16"/>
-              </w:rPr>
-              <w:t>Biology</w:t>
-            </w:r>
-          </w:p>
-        </w:tc>
-        <w:tc>
-          <w:tcPr>
-            <w:tcW w:type="dxa" w:w="2076"/>
-          </w:tcPr>
-          <w:p>
-            <w:pPr>
-              <w:spacing w:before="0" w:after="0"/>
-            </w:pPr>
-            <w:r>
-              <w:rPr>
-                <w:b w:val="0"/>
-                <w:sz w:val="16"/>
-              </w:rPr>
-              <w:t>B4</w:t>
-            </w:r>
-          </w:p>
-        </w:tc>
-        <w:tc>
-          <w:tcPr>
-            <w:tcW w:type="dxa" w:w="2076"/>
-          </w:tcPr>
-          <w:p>
-            <w:pPr>
-              <w:spacing w:before="0" w:after="0"/>
-            </w:pPr>
-            <w:r>
-              <w:rPr>
-                <w:b w:val="0"/>
-                <w:sz w:val="16"/>
-              </w:rPr>
-              <w:t>may</w:t>
-            </w:r>
-          </w:p>
-        </w:tc>
-        <w:tc>
-          <w:tcPr>
-            <w:tcW w:type="dxa" w:w="2076"/>
-          </w:tcPr>
-          <w:p>
-            <w:pPr>
-              <w:spacing w:before="0" w:after="0"/>
-            </w:pPr>
-            <w:r>
-              <w:rPr>
-                <w:b w:val="0"/>
-                <w:sz w:val="16"/>
-              </w:rPr>
-              <w:t>…flavonoids and saponins may contribute to its therapeutic effects.</w:t>
-            </w:r>
-          </w:p>
-        </w:tc>
-      </w:tr>
-      <w:tr>
-        <w:tc>
-          <w:tcPr>
-            <w:tcW w:type="dxa" w:w="2076"/>
-          </w:tcPr>
-          <w:p>
-            <w:pPr>
-              <w:spacing w:before="0" w:after="0"/>
-            </w:pPr>
-            <w:r>
-              <w:rPr>
-                <w:b w:val="0"/>
-                <w:sz w:val="16"/>
-              </w:rPr>
-              <w:t>Veterinary Medicine</w:t>
-            </w:r>
-          </w:p>
-        </w:tc>
-        <w:tc>
-          <w:tcPr>
-            <w:tcW w:type="dxa" w:w="2076"/>
-          </w:tcPr>
-          <w:p>
-            <w:pPr>
-              <w:spacing w:before="0" w:after="0"/>
-            </w:pPr>
-            <w:r>
-              <w:rPr>
-                <w:b w:val="0"/>
-                <w:sz w:val="16"/>
-              </w:rPr>
-              <w:t>VM5</w:t>
-            </w:r>
-          </w:p>
-        </w:tc>
-        <w:tc>
-          <w:tcPr>
-            <w:tcW w:type="dxa" w:w="2076"/>
-          </w:tcPr>
-          <w:p>
-            <w:pPr>
-              <w:spacing w:before="0" w:after="0"/>
-            </w:pPr>
-            <w:r>
-              <w:rPr>
-                <w:b w:val="0"/>
-                <w:sz w:val="16"/>
-              </w:rPr>
-              <w:t>potential</w:t>
-            </w:r>
-          </w:p>
-        </w:tc>
-        <w:tc>
-          <w:tcPr>
-            <w:tcW w:type="dxa" w:w="2076"/>
-          </w:tcPr>
-          <w:p>
-            <w:pPr>
-              <w:spacing w:before="0" w:after="0"/>
-            </w:pPr>
-            <w:r>
-              <w:rPr>
-                <w:b w:val="0"/>
-                <w:sz w:val="16"/>
-              </w:rPr>
-              <w:t>…highlight the potential of M. calabura L. as a source of antifungal agents…</w:t>
-            </w:r>
-          </w:p>
-        </w:tc>
-      </w:tr>
-      <w:tr>
-        <w:tc>
-          <w:tcPr>
-            <w:tcW w:type="dxa" w:w="2076"/>
-            <w:tcBorders>
-              <w:bottom w:val="single" w:sz="18" w:space="0" w:color="000000"/>
-            </w:tcBorders>
-          </w:tcPr>
-          <w:p>
-            <w:pPr>
-              <w:spacing w:before="0" w:after="0"/>
-            </w:pPr>
-            <w:r>
-              <w:rPr>
-                <w:b w:val="0"/>
-                <w:sz w:val="16"/>
-              </w:rPr>
-              <w:t>Veterinary Medicine</w:t>
-            </w:r>
-          </w:p>
-        </w:tc>
-        <w:tc>
-          <w:tcPr>
-            <w:tcW w:type="dxa" w:w="2076"/>
-            <w:tcBorders>
-              <w:bottom w:val="single" w:sz="18" w:space="0" w:color="000000"/>
-            </w:tcBorders>
-          </w:tcPr>
-          <w:p>
-            <w:pPr>
-              <w:spacing w:before="0" w:after="0"/>
-            </w:pPr>
-            <w:r>
-              <w:rPr>
-                <w:b w:val="0"/>
-                <w:sz w:val="16"/>
-              </w:rPr>
-              <w:t>VM12</w:t>
-            </w:r>
-          </w:p>
-        </w:tc>
-        <w:tc>
-          <w:tcPr>
-            <w:tcW w:type="dxa" w:w="2076"/>
-            <w:tcBorders>
-              <w:bottom w:val="single" w:sz="18" w:space="0" w:color="000000"/>
-            </w:tcBorders>
-          </w:tcPr>
-          <w:p>
-            <w:pPr>
-              <w:spacing w:before="0" w:after="0"/>
-            </w:pPr>
-            <w:r>
-              <w:rPr>
-                <w:b w:val="0"/>
-                <w:sz w:val="16"/>
-              </w:rPr>
-              <w:t>might</w:t>
-            </w:r>
-          </w:p>
-        </w:tc>
-        <w:tc>
-          <w:tcPr>
-            <w:tcW w:type="dxa" w:w="2076"/>
-            <w:tcBorders>
-              <w:bottom w:val="single" w:sz="18" w:space="0" w:color="000000"/>
-            </w:tcBorders>
-          </w:tcPr>
-          <w:p>
-            <w:pPr>
-              <w:spacing w:before="0" w:after="0"/>
-            </w:pPr>
-            <w:r>
-              <w:rPr>
-                <w:b w:val="0"/>
-                <w:sz w:val="16"/>
-              </w:rPr>
-              <w:t>…might be effective… but it is not conclusive that ASF is not present…</w:t>
-            </w:r>
-          </w:p>
-        </w:tc>
-      </w:tr>
-    </w:tbl>
     <w:p>
       <w:pPr>
         <w:spacing w:line="480" w:lineRule="auto"/>
@@ -8608,10 +8066,10 @@
       </w:pPr>
       <w:r>
         <w:rPr>
-          <w:i/>
+          <w:b/>
           <w:sz w:val="22"/>
         </w:rPr>
-        <w:t>Illustrative Retained Hedges by Program</w:t>
+        <w:t>Table 7</w:t>
       </w:r>
     </w:p>
     <w:p>
@@ -8622,24 +8080,10 @@
       </w:pPr>
       <w:r>
         <w:rPr>
-          <w:b/>
+          <w:i/>
           <w:sz w:val="22"/>
         </w:rPr>
-        <w:t>Table 8</w:t>
-      </w:r>
-    </w:p>
-    <w:p>
-      <w:pPr>
-        <w:spacing w:line="480" w:lineRule="auto" w:before="0" w:after="0"/>
-        <w:ind w:firstLine="720"/>
-        <w:jc w:val="both"/>
-      </w:pPr>
-      <w:r>
-        <w:rPr>
-          <w:rFonts w:ascii="Georgia" w:hAnsi="Georgia" w:eastAsia="Georgia"/>
-          <w:sz w:val="22"/>
-        </w:rPr>
-        <w:t>The pairs in Table 7 are drawn from the coded corpus. In each case the surface form is similar. What changes is whether the host clause is a claim about findings or implications, and whether removing the token raises epistemic commitment. Topic-naming, capability, and operational restatement stay outside the retained set even when the word looks like a hedge.</w:t>
+        <w:t>Retained Hedge versus False Positive: Coding Contrasts</w:t>
       </w:r>
     </w:p>
     <w:tbl>
@@ -9313,16 +8757,30 @@
     </w:tbl>
     <w:p>
       <w:pPr>
+        <w:spacing w:line="480" w:lineRule="auto" w:before="0" w:after="0"/>
+        <w:ind w:firstLine="720"/>
+        <w:jc w:val="both"/>
+      </w:pPr>
+      <w:r>
+        <w:rPr>
+          <w:rFonts w:ascii="Georgia" w:hAnsi="Georgia" w:eastAsia="Georgia"/>
+          <w:sz w:val="22"/>
+        </w:rPr>
+        <w:t>The pairs in Table 7 are drawn from the coded corpus. In each case the surface form is similar. What changes is whether the host clause is a claim about findings or implications, and whether removing the token raises epistemic commitment. Topic-naming, capability, and operational restatement stay outside the retained set even when the word looks like a hedge.</w:t>
+      </w:r>
+    </w:p>
+    <w:p>
+      <w:pPr>
         <w:spacing w:line="480" w:lineRule="auto"/>
         <w:ind w:firstLine="0"/>
         <w:jc w:val="center"/>
       </w:pPr>
       <w:r>
         <w:rPr>
-          <w:i/>
+          <w:b/>
           <w:sz w:val="22"/>
         </w:rPr>
-        <w:t>Retained Hedge versus False Positive: Coding Contrasts</w:t>
+        <w:t>Table 8</w:t>
       </w:r>
     </w:p>
     <w:p>
@@ -9333,12 +8791,554 @@
       </w:pPr>
       <w:r>
         <w:rPr>
-          <w:b/>
+          <w:i/>
           <w:sz w:val="22"/>
         </w:rPr>
-        <w:t>Table 7</w:t>
-      </w:r>
-    </w:p>
+        <w:t>Illustrative Retained Hedges by Program</w:t>
+      </w:r>
+    </w:p>
+    <w:tbl>
+      <w:tblPr>
+        <w:tblStyle w:val="Table4"/>
+        <w:tblW w:w="8355" w:type="dxa"/>
+        <w:jc w:val="left"/>
+        <w:tblInd w:w="-115" w:type="dxa"/>
+        <w:tblLayout w:type="fixed"/>
+        <w:tblLook w:val="0400"/>
+        <w:tblBorders>
+          <w:top w:val="single" w:color="000000" w:space="0" w:sz="18"/>
+          <w:left w:val="nil" w:color="000000" w:space="0" w:sz="0"/>
+          <w:bottom w:val="single" w:color="000000" w:space="0" w:sz="18"/>
+          <w:right w:val="nil" w:color="000000" w:space="0" w:sz="0"/>
+          <w:insideH w:val="nil" w:color="000000" w:space="0" w:sz="0"/>
+          <w:insideV w:val="nil" w:color="000000" w:space="0" w:sz="0"/>
+        </w:tblBorders>
+      </w:tblPr>
+      <w:tblGrid>
+        <w:gridCol w:w="2076"/>
+        <w:gridCol w:w="2076"/>
+        <w:gridCol w:w="2076"/>
+        <w:gridCol w:w="2076"/>
+      </w:tblGrid>
+      <w:tr>
+        <w:tc>
+          <w:tcPr>
+            <w:tcW w:type="dxa" w:w="2076"/>
+            <w:tcBorders>
+              <w:top w:val="single" w:sz="18" w:space="0" w:color="000000"/>
+              <w:bottom w:val="single" w:sz="4" w:space="0" w:color="000000"/>
+            </w:tcBorders>
+          </w:tcPr>
+          <w:p>
+            <w:pPr>
+              <w:spacing w:before="0" w:after="0"/>
+            </w:pPr>
+            <w:r>
+              <w:rPr>
+                <w:b/>
+                <w:sz w:val="16"/>
+              </w:rPr>
+              <w:t>Discipline</w:t>
+            </w:r>
+          </w:p>
+        </w:tc>
+        <w:tc>
+          <w:tcPr>
+            <w:tcW w:type="dxa" w:w="2076"/>
+            <w:tcBorders>
+              <w:top w:val="single" w:sz="18" w:space="0" w:color="000000"/>
+              <w:bottom w:val="single" w:sz="4" w:space="0" w:color="000000"/>
+            </w:tcBorders>
+          </w:tcPr>
+          <w:p>
+            <w:pPr>
+              <w:spacing w:before="0" w:after="0"/>
+            </w:pPr>
+            <w:r>
+              <w:rPr>
+                <w:b/>
+                <w:sz w:val="16"/>
+              </w:rPr>
+              <w:t>ID</w:t>
+            </w:r>
+          </w:p>
+        </w:tc>
+        <w:tc>
+          <w:tcPr>
+            <w:tcW w:type="dxa" w:w="2076"/>
+            <w:tcBorders>
+              <w:top w:val="single" w:sz="18" w:space="0" w:color="000000"/>
+              <w:bottom w:val="single" w:sz="4" w:space="0" w:color="000000"/>
+            </w:tcBorders>
+          </w:tcPr>
+          <w:p>
+            <w:pPr>
+              <w:spacing w:before="0" w:after="0"/>
+            </w:pPr>
+            <w:r>
+              <w:rPr>
+                <w:b/>
+                <w:sz w:val="16"/>
+              </w:rPr>
+              <w:t>Token</w:t>
+            </w:r>
+          </w:p>
+        </w:tc>
+        <w:tc>
+          <w:tcPr>
+            <w:tcW w:type="dxa" w:w="2076"/>
+            <w:tcBorders>
+              <w:top w:val="single" w:sz="18" w:space="0" w:color="000000"/>
+              <w:bottom w:val="single" w:sz="4" w:space="0" w:color="000000"/>
+            </w:tcBorders>
+          </w:tcPr>
+          <w:p>
+            <w:pPr>
+              <w:spacing w:before="0" w:after="0"/>
+            </w:pPr>
+            <w:r>
+              <w:rPr>
+                <w:b/>
+                <w:sz w:val="16"/>
+              </w:rPr>
+              <w:t>Excerpt</w:t>
+            </w:r>
+          </w:p>
+        </w:tc>
+      </w:tr>
+      <w:tr>
+        <w:tc>
+          <w:tcPr>
+            <w:tcW w:type="dxa" w:w="2076"/>
+          </w:tcPr>
+          <w:p>
+            <w:pPr>
+              <w:spacing w:before="0" w:after="0"/>
+            </w:pPr>
+            <w:r>
+              <w:rPr>
+                <w:b w:val="0"/>
+                <w:sz w:val="16"/>
+              </w:rPr>
+              <w:t>Agriculture</w:t>
+            </w:r>
+          </w:p>
+        </w:tc>
+        <w:tc>
+          <w:tcPr>
+            <w:tcW w:type="dxa" w:w="2076"/>
+          </w:tcPr>
+          <w:p>
+            <w:pPr>
+              <w:spacing w:before="0" w:after="0"/>
+            </w:pPr>
+            <w:r>
+              <w:rPr>
+                <w:b w:val="0"/>
+                <w:sz w:val="16"/>
+              </w:rPr>
+              <w:t>Acs1</w:t>
+            </w:r>
+          </w:p>
+        </w:tc>
+        <w:tc>
+          <w:tcPr>
+            <w:tcW w:type="dxa" w:w="2076"/>
+          </w:tcPr>
+          <w:p>
+            <w:pPr>
+              <w:spacing w:before="0" w:after="0"/>
+            </w:pPr>
+            <w:r>
+              <w:rPr>
+                <w:b w:val="0"/>
+                <w:sz w:val="16"/>
+              </w:rPr>
+              <w:t>suggest</w:t>
+            </w:r>
+          </w:p>
+        </w:tc>
+        <w:tc>
+          <w:tcPr>
+            <w:tcW w:type="dxa" w:w="2076"/>
+          </w:tcPr>
+          <w:p>
+            <w:pPr>
+              <w:spacing w:before="0" w:after="0"/>
+            </w:pPr>
+            <w:r>
+              <w:rPr>
+                <w:b w:val="0"/>
+                <w:sz w:val="16"/>
+              </w:rPr>
+              <w:t>These findings suggest that fermented banana peel…</w:t>
+            </w:r>
+          </w:p>
+        </w:tc>
+      </w:tr>
+      <w:tr>
+        <w:tc>
+          <w:tcPr>
+            <w:tcW w:type="dxa" w:w="2076"/>
+          </w:tcPr>
+          <w:p>
+            <w:pPr>
+              <w:spacing w:before="0" w:after="0"/>
+            </w:pPr>
+            <w:r>
+              <w:rPr>
+                <w:b w:val="0"/>
+                <w:sz w:val="16"/>
+              </w:rPr>
+              <w:t>Agriculture</w:t>
+            </w:r>
+          </w:p>
+        </w:tc>
+        <w:tc>
+          <w:tcPr>
+            <w:tcW w:type="dxa" w:w="2076"/>
+          </w:tcPr>
+          <w:p>
+            <w:pPr>
+              <w:spacing w:before="0" w:after="0"/>
+            </w:pPr>
+            <w:r>
+              <w:rPr>
+                <w:b w:val="0"/>
+                <w:sz w:val="16"/>
+              </w:rPr>
+              <w:t>Acs2</w:t>
+            </w:r>
+          </w:p>
+        </w:tc>
+        <w:tc>
+          <w:tcPr>
+            <w:tcW w:type="dxa" w:w="2076"/>
+          </w:tcPr>
+          <w:p>
+            <w:pPr>
+              <w:spacing w:before="0" w:after="0"/>
+            </w:pPr>
+            <w:r>
+              <w:rPr>
+                <w:b w:val="0"/>
+                <w:sz w:val="16"/>
+              </w:rPr>
+              <w:t>could / potential</w:t>
+            </w:r>
+          </w:p>
+        </w:tc>
+        <w:tc>
+          <w:tcPr>
+            <w:tcW w:type="dxa" w:w="2076"/>
+          </w:tcPr>
+          <w:p>
+            <w:pPr>
+              <w:spacing w:before="0" w:after="0"/>
+            </w:pPr>
+            <w:r>
+              <w:rPr>
+                <w:b w:val="0"/>
+                <w:sz w:val="16"/>
+              </w:rPr>
+              <w:t>…the mycorrhiza treatment could still offer potential benefits…</w:t>
+            </w:r>
+          </w:p>
+        </w:tc>
+      </w:tr>
+      <w:tr>
+        <w:tc>
+          <w:tcPr>
+            <w:tcW w:type="dxa" w:w="2076"/>
+          </w:tcPr>
+          <w:p>
+            <w:pPr>
+              <w:spacing w:before="0" w:after="0"/>
+            </w:pPr>
+            <w:r>
+              <w:rPr>
+                <w:b w:val="0"/>
+                <w:sz w:val="16"/>
+              </w:rPr>
+              <w:t>Biology</w:t>
+            </w:r>
+          </w:p>
+        </w:tc>
+        <w:tc>
+          <w:tcPr>
+            <w:tcW w:type="dxa" w:w="2076"/>
+          </w:tcPr>
+          <w:p>
+            <w:pPr>
+              <w:spacing w:before="0" w:after="0"/>
+            </w:pPr>
+            <w:r>
+              <w:rPr>
+                <w:b w:val="0"/>
+                <w:sz w:val="16"/>
+              </w:rPr>
+              <w:t>B1</w:t>
+            </w:r>
+          </w:p>
+        </w:tc>
+        <w:tc>
+          <w:tcPr>
+            <w:tcW w:type="dxa" w:w="2076"/>
+          </w:tcPr>
+          <w:p>
+            <w:pPr>
+              <w:spacing w:before="0" w:after="0"/>
+            </w:pPr>
+            <w:r>
+              <w:rPr>
+                <w:b w:val="0"/>
+                <w:sz w:val="16"/>
+              </w:rPr>
+              <w:t>implies</w:t>
+            </w:r>
+          </w:p>
+        </w:tc>
+        <w:tc>
+          <w:tcPr>
+            <w:tcW w:type="dxa" w:w="2076"/>
+          </w:tcPr>
+          <w:p>
+            <w:pPr>
+              <w:spacing w:before="0" w:after="0"/>
+            </w:pPr>
+            <w:r>
+              <w:rPr>
+                <w:b w:val="0"/>
+                <w:sz w:val="16"/>
+              </w:rPr>
+              <w:t>This implies that the use of low concentration of B. subtilis…</w:t>
+            </w:r>
+          </w:p>
+        </w:tc>
+      </w:tr>
+      <w:tr>
+        <w:tc>
+          <w:tcPr>
+            <w:tcW w:type="dxa" w:w="2076"/>
+          </w:tcPr>
+          <w:p>
+            <w:pPr>
+              <w:spacing w:before="0" w:after="0"/>
+            </w:pPr>
+            <w:r>
+              <w:rPr>
+                <w:b w:val="0"/>
+                <w:sz w:val="16"/>
+              </w:rPr>
+              <w:t>Biology</w:t>
+            </w:r>
+          </w:p>
+        </w:tc>
+        <w:tc>
+          <w:tcPr>
+            <w:tcW w:type="dxa" w:w="2076"/>
+          </w:tcPr>
+          <w:p>
+            <w:pPr>
+              <w:spacing w:before="0" w:after="0"/>
+            </w:pPr>
+            <w:r>
+              <w:rPr>
+                <w:b w:val="0"/>
+                <w:sz w:val="16"/>
+              </w:rPr>
+              <w:t>B4</w:t>
+            </w:r>
+          </w:p>
+        </w:tc>
+        <w:tc>
+          <w:tcPr>
+            <w:tcW w:type="dxa" w:w="2076"/>
+          </w:tcPr>
+          <w:p>
+            <w:pPr>
+              <w:spacing w:before="0" w:after="0"/>
+            </w:pPr>
+            <w:r>
+              <w:rPr>
+                <w:b w:val="0"/>
+                <w:sz w:val="16"/>
+              </w:rPr>
+              <w:t>may</w:t>
+            </w:r>
+          </w:p>
+        </w:tc>
+        <w:tc>
+          <w:tcPr>
+            <w:tcW w:type="dxa" w:w="2076"/>
+          </w:tcPr>
+          <w:p>
+            <w:pPr>
+              <w:spacing w:before="0" w:after="0"/>
+            </w:pPr>
+            <w:r>
+              <w:rPr>
+                <w:b w:val="0"/>
+                <w:sz w:val="16"/>
+              </w:rPr>
+              <w:t>…flavonoids and saponins may contribute to its therapeutic effects.</w:t>
+            </w:r>
+          </w:p>
+        </w:tc>
+      </w:tr>
+      <w:tr>
+        <w:tc>
+          <w:tcPr>
+            <w:tcW w:type="dxa" w:w="2076"/>
+          </w:tcPr>
+          <w:p>
+            <w:pPr>
+              <w:spacing w:before="0" w:after="0"/>
+            </w:pPr>
+            <w:r>
+              <w:rPr>
+                <w:b w:val="0"/>
+                <w:sz w:val="16"/>
+              </w:rPr>
+              <w:t>Veterinary Medicine</w:t>
+            </w:r>
+          </w:p>
+        </w:tc>
+        <w:tc>
+          <w:tcPr>
+            <w:tcW w:type="dxa" w:w="2076"/>
+          </w:tcPr>
+          <w:p>
+            <w:pPr>
+              <w:spacing w:before="0" w:after="0"/>
+            </w:pPr>
+            <w:r>
+              <w:rPr>
+                <w:b w:val="0"/>
+                <w:sz w:val="16"/>
+              </w:rPr>
+              <w:t>VM5</w:t>
+            </w:r>
+          </w:p>
+        </w:tc>
+        <w:tc>
+          <w:tcPr>
+            <w:tcW w:type="dxa" w:w="2076"/>
+          </w:tcPr>
+          <w:p>
+            <w:pPr>
+              <w:spacing w:before="0" w:after="0"/>
+            </w:pPr>
+            <w:r>
+              <w:rPr>
+                <w:b w:val="0"/>
+                <w:sz w:val="16"/>
+              </w:rPr>
+              <w:t>potential</w:t>
+            </w:r>
+          </w:p>
+        </w:tc>
+        <w:tc>
+          <w:tcPr>
+            <w:tcW w:type="dxa" w:w="2076"/>
+          </w:tcPr>
+          <w:p>
+            <w:pPr>
+              <w:spacing w:before="0" w:after="0"/>
+            </w:pPr>
+            <w:r>
+              <w:rPr>
+                <w:b w:val="0"/>
+                <w:sz w:val="16"/>
+              </w:rPr>
+              <w:t>…highlight the potential of M. calabura L. as a source of antifungal agents…</w:t>
+            </w:r>
+          </w:p>
+        </w:tc>
+      </w:tr>
+      <w:tr>
+        <w:tc>
+          <w:tcPr>
+            <w:tcW w:type="dxa" w:w="2076"/>
+            <w:tcBorders>
+              <w:bottom w:val="single" w:sz="18" w:space="0" w:color="000000"/>
+            </w:tcBorders>
+          </w:tcPr>
+          <w:p>
+            <w:pPr>
+              <w:spacing w:before="0" w:after="0"/>
+            </w:pPr>
+            <w:r>
+              <w:rPr>
+                <w:b w:val="0"/>
+                <w:sz w:val="16"/>
+              </w:rPr>
+              <w:t>Veterinary Medicine</w:t>
+            </w:r>
+          </w:p>
+        </w:tc>
+        <w:tc>
+          <w:tcPr>
+            <w:tcW w:type="dxa" w:w="2076"/>
+            <w:tcBorders>
+              <w:bottom w:val="single" w:sz="18" w:space="0" w:color="000000"/>
+            </w:tcBorders>
+          </w:tcPr>
+          <w:p>
+            <w:pPr>
+              <w:spacing w:before="0" w:after="0"/>
+            </w:pPr>
+            <w:r>
+              <w:rPr>
+                <w:b w:val="0"/>
+                <w:sz w:val="16"/>
+              </w:rPr>
+              <w:t>VM12</w:t>
+            </w:r>
+          </w:p>
+        </w:tc>
+        <w:tc>
+          <w:tcPr>
+            <w:tcW w:type="dxa" w:w="2076"/>
+            <w:tcBorders>
+              <w:bottom w:val="single" w:sz="18" w:space="0" w:color="000000"/>
+            </w:tcBorders>
+          </w:tcPr>
+          <w:p>
+            <w:pPr>
+              <w:spacing w:before="0" w:after="0"/>
+            </w:pPr>
+            <w:r>
+              <w:rPr>
+                <w:b w:val="0"/>
+                <w:sz w:val="16"/>
+              </w:rPr>
+              <w:t>might</w:t>
+            </w:r>
+          </w:p>
+        </w:tc>
+        <w:tc>
+          <w:tcPr>
+            <w:tcW w:type="dxa" w:w="2076"/>
+            <w:tcBorders>
+              <w:bottom w:val="single" w:sz="18" w:space="0" w:color="000000"/>
+            </w:tcBorders>
+          </w:tcPr>
+          <w:p>
+            <w:pPr>
+              <w:spacing w:before="0" w:after="0"/>
+            </w:pPr>
+            <w:r>
+              <w:rPr>
+                <w:b w:val="0"/>
+                <w:sz w:val="16"/>
+              </w:rPr>
+              <w:t>…might be effective… but it is not conclusive that ASF is not present…</w:t>
+            </w:r>
+          </w:p>
+        </w:tc>
+      </w:tr>
+    </w:tbl>
     <w:p>
       <w:pPr>
         <w:keepNext w:val="1"/>

</xml_diff>

<commit_message>
Draft_124: decimal table numbers for related illustrations; cantSplit rows for clean page breaks
</commit_message>
<xml_diff>
--- a/thesis/003_ThesisProposal_Draft_124_body.docx
+++ b/thesis/003_ThesisProposal_Draft_124_body.docx
@@ -2621,6 +2621,10 @@
         <w:gridCol w:w="2769"/>
       </w:tblGrid>
       <w:tr>
+        <w:trPr>
+          <w:cantSplit/>
+          <w:tblHeader/>
+        </w:trPr>
         <w:tc>
           <w:tcPr>
             <w:tcW w:w="2769" w:type="dxa"/>
@@ -2689,6 +2693,9 @@
         </w:tc>
       </w:tr>
       <w:tr>
+        <w:trPr>
+          <w:cantSplit/>
+        </w:trPr>
         <w:tc>
           <w:tcPr>
             <w:tcW w:w="2769" w:type="dxa"/>
@@ -2745,6 +2752,9 @@
         </w:tc>
       </w:tr>
       <w:tr>
+        <w:trPr>
+          <w:cantSplit/>
+        </w:trPr>
         <w:tc>
           <w:tcPr>
             <w:tcW w:w="2769" w:type="dxa"/>
@@ -2801,6 +2811,9 @@
         </w:tc>
       </w:tr>
       <w:tr>
+        <w:trPr>
+          <w:cantSplit/>
+        </w:trPr>
         <w:tc>
           <w:tcPr>
             <w:tcW w:w="2769" w:type="dxa"/>
@@ -2857,6 +2870,9 @@
         </w:tc>
       </w:tr>
       <w:tr>
+        <w:trPr>
+          <w:cantSplit/>
+        </w:trPr>
         <w:tc>
           <w:tcPr>
             <w:tcW w:w="2769" w:type="dxa"/>
@@ -2913,6 +2929,9 @@
         </w:tc>
       </w:tr>
       <w:tr>
+        <w:trPr>
+          <w:cantSplit/>
+        </w:trPr>
         <w:tc>
           <w:tcPr>
             <w:tcW w:w="2769" w:type="dxa"/>
@@ -2972,6 +2991,9 @@
         </w:tc>
       </w:tr>
       <w:tr>
+        <w:trPr>
+          <w:cantSplit/>
+        </w:trPr>
         <w:tc>
           <w:tcPr>
             <w:tcW w:type="dxa" w:w="2769"/>
@@ -3025,6 +3047,9 @@
         </w:tc>
       </w:tr>
       <w:tr>
+        <w:trPr>
+          <w:cantSplit/>
+        </w:trPr>
         <w:tc>
           <w:tcPr>
             <w:tcW w:type="dxa" w:w="2769"/>
@@ -3078,6 +3103,9 @@
         </w:tc>
       </w:tr>
       <w:tr>
+        <w:trPr>
+          <w:cantSplit/>
+        </w:trPr>
         <w:tc>
           <w:tcPr>
             <w:tcW w:type="dxa" w:w="2769"/>
@@ -3386,8 +3414,8 @@
       </w:tblGrid>
       <w:tr>
         <w:trPr>
-          <w:cantSplit w:val="1"/>
-          <w:tblHeader w:val="1"/>
+          <w:cantSplit/>
+          <w:tblHeader/>
         </w:trPr>
         <w:tc>
           <w:tcPr>
@@ -3590,8 +3618,7 @@
       </w:tr>
       <w:tr>
         <w:trPr>
-          <w:cantSplit w:val="1"/>
-          <w:tblHeader w:val="0"/>
+          <w:cantSplit/>
         </w:trPr>
         <w:tc>
           <w:tcPr/>
@@ -3758,8 +3785,7 @@
       </w:tr>
       <w:tr>
         <w:trPr>
-          <w:cantSplit w:val="1"/>
-          <w:tblHeader w:val="0"/>
+          <w:cantSplit/>
         </w:trPr>
         <w:tc>
           <w:tcPr/>
@@ -3919,8 +3945,7 @@
       </w:tr>
       <w:tr>
         <w:trPr>
-          <w:cantSplit w:val="1"/>
-          <w:tblHeader w:val="0"/>
+          <w:cantSplit/>
         </w:trPr>
         <w:tc>
           <w:tcPr/>
@@ -4087,8 +4112,7 @@
       </w:tr>
       <w:tr>
         <w:trPr>
-          <w:cantSplit w:val="1"/>
-          <w:tblHeader w:val="0"/>
+          <w:cantSplit/>
         </w:trPr>
         <w:tc>
           <w:tcPr/>
@@ -4255,8 +4279,7 @@
       </w:tr>
       <w:tr>
         <w:trPr>
-          <w:cantSplit w:val="1"/>
-          <w:tblHeader w:val="0"/>
+          <w:cantSplit/>
         </w:trPr>
         <w:tc>
           <w:tcPr>
@@ -4572,6 +4595,10 @@
         <w:gridCol w:w="1661"/>
       </w:tblGrid>
       <w:tr>
+        <w:trPr>
+          <w:cantSplit/>
+          <w:tblHeader/>
+        </w:trPr>
         <w:tc>
           <w:tcPr>
             <w:tcW w:type="dxa" w:w="1661"/>
@@ -4679,6 +4706,9 @@
         </w:tc>
       </w:tr>
       <w:tr>
+        <w:trPr>
+          <w:cantSplit/>
+        </w:trPr>
         <w:tc>
           <w:tcPr>
             <w:tcW w:type="dxa" w:w="1661"/>
@@ -4771,6 +4801,9 @@
         </w:tc>
       </w:tr>
       <w:tr>
+        <w:trPr>
+          <w:cantSplit/>
+        </w:trPr>
         <w:tc>
           <w:tcPr>
             <w:tcW w:type="dxa" w:w="1661"/>
@@ -4862,6 +4895,9 @@
         </w:tc>
       </w:tr>
       <w:tr>
+        <w:trPr>
+          <w:cantSplit/>
+        </w:trPr>
         <w:tc>
           <w:tcPr>
             <w:tcW w:type="dxa" w:w="1661"/>
@@ -4953,6 +4989,9 @@
         </w:tc>
       </w:tr>
       <w:tr>
+        <w:trPr>
+          <w:cantSplit/>
+        </w:trPr>
         <w:tc>
           <w:tcPr>
             <w:tcW w:type="dxa" w:w="1661"/>
@@ -5044,6 +5083,9 @@
         </w:tc>
       </w:tr>
       <w:tr>
+        <w:trPr>
+          <w:cantSplit/>
+        </w:trPr>
         <w:tc>
           <w:tcPr>
             <w:tcW w:type="dxa" w:w="1661"/>
@@ -5136,6 +5178,9 @@
         </w:tc>
       </w:tr>
       <w:tr>
+        <w:trPr>
+          <w:cantSplit/>
+        </w:trPr>
         <w:tc>
           <w:tcPr>
             <w:tcW w:type="dxa" w:w="1661"/>
@@ -5227,6 +5272,9 @@
         </w:tc>
       </w:tr>
       <w:tr>
+        <w:trPr>
+          <w:cantSplit/>
+        </w:trPr>
         <w:tc>
           <w:tcPr>
             <w:tcW w:type="dxa" w:w="1661"/>
@@ -5318,6 +5366,9 @@
         </w:tc>
       </w:tr>
       <w:tr>
+        <w:trPr>
+          <w:cantSplit/>
+        </w:trPr>
         <w:tc>
           <w:tcPr>
             <w:tcW w:type="dxa" w:w="1661"/>
@@ -5409,6 +5460,9 @@
         </w:tc>
       </w:tr>
       <w:tr>
+        <w:trPr>
+          <w:cantSplit/>
+        </w:trPr>
         <w:tc>
           <w:tcPr>
             <w:tcW w:type="dxa" w:w="1661"/>
@@ -5500,6 +5554,9 @@
         </w:tc>
       </w:tr>
       <w:tr>
+        <w:trPr>
+          <w:cantSplit/>
+        </w:trPr>
         <w:tc>
           <w:tcPr>
             <w:tcW w:type="dxa" w:w="1661"/>
@@ -5591,6 +5648,9 @@
         </w:tc>
       </w:tr>
       <w:tr>
+        <w:trPr>
+          <w:cantSplit/>
+        </w:trPr>
         <w:tc>
           <w:tcPr>
             <w:tcW w:type="dxa" w:w="1661"/>
@@ -5682,6 +5742,9 @@
         </w:tc>
       </w:tr>
       <w:tr>
+        <w:trPr>
+          <w:cantSplit/>
+        </w:trPr>
         <w:tc>
           <w:tcPr>
             <w:tcW w:type="dxa" w:w="1661"/>
@@ -5774,6 +5837,9 @@
         </w:tc>
       </w:tr>
       <w:tr>
+        <w:trPr>
+          <w:cantSplit/>
+        </w:trPr>
         <w:tc>
           <w:tcPr>
             <w:tcW w:type="dxa" w:w="1661"/>
@@ -5866,6 +5932,9 @@
         </w:tc>
       </w:tr>
       <w:tr>
+        <w:trPr>
+          <w:cantSplit/>
+        </w:trPr>
         <w:tc>
           <w:tcPr>
             <w:tcW w:type="dxa" w:w="1661"/>
@@ -6132,6 +6201,10 @@
         <w:gridCol w:w="1661"/>
       </w:tblGrid>
       <w:tr>
+        <w:trPr>
+          <w:cantSplit/>
+          <w:tblHeader/>
+        </w:trPr>
         <w:tc>
           <w:tcPr>
             <w:tcW w:type="dxa" w:w="1661"/>
@@ -6239,6 +6312,9 @@
         </w:tc>
       </w:tr>
       <w:tr>
+        <w:trPr>
+          <w:cantSplit/>
+        </w:trPr>
         <w:tc>
           <w:tcPr>
             <w:tcW w:type="dxa" w:w="1661"/>
@@ -6331,6 +6407,9 @@
         </w:tc>
       </w:tr>
       <w:tr>
+        <w:trPr>
+          <w:cantSplit/>
+        </w:trPr>
         <w:tc>
           <w:tcPr>
             <w:tcW w:type="dxa" w:w="1661"/>
@@ -6423,6 +6502,9 @@
         </w:tc>
       </w:tr>
       <w:tr>
+        <w:trPr>
+          <w:cantSplit/>
+        </w:trPr>
         <w:tc>
           <w:tcPr>
             <w:tcW w:type="dxa" w:w="1661"/>
@@ -6515,6 +6597,9 @@
         </w:tc>
       </w:tr>
       <w:tr>
+        <w:trPr>
+          <w:cantSplit/>
+        </w:trPr>
         <w:tc>
           <w:tcPr>
             <w:tcW w:type="dxa" w:w="1661"/>
@@ -6607,6 +6692,9 @@
         </w:tc>
       </w:tr>
       <w:tr>
+        <w:trPr>
+          <w:cantSplit/>
+        </w:trPr>
         <w:tc>
           <w:tcPr>
             <w:tcW w:type="dxa" w:w="1661"/>
@@ -6699,6 +6787,9 @@
         </w:tc>
       </w:tr>
       <w:tr>
+        <w:trPr>
+          <w:cantSplit/>
+        </w:trPr>
         <w:tc>
           <w:tcPr>
             <w:tcW w:type="dxa" w:w="1661"/>
@@ -6791,6 +6882,9 @@
         </w:tc>
       </w:tr>
       <w:tr>
+        <w:trPr>
+          <w:cantSplit/>
+        </w:trPr>
         <w:tc>
           <w:tcPr>
             <w:tcW w:type="dxa" w:w="1661"/>
@@ -6953,7 +7047,7 @@
           <w:b/>
           <w:sz w:val="22"/>
         </w:rPr>
-        <w:t>Table 5</w:t>
+        <w:t>Table 4.1</w:t>
       </w:r>
     </w:p>
     <w:p>
@@ -6995,6 +7089,10 @@
         <w:gridCol w:w="1661"/>
       </w:tblGrid>
       <w:tr>
+        <w:trPr>
+          <w:cantSplit/>
+          <w:tblHeader/>
+        </w:trPr>
         <w:tc>
           <w:tcPr>
             <w:tcW w:type="dxa" w:w="1661"/>
@@ -7102,6 +7200,9 @@
         </w:tc>
       </w:tr>
       <w:tr>
+        <w:trPr>
+          <w:cantSplit/>
+        </w:trPr>
         <w:tc>
           <w:tcPr>
             <w:tcW w:type="dxa" w:w="1661"/>
@@ -7189,6 +7290,9 @@
         </w:tc>
       </w:tr>
       <w:tr>
+        <w:trPr>
+          <w:cantSplit/>
+        </w:trPr>
         <w:tc>
           <w:tcPr>
             <w:tcW w:type="dxa" w:w="1661"/>
@@ -7276,6 +7380,9 @@
         </w:tc>
       </w:tr>
       <w:tr>
+        <w:trPr>
+          <w:cantSplit/>
+        </w:trPr>
         <w:tc>
           <w:tcPr>
             <w:tcW w:type="dxa" w:w="1661"/>
@@ -7363,6 +7470,9 @@
         </w:tc>
       </w:tr>
       <w:tr>
+        <w:trPr>
+          <w:cantSplit/>
+        </w:trPr>
         <w:tc>
           <w:tcPr>
             <w:tcW w:type="dxa" w:w="1661"/>
@@ -7591,7 +7701,7 @@
           <w:rFonts w:ascii="Georgia" w:hAnsi="Georgia" w:eastAsia="Georgia"/>
           <w:sz w:val="22"/>
         </w:rPr>
-        <w:t>Part III asks what retained hedges do when they appear, and how the coding scheme separates them from lookalike forms. Table 6 reports the Step 2 outcomes for the candidate pool. Of the retained hedges, all 65 were coded as epistemic caution. Politeness/deference is null (0). False positives totaled 65. Those 65 failed the claim condition or both removal checks. The functional profile of this corpus is therefore uniform on the retained side: when a token counts as a hedge, it softens commitment to a claim about findings or implications, not interpersonal stance toward the reader.</w:t>
+        <w:t>Part III asks what retained hedges do when they appear, and how the coding scheme separates them from lookalike forms. Table 5 reports the Step 2 outcomes for the candidate pool. Of the retained hedges, all 65 were coded as epistemic caution. Politeness/deference is null (0). False positives totaled 65. Those 65 failed the claim condition or both removal checks. The functional profile of this corpus is therefore uniform on the retained side: when a token counts as a hedge, it softens commitment to a claim about findings or implications, not interpersonal stance toward the reader.</w:t>
       </w:r>
     </w:p>
     <w:p>
@@ -7607,7 +7717,7 @@
           <w:b/>
           <w:sz w:val="22"/>
         </w:rPr>
-        <w:t>Table 6</w:t>
+        <w:t>Table 5</w:t>
       </w:r>
     </w:p>
     <w:p>
@@ -7658,8 +7768,8 @@
       </w:tblGrid>
       <w:tr>
         <w:trPr>
-          <w:cantSplit w:val="1"/>
-          <w:tblHeader w:val="1"/>
+          <w:cantSplit/>
+          <w:tblHeader/>
         </w:trPr>
         <w:tc>
           <w:tcPr>
@@ -7736,8 +7846,7 @@
       </w:tr>
       <w:tr>
         <w:trPr>
-          <w:cantSplit w:val="1"/>
-          <w:tblHeader w:val="0"/>
+          <w:cantSplit/>
         </w:trPr>
         <w:tc>
           <w:tcPr/>
@@ -7802,8 +7911,7 @@
       </w:tr>
       <w:tr>
         <w:trPr>
-          <w:cantSplit w:val="1"/>
-          <w:tblHeader w:val="0"/>
+          <w:cantSplit/>
         </w:trPr>
         <w:tc>
           <w:tcPr/>
@@ -7868,8 +7976,7 @@
       </w:tr>
       <w:tr>
         <w:trPr>
-          <w:cantSplit w:val="1"/>
-          <w:tblHeader w:val="0"/>
+          <w:cantSplit/>
         </w:trPr>
         <w:tc>
           <w:tcPr/>
@@ -7934,8 +8041,7 @@
       </w:tr>
       <w:tr>
         <w:trPr>
-          <w:cantSplit w:val="1"/>
-          <w:tblHeader w:val="0"/>
+          <w:cantSplit/>
         </w:trPr>
         <w:tc>
           <w:tcPr>
@@ -8041,7 +8147,7 @@
           <w:rFonts w:ascii="Georgia" w:hAnsi="Georgia" w:eastAsia="Georgia"/>
           <w:sz w:val="22"/>
         </w:rPr>
-        <w:t>Gillaerts and Van de Velde (2010) show that research-article abstracts are not miniature full articles. Interactional markers in abstracts can be more limited than in the longer text. In this PSAU sample, retained hedges most often sit in implication and conclusion sentences rather than in bare results lines. Forms such as potential and the suggest family typically qualify applications or interpretations. Results sentences in the same abstracts more often use factive reporting verbs without qualification. Table 7 shows how the same surface forms are kept or rejected once the claim condition and removal checks are applied. Table 8 then samples retained hedges across the three programs.</w:t>
+        <w:t>Gillaerts and Van de Velde (2010) show that research-article abstracts are not miniature full articles. Interactional markers in abstracts can be more limited than in the longer text. In this PSAU sample, retained hedges most often sit in implication and conclusion sentences rather than in bare results lines. Forms such as potential and the suggest family typically qualify applications or interpretations. Results sentences in the same abstracts more often use factive reporting verbs without qualification. Table 5.1 shows how the same surface forms are kept or rejected once the claim condition and removal checks are applied. Table 5.2 then samples retained hedges across the three programs.</w:t>
       </w:r>
     </w:p>
     <w:p>
@@ -8069,7 +8175,7 @@
           <w:b/>
           <w:sz w:val="22"/>
         </w:rPr>
-        <w:t>Table 7</w:t>
+        <w:t>Table 5.1</w:t>
       </w:r>
     </w:p>
     <w:p>
@@ -8111,6 +8217,10 @@
         <w:gridCol w:w="1661"/>
       </w:tblGrid>
       <w:tr>
+        <w:trPr>
+          <w:cantSplit/>
+          <w:tblHeader/>
+        </w:trPr>
         <w:tc>
           <w:tcPr>
             <w:tcW w:type="dxa" w:w="1661"/>
@@ -8218,6 +8328,9 @@
         </w:tc>
       </w:tr>
       <w:tr>
+        <w:trPr>
+          <w:cantSplit/>
+        </w:trPr>
         <w:tc>
           <w:tcPr>
             <w:tcW w:type="dxa" w:w="1661"/>
@@ -8305,6 +8418,9 @@
         </w:tc>
       </w:tr>
       <w:tr>
+        <w:trPr>
+          <w:cantSplit/>
+        </w:trPr>
         <w:tc>
           <w:tcPr>
             <w:tcW w:type="dxa" w:w="1661"/>
@@ -8392,6 +8508,9 @@
         </w:tc>
       </w:tr>
       <w:tr>
+        <w:trPr>
+          <w:cantSplit/>
+        </w:trPr>
         <w:tc>
           <w:tcPr>
             <w:tcW w:type="dxa" w:w="1661"/>
@@ -8479,6 +8598,9 @@
         </w:tc>
       </w:tr>
       <w:tr>
+        <w:trPr>
+          <w:cantSplit/>
+        </w:trPr>
         <w:tc>
           <w:tcPr>
             <w:tcW w:type="dxa" w:w="1661"/>
@@ -8566,6 +8688,9 @@
         </w:tc>
       </w:tr>
       <w:tr>
+        <w:trPr>
+          <w:cantSplit/>
+        </w:trPr>
         <w:tc>
           <w:tcPr>
             <w:tcW w:type="dxa" w:w="1661"/>
@@ -8653,6 +8778,9 @@
         </w:tc>
       </w:tr>
       <w:tr>
+        <w:trPr>
+          <w:cantSplit/>
+        </w:trPr>
         <w:tc>
           <w:tcPr>
             <w:tcW w:type="dxa" w:w="1661"/>
@@ -8766,7 +8894,7 @@
           <w:rFonts w:ascii="Georgia" w:hAnsi="Georgia" w:eastAsia="Georgia"/>
           <w:sz w:val="22"/>
         </w:rPr>
-        <w:t>The pairs in Table 7 are drawn from the coded corpus. In each case the surface form is similar. What changes is whether the host clause is a claim about findings or implications, and whether removing the token raises epistemic commitment. Topic-naming, capability, and operational restatement stay outside the retained set even when the word looks like a hedge.</w:t>
+        <w:t>The pairs in Table 5.1 are drawn from the coded corpus. In each case the surface form is similar. What changes is whether the host clause is a claim about findings or implications, and whether removing the token raises epistemic commitment. Topic-naming, capability, and operational restatement stay outside the retained set even when the word looks like a hedge.</w:t>
       </w:r>
     </w:p>
     <w:p>
@@ -8780,7 +8908,7 @@
           <w:b/>
           <w:sz w:val="22"/>
         </w:rPr>
-        <w:t>Table 8</w:t>
+        <w:t>Table 5.2</w:t>
       </w:r>
     </w:p>
     <w:p>
@@ -8821,6 +8949,10 @@
         <w:gridCol w:w="2076"/>
       </w:tblGrid>
       <w:tr>
+        <w:trPr>
+          <w:cantSplit/>
+          <w:tblHeader/>
+        </w:trPr>
         <w:tc>
           <w:tcPr>
             <w:tcW w:type="dxa" w:w="2076"/>
@@ -8907,6 +9039,9 @@
         </w:tc>
       </w:tr>
       <w:tr>
+        <w:trPr>
+          <w:cantSplit/>
+        </w:trPr>
         <w:tc>
           <w:tcPr>
             <w:tcW w:type="dxa" w:w="2076"/>
@@ -8977,6 +9112,9 @@
         </w:tc>
       </w:tr>
       <w:tr>
+        <w:trPr>
+          <w:cantSplit/>
+        </w:trPr>
         <w:tc>
           <w:tcPr>
             <w:tcW w:type="dxa" w:w="2076"/>
@@ -9047,6 +9185,9 @@
         </w:tc>
       </w:tr>
       <w:tr>
+        <w:trPr>
+          <w:cantSplit/>
+        </w:trPr>
         <w:tc>
           <w:tcPr>
             <w:tcW w:type="dxa" w:w="2076"/>
@@ -9117,6 +9258,9 @@
         </w:tc>
       </w:tr>
       <w:tr>
+        <w:trPr>
+          <w:cantSplit/>
+        </w:trPr>
         <w:tc>
           <w:tcPr>
             <w:tcW w:type="dxa" w:w="2076"/>
@@ -9187,6 +9331,9 @@
         </w:tc>
       </w:tr>
       <w:tr>
+        <w:trPr>
+          <w:cantSplit/>
+        </w:trPr>
         <w:tc>
           <w:tcPr>
             <w:tcW w:type="dxa" w:w="2076"/>
@@ -9257,6 +9404,9 @@
         </w:tc>
       </w:tr>
       <w:tr>
+        <w:trPr>
+          <w:cantSplit/>
+        </w:trPr>
         <w:tc>
           <w:tcPr>
             <w:tcW w:type="dxa" w:w="2076"/>
@@ -9377,7 +9527,7 @@
           <w:rFonts w:ascii="Georgia" w:hAnsi="Georgia" w:eastAsia="Georgia"/>
           <w:sz w:val="22"/>
         </w:rPr>
-        <w:t>Part IV reads the density and function findings against outcome type and program contrast. The discussion draws on Salager-Meyer’s (1994) claim-responsibility framework and Hyland’s (2005) stance model. Table 9 classifies how each abstract reports its main results. Table 10 samples how the programs word caution in concrete excerpts.</w:t>
+        <w:t>Part IV reads the density and function findings against outcome type and program contrast. The discussion draws on Salager-Meyer’s (1994) claim-responsibility framework and Hyland’s (2005) stance model. Table 6 classifies how each abstract reports its main results. Table 6.1 samples how the programs word caution in concrete excerpts.</w:t>
       </w:r>
     </w:p>
     <w:p>
@@ -9394,7 +9544,7 @@
           <w:b/>
           <w:sz w:val="22"/>
         </w:rPr>
-        <w:t>Table 9</w:t>
+        <w:t>Table 6</w:t>
       </w:r>
     </w:p>
     <w:p>
@@ -9446,8 +9596,8 @@
       </w:tblGrid>
       <w:tr>
         <w:trPr>
-          <w:cantSplit w:val="1"/>
-          <w:tblHeader w:val="1"/>
+          <w:cantSplit/>
+          <w:tblHeader/>
         </w:trPr>
         <w:tc>
           <w:tcPr>
@@ -9607,8 +9757,7 @@
       </w:tr>
       <w:tr>
         <w:trPr>
-          <w:cantSplit w:val="1"/>
-          <w:tblHeader w:val="0"/>
+          <w:cantSplit/>
         </w:trPr>
         <w:tc>
           <w:tcPr/>
@@ -9713,8 +9862,7 @@
       </w:tr>
       <w:tr>
         <w:trPr>
-          <w:cantSplit w:val="1"/>
-          <w:tblHeader w:val="0"/>
+          <w:cantSplit/>
         </w:trPr>
         <w:tc>
           <w:tcPr/>
@@ -9819,8 +9967,7 @@
       </w:tr>
       <w:tr>
         <w:trPr>
-          <w:cantSplit w:val="1"/>
-          <w:tblHeader w:val="0"/>
+          <w:cantSplit/>
         </w:trPr>
         <w:tc>
           <w:tcPr/>
@@ -9925,8 +10072,7 @@
       </w:tr>
       <w:tr>
         <w:trPr>
-          <w:cantSplit w:val="1"/>
-          <w:tblHeader w:val="0"/>
+          <w:cantSplit/>
         </w:trPr>
         <w:tc>
           <w:tcPr/>
@@ -10031,8 +10177,7 @@
       </w:tr>
       <w:tr>
         <w:trPr>
-          <w:cantSplit w:val="1"/>
-          <w:tblHeader w:val="0"/>
+          <w:cantSplit/>
         </w:trPr>
         <w:tc>
           <w:tcPr/>
@@ -10137,8 +10282,7 @@
       </w:tr>
       <w:tr>
         <w:trPr>
-          <w:cantSplit w:val="1"/>
-          <w:tblHeader w:val="0"/>
+          <w:cantSplit/>
         </w:trPr>
         <w:tc>
           <w:tcPr>
@@ -10279,7 +10423,7 @@
           <w:rFonts w:ascii="Georgia" w:hAnsi="Georgia" w:eastAsia="Georgia"/>
           <w:sz w:val="22"/>
         </w:rPr>
-        <w:t>Outcome type classifies how each abstract reports its main results from the abstract’s own results language. Binary covers presence/absence or clear yes/no outcomes. Continuous covers graded quantities. Mixed combines both. Null/NS marks non-significant or null findings. Other covers residual formats. Table 9 shows that outcome mix alone does not line up neatly with the density ranking: Veterinary Medicine is not simply a binary-only set, and Biology is not simply continuous-only.</w:t>
+        <w:t>Outcome type classifies how each abstract reports its main results from the abstract’s own results language. Binary covers presence/absence or clear yes/no outcomes. Continuous covers graded quantities. Mixed combines both. Null/NS marks non-significant or null findings. Other covers residual formats. Table 6 shows that outcome mix alone does not line up neatly with the density ranking: Veterinary Medicine is not simply a binary-only set, and Biology is not simply continuous-only.</w:t>
       </w:r>
     </w:p>
     <w:p>
@@ -10309,7 +10453,7 @@
           <w:rFonts w:ascii="Georgia" w:hAnsi="Georgia" w:eastAsia="Georgia"/>
           <w:sz w:val="22"/>
         </w:rPr>
-        <w:t>Outcome type does not remove the Biology–Veterinary Medicine gap. When results are reported as presence/absence findings, VM abstracts still use fewer epistemic softeners than Biology abstracts of the same broad outcome class. That is consistent with programs managing claim responsibility differently, not with a rule that binary evidence needs no hedge. Acs2 illustrates the opposite pole inside Agriculture: after non-significance, residual benefits are still hedged, which redistributes responsibility for a softened positive reading. Table 10 places concrete excerpts beside one another so the contrast is visible in the wording, not only in the counts.</w:t>
+        <w:t>Outcome type does not remove the Biology–Veterinary Medicine gap. When results are reported as presence/absence findings, VM abstracts still use fewer epistemic softeners than Biology abstracts of the same broad outcome class. That is consistent with programs managing claim responsibility differently, not with a rule that binary evidence needs no hedge. Acs2 illustrates the opposite pole inside Agriculture: after non-significance, residual benefits are still hedged, which redistributes responsibility for a softened positive reading. Table 6.1 places concrete excerpts beside one another so the contrast is visible in the wording, not only in the counts.</w:t>
       </w:r>
     </w:p>
     <w:p>
@@ -10393,7 +10537,7 @@
           <w:b/>
           <w:sz w:val="22"/>
         </w:rPr>
-        <w:t>Table 10</w:t>
+        <w:t>Table 6.1</w:t>
       </w:r>
     </w:p>
     <w:tbl>
@@ -10421,6 +10565,10 @@
         <w:gridCol w:w="1661"/>
       </w:tblGrid>
       <w:tr>
+        <w:trPr>
+          <w:cantSplit/>
+          <w:tblHeader/>
+        </w:trPr>
         <w:tc>
           <w:tcPr>
             <w:tcW w:type="dxa" w:w="1661"/>
@@ -10528,6 +10676,9 @@
         </w:tc>
       </w:tr>
       <w:tr>
+        <w:trPr>
+          <w:cantSplit/>
+        </w:trPr>
         <w:tc>
           <w:tcPr>
             <w:tcW w:type="dxa" w:w="1661"/>
@@ -10615,6 +10766,9 @@
         </w:tc>
       </w:tr>
       <w:tr>
+        <w:trPr>
+          <w:cantSplit/>
+        </w:trPr>
         <w:tc>
           <w:tcPr>
             <w:tcW w:type="dxa" w:w="1661"/>
@@ -10702,6 +10856,9 @@
         </w:tc>
       </w:tr>
       <w:tr>
+        <w:trPr>
+          <w:cantSplit/>
+        </w:trPr>
         <w:tc>
           <w:tcPr>
             <w:tcW w:type="dxa" w:w="1661"/>
@@ -10789,6 +10946,9 @@
         </w:tc>
       </w:tr>
       <w:tr>
+        <w:trPr>
+          <w:cantSplit/>
+        </w:trPr>
         <w:tc>
           <w:tcPr>
             <w:tcW w:type="dxa" w:w="1661"/>
@@ -10876,6 +11036,9 @@
         </w:tc>
       </w:tr>
       <w:tr>
+        <w:trPr>
+          <w:cantSplit/>
+        </w:trPr>
         <w:tc>
           <w:tcPr>
             <w:tcW w:type="dxa" w:w="1661"/>
@@ -10963,6 +11126,9 @@
         </w:tc>
       </w:tr>
       <w:tr>
+        <w:trPr>
+          <w:cantSplit/>
+        </w:trPr>
         <w:tc>
           <w:tcPr>
             <w:tcW w:type="dxa" w:w="1661"/>

</xml_diff>

<commit_message>
Draft_124: Part III–IV minor subheads; linguistic refocus of program contrast (less raw-number prose)
</commit_message>
<xml_diff>
--- a/thesis/003_ThesisProposal_Draft_124_body.docx
+++ b/thesis/003_ThesisProposal_Draft_124_body.docx
@@ -7691,6 +7691,21 @@
     </w:p>
     <w:p>
       <w:pPr>
+        <w:spacing w:line="480" w:lineRule="auto" w:before="240" w:after="0"/>
+        <w:ind w:firstLine="0"/>
+        <w:jc w:val="left"/>
+      </w:pPr>
+      <w:r>
+        <w:rPr>
+          <w:rFonts w:ascii="Georgia" w:hAnsi="Georgia" w:eastAsia="Georgia"/>
+          <w:b/>
+          <w:sz w:val="22"/>
+        </w:rPr>
+        <w:t>Function Profile of Retained Hedges</w:t>
+      </w:r>
+    </w:p>
+    <w:p>
+      <w:pPr>
         <w:spacing w:after="0" w:before="0" w:line="480" w:lineRule="auto"/>
         <w:ind w:firstLine="720"/>
         <w:jc w:val="both"/>
@@ -7701,7 +7716,7 @@
           <w:rFonts w:ascii="Georgia" w:hAnsi="Georgia" w:eastAsia="Georgia"/>
           <w:sz w:val="22"/>
         </w:rPr>
-        <w:t>Part III asks what retained hedges do when they appear, and how the coding scheme separates them from lookalike forms. Table 5 reports the Step 2 outcomes for the candidate pool. Of the retained hedges, all 65 were coded as epistemic caution. Politeness/deference is null (0). False positives totaled 65. Those 65 failed the claim condition or both removal checks. The functional profile of this corpus is therefore uniform on the retained side: when a token counts as a hedge, it softens commitment to a claim about findings or implications, not interpersonal stance toward the reader.</w:t>
+        <w:t>Part III asks what retained hedges do when they appear, and how the coding scheme separates them from lookalike forms. Table 5 reports the Step 2 outcomes for the candidate pool. Every retained token was coded as epistemic caution. None was coded as politeness/deference. An equal number of candidates were logged as false positives because they failed the claim condition or both removal checks. On the retained side, the functional profile is uniform: when a token counts as a hedge in this corpus, it softens commitment to a claim about findings or implications, not interpersonal stance toward the reader.</w:t>
       </w:r>
     </w:p>
     <w:p>
@@ -8132,7 +8147,7 @@
           <w:rFonts w:ascii="Georgia" w:hAnsi="Georgia" w:eastAsia="Georgia"/>
           <w:sz w:val="22"/>
         </w:rPr>
-        <w:t>No retained hedge was independently labeled politeness/deference. Under the Step 2 rule, only tokens attached to claims that pass the claim condition and at least one removal check enter the retained set. Recommendations and other non-claims are logged as false positives and never reach a politeness/deference label under this scheme. Fifteen recommendation-framed tokens sit in that false-positive pool. A wider definition of interpersonal softening could treat some of them differently. The zero count here is the outcome of the epistemic definition adopted for this study, not a claim that abstracts never soften directives in any linguistic sense. An all–epistemic-caution profile fits how scientific English often uses hedges on knowledge claims (Hyland, 1996, 1998; Salager-Meyer, 1994): the devices manage how far a proposition should be trusted.</w:t>
+        <w:t>That uniformity is a consequence of the Step 2 rule, not a claim that abstracts never soften directives in any linguistic sense. Only tokens attached to claims that pass the claim condition and at least one removal check enter the retained set. Recommendations and other non-claims are logged as false positives and never receive a politeness/deference label under this scheme. Fifteen recommendation-framed tokens sit in that false-positive pool. A wider definition of interpersonal softening could treat some of them differently. The all–epistemic-caution result fits how scientific English often uses hedges on knowledge claims (Hyland, 1996, 1998; Salager-Meyer, 1994): the devices manage how far a proposition should be trusted.</w:t>
       </w:r>
     </w:p>
     <w:p>
@@ -8147,7 +8162,7 @@
           <w:rFonts w:ascii="Georgia" w:hAnsi="Georgia" w:eastAsia="Georgia"/>
           <w:sz w:val="22"/>
         </w:rPr>
-        <w:t>Gillaerts and Van de Velde (2010) show that research-article abstracts are not miniature full articles. Interactional markers in abstracts can be more limited than in the longer text. In this PSAU sample, retained hedges most often sit in implication and conclusion sentences rather than in bare results lines. Forms such as potential and the suggest family typically qualify applications or interpretations. Results sentences in the same abstracts more often use factive reporting verbs without qualification. Table 5.1 shows how the same surface forms are kept or rejected once the claim condition and removal checks are applied. Table 5.2 then samples retained hedges across the three programs.</w:t>
+        <w:t>Gillaerts and Van de Velde (2010) show that research-article abstracts are not miniature full articles. Interactional markers in abstracts can be more limited than in the longer text. In this PSAU sample, retained hedges most often sit in implication and conclusion sentences rather than in bare results lines. Writers more often qualify what the findings mean for application or interpretation (potential, the suggest family) than they soften the reporting of the measured result itself. Results lines more often use factive reporting verbs without qualification. Table 5.1 shows how the same surface forms are kept or rejected once the claim condition and removal checks are applied. Table 5.2 then samples retained wording across the three programs.</w:t>
       </w:r>
     </w:p>
     <w:p>
@@ -8159,9 +8174,25 @@
       </w:pPr>
       <w:r>
         <w:rPr>
-          <w:rtl w:val="0"/>
-        </w:rPr>
-        <w:t xml:space="preserve">Linguistically, the profile shows English in these abstracts adjusting the epistemic weight of findings and implications. It does not show retained hedges doing interpersonal softening of those claims. As an account of ratified undergraduate abstracts, the result is a functionally narrow stance repertoire centered on the proposition.</w:t>
+          <w:rFonts w:ascii="Georgia" w:hAnsi="Georgia" w:eastAsia="Georgia"/>
+          <w:sz w:val="22"/>
+        </w:rPr>
+        <w:t>Taken together, the English of these abstracts adjusts the epistemic weight of findings and implications when hedges are retained. It does not show retained hedges doing interpersonal softening of those claims. The stance repertoire that survives Step 2 is functionally narrow and centered on the proposition.</w:t>
+      </w:r>
+    </w:p>
+    <w:p>
+      <w:pPr>
+        <w:spacing w:line="480" w:lineRule="auto" w:before="240" w:after="0"/>
+        <w:ind w:firstLine="0"/>
+        <w:jc w:val="left"/>
+      </w:pPr>
+      <w:r>
+        <w:rPr>
+          <w:rFonts w:ascii="Georgia" w:hAnsi="Georgia" w:eastAsia="Georgia"/>
+          <w:b/>
+          <w:sz w:val="22"/>
+        </w:rPr>
+        <w:t>Hedge versus False Positive in the Wording</w:t>
       </w:r>
     </w:p>
     <w:p>
@@ -9527,7 +9558,7 @@
           <w:rFonts w:ascii="Georgia" w:hAnsi="Georgia" w:eastAsia="Georgia"/>
           <w:sz w:val="22"/>
         </w:rPr>
-        <w:t>Part IV reads the density and function findings against outcome type and program contrast. The discussion draws on Salager-Meyer’s (1994) claim-responsibility framework and Hyland’s (2005) stance model. Table 6 classifies how each abstract reports its main results. Table 6.1 samples how the programs word caution in concrete excerpts.</w:t>
+        <w:t>Part IV asks what the density and function findings mean once outcome type and program wording are read together. The discussion draws on Salager-Meyer’s (1994) claim-responsibility framework and Hyland’s (2005) stance model. Table 6 classifies how each abstract reports its main results. Table 6.1 samples how the programs word caution in concrete excerpts.</w:t>
       </w:r>
     </w:p>
     <w:p>
@@ -10413,6 +10444,21 @@
     </w:tbl>
     <w:p>
       <w:pPr>
+        <w:spacing w:line="480" w:lineRule="auto" w:before="240" w:after="0"/>
+        <w:ind w:firstLine="0"/>
+        <w:jc w:val="left"/>
+      </w:pPr>
+      <w:r>
+        <w:rPr>
+          <w:rFonts w:ascii="Georgia" w:hAnsi="Georgia" w:eastAsia="Georgia"/>
+          <w:b/>
+          <w:sz w:val="22"/>
+        </w:rPr>
+        <w:t>Outcome Type and the Limits of a Design Explanation</w:t>
+      </w:r>
+    </w:p>
+    <w:p>
+      <w:pPr>
         <w:spacing w:after="0" w:before="0" w:line="480" w:lineRule="auto"/>
         <w:ind w:firstLine="720"/>
         <w:jc w:val="both"/>
@@ -10423,7 +10469,22 @@
           <w:rFonts w:ascii="Georgia" w:hAnsi="Georgia" w:eastAsia="Georgia"/>
           <w:sz w:val="22"/>
         </w:rPr>
-        <w:t>Outcome type classifies how each abstract reports its main results from the abstract’s own results language. Binary covers presence/absence or clear yes/no outcomes. Continuous covers graded quantities. Mixed combines both. Null/NS marks non-significant or null findings. Other covers residual formats. Table 6 shows that outcome mix alone does not line up neatly with the density ranking: Veterinary Medicine is not simply a binary-only set, and Biology is not simply continuous-only.</w:t>
+        <w:t>Outcome type classifies how each abstract reports its main results from the abstract’s own results language: binary presence/absence findings, continuous measures, mixed formats, null or non-significant results, and residual forms. Table 6 shows that outcome mix alone does not explain the program contrast. Veterinary Medicine is not simply a binary-only set, and Biology is not simply continuous-only. The same broad result styles appear in more than one program, so the difference in caution is not reducible to “VM only reports yes/no findings.”</w:t>
+      </w:r>
+    </w:p>
+    <w:p>
+      <w:pPr>
+        <w:spacing w:line="480" w:lineRule="auto" w:before="240" w:after="0"/>
+        <w:ind w:firstLine="0"/>
+        <w:jc w:val="left"/>
+      </w:pPr>
+      <w:r>
+        <w:rPr>
+          <w:rFonts w:ascii="Georgia" w:hAnsi="Georgia" w:eastAsia="Georgia"/>
+          <w:b/>
+          <w:sz w:val="22"/>
+        </w:rPr>
+        <w:t>How Programs Word Caution</w:t>
       </w:r>
     </w:p>
     <w:p>
@@ -10438,7 +10499,7 @@
           <w:rFonts w:ascii="Georgia" w:hAnsi="Georgia" w:eastAsia="Georgia"/>
           <w:sz w:val="22"/>
         </w:rPr>
-        <w:t>An informal reading of the tokens still suggests that hedges cluster in implication and conclusion sentences more than in direct results reporting. That pattern is strongest in Agriculture and weakest in Veterinary Medicine. A formal move analysis would be needed to quantify it. Under Salager-Meyer’s (1994) account, writers who hedge implications take partial distance from conclusions that go beyond the measured finding. Veterinary Medicine’s lower density is readable as thinner explicit softening where abstracts turn from results to implications. Unhedged claims were 6 in Agriculture, 4 in Biology, and 4 in Veterinary Medicine (Table 4), so the VM subset does not show more overclaiming on that inventory. Hyland’s (2005) stance model fits the density reading: fewer hedges mean less explicit softening of authorial commitment in the ratified text.</w:t>
+        <w:t>Where hedges do appear, they more often mark the move from result to implication than the bare reporting of a measured value. That tendency is easiest to see in Agriculture, where implication sentences frequently carry suggest, could, or potential. It is hardest to see in Veterinary Medicine, where many abstracts stay with direct results wording and never open an implication frame that would invite softening. Under Salager-Meyer’s (1994) account, hedging an implication takes partial distance from a conclusion that goes beyond the measured finding. Thinner softening in the VM subset is therefore readable as less explicit negotiation of that responsibility in the ratified English of the abstract. It is not readable as more overclaiming: the unhedged-claim inventory is not higher for VM than for Biology (Table 4). Hyland’s (2005) stance model fits the same linguistic picture: fewer hedges mean less explicit softening of authorial commitment in the text that remains.</w:t>
       </w:r>
     </w:p>
     <w:p>
@@ -10453,7 +10514,22 @@
           <w:rFonts w:ascii="Georgia" w:hAnsi="Georgia" w:eastAsia="Georgia"/>
           <w:sz w:val="22"/>
         </w:rPr>
-        <w:t>Outcome type does not remove the Biology–Veterinary Medicine gap. When results are reported as presence/absence findings, VM abstracts still use fewer epistemic softeners than Biology abstracts of the same broad outcome class. That is consistent with programs managing claim responsibility differently, not with a rule that binary evidence needs no hedge. Acs2 illustrates the opposite pole inside Agriculture: after non-significance, residual benefits are still hedged, which redistributes responsibility for a softened positive reading. Table 6.1 places concrete excerpts beside one another so the contrast is visible in the wording, not only in the counts.</w:t>
+        <w:t>Reading abstracts with similar result styles side by side makes the contrast concrete. Biology excerpts more often carry an inferential step after the finding (implies, indicating where the inference exceeds the lab result). Veterinary Medicine excerpts more often stop at the finding or use a single cautious modal in a limited frame. Acs2 shows the opposite pole inside Agriculture: after non-significance, residual benefits are still worded with stacked caution (suggests, might, could, potential), which keeps a softened positive reading in play after the statistical claim has failed. Table 6.1 places these wordings next to one another so the difference is visible in the English, not only in the program totals.</w:t>
+      </w:r>
+    </w:p>
+    <w:p>
+      <w:pPr>
+        <w:spacing w:line="480" w:lineRule="auto" w:before="240" w:after="0"/>
+        <w:ind w:firstLine="0"/>
+        <w:jc w:val="left"/>
+      </w:pPr>
+      <w:r>
+        <w:rPr>
+          <w:rFonts w:ascii="Georgia" w:hAnsi="Georgia" w:eastAsia="Georgia"/>
+          <w:b/>
+          <w:sz w:val="22"/>
+        </w:rPr>
+        <w:t>What the Contrast Can and Cannot Mean</w:t>
       </w:r>
     </w:p>
     <w:p>
@@ -10468,7 +10544,22 @@
           <w:rFonts w:ascii="Georgia" w:hAnsi="Georgia" w:eastAsia="Georgia"/>
           <w:sz w:val="22"/>
         </w:rPr>
-        <w:t>Among these three programs, the descriptive density contrast that stands out is Biology versus Veterinary Medicine. What differs is how these ratified abstracts use English to mark caution around findings and implications: more sustained epistemic softening in the Biology subset, thinner softening in the Veterinary Medicine subset, under overlapping outcome styles. Abstract text alone cannot separate field convention, adviser practice, and individual skill as causes.</w:t>
+        <w:t>Across the three programs, the contrast that stands out is therefore not a raw ranking of counts but a difference in how caution is worded around findings and implications. Biology more often sustains epistemic softening when results turn into meaning. Veterinary Medicine more often leaves that turn thinly marked or absent. Agriculture sits between those poles and occasionally stacks caution after a weak statistical claim. Abstract text alone cannot separate field convention, adviser practice, and individual skill as causes of that pattern.</w:t>
+      </w:r>
+    </w:p>
+    <w:p>
+      <w:pPr>
+        <w:spacing w:line="480" w:lineRule="auto" w:before="240" w:after="0"/>
+        <w:ind w:firstLine="0"/>
+        <w:jc w:val="left"/>
+      </w:pPr>
+      <w:r>
+        <w:rPr>
+          <w:rFonts w:ascii="Georgia" w:hAnsi="Georgia" w:eastAsia="Georgia"/>
+          <w:b/>
+          <w:sz w:val="22"/>
+        </w:rPr>
+        <w:t>Open Readings</w:t>
       </w:r>
     </w:p>
     <w:p>
@@ -10483,7 +10574,7 @@
           <w:rFonts w:ascii="Georgia" w:hAnsi="Georgia" w:eastAsia="Georgia"/>
           <w:sz w:val="22"/>
         </w:rPr>
-        <w:t>Two readings follow as hypotheses for later work. First, VM abstracts may more often end on results with no implication sentence, which leaves less to hedge. A move-structured count of the VM subset would test that. Second, advisers may filter interpersonal softening out of final abstracts, which would help explain the all–epistemic-caution profile. Comparing early drafts with the ratified abstracts would test that second reading.</w:t>
+        <w:t>Two readings follow as hypotheses for later work. First, VM abstracts may more often end on results with no implication sentence, which leaves less linguistic room to hedge. A move-structured count of the VM subset would test that. Second, advisers may filter interpersonal softening out of final abstracts, which would help explain why retained hedges in this corpus do only epistemic work. Comparing early drafts with the ratified abstracts would test that second reading.</w:t>
       </w:r>
     </w:p>
     <w:p>

</xml_diff>

<commit_message>
Draft_124: place Table 6.1 before contrast synthesis subhead
</commit_message>
<xml_diff>
--- a/thesis/003_ThesisProposal_Draft_124_body.docx
+++ b/thesis/003_ThesisProposal_Draft_124_body.docx
@@ -10517,120 +10517,6 @@
         <w:t>Reading abstracts with similar result styles side by side makes the contrast concrete. Biology excerpts more often carry an inferential step after the finding (implies, indicating where the inference exceeds the lab result). Veterinary Medicine excerpts more often stop at the finding or use a single cautious modal in a limited frame. Acs2 shows the opposite pole inside Agriculture: after non-significance, residual benefits are still worded with stacked caution (suggests, might, could, potential), which keeps a softened positive reading in play after the statistical claim has failed. Table 6.1 places these wordings next to one another so the difference is visible in the English, not only in the program totals.</w:t>
       </w:r>
     </w:p>
-    <w:p>
-      <w:pPr>
-        <w:spacing w:line="480" w:lineRule="auto" w:before="240" w:after="0"/>
-        <w:ind w:firstLine="0"/>
-        <w:jc w:val="left"/>
-      </w:pPr>
-      <w:r>
-        <w:rPr>
-          <w:rFonts w:ascii="Georgia" w:hAnsi="Georgia" w:eastAsia="Georgia"/>
-          <w:b/>
-          <w:sz w:val="22"/>
-        </w:rPr>
-        <w:t>What the Contrast Can and Cannot Mean</w:t>
-      </w:r>
-    </w:p>
-    <w:p>
-      <w:pPr>
-        <w:spacing w:after="0" w:before="0" w:line="480" w:lineRule="auto"/>
-        <w:ind w:firstLine="720"/>
-        <w:jc w:val="both"/>
-        <w:rPr/>
-      </w:pPr>
-      <w:r>
-        <w:rPr>
-          <w:rFonts w:ascii="Georgia" w:hAnsi="Georgia" w:eastAsia="Georgia"/>
-          <w:sz w:val="22"/>
-        </w:rPr>
-        <w:t>Across the three programs, the contrast that stands out is therefore not a raw ranking of counts but a difference in how caution is worded around findings and implications. Biology more often sustains epistemic softening when results turn into meaning. Veterinary Medicine more often leaves that turn thinly marked or absent. Agriculture sits between those poles and occasionally stacks caution after a weak statistical claim. Abstract text alone cannot separate field convention, adviser practice, and individual skill as causes of that pattern.</w:t>
-      </w:r>
-    </w:p>
-    <w:p>
-      <w:pPr>
-        <w:spacing w:line="480" w:lineRule="auto" w:before="240" w:after="0"/>
-        <w:ind w:firstLine="0"/>
-        <w:jc w:val="left"/>
-      </w:pPr>
-      <w:r>
-        <w:rPr>
-          <w:rFonts w:ascii="Georgia" w:hAnsi="Georgia" w:eastAsia="Georgia"/>
-          <w:b/>
-          <w:sz w:val="22"/>
-        </w:rPr>
-        <w:t>Open Readings</w:t>
-      </w:r>
-    </w:p>
-    <w:p>
-      <w:pPr>
-        <w:spacing w:after="0" w:before="0" w:line="480" w:lineRule="auto"/>
-        <w:ind w:firstLine="720"/>
-        <w:jc w:val="both"/>
-        <w:rPr/>
-      </w:pPr>
-      <w:r>
-        <w:rPr>
-          <w:rFonts w:ascii="Georgia" w:hAnsi="Georgia" w:eastAsia="Georgia"/>
-          <w:sz w:val="22"/>
-        </w:rPr>
-        <w:t>Two readings follow as hypotheses for later work. First, VM abstracts may more often end on results with no implication sentence, which leaves less linguistic room to hedge. A move-structured count of the VM subset would test that. Second, advisers may filter interpersonal softening out of final abstracts, which would help explain why retained hedges in this corpus do only epistemic work. Comparing early drafts with the ratified abstracts would test that second reading.</w:t>
-      </w:r>
-    </w:p>
-    <w:p>
-      <w:pPr>
-        <w:spacing w:after="0" w:before="0" w:line="480" w:lineRule="auto"/>
-        <w:ind w:firstLine="720"/>
-        <w:jc w:val="both"/>
-        <w:rPr/>
-        <w:sectPr>
-          <w:headerReference r:id="rId21" w:type="default"/>
-          <w:headerReference r:id="rId22" w:type="first"/>
-          <w:footerReference r:id="rId23" w:type="default"/>
-          <w:footerReference r:id="rId24" w:type="first"/>
-          <w:type w:val="nextPage"/>
-          <w:pgSz w:h="16838" w:w="11906" w:orient="portrait"/>
-          <w:pgMar w:bottom="1440" w:top="1440" w:left="2160" w:right="1440" w:header="720" w:footer="720"/>
-          <w:titlePg w:val="1"/>
-        </w:sectPr>
-      </w:pPr>
-      <w:r>
-        <w:br w:type="page"/>
-      </w:r>
-      <w:r>
-        <w:rPr>
-          <w:rtl w:val="0"/>
-        </w:rPr>
-      </w:r>
-    </w:p>
-    <w:p>
-      <w:pPr>
-        <w:spacing w:line="480" w:lineRule="auto"/>
-        <w:ind w:firstLine="0"/>
-        <w:jc w:val="center"/>
-      </w:pPr>
-      <w:r>
-        <w:rPr>
-          <w:i/>
-          <w:sz w:val="22"/>
-        </w:rPr>
-        <w:t>Program Contrast: Sample Excerpts</w:t>
-      </w:r>
-    </w:p>
-    <w:p>
-      <w:pPr>
-        <w:spacing w:line="480" w:lineRule="auto"/>
-        <w:ind w:firstLine="0"/>
-        <w:jc w:val="center"/>
-      </w:pPr>
-      <w:r>
-        <w:rPr>
-          <w:b/>
-          <w:sz w:val="22"/>
-        </w:rPr>
-        <w:t>Table 6.1</w:t>
-      </w:r>
-    </w:p>
     <w:tbl>
       <w:tblPr>
         <w:tblStyle w:val="Table4"/>
@@ -11322,6 +11208,120 @@
         </w:tc>
       </w:tr>
     </w:tbl>
+    <w:p>
+      <w:pPr>
+        <w:spacing w:line="480" w:lineRule="auto"/>
+        <w:ind w:firstLine="0"/>
+        <w:jc w:val="center"/>
+      </w:pPr>
+      <w:r>
+        <w:rPr>
+          <w:i/>
+          <w:sz w:val="22"/>
+        </w:rPr>
+        <w:t>Program Contrast: Sample Excerpts</w:t>
+      </w:r>
+    </w:p>
+    <w:p>
+      <w:pPr>
+        <w:spacing w:line="480" w:lineRule="auto"/>
+        <w:ind w:firstLine="0"/>
+        <w:jc w:val="center"/>
+      </w:pPr>
+      <w:r>
+        <w:rPr>
+          <w:b/>
+          <w:sz w:val="22"/>
+        </w:rPr>
+        <w:t>Table 6.1</w:t>
+      </w:r>
+    </w:p>
+    <w:p>
+      <w:pPr>
+        <w:spacing w:line="480" w:lineRule="auto" w:before="240" w:after="0"/>
+        <w:ind w:firstLine="0"/>
+        <w:jc w:val="left"/>
+      </w:pPr>
+      <w:r>
+        <w:rPr>
+          <w:rFonts w:ascii="Georgia" w:hAnsi="Georgia" w:eastAsia="Georgia"/>
+          <w:b/>
+          <w:sz w:val="22"/>
+        </w:rPr>
+        <w:t>What the Contrast Can and Cannot Mean</w:t>
+      </w:r>
+    </w:p>
+    <w:p>
+      <w:pPr>
+        <w:spacing w:after="0" w:before="0" w:line="480" w:lineRule="auto"/>
+        <w:ind w:firstLine="720"/>
+        <w:jc w:val="both"/>
+        <w:rPr/>
+      </w:pPr>
+      <w:r>
+        <w:rPr>
+          <w:rFonts w:ascii="Georgia" w:hAnsi="Georgia" w:eastAsia="Georgia"/>
+          <w:sz w:val="22"/>
+        </w:rPr>
+        <w:t>Across the three programs, the contrast that stands out is therefore not a raw ranking of counts but a difference in how caution is worded around findings and implications. Biology more often sustains epistemic softening when results turn into meaning. Veterinary Medicine more often leaves that turn thinly marked or absent. Agriculture sits between those poles and occasionally stacks caution after a weak statistical claim. Abstract text alone cannot separate field convention, adviser practice, and individual skill as causes of that pattern.</w:t>
+      </w:r>
+    </w:p>
+    <w:p>
+      <w:pPr>
+        <w:spacing w:line="480" w:lineRule="auto" w:before="240" w:after="0"/>
+        <w:ind w:firstLine="0"/>
+        <w:jc w:val="left"/>
+      </w:pPr>
+      <w:r>
+        <w:rPr>
+          <w:rFonts w:ascii="Georgia" w:hAnsi="Georgia" w:eastAsia="Georgia"/>
+          <w:b/>
+          <w:sz w:val="22"/>
+        </w:rPr>
+        <w:t>Open Readings</w:t>
+      </w:r>
+    </w:p>
+    <w:p>
+      <w:pPr>
+        <w:spacing w:after="0" w:before="0" w:line="480" w:lineRule="auto"/>
+        <w:ind w:firstLine="720"/>
+        <w:jc w:val="both"/>
+        <w:rPr/>
+      </w:pPr>
+      <w:r>
+        <w:rPr>
+          <w:rFonts w:ascii="Georgia" w:hAnsi="Georgia" w:eastAsia="Georgia"/>
+          <w:sz w:val="22"/>
+        </w:rPr>
+        <w:t>Two readings follow as hypotheses for later work. First, VM abstracts may more often end on results with no implication sentence, which leaves less linguistic room to hedge. A move-structured count of the VM subset would test that. Second, advisers may filter interpersonal softening out of final abstracts, which would help explain why retained hedges in this corpus do only epistemic work. Comparing early drafts with the ratified abstracts would test that second reading.</w:t>
+      </w:r>
+    </w:p>
+    <w:p>
+      <w:pPr>
+        <w:spacing w:after="0" w:before="0" w:line="480" w:lineRule="auto"/>
+        <w:ind w:firstLine="720"/>
+        <w:jc w:val="both"/>
+        <w:rPr/>
+        <w:sectPr>
+          <w:headerReference r:id="rId21" w:type="default"/>
+          <w:headerReference r:id="rId22" w:type="first"/>
+          <w:footerReference r:id="rId23" w:type="default"/>
+          <w:footerReference r:id="rId24" w:type="first"/>
+          <w:type w:val="nextPage"/>
+          <w:pgSz w:h="16838" w:w="11906" w:orient="portrait"/>
+          <w:pgMar w:bottom="1440" w:top="1440" w:left="2160" w:right="1440" w:header="720" w:footer="720"/>
+          <w:titlePg w:val="1"/>
+        </w:sectPr>
+      </w:pPr>
+      <w:r>
+        <w:br w:type="page"/>
+      </w:r>
+      <w:r>
+        <w:rPr>
+          <w:rtl w:val="0"/>
+        </w:rPr>
+      </w:r>
+    </w:p>
     <w:p>
       <w:pPr>
         <w:spacing w:after="240" w:before="0" w:line="480" w:lineRule="auto"/>

</xml_diff>

<commit_message>
Draft_124: Table 6.1 caption order (caption, title, table)
</commit_message>
<xml_diff>
--- a/thesis/003_ThesisProposal_Draft_124_body.docx
+++ b/thesis/003_ThesisProposal_Draft_124_body.docx
@@ -10517,6 +10517,34 @@
         <w:t>Reading abstracts with similar result styles side by side makes the contrast concrete. Biology excerpts more often carry an inferential step after the finding (implies, indicating where the inference exceeds the lab result). Veterinary Medicine excerpts more often stop at the finding or use a single cautious modal in a limited frame. Acs2 shows the opposite pole inside Agriculture: after non-significance, residual benefits are still worded with stacked caution (suggests, might, could, potential), which keeps a softened positive reading in play after the statistical claim has failed. Table 6.1 places these wordings next to one another so the difference is visible in the English, not only in the program totals.</w:t>
       </w:r>
     </w:p>
+    <w:p>
+      <w:pPr>
+        <w:spacing w:line="480" w:lineRule="auto"/>
+        <w:ind w:firstLine="0"/>
+        <w:jc w:val="center"/>
+      </w:pPr>
+      <w:r>
+        <w:rPr>
+          <w:b/>
+          <w:sz w:val="22"/>
+        </w:rPr>
+        <w:t>Table 6.1</w:t>
+      </w:r>
+    </w:p>
+    <w:p>
+      <w:pPr>
+        <w:spacing w:line="480" w:lineRule="auto"/>
+        <w:ind w:firstLine="0"/>
+        <w:jc w:val="center"/>
+      </w:pPr>
+      <w:r>
+        <w:rPr>
+          <w:i/>
+          <w:sz w:val="22"/>
+        </w:rPr>
+        <w:t>Program Contrast: Sample Excerpts</w:t>
+      </w:r>
+    </w:p>
     <w:tbl>
       <w:tblPr>
         <w:tblStyle w:val="Table4"/>
@@ -11208,34 +11236,6 @@
         </w:tc>
       </w:tr>
     </w:tbl>
-    <w:p>
-      <w:pPr>
-        <w:spacing w:line="480" w:lineRule="auto"/>
-        <w:ind w:firstLine="0"/>
-        <w:jc w:val="center"/>
-      </w:pPr>
-      <w:r>
-        <w:rPr>
-          <w:i/>
-          <w:sz w:val="22"/>
-        </w:rPr>
-        <w:t>Program Contrast: Sample Excerpts</w:t>
-      </w:r>
-    </w:p>
-    <w:p>
-      <w:pPr>
-        <w:spacing w:line="480" w:lineRule="auto"/>
-        <w:ind w:firstLine="0"/>
-        <w:jc w:val="center"/>
-      </w:pPr>
-      <w:r>
-        <w:rPr>
-          <w:b/>
-          <w:sz w:val="22"/>
-        </w:rPr>
-        <w:t>Table 6.1</w:t>
-      </w:r>
-    </w:p>
     <w:p>
       <w:pPr>
         <w:spacing w:line="480" w:lineRule="auto" w:before="240" w:after="0"/>

</xml_diff>

<commit_message>
Draft_124: full-pass linguistic refocus (RAD I–II + conclusions); counts stay in tables
</commit_message>
<xml_diff>
--- a/thesis/003_ThesisProposal_Draft_124_body.docx
+++ b/thesis/003_ThesisProposal_Draft_124_body.docx
@@ -4518,7 +4518,7 @@
           <w:rFonts w:ascii="Georgia" w:hAnsi="Georgia" w:eastAsia="Georgia"/>
           <w:sz w:val="22"/>
         </w:rPr>
-        <w:t>Across the 60 abstracts, the coding retained 65 hedge tokens, or about 1.08 hedges per abstract. That rate is lower than the 2.04 hedges per abstract Hu and Cao (2011) reported for English-medium applied-linguistics journal abstracts, though the fields and the writers are not the same. The comparison is useful only as a rough external benchmark: it situates this undergraduate life-science sample as leaner in hedge use than that published linguistics baseline, without claiming an equivalent genre or population.</w:t>
+        <w:t>Across the 60 abstracts, retained hedges are few relative to the length of the texts, and the stance work they do is concentrated rather than spread through every results line. The inventory is leaner than the abstract baseline Hu and Cao (2011) reported for English-medium applied-linguistics journals, though the fields and the writers are not the same. That comparison is only a rough external benchmark. It situates this undergraduate life-science sample as restrained in how often caution is marked in English, without claiming an equivalent genre or population.</w:t>
       </w:r>
     </w:p>
     <w:p>
@@ -6058,7 +6058,7 @@
           <w:rFonts w:ascii="Georgia" w:hAnsi="Georgia" w:eastAsia="Georgia"/>
           <w:sz w:val="22"/>
         </w:rPr>
-        <w:t>Lexical hedges account for most of the inventory (42 of 65 tokens). Modal verbs follow with 20 tokens. Adverbial hedges are rare (3 tokens, all potentially, and all in Biology). Clause-level hedges do not appear at all. Within the lexical set, potential is the single most frequent form (19 instances), followed by the suggest family (suggest / suggests / suggesting, 13 instances). Modal use is concentrated in can, could, may, and might, with Agriculture supplying most of the can tokens.</w:t>
+        <w:t>The repertoire is lexical first. Writers more often qualify claims with content words such as potential and the suggest family than with modal verbs, and almost never with adverbial hedges. Clause-level packages do not appear. Modal use, when it occurs, is limited to a small set (can, could, may, might), and Agriculture supplies most of the can tokens. Table 3 holds the counts. The linguistic point is the narrow formal range: a few preferred forms do most of the caution work.</w:t>
       </w:r>
     </w:p>
     <w:p>
@@ -6072,7 +6072,7 @@
           <w:rFonts w:ascii="Georgia" w:hAnsi="Georgia" w:eastAsia="Georgia"/>
           <w:sz w:val="22"/>
         </w:rPr>
-        <w:t>The three programs do not share the same type mix. Agriculture is nearly balanced between modal verbs (13) and lexical hedges (14). Biology is strongly lexical (20 of 28 tokens), with only five modal verbs. Veterinary Medicine’s total is small (10 tokens) and also mainly lexical (8), with only two modal verbs. In short, the formal repertoire is narrow corpus-wide, and the main cross-program difference at this level is how much of that small repertoire is modal rather than lexical, not whether writers draw on a wide set of hedge types.</w:t>
+        <w:t>The three programs do not share the same mix within that narrow range. Agriculture balances modal and lexical caution more evenly. Biology leans heavily on lexical qualification. Veterinary Medicine uses the same lexical preference but with far fewer occasions of either type. The cross-program difference at this level is not access to a wide hedge taxonomy. It is how often, and with which preferred form, writers mark caution at all.</w:t>
       </w:r>
     </w:p>
     <w:p>
@@ -6142,7 +6142,7 @@
           <w:rFonts w:ascii="Georgia" w:hAnsi="Georgia" w:eastAsia="Georgia"/>
           <w:sz w:val="22"/>
         </w:rPr>
-        <w:t>Part II turns from the formal inventory to how much caution the abstracts actually display. The question is comparative: how dense are retained hedges across Agriculture, Veterinary Medicine, and Biology, and what else sits beside those counts on the same ledger. Table 4 reports, for each discipline, abstract and word totals, retained hedges, hedges per 100 words, zero-hedge abstracts, false positives, and unhedged claims.</w:t>
+        <w:t>Part II turns from the formal inventory to how much caution the abstracts actually display in English. The question is comparative across Agriculture, Veterinary Medicine, and Biology: how often retained hedges appear, how often abstracts show none, and what else sits beside those patterns on the same ledger. Table 4 reports the counts. The paragraphs that follow read them as patterns of wording, not as ends in themselves.</w:t>
       </w:r>
     </w:p>
     <w:p>
@@ -7004,7 +7004,7 @@
           <w:rFonts w:ascii="Georgia" w:hAnsi="Georgia" w:eastAsia="Georgia"/>
           <w:sz w:val="22"/>
         </w:rPr>
-        <w:t>On density, Biology and Agriculture sit close together. Biology shows 0.62 hedges per 100 words (28 hedges across 4,509 words). Agriculture shows 0.63 (27 hedges across 4,300 words). Veterinary Medicine sits well below both, at 0.20 (10 hedges across 5,060 words). The corpus as a whole averages 0.47 hedges per 100 words. For practical reading of the table, the Agriculture–Biology gap is negligible. Veterinary Medicine is the low-density corner of the sample.</w:t>
+        <w:t>Biology and Agriculture mark caution with similar frequency overall. Veterinary Medicine marks it far less often. In linguistic terms, Bio and Ag abstracts more often contain at least some epistemic softening of findings or implications, while many VM abstracts stay with direct results wording from start to finish. Table 4 records the densities. The practical reading is that the Agriculture–Biology gap is negligible in how the English behaves, and Veterinary Medicine is the low-caution corner of the sample.</w:t>
       </w:r>
     </w:p>
     <w:p>
@@ -7019,7 +7019,7 @@
           <w:rFonts w:ascii="Georgia" w:hAnsi="Georgia" w:eastAsia="Georgia"/>
           <w:sz w:val="22"/>
         </w:rPr>
-        <w:t>Zero-hedge abstracts make that contrast sharper. Of the 60 abstracts, 25 contain no retained hedge token. Veterinary Medicine accounts for 12 of those 25 (12 of 20 VM abstracts). Agriculture accounts for 8 (8 of 20), and Biology for 5 (5 of 20). The overrepresentation of Veterinary Medicine in the zero-hedge set is the main structural reason its density stays low: more than half of the VM abstracts contribute nothing to the hedge count, while Biology and Agriculture more often contribute at least one token.</w:t>
+        <w:t>Abstracts with no retained hedge make that contrast sharper. More than half of the Veterinary Medicine abstracts never open an epistemic softener under the coding rules, while Biology and Agriculture more often include at least one. The VM pattern is therefore not only “fewer tokens per text.” It is a higher share of abstracts whose English never leaves the unsoftened reporting of results.</w:t>
       </w:r>
     </w:p>
     <w:p>
@@ -7586,7 +7586,7 @@
           <w:rFonts w:ascii="Georgia" w:hAnsi="Georgia" w:eastAsia="Georgia"/>
           <w:sz w:val="22"/>
         </w:rPr>
-        <w:t>A limited count of assertive reporting forms in the 25 zero-hedge abstracts found recurring items such as showed, revealed, observed, and highest (79 tokens in total, about 3.2 per abstract). These are reporting verbs and a superlative, not a closed booster checklist. The same count was not run on the 35 abstracts that contain at least one hedge, so the figure describes the zero-hedge subset only. It shows how those abstracts often report findings in direct, unqualified wording. It does not support a comparison with hedged abstracts.</w:t>
+        <w:t>In the zero-hedge abstracts, assertive reporting forms recur: showed, revealed, observed, and highest among them. These are reporting verbs and a superlative, not a closed booster checklist. They show how those abstracts often deliver findings in direct, unqualified wording. The same count was not run on abstracts that already contain hedges, so it describes the zero-hedge subset only and supports no comparison with hedged abstracts.</w:t>
       </w:r>
     </w:p>
     <w:p>
@@ -7601,7 +7601,7 @@
           <w:rFonts w:ascii="Georgia" w:hAnsi="Georgia" w:eastAsia="Georgia"/>
           <w:sz w:val="22"/>
         </w:rPr>
-        <w:t>Per-abstract counts are skewed, especially in Agriculture. Agriculture averages 1.35 hedges per abstract (median 1, range 0–8). Biology averages 1.40 (median 1, range 0–5). Veterinary Medicine averages 0.50 (median 0, range 0–3). Agriculture’s high standard deviation (1.87) is driven largely by Acs2, which alone carries 8 hedges. When Acs2 is set aside as a sensitivity check, Agriculture’s density falls to 0.46 hedges per 100 words and no longer sits above Biology. Any simple ranking that places Agriculture above Biology on density is therefore partly an Acs2 effect.</w:t>
+        <w:t>Caution is unevenly distributed across individual abstracts, especially in Agriculture. Most Ag texts show little or moderate softening, while Acs2 alone stacks several hedges after a non-significant result. When that one abstract is set aside, Agriculture no longer sits above Biology in how often caution appears. Any simple ranking that treats Agriculture as the most cautious program is therefore partly the effect of one densely hedged text rather than a stable program style.</w:t>
       </w:r>
     </w:p>
     <w:p>
@@ -7615,7 +7615,7 @@
           <w:rFonts w:ascii="Georgia" w:hAnsi="Georgia" w:eastAsia="Georgia"/>
           <w:sz w:val="22"/>
         </w:rPr>
-        <w:t>Two further cautions apply to reading the discipline means. Abstracts within a program may share advisers, so the observations are not fully independent, and within-discipline spread remains larger than the gaps between means. Removing all 19 instances of potential leaves 46 hedges in the corpus, and Veterinary Medicine’s share of zero-hedge abstracts rises further. Low hedge density is widely reported in undergraduate and L2 academic writing (Hyland &amp; Milton, 1997; Qiu et al., 2024). In this PSAU sample the sharpest descriptive contrast is between Biology and Veterinary Medicine. It is a local pattern in ratified English abstracts. Supervised texts may reflect program tolerance for soft claims as much as individual rhetorical choice.</w:t>
+        <w:t>Two further cautions apply. Abstracts within a program may share advisers, so patterns may reflect supervision as much as individual choice, and spread within each program remains large. If potential is set aside, the remaining inventory shrinks and Veterinary Medicine’s share of unsoftened abstracts rises further. Low rates of hedging are widely reported in undergraduate and L2 academic writing (Hyland &amp; Milton, 1997; Qiu et al., 2024). In this PSAU sample the sharpest contrast in how English marks caution is between Biology and Veterinary Medicine. It is a local pattern in ratified abstracts. Supervised texts may reflect program tolerance for soft claims as much as individual rhetorical choice.</w:t>
       </w:r>
     </w:p>
     <w:p>
@@ -7630,7 +7630,7 @@
           <w:rFonts w:ascii="Georgia" w:hAnsi="Georgia" w:eastAsia="Georgia"/>
           <w:sz w:val="22"/>
         </w:rPr>
-        <w:t>The frequency pattern only partly matches prior cross-disciplinary work. Afshar et al. (2014) found agriculture using the fewest hedges among expert research articles. Here Agriculture is level with Biology in the full sample and ranks first only because of Acs2. Without that abstract it falls below Biology, which sits closer to Afshar et al.’s direction. Expert research articles and undergraduate abstracts are different genres, so the comparison stays loose. What the present table can support is a local ranking under one institutional coding scheme, not a general claim about agricultural writing worldwide.</w:t>
+        <w:t>The pattern only partly matches prior cross-disciplinary work. Afshar et al. (2014) found agriculture using the fewest hedges among expert research articles. Here Agriculture is level with Biology in the full sample and looks more cautious only because of Acs2. Without that abstract it falls below Biology, which sits closer to Afshar et al.’s direction. Expert research articles and undergraduate abstracts are different genres, so the comparison stays loose. What the present table can support is a local reading of how three programs at one institution word caution, not a general claim about agricultural writing worldwide.</w:t>
       </w:r>
     </w:p>
     <w:p>
@@ -7645,7 +7645,7 @@
           <w:rFonts w:ascii="Georgia" w:hAnsi="Georgia" w:eastAsia="Georgia"/>
           <w:sz w:val="22"/>
         </w:rPr>
-        <w:t>Veterinary Medicine’s low density needs a careful reading. Many VM abstracts in this corpus report clinical findings from animal studies, including drug-efficacy trials, disease detection, and hematological profiling. Binary or presence-style results are common in that set, but they do not fully explain the gap: Biology abstracts with binary results still show more epistemic softening than VM abstracts with a similar results style. The low rate is better treated as a VM pattern in this institutional corpus. It is consistent with departmental or supervisory practice, with outcome mix, or with both. It should not be read as a general rule that binary evidence needs no hedge under Salager-Meyer’s (1994) claim-responsibility account.</w:t>
+        <w:t>Veterinary Medicine’s thinner caution needs a careful reading. Many VM abstracts report clinical findings from animal studies, including drug-efficacy trials, disease detection, and hematological profiling. Binary or presence-style results are common in that set, but they do not fully explain the wording gap: Biology abstracts with similar result styles still show more epistemic softening of implications. The pattern is better treated as how VM abstracts in this institutional corpus tend to word results, consistent with departmental or supervisory practice, with outcome mix, or with both. It should not be read as a general rule that binary evidence needs no hedge under Salager-Meyer’s (1994) claim-responsibility account.</w:t>
       </w:r>
     </w:p>
     <w:p>
@@ -7660,7 +7660,7 @@
           <w:rFonts w:ascii="Georgia" w:hAnsi="Georgia" w:eastAsia="Georgia"/>
           <w:sz w:val="22"/>
         </w:rPr>
-        <w:t>False positives also differ by discipline, and the direction is not the same as for retained hedges. Biology produced 34 false positives, compared with 17 in Agriculture and 14 in Veterinary Medicine. The Biology excess is tied in part to more instances of potential in aim statements and indicated by as an evidential pointer: forms that resemble hedges in surface shape but do not mark uncertainty about a claim under the coding rules. A higher false-positive count therefore means more hedge-like vocabulary in non-hedging roles, not more hedging. Read with Table 4, Biology is both relatively dense in retained hedges and rich in rejected lookalikes, while Veterinary Medicine is low on both retained hedges and false positives.</w:t>
+        <w:t>False positives also differ by program, and not in the same direction as retained hedges. Biology yields more rejected lookalikes, often potential in aim statements and indicated by as an evidential pointer: forms that resemble hedges in surface shape but do not mark uncertainty about a claim under the coding rules. A higher false-positive count therefore means more hedge-like vocabulary in non-hedging roles, not more hedging. Read with Table 4, Biology both softens claims more often when the token is retained and uses more lookalike wording that the scheme rejects, while Veterinary Medicine is low on both retained softeners and rejected lookalikes.</w:t>
       </w:r>
     </w:p>
     <w:p>
@@ -11438,9 +11438,10 @@
       </w:pPr>
       <w:r>
         <w:rPr>
-          <w:rtl w:val="0"/>
-        </w:rPr>
-        <w:t xml:space="preserve">Disciplinary difference exists, but it is thinner than a strong "three cultures" story would predict. Veterinary Medicine is the clearest low-hedge corner of the sample. Agriculture and Biology are less distinct from each other once a single high-hedge Agriculture abstract is taken seriously as an outlier rather than as proof of a Null/NS style. The deeper point is institutional as much as linguistic. These texts are supervised products. What looks like a writer’s caution profile may also be a program’s tolerance for soft claims in a high-stakes summary.</w:t>
+          <w:rFonts w:ascii="Georgia" w:hAnsi="Georgia" w:eastAsia="Georgia"/>
+          <w:sz w:val="22"/>
+        </w:rPr>
+        <w:t>Disciplinary difference exists, but it is thinner than a strong “three cultures” story would predict. Veterinary Medicine is the clearest low-caution corner of the sample: its abstracts more often leave findings and implications unsoftened. Agriculture and Biology are less distinct from each other once Acs2 is read as one densely hedged text rather than as proof of a whole-program style. The deeper point is institutional as much as linguistic. These texts are supervised products. What looks like a writer’s caution profile may also be a program’s tolerance for soft claims in a high-stakes summary.</w:t>
       </w:r>
     </w:p>
     <w:p>

</xml_diff>

<commit_message>
Draft_124: place tables immediately after introducing paragraphs (Parts III–IV)
</commit_message>
<xml_diff>
--- a/thesis/003_ThesisProposal_Draft_124_body.docx
+++ b/thesis/003_ThesisProposal_Draft_124_body.docx
@@ -8167,21 +8167,6 @@
     </w:p>
     <w:p>
       <w:pPr>
-        <w:spacing w:after="0" w:before="0" w:line="480" w:lineRule="auto"/>
-        <w:ind w:firstLine="720"/>
-        <w:jc w:val="both"/>
-        <w:rPr/>
-      </w:pPr>
-      <w:r>
-        <w:rPr>
-          <w:rFonts w:ascii="Georgia" w:hAnsi="Georgia" w:eastAsia="Georgia"/>
-          <w:sz w:val="22"/>
-        </w:rPr>
-        <w:t>Taken together, the English of these abstracts adjusts the epistemic weight of findings and implications when hedges are retained. It does not show retained hedges doing interpersonal softening of those claims. The stance repertoire that survives Step 2 is functionally narrow and centered on the proposition.</w:t>
-      </w:r>
-    </w:p>
-    <w:p>
-      <w:pPr>
         <w:spacing w:line="480" w:lineRule="auto" w:before="240" w:after="0"/>
         <w:ind w:firstLine="0"/>
         <w:jc w:val="left"/>
@@ -9522,6 +9507,21 @@
     </w:tbl>
     <w:p>
       <w:pPr>
+        <w:spacing w:after="0" w:before="0" w:line="480" w:lineRule="auto"/>
+        <w:ind w:firstLine="720"/>
+        <w:jc w:val="both"/>
+        <w:rPr/>
+      </w:pPr>
+      <w:r>
+        <w:rPr>
+          <w:rFonts w:ascii="Georgia" w:hAnsi="Georgia" w:eastAsia="Georgia"/>
+          <w:sz w:val="22"/>
+        </w:rPr>
+        <w:t>Taken together, the English of these abstracts adjusts the epistemic weight of findings and implications when hedges are retained. It does not show retained hedges doing interpersonal softening of those claims. The stance repertoire that survives Step 2 is functionally narrow and centered on the proposition.</w:t>
+      </w:r>
+    </w:p>
+    <w:p>
+      <w:pPr>
         <w:keepNext w:val="1"/>
         <w:spacing w:after="120" w:before="240" w:line="480" w:lineRule="auto"/>
         <w:ind w:firstLine="0"/>
@@ -9559,6 +9559,36 @@
           <w:sz w:val="22"/>
         </w:rPr>
         <w:t>Part IV asks what the density and function findings mean once outcome type and program wording are read together. The discussion draws on Salager-Meyer’s (1994) claim-responsibility framework and Hyland’s (2005) stance model. Table 6 classifies how each abstract reports its main results. Table 6.1 samples how the programs word caution in concrete excerpts.</w:t>
+      </w:r>
+    </w:p>
+    <w:p>
+      <w:pPr>
+        <w:spacing w:line="480" w:lineRule="auto" w:before="240" w:after="0"/>
+        <w:ind w:firstLine="0"/>
+        <w:jc w:val="left"/>
+      </w:pPr>
+      <w:r>
+        <w:rPr>
+          <w:rFonts w:ascii="Georgia" w:hAnsi="Georgia" w:eastAsia="Georgia"/>
+          <w:b/>
+          <w:sz w:val="22"/>
+        </w:rPr>
+        <w:t>Outcome Type and the Limits of a Design Explanation</w:t>
+      </w:r>
+    </w:p>
+    <w:p>
+      <w:pPr>
+        <w:spacing w:after="0" w:before="0" w:line="480" w:lineRule="auto"/>
+        <w:ind w:firstLine="720"/>
+        <w:jc w:val="both"/>
+        <w:rPr/>
+      </w:pPr>
+      <w:r>
+        <w:rPr>
+          <w:rFonts w:ascii="Georgia" w:hAnsi="Georgia" w:eastAsia="Georgia"/>
+          <w:sz w:val="22"/>
+        </w:rPr>
+        <w:t>Outcome type classifies how each abstract reports its main results from the abstract’s own results language: binary presence/absence findings, continuous measures, mixed formats, null or non-significant results, and residual forms. Table 6 shows that outcome mix alone does not explain the program contrast. Veterinary Medicine is not simply a binary-only set, and Biology is not simply continuous-only. The same broad result styles appear in more than one program, so the difference in caution is not reducible to “VM only reports yes/no findings.”</w:t>
       </w:r>
     </w:p>
     <w:p>
@@ -10442,36 +10472,6 @@
         </w:tc>
       </w:tr>
     </w:tbl>
-    <w:p>
-      <w:pPr>
-        <w:spacing w:line="480" w:lineRule="auto" w:before="240" w:after="0"/>
-        <w:ind w:firstLine="0"/>
-        <w:jc w:val="left"/>
-      </w:pPr>
-      <w:r>
-        <w:rPr>
-          <w:rFonts w:ascii="Georgia" w:hAnsi="Georgia" w:eastAsia="Georgia"/>
-          <w:b/>
-          <w:sz w:val="22"/>
-        </w:rPr>
-        <w:t>Outcome Type and the Limits of a Design Explanation</w:t>
-      </w:r>
-    </w:p>
-    <w:p>
-      <w:pPr>
-        <w:spacing w:after="0" w:before="0" w:line="480" w:lineRule="auto"/>
-        <w:ind w:firstLine="720"/>
-        <w:jc w:val="both"/>
-        <w:rPr/>
-      </w:pPr>
-      <w:r>
-        <w:rPr>
-          <w:rFonts w:ascii="Georgia" w:hAnsi="Georgia" w:eastAsia="Georgia"/>
-          <w:sz w:val="22"/>
-        </w:rPr>
-        <w:t>Outcome type classifies how each abstract reports its main results from the abstract’s own results language: binary presence/absence findings, continuous measures, mixed formats, null or non-significant results, and residual forms. Table 6 shows that outcome mix alone does not explain the program contrast. Veterinary Medicine is not simply a binary-only set, and Biology is not simply continuous-only. The same broad result styles appear in more than one program, so the difference in caution is not reducible to “VM only reports yes/no findings.”</w:t>
-      </w:r>
-    </w:p>
     <w:p>
       <w:pPr>
         <w:spacing w:line="480" w:lineRule="auto" w:before="240" w:after="0"/>

</xml_diff>

<commit_message>
Draft_124: move Figure 1 up in Research Framework after first paragraph
</commit_message>
<xml_diff>
--- a/thesis/003_ThesisProposal_Draft_124_body.docx
+++ b/thesis/003_ThesisProposal_Draft_124_body.docx
@@ -1304,52 +1304,10 @@
       </w:pPr>
       <w:r>
         <w:rPr>
-          <w:rtl w:val="0"/>
-        </w:rPr>
-        <w:t>This study is grounded in a coding scheme adapted from Hyland’s (1998) classification of hedging forms. The scheme is used here as an English Language Studies instrument for describing how stance is worded in L2 academic English, not only as a tally of tokens by program. Following the definition adopted in this study, a hedge is a device that changes the writer’s stance toward a proposition. Two forms of that change are coded. Epistemic caution is reduced commitment to the truth of a knowledge claim. Politeness/deference is a change in the writer’s relationship to readers or prior work with respect to the same claim. Hyland (1998) supplies the grammatical types coded in the corpus (lexical hedges, modal verbs, adverbial hedges, and clause-level hedges) and the starting point for reading retained hedges in those two forms. False positives are a residual record of candidates that fail the claim condition or both removal checks. They are not a function label. The scheme is adapted for this corpus rather than treated as a fixed published taxonomy.</w:t>
-      </w:r>
-    </w:p>
-    <w:p>
-      <w:pPr>
-        <w:spacing w:after="0" w:before="0" w:line="480" w:lineRule="auto"/>
-        <w:ind w:firstLine="720"/>
-        <w:jc w:val="both"/>
-        <w:rPr/>
-      </w:pPr>
-      <w:r>
-        <w:rPr>
-          <w:rtl w:val="0"/>
-        </w:rPr>
-        <w:t>Hyland (1998) is the type instrument and the broad start for epistemic caution and politeness/deference. Crompton (1997) supplies the boundary rule for epistemic caution alone: his restatement test operationalizes the Working Test for epistemic caution at Step 2. The study does not adopt Crompton’s full taxonomy. Salager-Meyer (1994) is an interpretive lens in Part IV. Her claim-responsibility account helps read density differences across programs. Hyland (2005) is a second interpretive lens. The stance model helps read what fewer hedges mean where results turn into implications. Neither interpretive lens is an operational coding criterion.</w:t>
-      </w:r>
-    </w:p>
-    <w:p>
-      <w:pPr>
-        <w:spacing w:after="0" w:before="0" w:line="480" w:lineRule="auto"/>
-        <w:ind w:firstLine="720"/>
-        <w:jc w:val="both"/>
-        <w:rPr/>
-      </w:pPr>
-      <w:r>
-        <w:rPr>
-          <w:rFonts w:ascii="Cardo" w:cs="Cardo" w:eastAsia="Cardo" w:hAnsi="Cardo"/>
-          <w:rtl w:val="0"/>
-        </w:rPr>
-        <w:t>Coding followed the decision rules in Appendix A. After a holistic reading of each abstract, Step 1 marked all possible hedge candidates without counting retained hedges. Step 2 applied a claim condition and two removal checks. Because a hedge changes the writer’s stance toward a proposition, the device must attach to a claim: a statement about data, the world, or prior work that evidence could show to be wrong. Aims, directives, and routine procedures are excluded by kind as a consequence of that definition, not as a coding convenience. Working Test: remove the device. If the claim’s epistemic weight (the writer’s commitment to its truth) rises → epistemic caution. Reader Test: remove the device. If epistemic weight stays the same but the claim reaches the reader more bluntly or the writer takes sole ownership against prior work → politeness/deference. Neither check met → false positive. Retention and function assignment are the same operation by design. A token qualifies as a hedge by passing at least one test, and which test it passes is its function. epistemic caution and P may be assigned together when a token both reduces commitment to the claim’s truth and softens how the claim meets the reader or prior work. In that case the Working Test still holds, and P is recorded as a concurrent interpersonal reading rather than as a second independent pass of the Reader Test. The Reader Test alone is reserved for pure P, where commitment does not rise. Step 3 assigned grammatical type only to retained epistemic caution and P tokens. Reason codes (false positive, false positive, false positive, false positive) label residual rejects. Among retained hedges, the research questions on function ask how tokens split across epistemic caution and P under this scope, not what functions hedges might serve outside it.</w:t>
-      </w:r>
-    </w:p>
-    <w:p>
-      <w:pPr>
-        <w:spacing w:after="0" w:before="0" w:line="480" w:lineRule="auto"/>
-        <w:ind w:firstLine="720"/>
-        <w:jc w:val="both"/>
-        <w:rPr/>
-      </w:pPr>
-      <w:r>
-        <w:rPr>
-          <w:rtl w:val="0"/>
-        </w:rPr>
-        <w:t xml:space="preserve">The conceptual framework is presented in Figure 1. The grouping variable is discipline (Agriculture, Veterinary Medicine, and Biology). The outcome measures are hedge type frequency, distribution, and function. The analytical path moves from Steps 1-3 through frequency analysis and cross-disciplinary comparison to functional and interpretive reading. Two boundary conditions limit generalization. The texts are produced by developing researchers whose work may not yet reflect discipline-specific norms. The institutional context at PSAU includes L2 English use, but language proficiency is not measured as a variable in this design.</w:t>
+          <w:rFonts w:ascii="Georgia" w:hAnsi="Georgia" w:eastAsia="Georgia"/>
+          <w:sz w:val="22"/>
+        </w:rPr>
+        <w:t>This study is grounded in a coding scheme adapted from Hyland’s (1998) classification of hedging forms, with function coded through an epistemic Working Test and a Reader Test under a claim condition. Figure 1 presents the conceptual framework. The grouping variable is discipline (Agriculture, Veterinary Medicine, and Biology). The dependent measures are hedge frequency, formal type, and function. The figure also marks the boundary between retained epistemic caution and false positives excluded under the decision rules.</w:t>
       </w:r>
     </w:p>
     <w:p>
@@ -1438,6 +1396,35 @@
         <w:rPr>
           <w:rtl w:val="0"/>
         </w:rPr>
+      </w:r>
+    </w:p>
+    <w:p>
+      <w:pPr>
+        <w:spacing w:after="0" w:before="0" w:line="480" w:lineRule="auto"/>
+        <w:ind w:firstLine="720"/>
+        <w:jc w:val="both"/>
+        <w:rPr/>
+      </w:pPr>
+      <w:r>
+        <w:rPr>
+          <w:rtl w:val="0"/>
+        </w:rPr>
+        <w:t>Hyland (1998) is the type instrument and the broad start for epistemic caution and politeness/deference. Crompton (1997) supplies the boundary rule for epistemic caution alone: his restatement test operationalizes the Working Test for epistemic caution at Step 2. The study does not adopt Crompton’s full taxonomy. Salager-Meyer (1994) is an interpretive lens in Part IV. Her claim-responsibility account helps read density differences across programs. Hyland (2005) is a second interpretive lens. The stance model helps read what fewer hedges mean where results turn into implications. Neither interpretive lens is an operational coding criterion.</w:t>
+      </w:r>
+    </w:p>
+    <w:p>
+      <w:pPr>
+        <w:spacing w:after="0" w:before="0" w:line="480" w:lineRule="auto"/>
+        <w:ind w:firstLine="720"/>
+        <w:jc w:val="both"/>
+        <w:rPr/>
+      </w:pPr>
+      <w:r>
+        <w:rPr>
+          <w:rFonts w:ascii="Cardo" w:cs="Cardo" w:eastAsia="Cardo" w:hAnsi="Cardo"/>
+          <w:rtl w:val="0"/>
+        </w:rPr>
+        <w:t>Coding followed the decision rules in Appendix A. After a holistic reading of each abstract, Step 1 marked all possible hedge candidates without counting retained hedges. Step 2 applied a claim condition and two removal checks. Because a hedge changes the writer’s stance toward a proposition, the device must attach to a claim: a statement about data, the world, or prior work that evidence could show to be wrong. Aims, directives, and routine procedures are excluded by kind as a consequence of that definition, not as a coding convenience. Working Test: remove the device. If the claim’s epistemic weight (the writer’s commitment to its truth) rises → epistemic caution. Reader Test: remove the device. If epistemic weight stays the same but the claim reaches the reader more bluntly or the writer takes sole ownership against prior work → politeness/deference. Neither check met → false positive. Retention and function assignment are the same operation by design. A token qualifies as a hedge by passing at least one test, and which test it passes is its function. epistemic caution and P may be assigned together when a token both reduces commitment to the claim’s truth and softens how the claim meets the reader or prior work. In that case the Working Test still holds, and P is recorded as a concurrent interpersonal reading rather than as a second independent pass of the Reader Test. The Reader Test alone is reserved for pure P, where commitment does not rise. Step 3 assigned grammatical type only to retained epistemic caution and P tokens. Reason codes (false positive, false positive, false positive, false positive) label residual rejects. Among retained hedges, the research questions on function ask how tokens split across epistemic caution and P under this scope, not what functions hedges might serve outside it.</w:t>
       </w:r>
     </w:p>
     <w:p>

</xml_diff>

<commit_message>
Draft_124: fold VM binary/outcome reading into Part IV; Part II stays on Table 4 wording pattern
</commit_message>
<xml_diff>
--- a/thesis/003_ThesisProposal_Draft_124_body.docx
+++ b/thesis/003_ThesisProposal_Draft_124_body.docx
@@ -7632,7 +7632,7 @@
           <w:rFonts w:ascii="Georgia" w:hAnsi="Georgia" w:eastAsia="Georgia"/>
           <w:sz w:val="22"/>
         </w:rPr>
-        <w:t>Veterinary Medicine’s thinner caution needs a careful reading. Many VM abstracts report clinical findings from animal studies, including drug-efficacy trials, disease detection, and hematological profiling. Binary or presence-style results are common in that set, but they do not fully explain the wording gap: Biology abstracts with similar result styles still show more epistemic softening of implications. The pattern is better treated as how VM abstracts in this institutional corpus tend to word results, consistent with departmental or supervisory practice, with outcome mix, or with both. It should not be read as a general rule that binary evidence needs no hedge under Salager-Meyer’s (1994) claim-responsibility account.</w:t>
+        <w:t>Veterinary Medicine’s thinner caution is a local wording pattern on the Table 4 ledger. Many VM abstracts stay with direct results wording and never open an implication frame that would invite softening. That pattern is consistent with departmental or supervisory practice as much as with individual choice. It is the low-caution corner of this institutional sample, not yet a claim about binary evidence as such.</w:t>
       </w:r>
     </w:p>
     <w:p>
@@ -9575,7 +9575,7 @@
           <w:rFonts w:ascii="Georgia" w:hAnsi="Georgia" w:eastAsia="Georgia"/>
           <w:sz w:val="22"/>
         </w:rPr>
-        <w:t>Outcome type classifies how each abstract reports its main results from the abstract’s own results language: binary presence/absence findings, continuous measures, mixed formats, null or non-significant results, and residual forms. Table 6 shows that outcome mix alone does not explain the program contrast. Veterinary Medicine is not simply a binary-only set, and Biology is not simply continuous-only. The same broad result styles appear in more than one program, so the difference in caution is not reducible to “VM only reports yes/no findings.”</w:t>
+        <w:t>Outcome type classifies how each abstract reports its main results from the abstract’s own results language: binary presence/absence findings, continuous measures, mixed formats, null or non-significant results, and residual forms. Table 6 shows that outcome mix alone does not explain the program contrast. Veterinary Medicine is not simply a binary-only set, and Biology is not simply continuous-only. Many VM abstracts do report clinical findings from animal studies (drug-efficacy trials, disease detection, hematological profiling), and binary or presence-style results are common in that set, but they do not fully explain the wording gap. Biology abstracts with similar result styles still show more epistemic softening of implications. The thinner caution in VM is therefore consistent with departmental or supervisory practice, with outcome mix, or with both. It should not be read as a general rule that binary evidence needs no hedge under Salager-Meyer’s (1994) claim-responsibility account.</w:t>
       </w:r>
     </w:p>
     <w:p>

</xml_diff>

<commit_message>
Draft_124: fold VM wording into Part IV; remove standalone Part II VM paragraph
</commit_message>
<xml_diff>
--- a/thesis/003_ThesisProposal_Draft_124_body.docx
+++ b/thesis/003_ThesisProposal_Draft_124_body.docx
@@ -7632,21 +7632,6 @@
           <w:rFonts w:ascii="Georgia" w:hAnsi="Georgia" w:eastAsia="Georgia"/>
           <w:sz w:val="22"/>
         </w:rPr>
-        <w:t>Veterinary Medicine is the low-caution corner of this sample. Many of its abstracts report findings in direct English and rarely open the kind of implication sentence where writers elsewhere add potential, suggest, or a modal softener. On the Table 4 counts, that shows up as fewer retained hedges and more abstracts with none at all. Whether that pattern comes mainly from supervision, from local reporting habits, or from both cannot be settled from the abstracts alone.</w:t>
-      </w:r>
-    </w:p>
-    <w:p>
-      <w:pPr>
-        <w:spacing w:after="0" w:before="0" w:line="480" w:lineRule="auto"/>
-        <w:ind w:firstLine="720"/>
-        <w:jc w:val="both"/>
-        <w:rPr/>
-      </w:pPr>
-      <w:r>
-        <w:rPr>
-          <w:rFonts w:ascii="Georgia" w:hAnsi="Georgia" w:eastAsia="Georgia"/>
-          <w:sz w:val="22"/>
-        </w:rPr>
         <w:t>False positives also differ by program, and not in the same direction as retained hedges. Biology yields more rejected lookalikes, often potential in aim statements and indicated by as an evidential pointer: forms that resemble hedges in surface shape but do not mark uncertainty about a claim under the coding rules. A higher false-positive count therefore means more hedge-like vocabulary in non-hedging roles, not more hedging. Read with Table 4, Biology both softens claims more often when the token is retained and uses more lookalike wording that the scheme rejects, while Veterinary Medicine is low on both retained softeners and rejected lookalikes.</w:t>
       </w:r>
     </w:p>
@@ -10486,7 +10471,7 @@
           <w:rFonts w:ascii="Georgia" w:hAnsi="Georgia" w:eastAsia="Georgia"/>
           <w:sz w:val="22"/>
         </w:rPr>
-        <w:t>Where hedges do appear, they more often mark the move from result to implication than the bare reporting of a measured value. That tendency is easiest to see in Agriculture, where implication sentences frequently carry suggest, could, or potential. It is hardest to see in Veterinary Medicine, where many abstracts stay with direct results wording and never open an implication frame that would invite softening. Under Salager-Meyer’s (1994) account, hedging an implication takes partial distance from a conclusion that goes beyond the measured finding. Thinner softening in the VM subset is therefore readable as less explicit negotiation of that responsibility in the ratified English of the abstract. It is not readable as more overclaiming: the unhedged-claim inventory is not higher for VM than for Biology (Table 4). Hyland’s (2005) stance model fits the same linguistic picture: fewer hedges mean less explicit softening of authorial commitment in the text that remains.</w:t>
+        <w:t>Where hedges do appear, they more often mark the move from result to implication than the bare reporting of a measured value. That tendency is easiest to see in Agriculture, where implication sentences frequently carry suggest, could, or potential. It is hardest to see in Veterinary Medicine. Many VM abstracts report findings in direct English and rarely open the kind of implication sentence where writers elsewhere add those softeners. On the Table 4 ledger that shows up as fewer retained hedges and more abstracts with none at all. Under Salager-Meyer’s (1994) account, hedging an implication takes partial distance from a conclusion that goes beyond the measured finding. Thinner softening in the VM subset is therefore readable as less explicit negotiation of that responsibility in the ratified English of the abstract. It is not readable as more overclaiming: the unhedged-claim inventory is not higher for VM than for Biology (Table 4). Hyland’s (2005) stance model fits the same linguistic picture: fewer hedges mean less explicit softening of authorial commitment in the text that remains. Whether the pattern comes mainly from supervision, from local reporting habits, or from both cannot be settled from the abstracts alone.</w:t>
       </w:r>
     </w:p>
     <w:p>

</xml_diff>

<commit_message>
Draft_124: replace RAD Step 2 jargon with claim condition / removal checks
</commit_message>
<xml_diff>
--- a/thesis/003_ThesisProposal_Draft_124_body.docx
+++ b/thesis/003_ThesisProposal_Draft_124_body.docx
@@ -8119,7 +8119,7 @@
           <w:rFonts w:ascii="Georgia" w:hAnsi="Georgia" w:eastAsia="Georgia"/>
           <w:sz w:val="22"/>
         </w:rPr>
-        <w:t>That uniformity is a consequence of the Step 2 rule, not a claim that abstracts never soften directives in any linguistic sense. Only tokens attached to claims that pass the claim condition and at least one removal check enter the retained set. Recommendations and other non-claims are logged as false positives and never receive a politeness/deference label under this scheme. Fifteen recommendation-framed tokens sit in that false-positive pool. A wider definition of interpersonal softening could treat some of them differently. The all–epistemic-caution result fits how scientific English often uses hedges on knowledge claims (Hyland, 1996, 1998; Salager-Meyer, 1994): the devices manage how far a proposition should be trusted.</w:t>
+        <w:t>That uniformity follows from the claim condition and the two removal checks, not from a claim that abstracts never soften directives in any linguistic sense. Only tokens attached to claims that pass the claim condition and at least one removal check enter the retained set. Recommendations and other non-claims are logged as false positives and never receive a politeness/deference label under this scheme. Fifteen recommendation-framed tokens sit in that false-positive pool. A wider definition of interpersonal softening could treat some of them differently. The all–epistemic-caution result fits how scientific English often uses hedges on knowledge claims (Hyland, 1996, 1998; Salager-Meyer, 1994): the devices manage how far a proposition should be trusted.</w:t>
       </w:r>
     </w:p>
     <w:p>
@@ -9489,7 +9489,7 @@
           <w:rFonts w:ascii="Georgia" w:hAnsi="Georgia" w:eastAsia="Georgia"/>
           <w:sz w:val="22"/>
         </w:rPr>
-        <w:t>Taken together, the English of these abstracts adjusts the epistemic weight of findings and implications when hedges are retained. It does not show retained hedges doing interpersonal softening of those claims. The stance repertoire that survives Step 2 is functionally narrow and centered on the proposition.</w:t>
+        <w:t>Taken together, the English of these abstracts adjusts the epistemic weight of findings and implications when hedges are retained. It does not show retained hedges doing interpersonal softening of those claims. The stance repertoire that survives the claim condition and the removal checks is functionally narrow and centered on the proposition.</w:t>
       </w:r>
     </w:p>
     <w:p>

</xml_diff>

<commit_message>
Draft_124: replace ledger with counts
P170 and P204: metaphorical ledger → same counts / Table 4 counts.
</commit_message>
<xml_diff>
--- a/thesis/003_ThesisProposal_Draft_124_body.docx
+++ b/thesis/003_ThesisProposal_Draft_124_body.docx
@@ -6126,10 +6126,10 @@
       </w:pPr>
       <w:r>
         <w:rPr>
-          <w:rFonts w:ascii="Georgia" w:hAnsi="Georgia" w:eastAsia="Georgia"/>
+          <w:rFonts w:ascii="Georgia" w:hAnsi="Georgia" w:cs="Georgia"/>
           <w:sz w:val="22"/>
         </w:rPr>
-        <w:t>Part II turns from the formal inventory to how much caution the abstracts actually display in English. The question is comparative across Agriculture, Veterinary Medicine, and Biology: how often retained hedges appear, how often abstracts show none, and what else sits beside those patterns on the same ledger. Table 4 reports the counts. The paragraphs that follow read them as patterns of wording, not as ends in themselves.</w:t>
+        <w:t>Part II turns from the formal inventory to how much caution the abstracts actually display in English. The question is comparative across Agriculture, Veterinary Medicine, and Biology: how often retained hedges appear, how often abstracts show none, and what else sits beside those patterns in the same counts. Table 4 reports the counts. The paragraphs that follow read them as patterns of wording, not as ends in themselves.</w:t>
       </w:r>
     </w:p>
     <w:p>
@@ -10468,10 +10468,10 @@
       </w:pPr>
       <w:r>
         <w:rPr>
-          <w:rFonts w:ascii="Georgia" w:hAnsi="Georgia" w:eastAsia="Georgia"/>
+          <w:rFonts w:ascii="Georgia" w:hAnsi="Georgia" w:cs="Georgia"/>
           <w:sz w:val="22"/>
         </w:rPr>
-        <w:t>Where hedges do appear, they more often mark the move from result to implication than the bare reporting of a measured value. That tendency is easiest to see in Agriculture, where implication sentences frequently carry suggest, could, or potential. It is hardest to see in Veterinary Medicine. Many VM abstracts report findings in direct English and rarely open the kind of implication sentence where writers elsewhere add those softeners. On the Table 4 ledger that shows up as fewer retained hedges and more abstracts with none at all. Under Salager-Meyer’s (1994) account, hedging an implication takes partial distance from a conclusion that goes beyond the measured finding. Thinner softening in the VM subset is therefore readable as less explicit negotiation of that responsibility in the ratified English of the abstract. It is not readable as more overclaiming: the unhedged-claim inventory is not higher for VM than for Biology (Table 4). Hyland’s (2005) stance model fits the same linguistic picture: fewer hedges mean less explicit softening of authorial commitment in the text that remains. Whether the pattern comes mainly from supervision, from local reporting habits, or from both cannot be settled from the abstracts alone.</w:t>
+        <w:t>Where hedges do appear, they more often mark the move from result to implication than the bare reporting of a measured value. That tendency is easiest to see in Agriculture, where implication sentences frequently carry suggest, could, or potential. It is hardest to see in Veterinary Medicine. Many VM abstracts report findings in direct English and rarely open the kind of implication sentence where writers elsewhere add those softeners. In the Table 4 counts that shows up as fewer retained hedges and more abstracts with none at all. Under Salager-Meyer’s (1994) account, hedging an implication takes partial distance from a conclusion that goes beyond the measured finding. Thinner softening in the VM subset is therefore readable as less explicit negotiation of that responsibility in the ratified English of the abstract. It is not readable as more overclaiming: the unhedged-claim inventory is not higher for VM than for Biology (Table 4). Hyland’s (2005) stance model fits the same linguistic picture: fewer hedges mean less explicit softening of authorial commitment in the text that remains. Whether the pattern comes mainly from supervision, from local reporting habits, or from both cannot be settled from the abstracts alone.</w:t>
       </w:r>
     </w:p>
     <w:p>

</xml_diff>

<commit_message>
Draft_124: ledger/counts → inventory
P170 and P204 use inventory for consistency with formal inventory
and unhedged-claim inventory elsewhere in Part II.
</commit_message>
<xml_diff>
--- a/thesis/003_ThesisProposal_Draft_124_body.docx
+++ b/thesis/003_ThesisProposal_Draft_124_body.docx
@@ -6129,7 +6129,7 @@
           <w:rFonts w:ascii="Georgia" w:hAnsi="Georgia" w:cs="Georgia"/>
           <w:sz w:val="22"/>
         </w:rPr>
-        <w:t>Part II turns from the formal inventory to how much caution the abstracts actually display in English. The question is comparative across Agriculture, Veterinary Medicine, and Biology: how often retained hedges appear, how often abstracts show none, and what else sits beside those patterns in the same counts. Table 4 reports the counts. The paragraphs that follow read them as patterns of wording, not as ends in themselves.</w:t>
+        <w:t>Part II turns from the formal inventory to how much caution the abstracts actually display in English. The question is comparative across Agriculture, Veterinary Medicine, and Biology: how often retained hedges appear, how often abstracts show none, and what else sits beside those patterns in the same inventory. Table 4 reports the counts. The paragraphs that follow read them as patterns of wording, not as ends in themselves.</w:t>
       </w:r>
     </w:p>
     <w:p>
@@ -10471,7 +10471,7 @@
           <w:rFonts w:ascii="Georgia" w:hAnsi="Georgia" w:cs="Georgia"/>
           <w:sz w:val="22"/>
         </w:rPr>
-        <w:t>Where hedges do appear, they more often mark the move from result to implication than the bare reporting of a measured value. That tendency is easiest to see in Agriculture, where implication sentences frequently carry suggest, could, or potential. It is hardest to see in Veterinary Medicine. Many VM abstracts report findings in direct English and rarely open the kind of implication sentence where writers elsewhere add those softeners. In the Table 4 counts that shows up as fewer retained hedges and more abstracts with none at all. Under Salager-Meyer’s (1994) account, hedging an implication takes partial distance from a conclusion that goes beyond the measured finding. Thinner softening in the VM subset is therefore readable as less explicit negotiation of that responsibility in the ratified English of the abstract. It is not readable as more overclaiming: the unhedged-claim inventory is not higher for VM than for Biology (Table 4). Hyland’s (2005) stance model fits the same linguistic picture: fewer hedges mean less explicit softening of authorial commitment in the text that remains. Whether the pattern comes mainly from supervision, from local reporting habits, or from both cannot be settled from the abstracts alone.</w:t>
+        <w:t>Where hedges do appear, they more often mark the move from result to implication than the bare reporting of a measured value. That tendency is easiest to see in Agriculture, where implication sentences frequently carry suggest, could, or potential. It is hardest to see in Veterinary Medicine. Many VM abstracts report findings in direct English and rarely open the kind of implication sentence where writers elsewhere add those softeners. In the Table 4 inventory that shows up as fewer retained hedges and more abstracts with none at all. Under Salager-Meyer’s (1994) account, hedging an implication takes partial distance from a conclusion that goes beyond the measured finding. Thinner softening in the VM subset is therefore readable as less explicit negotiation of that responsibility in the ratified English of the abstract. It is not readable as more overclaiming: the unhedged-claim inventory is not higher for VM than for Biology (Table 4). Hyland’s (2005) stance model fits the same linguistic picture: fewer hedges mean less explicit softening of authorial commitment in the text that remains. Whether the pattern comes mainly from supervision, from local reporting habits, or from both cannot be settled from the abstracts alone.</w:t>
       </w:r>
     </w:p>
     <w:p>

</xml_diff>

<commit_message>
Draft_124: full prose pass (beats, em-dash, incomplete)
Priority: Verb Tense Matrix, no em-dash/semicolon prose, B1-B2.
P120: split Hyland type list without em-dash.
P94: Working/Reader Tests in full sentences; reason codes repaired.
Short beats merged in P39, P46, P48, P72, P165, P173, P185, P219.
Body en-dash compounds normalized. APA citation semicolons kept.
</commit_message>
<xml_diff>
--- a/thesis/003_ThesisProposal_Draft_124_body.docx
+++ b/thesis/003_ThesisProposal_Draft_124_body.docx
@@ -614,10 +614,10 @@
       </w:pPr>
       <w:r>
         <w:rPr>
-          <w:rFonts w:ascii="Georgia" w:hAnsi="Georgia" w:eastAsia="Georgia"/>
+          <w:rFonts w:ascii="Georgia" w:hAnsi="Georgia" w:cs="Georgia"/>
           <w:sz w:val="22"/>
         </w:rPr>
-        <w:t>Halabisaz et al. (2014) focus the comparison on thesis abstracts in applied linguistics. They sampled 300 master’s abstracts written between 2000 and 2013, split between English L1 writers and Iranian L2 writers, and coded hedges according to Crompton’s (1997) taxonomy. English L1 writers used more hedging devices overall. L2 writers used fewer. The authors attribute the difference to rhetorical sensitivity, modality, awareness of audience and purpose, and cultural background. Because the unit of analysis is the thesis abstract, the study sits closer to the present design than full-paper comparisons do. It also shows that L1–L2 differences in hedging can appear even among writers who have completed substantial graduate coursework in a language-related field.</w:t>
+        <w:t>Halabisaz et al. (2014) focus the comparison on thesis abstracts in applied linguistics. They sampled 300 master’s abstracts written between 2000 and 2013, split between English L1 writers and Iranian L2 writers, and coded hedges according to Crompton’s (1997) taxonomy. English L1 writers used more hedging devices overall, and L2 writers used fewer. The authors attribute the difference to rhetorical sensitivity, modality, awareness of audience and purpose, and cultural background. Because the unit of analysis is the thesis abstract, the study sits closer to the present design than full-paper comparisons do. It also shows that L1-L2 differences in hedging can appear even among writers who have completed substantial graduate coursework in a language-related field.</w:t>
       </w:r>
     </w:p>
     <w:p>
@@ -724,10 +724,24 @@
       </w:pPr>
       <w:r>
         <w:rPr>
+          <w:rFonts w:ascii="Georgia" w:hAnsi="Georgia" w:cs="Georgia"/>
+          <w:sz w:val="22"/>
+        </w:rPr>
+        <w:t>Bonyadi, Gholami, and Nasiri (2012) keep the lens on an applied science close to agriculture. They compared hedges in Discussion sections of 60 environmental-sciences research articles: 20 by English research writers, 20 by Iranian writers in English, and 20 by Iranian writers in Farsi, coded with Salager-Meyer’s (1994) taxonomy. English and Iranian English articles did not differ significantly in hedge use, but English and Farsi articles did. The authors link the English-Farsi gap to rhetorical preference in Farsi for less hedged, more categorically validated prose, a pattern that sits at odds with international environmental-science discourse expectations. For the present corpus, the study is a reminder that applied-science hedging norms are international as well as disciplinary, and that L1 background can still shape English research writing in the same field.</w:t>
+      </w:r>
+    </w:p>
+    <w:p>
+      <w:pPr>
+        <w:spacing w:line="480" w:lineRule="auto" w:before="0" w:after="0"/>
+        <w:ind w:firstLine="720"/>
+        <w:jc w:val="both"/>
+      </w:pPr>
+      <w:r>
+        <w:rPr>
           <w:rFonts w:ascii="Georgia" w:hAnsi="Georgia" w:eastAsia="Georgia"/>
           <w:sz w:val="22"/>
         </w:rPr>
-        <w:t>Bonyadi, Gholami, and Nasiri (2012) keep the lens on an applied science close to agriculture. They compared hedges in Discussion sections of 60 environmental-sciences research articles: 20 by English research writers, 20 by Iranian writers in English, and 20 by Iranian writers in Farsi, coded with Salager-Meyer’s (1994) taxonomy. English and Iranian English articles did not differ significantly in hedge use. English and Farsi articles did. The authors link the English–Farsi gap to rhetorical preference in Farsi for less hedged, more categorically validated prose, a pattern that sits at odds with international environmental-science discourse expectations. For the present corpus, the study is a reminder that applied-science hedging norms are international as well as disciplinary, and that L1 background can still shape English research writing in the same field.</w:t>
+        <w:t>Within life sciences proper, Souici and Slougui (2022) examined 31 biology research articles by Algerian authors from five locally published journals. Main verbs were the most prominent hedge category. Within that category, non-factive reporting verbs ranked highest. Writers relied on those verbs to support and frame findings rather than on a wide modal set alone. Hamidi et al. (2025) compared conclusion sections of basic-science and clinical-science papers in the Medical Journal of the Islamic Republic of Iran. Clinical papers used more hedge tokens (330 versus 154), yet an inferential test found no statistically significant difference. Journal standards and cultural factors, the authors argue, shape hedging as much as the basic-versus-clinical split.</w:t>
       </w:r>
     </w:p>
     <w:p>
@@ -738,24 +752,10 @@
       </w:pPr>
       <w:r>
         <w:rPr>
-          <w:rFonts w:ascii="Georgia" w:hAnsi="Georgia" w:eastAsia="Georgia"/>
+          <w:rFonts w:ascii="Georgia" w:hAnsi="Georgia" w:cs="Georgia"/>
           <w:sz w:val="22"/>
         </w:rPr>
-        <w:t>Within life sciences proper, Souici and Slougui (2022) examined 31 biology research articles by Algerian authors from five locally published journals. Main verbs were the most prominent hedge category. Within that category, non-factive reporting verbs ranked highest. Writers relied on those verbs to support and frame findings rather than on a wide modal set alone. Hamidi et al. (2025) compared conclusion sections of basic-science and clinical-science papers in the Medical Journal of the Islamic Republic of Iran. Clinical papers used more hedge tokens (330 versus 154), yet an inferential test found no statistically significant difference. Journal standards and cultural factors, the authors argue, shape hedging as much as the basic-versus-clinical split.</w:t>
-      </w:r>
-    </w:p>
-    <w:p>
-      <w:pPr>
-        <w:spacing w:line="480" w:lineRule="auto" w:before="0" w:after="0"/>
-        <w:ind w:firstLine="720"/>
-        <w:jc w:val="both"/>
-      </w:pPr>
-      <w:r>
-        <w:rPr>
-          <w:rFonts w:ascii="Georgia" w:hAnsi="Georgia" w:eastAsia="Georgia"/>
-          <w:sz w:val="22"/>
-        </w:rPr>
-        <w:t>Salager-Meyer (1994) anchors much of this comparative work in medical English. In research papers and case reports from leading medical journals, hedge frequency and category distribution shifted with rhetorical section. Discussion and Comment sections were the most heavily hedged. Methods and case-report body sections were among the least. Shields, approximators, and compound hedges accounted for the great majority of devices. Introductions favored shields, especially epistemic verbs, as writers carved an early niche for the study. That section pattern matters for how medical writers present results. Directly measured findings often remain categorical. Hedging rises where writers move from measurement to interpretation, generalization, or clinical implication. The same medical discourse can therefore look firm in the results strip and still manage claim responsibility in the interpretive strip.</w:t>
+        <w:t>Salager-Meyer (1994) anchors much of this comparative work in medical English. In research papers and case reports from leading medical journals, hedge frequency and category distribution shifted with rhetorical section. Discussion and Comment sections were the most heavily hedged. Methods and case-report body sections were among the least. Shields, approximators, and compound hedges accounted for the great majority of devices. Introductions favored shields, especially epistemic verbs, as writers carved an early niche for the study. That section pattern matters for how medical writers present results. Directly measured findings often remain categorical, and hedging rises where writers move from measurement to interpretation, generalization, or clinical implication. The same medical discourse can therefore look firm in the results strip and still manage claim responsibility in the interpretive strip.</w:t>
       </w:r>
     </w:p>
     <w:p>
@@ -1056,7 +1056,10 @@
         <w:jc w:val="both"/>
       </w:pPr>
       <w:r>
-        <w:t>Thesis and dissertation abstracts written by developing researchers add a second layer. Wahyuningsih and Sofwan (2014) analyzed hedges in graduate thesis abstracts at Semarang State University across five programs: English, Mathematics, Science, Social, and Education Management. Lexical hedges were coded with Salager-Meyer's (1994) and Hyland's (1998) taxonomies, and non-lexical forms followed Navratilova (2013). English, Social, and Education Management abstracts used more hedges than Mathematics and Science. English led the lexical counts. Agentless passives were the dominant non-lexical form in every program. The authors link higher soft-field density to interpretive claims and lower hard-field density to measurement-based reporting. The study shows that disciplinary contrast appears inside the thesis abstract even when writers share one institution and one L2 medium.</w:t>
+        <w:rPr>
+          <w:rFonts w:ascii="Georgia" w:hAnsi="Georgia" w:cs="Georgia"/>
+        </w:rPr>
+        <w:t>Thesis and dissertation abstracts written by developing researchers add a second layer. Wahyuningsih and Sofwan (2014) analyzed hedges in graduate thesis abstracts at Semarang State University across five programs: English, Mathematics, Science, Social, and Education Management. Lexical hedges were coded with Salager-Meyer's (1994) and Hyland's (1998) taxonomies, and non-lexical forms followed Navratilova (2013). English, Social, and Education Management abstracts used more hedges than Mathematics and Science. English led the lexical counts overall. Agentless passives were the dominant non-lexical form in every program. The authors link higher soft-field density to interpretive claims and lower hard-field density to measurement-based reporting. The study shows that disciplinary contrast appears inside the thesis abstract even when writers share one institution and one L2 medium.</w:t>
       </w:r>
     </w:p>
     <w:p>
@@ -1080,7 +1083,10 @@
         <w:jc w:val="both"/>
       </w:pPr>
       <w:r>
-        <w:t>Mazidah et al. (2022), reviewed under undergraduate writing, found a soft-versus-hard contrast in undergraduate thesis abstracts at Qomaruddin University that aligns with the graduate pattern reported by Wahyuningsih and Sofwan (2014). English-education abstracts used more hedges. Mathematics abstracts used more boosters.</w:t>
+        <w:rPr>
+          <w:rFonts w:ascii="Georgia" w:hAnsi="Georgia" w:cs="Georgia"/>
+        </w:rPr>
+        <w:t>Mazidah et al. (2022), reviewed under undergraduate writing, found a soft-versus-hard contrast in undergraduate thesis abstracts at Qomaruddin University that aligns with the graduate pattern reported by Wahyuningsih and Sofwan (2014). English-education abstracts used more hedges, while mathematics abstracts used more boosters.</w:t>
       </w:r>
     </w:p>
     <w:p>
@@ -1421,10 +1427,9 @@
       </w:pPr>
       <w:r>
         <w:rPr>
-          <w:rFonts w:ascii="Cardo" w:cs="Cardo" w:eastAsia="Cardo" w:hAnsi="Cardo"/>
-          <w:rtl w:val="0"/>
-        </w:rPr>
-        <w:t>Coding followed the decision rules in Appendix A. After a holistic reading of each abstract, Step 1 marked all possible hedge candidates without counting retained hedges. Step 2 applied a claim condition and two removal checks. Because a hedge changes the writer’s stance toward a proposition, the device must attach to a claim: a statement about data, the world, or prior work that evidence could show to be wrong. Aims, directives, and routine procedures are excluded by kind as a consequence of that definition, not as a coding convenience. Working Test: remove the device. If the claim’s epistemic weight (the writer’s commitment to its truth) rises → epistemic caution. Reader Test: remove the device. If epistemic weight stays the same but the claim reaches the reader more bluntly or the writer takes sole ownership against prior work → politeness/deference. Neither check met → false positive. Retention and function assignment are the same operation by design. A token qualifies as a hedge by passing at least one test, and which test it passes is its function. epistemic caution and P may be assigned together when a token both reduces commitment to the claim’s truth and softens how the claim meets the reader or prior work. In that case the Working Test still holds, and P is recorded as a concurrent interpersonal reading rather than as a second independent pass of the Reader Test. The Reader Test alone is reserved for pure P, where commitment does not rise. Step 3 assigned grammatical type only to retained epistemic caution and P tokens. Reason codes (false positive, false positive, false positive, false positive) label residual rejects. Among retained hedges, the research questions on function ask how tokens split across epistemic caution and P under this scope, not what functions hedges might serve outside it.</w:t>
+          <w:rFonts w:ascii="Cardo" w:hAnsi="Cardo" w:cs="Cardo"/>
+        </w:rPr>
+        <w:t>Coding followed the decision rules in Appendix A. After a holistic reading of each abstract, Step 1 marked all possible hedge candidates without counting retained hedges. Step 2 applied a claim condition and two removal checks. Because a hedge changes the writer’s stance toward a proposition, the device must attach to a claim: a statement about data, the world, or prior work that evidence could show to be wrong. Aims, directives, and routine procedures are excluded by kind as a consequence of that definition, not as a coding convenience. Under the Working Test, the device is removed from the claim. If the writer’s commitment to the truth of the claim rises, the token is epistemic caution. Under the Reader Test, the device is removed from the claim. If commitment stays the same but the claim reaches the reader more bluntly, or the writer takes sole ownership against prior work, the token is politeness/deference. If neither check is met, the token is a false positive. Retention and function assignment are the same operation by design. A token qualifies as a hedge by passing at least one test, and which test it passes is its function. Epistemic caution and politeness/deference may be assigned together when a token both reduces commitment to the claim’s truth and softens how the claim meets the reader or prior work. In that case the Working Test still holds, and politeness/deference is recorded as a concurrent interpersonal reading rather than as a second independent pass of the Reader Test. The Reader Test alone is reserved for pure politeness/deference, where commitment does not rise. Step 3 assigned grammatical type only to retained epistemic caution and politeness/deference tokens. Residual rejects are labeled with reason codes such as recommendation, capability, procedure, or general false positive. Among retained hedges, the research questions on function ask how tokens split across epistemic caution and politeness/deference under this scope, not what functions hedges might serve outside it.</w:t>
       </w:r>
     </w:p>
     <w:p>
@@ -1953,17 +1958,9 @@
       </w:pPr>
       <w:r>
         <w:rPr>
-          <w:b w:val="1"/>
-          <w:bCs w:val="1"/>
-          <w:rtl w:val="0"/>
-        </w:rPr>
-        <w:t xml:space="preserve">Hedging</w:t>
-      </w:r>
-      <w:r>
-        <w:rPr>
-          <w:rtl w:val="0"/>
-        </w:rPr>
-        <w:t xml:space="preserve">, conceptually, is the use of a linguistic device that changes the writer’s stance toward a proposition: either the writer’s commitment to the truth of that proposition (Epistemic Caution) or the writer’s relationship to readers or prior work with respect to it (Politeness/Deference). Operationally, this study codes four grammatical types after Hyland (1998)—lexical hedges, modal verbs, adverbial hedges, and clause-level hedges—and retains a token only when Step 2 shows such a stance change on a claim.</w:t>
+          <w:rFonts w:ascii="Georgia" w:hAnsi="Georgia" w:cs="Georgia"/>
+        </w:rPr>
+        <w:t>Hedging, conceptually, is the use of a linguistic device that changes the writer’s stance toward a proposition: either the writer’s commitment to the truth of that proposition (Epistemic Caution) or the writer’s relationship to readers or prior work with respect to it (Politeness/Deference). Operationally, this study codes four grammatical types after Hyland (1998). These are lexical hedges, modal verbs, adverbial hedges, and clause-level hedges. A token is retained only when Step 2 shows such a stance change on a claim.</w:t>
       </w:r>
     </w:p>
     <w:p>
@@ -6042,10 +6039,10 @@
       </w:pPr>
       <w:r>
         <w:rPr>
-          <w:rFonts w:ascii="Georgia" w:hAnsi="Georgia" w:eastAsia="Georgia"/>
+          <w:rFonts w:ascii="Georgia" w:hAnsi="Georgia" w:cs="Georgia"/>
           <w:sz w:val="22"/>
         </w:rPr>
-        <w:t>The repertoire is lexical first. Writers more often qualify claims with content words such as potential and the suggest family than with modal verbs, and almost never with adverbial hedges. Clause-level packages do not appear. Modal use, when it occurs, is limited to a small set (can, could, may, might), and Agriculture supplies most of the can tokens. Table 3 holds the counts. The linguistic point is the narrow formal range: a few preferred forms do most of the caution work.</w:t>
+        <w:t>The repertoire is lexical first. Writers more often qualify claims with content words such as potential and the suggest family than with modal verbs, and almost never with adverbial hedges or clause-level packages. Modal use, when it occurs, is limited to a small set (can, could, may, might), and Agriculture supplies most of the can tokens. Table 3 holds the counts. The linguistic point is the narrow formal range: a few preferred forms do most of the caution work.</w:t>
       </w:r>
     </w:p>
     <w:p>
@@ -6988,10 +6985,10 @@
       </w:pPr>
       <w:r>
         <w:rPr>
-          <w:rFonts w:ascii="Georgia" w:hAnsi="Georgia" w:eastAsia="Georgia"/>
+          <w:rFonts w:ascii="Georgia" w:hAnsi="Georgia" w:cs="Georgia"/>
           <w:sz w:val="22"/>
         </w:rPr>
-        <w:t>Biology and Agriculture mark caution with similar frequency overall. Veterinary Medicine marks it far less often. In linguistic terms, Bio and Ag abstracts more often contain at least some epistemic softening of findings or implications, while many VM abstracts stay with direct results wording from start to finish. Table 4 records the densities. The practical reading is that the Agriculture–Biology gap is negligible in how the English behaves, and Veterinary Medicine is the low-caution corner of the sample.</w:t>
+        <w:t>Biology and Agriculture mark caution with similar frequency overall, while Veterinary Medicine marks it far less often. In linguistic terms, Bio and Ag abstracts more often contain at least some epistemic softening of findings or implications, while many VM abstracts stay with direct results wording from start to finish. Table 4 records the densities. The practical reading is that the gap between Agriculture and Biology is negligible in how the English behaves, and Veterinary Medicine is the low-caution corner of the sample.</w:t>
       </w:r>
     </w:p>
     <w:p>
@@ -7685,10 +7682,10 @@
       </w:pPr>
       <w:r>
         <w:rPr>
-          <w:rFonts w:ascii="Georgia" w:hAnsi="Georgia" w:eastAsia="Georgia"/>
+          <w:rFonts w:ascii="Georgia" w:hAnsi="Georgia" w:cs="Georgia"/>
           <w:sz w:val="22"/>
         </w:rPr>
-        <w:t>Part III asks what retained hedges do when they appear, and how the coding scheme separates them from lookalike forms. Table 5 reports how candidate tokens were classified after the claim condition and the two removal checks. Every retained token was coded as epistemic caution. None was coded as politeness/deference. An equal number of candidates were logged as false positives because they failed the claim condition or both removal checks. On the retained side, the functional profile is uniform: when a token counts as a hedge in this corpus, it softens commitment to a claim about findings or implications, not interpersonal stance toward the reader.</w:t>
+        <w:t>Part III asks what retained hedges do when they appear, and how the coding scheme separates them from lookalike forms. Table 5 reports how candidate tokens were classified after the claim condition and the two removal checks. Every retained token was coded as epistemic caution, and none was coded as politeness/deference. An equal number of candidates were logged as false positives because they failed the claim condition or both removal checks. On the retained side, the functional profile is uniform: when a token counts as a hedge in this corpus, it softens commitment to a claim about findings or implications, not interpersonal stance toward the reader.</w:t>
       </w:r>
     </w:p>
     <w:p>
@@ -8116,10 +8113,10 @@
       </w:pPr>
       <w:r>
         <w:rPr>
-          <w:rFonts w:ascii="Georgia" w:hAnsi="Georgia" w:eastAsia="Georgia"/>
+          <w:rFonts w:ascii="Georgia" w:hAnsi="Georgia" w:cs="Georgia"/>
           <w:sz w:val="22"/>
         </w:rPr>
-        <w:t>That uniformity follows from the claim condition and the two removal checks, not from a claim that abstracts never soften directives in any linguistic sense. Only tokens attached to claims that pass the claim condition and at least one removal check enter the retained set. Recommendations and other non-claims are logged as false positives and never receive a politeness/deference label under this scheme. Fifteen recommendation-framed tokens sit in that false-positive pool. A wider definition of interpersonal softening could treat some of them differently. The all–epistemic-caution result fits how scientific English often uses hedges on knowledge claims (Hyland, 1996, 1998; Salager-Meyer, 1994): the devices manage how far a proposition should be trusted.</w:t>
+        <w:t>That uniformity follows from the claim condition and the two removal checks, not from a claim that abstracts never soften directives in any linguistic sense. Only tokens attached to claims that pass the claim condition and at least one removal check enter the retained set. Recommendations and other non-claims are logged as false positives and never receive a politeness/deference label under this scheme. Fifteen recommendation-framed tokens sit in that false-positive pool. A wider definition of interpersonal softening could treat some of them differently. The all-epistemic-caution result fits how scientific English often uses hedges on knowledge claims (Hyland, 1996, 1998; Salager-Meyer, 1994): the devices manage how far a proposition should be trusted.</w:t>
       </w:r>
     </w:p>
     <w:p>
@@ -11409,10 +11406,10 @@
       </w:pPr>
       <w:r>
         <w:rPr>
-          <w:rFonts w:ascii="Georgia" w:hAnsi="Georgia" w:eastAsia="Georgia"/>
+          <w:rFonts w:ascii="Georgia" w:hAnsi="Georgia" w:cs="Georgia"/>
           <w:sz w:val="22"/>
         </w:rPr>
-        <w:t>Disciplinary difference exists, but it is thinner than a strong “three cultures” story would predict. Veterinary Medicine is the clearest low-caution corner of the sample: its abstracts more often leave findings and implications unsoftened. Agriculture and Biology are less distinct from each other once Acs2 is read as one densely hedged text rather than as proof of a whole-program style. The deeper point is institutional as much as linguistic. These texts are supervised products. What looks like a writer’s caution profile may also be a program’s tolerance for soft claims in a high-stakes summary.</w:t>
+        <w:t>Disciplinary difference exists, but it is thinner than a strong “three cultures” story would predict. Veterinary Medicine is the clearest low-caution corner of the sample: its abstracts more often leave findings and implications unsoftened. Agriculture and Biology are less distinct from each other once Acs2 is read as one densely hedged text rather than as proof of a whole-program style. The deeper point is institutional as much as linguistic. These texts are supervised products, so what looks like a writer’s caution profile may also be a program’s tolerance for soft claims in a high-stakes summary.</w:t>
       </w:r>
     </w:p>
     <w:p>

</xml_diff>

<commit_message>
Draft_124: separate BOTS and Results prose passes
BOTS: merge short beats in P33, P40, P42, P44, P45, P51, P64, P78.
Results: merge short beats in P166, P167, P180.
Priority: Verb Tense Matrix, no em-dash/semicolon prose, B1-B2.
</commit_message>
<xml_diff>
--- a/thesis/003_ThesisProposal_Draft_124_body.docx
+++ b/thesis/003_ThesisProposal_Draft_124_body.docx
@@ -523,9 +523,9 @@
       </w:pPr>
       <w:r>
         <w:rPr>
-          <w:rtl w:val="0"/>
-        </w:rPr>
-        <w:t xml:space="preserve">This study examines undergraduate thesis abstracts from three programs at Pampanga State Agricultural University (PSAU): Agriculture, Veterinary Medicine, and Biology. These fields share an institutional context but differ in how they typically handle evidence. Agricultural research often involves field conditions outside the researcher’s control. Biological studies frequently take place under controlled laboratory conditions. Veterinary medicine manages clinical variables tied to individual patient outcomes. The boundaries are not absolute. Agricultural work can be lab-based and biology can be field-based, but the different epistemic orientations may still shape hedging. If disciplinary norms appear at the undergraduate level, they should show up here. If they do not, the shared pattern is equally informative for instruction.</w:t>
+          <w:rFonts w:ascii="Georgia" w:hAnsi="Georgia" w:cs="Georgia"/>
+        </w:rPr>
+        <w:t>This study examines undergraduate thesis abstracts from three programs at Pampanga State Agricultural University (PSAU): Agriculture, Veterinary Medicine, and Biology. These fields share an institutional context but differ in how they typically handle evidence. Agricultural research often involves field conditions outside the researcher’s control. Biological studies frequently take place under controlled laboratory conditions. Veterinary medicine manages clinical variables tied to individual patient outcomes. The boundaries are not absolute, since agricultural work can be lab-based and biology can be field-based, but the different epistemic orientations may still shape hedging. If disciplinary norms appear at the undergraduate level, they should show up here. If they do not, the shared pattern is equally informative for instruction.</w:t>
       </w:r>
     </w:p>
     <w:p>
@@ -579,18 +579,31 @@
       </w:pPr>
       <w:r>
         <w:rPr>
+          <w:rFonts w:ascii="Georgia" w:hAnsi="Georgia" w:cs="Georgia"/>
+          <w:sz w:val="22"/>
+        </w:rPr>
+        <w:t>Ghia et al. (2022) supply one of the clearest abstract-focused accounts. They built a corpus of 217 English-language bachelor’s thesis abstracts written by advanced Italian EFL undergraduates specializing in linguistic and cross-cultural mediation, totaling 287,048 words, and compared hedge use with a subsection of successful L1 student writing in MICUSP. Fifteen hedge forms were set against boosters and modals of logical possibility and inferential certainty. The EFL abstracts used fewer hedges overall and leaned more on boosters and on modals of epistemic certainty than the L1 comparison group. At the same time, patterns in the two corpora still showed parallelisms, which the authors read as awareness of hedging strategies rather than absence of the concept. The study matters for the present work because it isolates the thesis abstract as a genre and shows that advanced L2 writers can under-hedge even when their programs center on language. Mazidah et al. (2022) compared hedges and boosters in 50 undergraduate thesis abstracts from Qomaruddin University: 25 from an English Language Education program and 25 from a Mathematics program. Coding followed Hyland’s (2005) taxonomy throughout. Across the sample they recorded 53 hedge tokens (22 variants) against 130 booster tokens (17 variants), so boosters outnumbered hedges overall. Mathematics abstracts used more hedge tokens than the English-education abstracts, while the English-education group still showed a wider set of hedge word variants. The authors link student hedging to limited knowledge of English academic rhetoric. For the present study, the result underscores that undergraduate abstracts can favor certainty markers as much as caution, and that program differences need not follow a simple language-versus-science split.</w:t>
+      </w:r>
+    </w:p>
+    <w:p>
+      <w:pPr>
+        <w:spacing w:line="480" w:lineRule="auto"/>
+        <w:ind w:left="720" w:hanging="720"/>
+      </w:pPr>
+    </w:p>
+    <w:p>
+      <w:pPr>
+        <w:spacing w:line="480" w:lineRule="auto" w:before="0" w:after="0"/>
+        <w:ind w:firstLine="720"/>
+        <w:jc w:val="both"/>
+      </w:pPr>
+      <w:r>
+        <w:rPr>
           <w:rFonts w:ascii="Georgia" w:hAnsi="Georgia" w:eastAsia="Georgia"/>
           <w:sz w:val="22"/>
-          <w:rtl w:val="0"/>
-        </w:rPr>
-        <w:t>Ghia et al. (2022) supply one of the clearest abstract-focused accounts. They built a corpus of 217 English-language bachelor’s thesis abstracts written by advanced Italian EFL undergraduates specializing in linguistic and cross-cultural mediation, totaling 287,048 words, and compared hedge use with a subsection of successful L1 student writing in MICUSP. Fifteen hedge forms were set against boosters and modals of logical possibility and inferential certainty. The EFL abstracts used fewer hedges overall and leaned more on boosters and on modals of epistemic certainty than the L1 comparison group. At the same time, patterns in the two corpora still showed parallelisms, which the authors read as awareness of hedging strategies rather than absence of the concept. The study matters for the present work because it isolates the thesis abstract as a genre and shows that advanced L2 writers can under-hedge even when their programs center on language. Mazidah et al. (2022) compared hedges and boosters in 50 undergraduate thesis abstracts from Qomaruddin University: 25 from an English Language Education program and 25 from a Mathematics program. Coding followed Hyland’s (2005) taxonomy. Across the sample they recorded 53 hedge tokens (22 variants) against 130 booster tokens (17 variants), so boosters outnumbered hedges overall. Mathematics abstracts used more hedge tokens than the English-education abstracts, while the English-education group still showed a wider set of hedge word variants. The authors link student hedging to limited knowledge of English academic rhetoric. For the present study, the result underscores that undergraduate abstracts can favor certainty markers as much as caution, and that program differences need not follow a simple language-versus-science split.</w:t>
-      </w:r>
-    </w:p>
-    <w:p>
-      <w:pPr>
-        <w:spacing w:line="480" w:lineRule="auto"/>
-        <w:ind w:left="720" w:hanging="720"/>
-      </w:pPr>
+        </w:rPr>
+        <w:t>Wang (2022) widens the student-writing picture by comparing hedging across sixteen disciplines in MICUSP. Five types of hedging devices were examined in successful upper-level student papers rather than in expert research articles alone. Hedging was more common in argumentation-driven disciplines than in data-driven ones, and further differences appeared between disciplines housed under the same broad division. That pattern challenges a simple natural-versus-social science split: two science fields need not hedge alike, and two fields within the same division need not either. Modal auxiliaries were one of the device types tracked, and disciplinary profiles for modal-auxiliary hedges differed across the corpus. Wang’s study therefore supports disciplinary comparison among student writers while also showing that aggregate “more hedging” can hide different formal mixes. For applied life-science undergraduates, the implication is that any cross-program difference at PSAU should be read against this dual finding: discipline can matter, and form-level patterns need to be reported alongside density.</w:t>
+      </w:r>
     </w:p>
     <w:p>
       <w:pPr>
@@ -600,10 +613,10 @@
       </w:pPr>
       <w:r>
         <w:rPr>
-          <w:rFonts w:ascii="Georgia" w:hAnsi="Georgia" w:eastAsia="Georgia"/>
+          <w:rFonts w:ascii="Georgia" w:hAnsi="Georgia" w:cs="Georgia"/>
           <w:sz w:val="22"/>
         </w:rPr>
-        <w:t>Wang (2022) widens the student-writing picture by comparing hedging across sixteen disciplines in MICUSP. Five types of hedging devices were examined in successful upper-level student papers rather than in expert research articles alone. Hedging was more common in argumentation-driven disciplines than in data-driven ones, and further differences appeared between disciplines housed under the same broad division. That pattern challenges a simple natural-versus-social science split: two science fields need not hedge alike, and two fields within the same division need not either. Modal auxiliaries were one of the device types tracked, and disciplinary profiles for modal-auxiliary hedges differed across the corpus. Wang’s study therefore supports disciplinary comparison among student writers while also showing that aggregate “more hedging” can hide different formal mixes. For applied life-science undergraduates, the implication is that any cross-program difference at PSAU should be read against this dual finding: discipline can matter, and form-level patterns need to be reported alongside density.</w:t>
+        <w:t>Halabisaz et al. (2014) focus the comparison on thesis abstracts in applied linguistics. They sampled 300 master’s abstracts written between 2000 and 2013, split between English L1 writers and Iranian L2 writers, and coded hedges according to Crompton’s (1997) taxonomy. English L1 writers used more hedging devices overall, and L2 writers used fewer. The authors attribute the difference to rhetorical sensitivity, modality, awareness of audience and purpose, and cultural background. Because the unit of analysis is the thesis abstract, the study sits closer to the present design than full-paper comparisons do. It also shows that L1-L2 differences in hedging can appear even among writers who have completed substantial graduate coursework in a language-related field.</w:t>
       </w:r>
     </w:p>
     <w:p>
@@ -617,21 +630,7 @@
           <w:rFonts w:ascii="Georgia" w:hAnsi="Georgia" w:cs="Georgia"/>
           <w:sz w:val="22"/>
         </w:rPr>
-        <w:t>Halabisaz et al. (2014) focus the comparison on thesis abstracts in applied linguistics. They sampled 300 master’s abstracts written between 2000 and 2013, split between English L1 writers and Iranian L2 writers, and coded hedges according to Crompton’s (1997) taxonomy. English L1 writers used more hedging devices overall, and L2 writers used fewer. The authors attribute the difference to rhetorical sensitivity, modality, awareness of audience and purpose, and cultural background. Because the unit of analysis is the thesis abstract, the study sits closer to the present design than full-paper comparisons do. It also shows that L1-L2 differences in hedging can appear even among writers who have completed substantial graduate coursework in a language-related field.</w:t>
-      </w:r>
-    </w:p>
-    <w:p>
-      <w:pPr>
-        <w:spacing w:line="480" w:lineRule="auto" w:before="0" w:after="0"/>
-        <w:ind w:firstLine="720"/>
-        <w:jc w:val="both"/>
-      </w:pPr>
-      <w:r>
-        <w:rPr>
-          <w:rFonts w:ascii="Georgia" w:hAnsi="Georgia" w:eastAsia="Georgia"/>
-          <w:sz w:val="22"/>
-        </w:rPr>
-        <w:t>Taken together, these studies show that undergraduate and master’s-level writers often under-deploy hedges, lean on a limited set of forms (often modals), and may differ by program without matching expert disciplinary profiles. Clear gaps remain for the present work. Only a few of these studies examined abstracts specifically, and most of those focused on English or language majors rather than applied science programs. Others analyzed discussion sections or full papers, where rhetorical space is wider. None is set in a Philippine L2 context for Agriculture, Veterinary Medicine, and Biology undergraduate thesis abstracts.</w:t>
+        <w:t>Taken together, these studies show that undergraduate and master’s-level writers often under-deploy hedges, lean on a limited set of forms (often modals), and may differ by program without matching expert disciplinary profiles. Clear gaps remain for the present work: only a few of these studies examined abstracts specifically, and most of those focused on English or language majors rather than applied science programs. Others analyzed discussion sections or full papers, where rhetorical space is wider. None is set in a Philippine L2 context for Agriculture, Veterinary Medicine, and Biology undergraduate thesis abstracts.</w:t>
       </w:r>
     </w:p>
     <w:p>
@@ -668,10 +667,24 @@
       </w:pPr>
       <w:r>
         <w:rPr>
+          <w:rFonts w:ascii="Georgia" w:hAnsi="Georgia" w:cs="Georgia"/>
+          <w:sz w:val="22"/>
+        </w:rPr>
+        <w:t>Field norms shape expert hedging, but not along a simple hard-or-soft divide. Hyland (1996) grounds that claim in scientific research writing itself. In a corpus of 26 molecular biology research articles, he shows that hedging is central to gaining reader acceptance of claims. Writers use hedges to state findings with precision, caution, and deference to colleagues rather than as optional politeness. Lexical forms carry most of the load: about 79% of hedging instances are lexical, mainly verbs, adjectives, and adverbs, rather than modal verbs alone. That formal profile matters for later comparison with undergraduate biology and applied-life-science abstracts that may lean more heavily on a small modal set.</w:t>
+      </w:r>
+    </w:p>
+    <w:p>
+      <w:pPr>
+        <w:spacing w:line="480" w:lineRule="auto" w:before="0" w:after="0"/>
+        <w:ind w:firstLine="720"/>
+        <w:jc w:val="both"/>
+      </w:pPr>
+      <w:r>
+        <w:rPr>
           <w:rFonts w:ascii="Georgia" w:hAnsi="Georgia" w:eastAsia="Georgia"/>
           <w:sz w:val="22"/>
         </w:rPr>
-        <w:t>Field norms shape expert hedging, but not along a simple hard-or-soft divide. Hyland (1996) grounds that claim in scientific research writing itself. In a corpus of 26 molecular biology research articles, he shows that hedging is central to gaining reader acceptance of claims. Writers use hedges to state findings with precision, caution, and deference to colleagues rather than as optional politeness. Lexical forms carry most of the load. About 79% of hedging instances are lexical, mainly verbs, adjectives, and adverbs, rather than modal verbs alone. That formal profile matters for later comparison with undergraduate biology and applied-life-science abstracts that may lean more heavily on a small modal set.</w:t>
+        <w:t>Afshar et al. (2014) scale the comparison across fields. They examined Discussion sections of 180 research articles from Humanities (Law, Persian literature, TEFL), Basic Sciences (Biology, Applied Chemistry, Geology), and Agriculture (Biotechnology, Soil Sciences, Horticulture), with 20 articles per sub-field, using Salager-Meyer’s (1994) taxonomy. Significant differences appeared both among the three fields and among sub-fields within each field. Humanities articles carried the highest overall hedge counts. Agriculture and Basic Sciences sat lower, with further unevenness inside each label. The study therefore does more than rank soft above hard. It shows that sub-field matters even when articles share a broad disciplinary name.</w:t>
       </w:r>
     </w:p>
     <w:p>
@@ -682,10 +695,52 @@
       </w:pPr>
       <w:r>
         <w:rPr>
+          <w:rFonts w:ascii="Georgia" w:hAnsi="Georgia" w:cs="Georgia"/>
+          <w:sz w:val="22"/>
+        </w:rPr>
+        <w:t>Mohammed (2011) takes a different cut by comparing lexical hedges in biochemistry and applied-linguistics research articles by American and Arabic authors. The study found that American writers used more hedging forms than Arabic writers in both disciplines. Linguists used considerably fewer hedges than scientists, and biochemistry articles were more heavily hedged than applied-linguistics articles. Discussion sections contained more hedges than introductions. Because Mohammed focuses on lexical hedges rather than Salager-Meyer’s full taxonomy, the ranking cannot be stacked directly onto Afshar et al.’s field totals. What the two studies share is that density tracks the pairing under analysis and the coding scheme, not a single universal hard-or-soft scale.</w:t>
+      </w:r>
+    </w:p>
+    <w:p>
+      <w:pPr>
+        <w:spacing w:line="480" w:lineRule="auto" w:before="0" w:after="0"/>
+        <w:ind w:firstLine="720"/>
+        <w:jc w:val="both"/>
+      </w:pPr>
+      <w:r>
+        <w:rPr>
+          <w:rFonts w:ascii="Georgia" w:hAnsi="Georgia" w:cs="Georgia"/>
+          <w:sz w:val="22"/>
+        </w:rPr>
+        <w:t>Rezvani and Javadi (2021) test hard-versus-soft differences in abstracts by Iranian writers of English. They sampled 200 research-article abstracts, 50 each from chemistry, mathematics, philosophy, and English, grouped as hard and soft sciences under Biglan’s (1973) typology. Soft-science abstracts used more hedge expressions overall, and soft writers drew more on modals, verbs, nouns, adjectives, and adverbs, while hard-science writers used more conditional expressions. Epistemic and cognition verbs were the most frequent hedging expressions in both groups. The study supports disciplinary differentiation inside the compressed abstract genre and shows that form mix, not only density, separates the two clusters.</w:t>
+      </w:r>
+    </w:p>
+    <w:p>
+      <w:pPr>
+        <w:spacing w:line="480" w:lineRule="auto" w:before="0" w:after="0"/>
+        <w:ind w:firstLine="720"/>
+        <w:jc w:val="both"/>
+      </w:pPr>
+      <w:r>
+        <w:rPr>
+          <w:rFonts w:ascii="Georgia" w:hAnsi="Georgia" w:cs="Georgia"/>
+          <w:sz w:val="22"/>
+        </w:rPr>
+        <w:t>Bonyadi, Gholami, and Nasiri (2012) keep the lens on an applied science close to agriculture. They compared hedges in Discussion sections of 60 environmental-sciences research articles: 20 by English research writers, 20 by Iranian writers in English, and 20 by Iranian writers in Farsi, coded with Salager-Meyer’s (1994) taxonomy. English and Iranian English articles did not differ significantly in hedge use, but English and Farsi articles did. The authors link the English-Farsi gap to rhetorical preference in Farsi for less hedged, more categorically validated prose, a pattern that sits at odds with international environmental-science discourse expectations. For the present corpus, the study is a reminder that applied-science hedging norms are international as well as disciplinary, and that L1 background can still shape English research writing in the same field.</w:t>
+      </w:r>
+    </w:p>
+    <w:p>
+      <w:pPr>
+        <w:spacing w:line="480" w:lineRule="auto" w:before="0" w:after="0"/>
+        <w:ind w:firstLine="720"/>
+        <w:jc w:val="both"/>
+      </w:pPr>
+      <w:r>
+        <w:rPr>
           <w:rFonts w:ascii="Georgia" w:hAnsi="Georgia" w:eastAsia="Georgia"/>
           <w:sz w:val="22"/>
         </w:rPr>
-        <w:t>Afshar et al. (2014) scale the comparison across fields. They examined Discussion sections of 180 research articles from Humanities (Law, Persian literature, TEFL), Basic Sciences (Biology, Applied Chemistry, Geology), and Agriculture (Biotechnology, Soil Sciences, Horticulture), with 20 articles per sub-field, using Salager-Meyer’s (1994) taxonomy. Significant differences appeared both among the three fields and among sub-fields within each field. Humanities articles carried the highest overall hedge counts. Agriculture and Basic Sciences sat lower, with further unevenness inside each label. The study therefore does more than rank soft above hard. It shows that sub-field matters even when articles share a broad disciplinary name.</w:t>
+        <w:t>Within life sciences proper, Souici and Slougui (2022) examined 31 biology research articles by Algerian authors from five locally published journals. Main verbs were the most prominent hedge category. Within that category, non-factive reporting verbs ranked highest. Writers relied on those verbs to support and frame findings rather than on a wide modal set alone. Hamidi et al. (2025) compared conclusion sections of basic-science and clinical-science papers in the Medical Journal of the Islamic Republic of Iran. Clinical papers used more hedge tokens (330 versus 154), yet an inferential test found no statistically significant difference. Journal standards and cultural factors, the authors argue, shape hedging as much as the basic-versus-clinical split.</w:t>
       </w:r>
     </w:p>
     <w:p>
@@ -696,90 +751,37 @@
       </w:pPr>
       <w:r>
         <w:rPr>
-          <w:rFonts w:ascii="Georgia" w:hAnsi="Georgia" w:eastAsia="Georgia"/>
-          <w:sz w:val="22"/>
-        </w:rPr>
-        <w:t>Mohammed (2011) takes a different cut. Comparing lexical hedges in biochemistry and applied-linguistics research articles by American and Arabic authors, the study found that American writers used more hedging forms than Arabic writers in both disciplines. Linguists used considerably fewer hedges than scientists, and biochemistry articles were more heavily hedged than applied-linguistics articles. Discussion sections contained more hedges than introductions. Because Mohammed focuses on lexical hedges rather than Salager-Meyer’s full taxonomy, the ranking cannot be stacked directly onto Afshar et al.’s field totals. What the two studies share is that density tracks the pairing under analysis and the coding scheme, not a single universal hard-or-soft scale.</w:t>
-      </w:r>
-    </w:p>
-    <w:p>
-      <w:pPr>
-        <w:spacing w:line="480" w:lineRule="auto" w:before="0" w:after="0"/>
-        <w:ind w:firstLine="720"/>
-        <w:jc w:val="both"/>
-      </w:pPr>
-      <w:r>
-        <w:rPr>
-          <w:rFonts w:ascii="Georgia" w:hAnsi="Georgia" w:eastAsia="Georgia"/>
-          <w:sz w:val="22"/>
-        </w:rPr>
-        <w:t>Rezvani and Javadi (2021) test hard-versus-soft differences in abstracts by Iranian writers of English. They sampled 200 research-article abstracts, 50 each from chemistry, mathematics, philosophy, and English, grouped as hard and soft sciences under Biglan’s (1973) typology. Soft-science abstracts used more hedge expressions overall. Soft writers drew more on modals, verbs, nouns, adjectives, and adverbs, while hard-science writers used more conditional expressions. Epistemic and cognition verbs were the most frequent hedging expressions in both groups. The study supports disciplinary differentiation inside the compressed abstract genre and shows that form mix, not only density, separates the two clusters.</w:t>
-      </w:r>
-    </w:p>
-    <w:p>
-      <w:pPr>
-        <w:spacing w:line="480" w:lineRule="auto" w:before="0" w:after="0"/>
-        <w:ind w:firstLine="720"/>
-        <w:jc w:val="both"/>
-      </w:pPr>
-      <w:r>
-        <w:rPr>
           <w:rFonts w:ascii="Georgia" w:hAnsi="Georgia" w:cs="Georgia"/>
           <w:sz w:val="22"/>
         </w:rPr>
-        <w:t>Bonyadi, Gholami, and Nasiri (2012) keep the lens on an applied science close to agriculture. They compared hedges in Discussion sections of 60 environmental-sciences research articles: 20 by English research writers, 20 by Iranian writers in English, and 20 by Iranian writers in Farsi, coded with Salager-Meyer’s (1994) taxonomy. English and Iranian English articles did not differ significantly in hedge use, but English and Farsi articles did. The authors link the English-Farsi gap to rhetorical preference in Farsi for less hedged, more categorically validated prose, a pattern that sits at odds with international environmental-science discourse expectations. For the present corpus, the study is a reminder that applied-science hedging norms are international as well as disciplinary, and that L1 background can still shape English research writing in the same field.</w:t>
-      </w:r>
-    </w:p>
-    <w:p>
-      <w:pPr>
-        <w:spacing w:line="480" w:lineRule="auto" w:before="0" w:after="0"/>
-        <w:ind w:firstLine="720"/>
-        <w:jc w:val="both"/>
-      </w:pPr>
-      <w:r>
-        <w:rPr>
-          <w:rFonts w:ascii="Georgia" w:hAnsi="Georgia" w:eastAsia="Georgia"/>
-          <w:sz w:val="22"/>
-        </w:rPr>
-        <w:t>Within life sciences proper, Souici and Slougui (2022) examined 31 biology research articles by Algerian authors from five locally published journals. Main verbs were the most prominent hedge category. Within that category, non-factive reporting verbs ranked highest. Writers relied on those verbs to support and frame findings rather than on a wide modal set alone. Hamidi et al. (2025) compared conclusion sections of basic-science and clinical-science papers in the Medical Journal of the Islamic Republic of Iran. Clinical papers used more hedge tokens (330 versus 154), yet an inferential test found no statistically significant difference. Journal standards and cultural factors, the authors argue, shape hedging as much as the basic-versus-clinical split.</w:t>
-      </w:r>
-    </w:p>
-    <w:p>
-      <w:pPr>
-        <w:spacing w:line="480" w:lineRule="auto" w:before="0" w:after="0"/>
-        <w:ind w:firstLine="720"/>
+        <w:t>Salager-Meyer (1994) anchors much of this comparative work in medical English. In research papers and case reports from leading medical journals, hedge frequency and category distribution shifted with rhetorical section. Discussion and Comment sections were the most heavily hedged. Methods and case-report body sections were among the least. Shields, approximators, and compound hedges accounted for the great majority of devices. Introductions favored shields, especially epistemic verbs, as writers carved an early niche for the study. That section pattern matters for how medical writers present results. Directly measured findings often remain categorical, and hedging rises where writers move from measurement to interpretation, generalization, or clinical implication. The same medical discourse can therefore look firm in the results strip and still manage claim responsibility in the interpretive strip.</w:t>
+      </w:r>
+    </w:p>
+    <w:p>
+      <w:pPr>
+        <w:jc w:val="both"/>
+      </w:pPr>
+      <w:r>
+        <w:t>Corpus work on medical Results and Discussion sections supports that reading. Doğan and Akbaş (2021) analysed about 215,000 words from the Results and Discussion sections of 100 medical research articles across fields from anatomy to endocrinology. Medical writers used modal auxiliaries frequently to mark stance. They did not rely on a matching surge of boosters to amplify commitment. Where boosters appeared, they were often strategic, used to support credibility and reader engagement rather than as a default claim of certainty. Medical scientific English in those sections is therefore better described as calibrated commitment than as either blanket tentativeness or blanket conviction.</w:t>
+      </w:r>
+    </w:p>
+    <w:p>
+      <w:pPr>
+        <w:jc w:val="both"/>
+      </w:pPr>
+      <w:r>
+        <w:t>Lingard (2026) makes the same point in pedagogical terms for health-professions research writing. High authorial commitment is appropriate when the warrant is strong. Heavy hedging on a well-supported measurement can read as unnecessary softening. Low commitment remains necessary when the claim outruns the data. The issue is match of stance to warrant, not a medical culture of always agreeing or disagreeing more bluntly than other sciences.</w:t>
+      </w:r>
+    </w:p>
+    <w:p>
+      <w:pPr>
         <w:jc w:val="both"/>
       </w:pPr>
       <w:r>
         <w:rPr>
           <w:rFonts w:ascii="Georgia" w:hAnsi="Georgia" w:cs="Georgia"/>
-          <w:sz w:val="22"/>
-        </w:rPr>
-        <w:t>Salager-Meyer (1994) anchors much of this comparative work in medical English. In research papers and case reports from leading medical journals, hedge frequency and category distribution shifted with rhetorical section. Discussion and Comment sections were the most heavily hedged. Methods and case-report body sections were among the least. Shields, approximators, and compound hedges accounted for the great majority of devices. Introductions favored shields, especially epistemic verbs, as writers carved an early niche for the study. That section pattern matters for how medical writers present results. Directly measured findings often remain categorical, and hedging rises where writers move from measurement to interpretation, generalization, or clinical implication. The same medical discourse can therefore look firm in the results strip and still manage claim responsibility in the interpretive strip.</w:t>
-      </w:r>
-    </w:p>
-    <w:p>
-      <w:pPr>
-        <w:jc w:val="both"/>
-      </w:pPr>
-      <w:r>
-        <w:t>Corpus work on medical Results and Discussion sections supports that reading. Doğan and Akbaş (2021) analysed about 215,000 words from the Results and Discussion sections of 100 medical research articles across fields from anatomy to endocrinology. Medical writers used modal auxiliaries frequently to mark stance. They did not rely on a matching surge of boosters to amplify commitment. Where boosters appeared, they were often strategic, used to support credibility and reader engagement rather than as a default claim of certainty. Medical scientific English in those sections is therefore better described as calibrated commitment than as either blanket tentativeness or blanket conviction.</w:t>
-      </w:r>
-    </w:p>
-    <w:p>
-      <w:pPr>
-        <w:jc w:val="both"/>
-      </w:pPr>
-      <w:r>
-        <w:t>Lingard (2026) makes the same point in pedagogical terms for health-professions research writing. High authorial commitment is appropriate when the warrant is strong. Heavy hedging on a well-supported measurement can read as unnecessary softening. Low commitment remains necessary when the claim outruns the data. The issue is match of stance to warrant, not a medical culture of always agreeing or disagreeing more bluntly than other sciences.</w:t>
-      </w:r>
-    </w:p>
-    <w:p>
-      <w:pPr>
-        <w:jc w:val="both"/>
-      </w:pPr>
-      <w:r>
-        <w:t>Cross-field comparisons complicate any simple medical-versus-other ranking. Sepehri, Hajijalili, and Namaziandost (2019) compared hedges and boosters in 30 medical and 30 engineering research articles and found a significant disciplinary difference, with medical articles carrying more hedge tokens overall in their sample. Medical writing is not uniformly under-hedged relative to other technical fields. What remains distinctive is the reporting pattern inside the article: categorical presentation of measured results, denser hedging where interpretation and generalization begin. Hu and Cao (2011) add publication medium and evidence type outside medicine. In applied-linguistics journal abstracts, English-medium texts featured markedly more hedges than Chinese-medium texts, and empirical research abstracts used significantly more boosters than non-empirical articles. Stance choices therefore track section, medium, and evidence type as well as discipline.</w:t>
+        </w:rPr>
+        <w:t>Cross-field comparisons complicate any simple medical-versus-other ranking, as Sepehri, Hajijalili, and Namaziandost (2019) compared hedges and boosters in 30 medical and 30 engineering research articles and found a significant disciplinary difference, with medical articles carrying more hedge tokens overall in their sample. Medical writing is not uniformly under-hedged relative to other technical fields. What remains distinctive is the reporting pattern inside the article: categorical presentation of measured results, denser hedging where interpretation and generalization begin. Hu and Cao (2011) add publication medium and evidence type outside medicine. In applied-linguistics journal abstracts, English-medium texts featured markedly more hedges than Chinese-medium texts, and empirical research abstracts used significantly more boosters than non-empirical articles. Stance choices therefore track section, medium, and evidence type as well as discipline.</w:t>
       </w:r>
     </w:p>
     <w:p>
@@ -980,7 +982,7 @@
         <w:rPr>
           <w:rFonts w:ascii="Georgia" w:hAnsi="Georgia" w:cs="Georgia"/>
         </w:rPr>
-        <w:t xml:space="preserve">Research on Philippine student research writing brings the evidence closer to the thesis genre. Luyun (2024) analysed introduction and conclusion sections in 41 undergraduate research papers from BSED and BEED programs at a Philippine university, using Mojica's hedge categories and Hyland's booster taxonomy. The most frequent hedge forms included this study, it, and the study, with may also appearing among Type I devices. The dominant booster was should. No significant difference in hedge or booster frequency emerged between the two education programs. Melon-Galvez (2017) examined the hedging system of Filipino engineering students writing technical ESP texts and linked hedge use to framing, intertextuality, and task type, with pedagogical implications for precision and interpersonal stance in technical discourse.</w:t>
+        <w:t>Research on Philippine student research writing brings the evidence closer to the thesis genre. Luyun (2024) analysed introduction and conclusion sections in 41 undergraduate research papers from BSED and BEED programs at a Philippine university, using Mojica's hedge categories and Hyland's booster taxonomy. The most frequent hedge forms included this study, it, and the study, with may also appearing among Type I devices. The dominant booster was should, and no significant difference in hedge or booster frequency emerged between the two education programs. Melon-Galvez (2017) examined the hedging system of Filipino engineering students writing technical ESP texts and linked hedge use to framing, intertextuality, and task type, with pedagogical implications for precision and interpersonal stance in technical discourse.</w:t>
       </w:r>
     </w:p>
     <w:p>
@@ -1140,7 +1142,10 @@
         <w:jc w:val="both"/>
       </w:pPr>
       <w:r>
-        <w:t>Directives and recommendations sit at the edge of that debate. They manage action rather than the truth of a claim. Under a wide interpersonal reading they look like mitigation. Under a claim-centered reading they fall outside the hedge count. This study adopts the claim-centered boundary. A token is retained as a hedge only when it changes the writer's stance toward a proposition that evidence could show to be wrong. Epistemic Caution records reduced commitment to that claim's truth. Politeness/Deference records interpersonal softening of the same claim when that softening co-occurs with, or stands in place of, an epistemic effect on a claim. Softened recommendations are logged as false positives under this scope. The choice is a position in the definitional debate.</w:t>
+        <w:rPr>
+          <w:rFonts w:ascii="Georgia" w:hAnsi="Georgia" w:cs="Georgia"/>
+        </w:rPr>
+        <w:t>Directives and recommendations sit at the edge of that debate. They manage action rather than the truth of a claim. Under a wide interpersonal reading they look like mitigation. Under a claim-centered reading they fall outside the hedge count. This study adopts the claim-centered boundary, so a token is retained as a hedge only when it changes the writer's stance toward a proposition that evidence could show to be wrong. Epistemic Caution records reduced commitment to that claim's truth. Politeness/Deference records interpersonal softening of the same claim when that softening co-occurs with, or stands in place of, an epistemic effect on a claim. Softened recommendations are logged as false positives under this scope. The choice is a position in the definitional debate.</w:t>
       </w:r>
     </w:p>
     <w:p>
@@ -6053,10 +6058,10 @@
       </w:pPr>
       <w:r>
         <w:rPr>
-          <w:rFonts w:ascii="Georgia" w:hAnsi="Georgia" w:eastAsia="Georgia"/>
+          <w:rFonts w:ascii="Georgia" w:hAnsi="Georgia" w:cs="Georgia"/>
           <w:sz w:val="22"/>
         </w:rPr>
-        <w:t>The three programs do not share the same mix within that narrow range. Agriculture balances modal and lexical caution more evenly. Biology leans heavily on lexical qualification. Veterinary Medicine uses the same lexical preference but with far fewer occasions of either type. The cross-program difference at this level is not access to a wide hedge taxonomy. It is how often, and with which preferred form, writers mark caution at all.</w:t>
+        <w:t>The three programs do not share the same mix within that narrow range. Agriculture balances modal and lexical caution more evenly, Biology leans heavily on lexical qualification, and Veterinary Medicine uses the same lexical preference but with far fewer occasions of either type. The cross-program difference at this level is not access to a wide hedge taxonomy. It is how often, and with which preferred form, writers mark caution at all.</w:t>
       </w:r>
     </w:p>
     <w:p>
@@ -6068,10 +6073,10 @@
       </w:pPr>
       <w:r>
         <w:rPr>
-          <w:rFonts w:ascii="Georgia" w:hAnsi="Georgia" w:eastAsia="Georgia"/>
+          <w:rFonts w:ascii="Georgia" w:hAnsi="Georgia" w:cs="Georgia"/>
           <w:sz w:val="22"/>
         </w:rPr>
-        <w:t>The zero count for clause-level hedges fits the abstract as a compressed, impersonal reporting genre. Clause-level frames that put the writer’s stance in the foreground (first-person forms such as I think or in our view, and more impersonal ones such as it seems that) are uncommon in science abstracts. The present texts favor short, result-centered sentences. That register leaves little room for the longer clausal packages in which stance is often packaged in student essays or discussion sections.</w:t>
+        <w:t>The zero count for clause-level hedges fits the abstract as a compressed, impersonal reporting genre. Clause-level frames that put the writer’s stance in the foreground (first-person forms such as I think or in our view, and more impersonal ones such as it seems that) are uncommon in science abstracts. The present texts favor short, result-centered sentences, and that register leaves little room for the longer clausal packages in which stance is often packaged in student essays or discussion sections.</w:t>
       </w:r>
     </w:p>
     <w:p>
@@ -7596,10 +7601,10 @@
       </w:pPr>
       <w:r>
         <w:rPr>
-          <w:rFonts w:ascii="Georgia" w:hAnsi="Georgia" w:eastAsia="Georgia"/>
+          <w:rFonts w:ascii="Georgia" w:hAnsi="Georgia" w:cs="Georgia"/>
           <w:sz w:val="22"/>
         </w:rPr>
-        <w:t>Two further cautions apply. Abstracts within a program may share advisers, so patterns may reflect supervision as much as individual choice, and spread within each program remains large. If potential is set aside, the remaining inventory shrinks and Veterinary Medicine’s share of unsoftened abstracts rises further. Low rates of hedging are widely reported in undergraduate and L2 academic writing (Hyland &amp; Milton, 1997; Qiu et al., 2024). In this PSAU sample the sharpest contrast in how English marks caution is between Biology and Veterinary Medicine. It is a local pattern in ratified abstracts. Supervised texts may reflect program tolerance for soft claims as much as individual rhetorical choice.</w:t>
+        <w:t>Two further cautions apply. Abstracts within a program may share advisers, so patterns may reflect supervision as much as individual choice, and spread within each program remains large. If potential is set aside, the remaining inventory shrinks and Veterinary Medicine’s share of unsoftened abstracts rises further. Low rates of hedging are widely reported in undergraduate and L2 academic writing (Hyland &amp; Milton, 1997; Qiu et al., 2024). In this PSAU sample the sharpest contrast in how English marks caution is between Biology and Veterinary Medicine. That local pattern appears in ratified abstracts, and supervised texts may reflect program tolerance for soft claims as much as individual rhetorical choice.</w:t>
       </w:r>
     </w:p>
     <w:p>

</xml_diff>

<commit_message>
Draft_124: Research Process Timeline as Phase/Duration table
</commit_message>
<xml_diff>
--- a/thesis/003_ThesisProposal_Draft_124_body.docx
+++ b/thesis/003_ThesisProposal_Draft_124_body.docx
@@ -2504,19 +2504,499 @@
       </w:pPr>
       <w:r>
         <w:rPr>
-          <w:b w:val="1"/>
+          <w:rFonts w:ascii="Times New Roman" w:hAnsi="Times New Roman"/>
+          <w:b/>
           <w:bCs w:val="1"/>
-          <w:rtl w:val="0"/>
-        </w:rPr>
-        <w:t xml:space="preserve">f. Timeline. </w:t>
-      </w:r>
-      <w:r>
-        <w:rPr>
-          <w:rtl w:val="0"/>
-        </w:rPr>
-        <w:t xml:space="preserve">Permission and library access: 1 week. Corpus construction and on-site photography: 3 weeks. OCR verification and text preparation: 2 weeks. Pilot testing and coding finalization: 2 weeks. Full coding and frequency analysis: 8 weeks (approximately 10 hours per week). Writing and revision: 8 weeks. Total timeframe: approximately 5.5 months (24 weeks).</w:t>
-      </w:r>
-    </w:p>
+          <w:sz w:val="24"/>
+          <w:rtl w:val="0"/>
+        </w:rPr>
+        <w:t>f. Timeline.</w:t>
+      </w:r>
+      <w:r>
+        <w:rPr>
+          <w:rtl w:val="0"/>
+        </w:rPr>
+      </w:r>
+    </w:p>
+    <w:tbl>
+      <w:tblPr>
+        <w:tblLook w:firstColumn="1" w:firstRow="1" w:lastColumn="0" w:lastRow="0" w:noHBand="0" w:noVBand="1" w:val="04A0"/>
+        <w:tblW w:w="5000" w:type="pct"/>
+        <w:tblBorders>
+          <w:top w:val="single" w:sz="12" w:space="0" w:color="000000"/>
+          <w:left w:val="single" w:sz="12" w:space="0" w:color="000000"/>
+          <w:bottom w:val="single" w:sz="12" w:space="0" w:color="000000"/>
+          <w:right w:val="single" w:sz="12" w:space="0" w:color="000000"/>
+          <w:insideH w:val="single" w:sz="12" w:space="0" w:color="000000"/>
+          <w:insideV w:val="single" w:sz="12" w:space="0" w:color="000000"/>
+        </w:tblBorders>
+      </w:tblPr>
+      <w:tblGrid>
+        <w:gridCol w:w="4153"/>
+        <w:gridCol w:w="4153"/>
+      </w:tblGrid>
+      <w:tr>
+        <w:trPr>
+          <w:cantSplit/>
+          <w:tblHeader/>
+        </w:trPr>
+        <w:tc>
+          <w:tcPr>
+            <w:tcW w:type="dxa" w:w="4153"/>
+            <w:tcBorders>
+              <w:top w:val="single" w:sz="12" w:space="0" w:color="000000"/>
+              <w:left w:val="single" w:sz="12" w:space="0" w:color="000000"/>
+              <w:bottom w:val="single" w:sz="12" w:space="0" w:color="000000"/>
+              <w:right w:val="single" w:sz="12" w:space="0" w:color="000000"/>
+            </w:tcBorders>
+            <w:vAlign w:val="center"/>
+            <w:shd w:fill="D9E2F3" w:val="clear"/>
+          </w:tcPr>
+          <w:p>
+            <w:pPr>
+              <w:jc w:val="center"/>
+            </w:pPr>
+            <w:r/>
+            <w:r>
+              <w:rPr>
+                <w:rFonts w:ascii="Times New Roman" w:hAnsi="Times New Roman"/>
+                <w:b/>
+                <w:sz w:val="22"/>
+              </w:rPr>
+              <w:t>Phase</w:t>
+            </w:r>
+          </w:p>
+        </w:tc>
+        <w:tc>
+          <w:tcPr>
+            <w:tcW w:type="dxa" w:w="4153"/>
+            <w:tcBorders>
+              <w:top w:val="single" w:sz="12" w:space="0" w:color="000000"/>
+              <w:left w:val="single" w:sz="12" w:space="0" w:color="000000"/>
+              <w:bottom w:val="single" w:sz="12" w:space="0" w:color="000000"/>
+              <w:right w:val="single" w:sz="12" w:space="0" w:color="000000"/>
+            </w:tcBorders>
+            <w:vAlign w:val="center"/>
+            <w:shd w:fill="D9E2F3" w:val="clear"/>
+          </w:tcPr>
+          <w:p>
+            <w:pPr>
+              <w:jc w:val="center"/>
+            </w:pPr>
+            <w:r/>
+            <w:r>
+              <w:rPr>
+                <w:rFonts w:ascii="Times New Roman" w:hAnsi="Times New Roman"/>
+                <w:b/>
+                <w:sz w:val="22"/>
+              </w:rPr>
+              <w:t>Duration</w:t>
+            </w:r>
+          </w:p>
+        </w:tc>
+      </w:tr>
+      <w:tr>
+        <w:trPr>
+          <w:cantSplit/>
+        </w:trPr>
+        <w:tc>
+          <w:tcPr>
+            <w:tcW w:type="dxa" w:w="4153"/>
+            <w:tcBorders>
+              <w:top w:val="single" w:sz="12" w:space="0" w:color="000000"/>
+              <w:left w:val="single" w:sz="12" w:space="0" w:color="000000"/>
+              <w:bottom w:val="single" w:sz="12" w:space="0" w:color="000000"/>
+              <w:right w:val="single" w:sz="12" w:space="0" w:color="000000"/>
+            </w:tcBorders>
+            <w:vAlign w:val="center"/>
+          </w:tcPr>
+          <w:p>
+            <w:pPr>
+              <w:jc w:val="left"/>
+            </w:pPr>
+            <w:r/>
+            <w:r>
+              <w:rPr>
+                <w:rFonts w:ascii="Times New Roman" w:hAnsi="Times New Roman"/>
+                <w:b w:val="0"/>
+                <w:sz w:val="22"/>
+              </w:rPr>
+              <w:t>Permission and library access</w:t>
+            </w:r>
+          </w:p>
+        </w:tc>
+        <w:tc>
+          <w:tcPr>
+            <w:tcW w:type="dxa" w:w="4153"/>
+            <w:tcBorders>
+              <w:top w:val="single" w:sz="12" w:space="0" w:color="000000"/>
+              <w:left w:val="single" w:sz="12" w:space="0" w:color="000000"/>
+              <w:bottom w:val="single" w:sz="12" w:space="0" w:color="000000"/>
+              <w:right w:val="single" w:sz="12" w:space="0" w:color="000000"/>
+            </w:tcBorders>
+            <w:vAlign w:val="center"/>
+          </w:tcPr>
+          <w:p>
+            <w:pPr>
+              <w:jc w:val="left"/>
+            </w:pPr>
+            <w:r/>
+            <w:r>
+              <w:rPr>
+                <w:rFonts w:ascii="Times New Roman" w:hAnsi="Times New Roman"/>
+                <w:b w:val="0"/>
+                <w:sz w:val="22"/>
+              </w:rPr>
+              <w:t>1 week</w:t>
+            </w:r>
+          </w:p>
+        </w:tc>
+      </w:tr>
+      <w:tr>
+        <w:trPr>
+          <w:cantSplit/>
+        </w:trPr>
+        <w:tc>
+          <w:tcPr>
+            <w:tcW w:type="dxa" w:w="4153"/>
+            <w:tcBorders>
+              <w:top w:val="single" w:sz="12" w:space="0" w:color="000000"/>
+              <w:left w:val="single" w:sz="12" w:space="0" w:color="000000"/>
+              <w:bottom w:val="single" w:sz="12" w:space="0" w:color="000000"/>
+              <w:right w:val="single" w:sz="12" w:space="0" w:color="000000"/>
+            </w:tcBorders>
+            <w:vAlign w:val="center"/>
+          </w:tcPr>
+          <w:p>
+            <w:pPr>
+              <w:jc w:val="left"/>
+            </w:pPr>
+            <w:r/>
+            <w:r>
+              <w:rPr>
+                <w:rFonts w:ascii="Times New Roman" w:hAnsi="Times New Roman"/>
+                <w:b w:val="0"/>
+                <w:sz w:val="22"/>
+              </w:rPr>
+              <w:t>Corpus construction and on-site photography</w:t>
+            </w:r>
+          </w:p>
+        </w:tc>
+        <w:tc>
+          <w:tcPr>
+            <w:tcW w:type="dxa" w:w="4153"/>
+            <w:tcBorders>
+              <w:top w:val="single" w:sz="12" w:space="0" w:color="000000"/>
+              <w:left w:val="single" w:sz="12" w:space="0" w:color="000000"/>
+              <w:bottom w:val="single" w:sz="12" w:space="0" w:color="000000"/>
+              <w:right w:val="single" w:sz="12" w:space="0" w:color="000000"/>
+            </w:tcBorders>
+            <w:vAlign w:val="center"/>
+          </w:tcPr>
+          <w:p>
+            <w:pPr>
+              <w:jc w:val="left"/>
+            </w:pPr>
+            <w:r/>
+            <w:r>
+              <w:rPr>
+                <w:rFonts w:ascii="Times New Roman" w:hAnsi="Times New Roman"/>
+                <w:b w:val="0"/>
+                <w:sz w:val="22"/>
+              </w:rPr>
+              <w:t>3 weeks</w:t>
+            </w:r>
+          </w:p>
+        </w:tc>
+      </w:tr>
+      <w:tr>
+        <w:trPr>
+          <w:cantSplit/>
+        </w:trPr>
+        <w:tc>
+          <w:tcPr>
+            <w:tcW w:type="dxa" w:w="4153"/>
+            <w:tcBorders>
+              <w:top w:val="single" w:sz="12" w:space="0" w:color="000000"/>
+              <w:left w:val="single" w:sz="12" w:space="0" w:color="000000"/>
+              <w:bottom w:val="single" w:sz="12" w:space="0" w:color="000000"/>
+              <w:right w:val="single" w:sz="12" w:space="0" w:color="000000"/>
+            </w:tcBorders>
+            <w:vAlign w:val="center"/>
+          </w:tcPr>
+          <w:p>
+            <w:pPr>
+              <w:jc w:val="left"/>
+            </w:pPr>
+            <w:r/>
+            <w:r>
+              <w:rPr>
+                <w:rFonts w:ascii="Times New Roman" w:hAnsi="Times New Roman"/>
+                <w:b w:val="0"/>
+                <w:sz w:val="22"/>
+              </w:rPr>
+              <w:t>OCR verification and text preparation</w:t>
+            </w:r>
+          </w:p>
+        </w:tc>
+        <w:tc>
+          <w:tcPr>
+            <w:tcW w:type="dxa" w:w="4153"/>
+            <w:tcBorders>
+              <w:top w:val="single" w:sz="12" w:space="0" w:color="000000"/>
+              <w:left w:val="single" w:sz="12" w:space="0" w:color="000000"/>
+              <w:bottom w:val="single" w:sz="12" w:space="0" w:color="000000"/>
+              <w:right w:val="single" w:sz="12" w:space="0" w:color="000000"/>
+            </w:tcBorders>
+            <w:vAlign w:val="center"/>
+          </w:tcPr>
+          <w:p>
+            <w:pPr>
+              <w:jc w:val="left"/>
+            </w:pPr>
+            <w:r/>
+            <w:r>
+              <w:rPr>
+                <w:rFonts w:ascii="Times New Roman" w:hAnsi="Times New Roman"/>
+                <w:b w:val="0"/>
+                <w:sz w:val="22"/>
+              </w:rPr>
+              <w:t>2 weeks</w:t>
+            </w:r>
+          </w:p>
+        </w:tc>
+      </w:tr>
+      <w:tr>
+        <w:trPr>
+          <w:cantSplit/>
+        </w:trPr>
+        <w:tc>
+          <w:tcPr>
+            <w:tcW w:type="dxa" w:w="4153"/>
+            <w:tcBorders>
+              <w:top w:val="single" w:sz="12" w:space="0" w:color="000000"/>
+              <w:left w:val="single" w:sz="12" w:space="0" w:color="000000"/>
+              <w:bottom w:val="single" w:sz="12" w:space="0" w:color="000000"/>
+              <w:right w:val="single" w:sz="12" w:space="0" w:color="000000"/>
+            </w:tcBorders>
+            <w:vAlign w:val="center"/>
+          </w:tcPr>
+          <w:p>
+            <w:pPr>
+              <w:jc w:val="left"/>
+            </w:pPr>
+            <w:r/>
+            <w:r>
+              <w:rPr>
+                <w:rFonts w:ascii="Times New Roman" w:hAnsi="Times New Roman"/>
+                <w:b w:val="0"/>
+                <w:sz w:val="22"/>
+              </w:rPr>
+              <w:t>Pilot testing and coding finalization</w:t>
+            </w:r>
+          </w:p>
+        </w:tc>
+        <w:tc>
+          <w:tcPr>
+            <w:tcW w:type="dxa" w:w="4153"/>
+            <w:tcBorders>
+              <w:top w:val="single" w:sz="12" w:space="0" w:color="000000"/>
+              <w:left w:val="single" w:sz="12" w:space="0" w:color="000000"/>
+              <w:bottom w:val="single" w:sz="12" w:space="0" w:color="000000"/>
+              <w:right w:val="single" w:sz="12" w:space="0" w:color="000000"/>
+            </w:tcBorders>
+            <w:vAlign w:val="center"/>
+          </w:tcPr>
+          <w:p>
+            <w:pPr>
+              <w:jc w:val="left"/>
+            </w:pPr>
+            <w:r/>
+            <w:r>
+              <w:rPr>
+                <w:rFonts w:ascii="Times New Roman" w:hAnsi="Times New Roman"/>
+                <w:b w:val="0"/>
+                <w:sz w:val="22"/>
+              </w:rPr>
+              <w:t>2 weeks</w:t>
+            </w:r>
+          </w:p>
+        </w:tc>
+      </w:tr>
+      <w:tr>
+        <w:trPr>
+          <w:cantSplit/>
+        </w:trPr>
+        <w:tc>
+          <w:tcPr>
+            <w:tcW w:type="dxa" w:w="4153"/>
+            <w:tcBorders>
+              <w:top w:val="single" w:sz="12" w:space="0" w:color="000000"/>
+              <w:left w:val="single" w:sz="12" w:space="0" w:color="000000"/>
+              <w:bottom w:val="single" w:sz="12" w:space="0" w:color="000000"/>
+              <w:right w:val="single" w:sz="12" w:space="0" w:color="000000"/>
+            </w:tcBorders>
+            <w:vAlign w:val="center"/>
+          </w:tcPr>
+          <w:p>
+            <w:pPr>
+              <w:jc w:val="left"/>
+            </w:pPr>
+            <w:r/>
+            <w:r>
+              <w:rPr>
+                <w:rFonts w:ascii="Times New Roman" w:hAnsi="Times New Roman"/>
+                <w:b w:val="0"/>
+                <w:sz w:val="22"/>
+              </w:rPr>
+              <w:t>Full coding and frequency analysis</w:t>
+            </w:r>
+          </w:p>
+        </w:tc>
+        <w:tc>
+          <w:tcPr>
+            <w:tcW w:type="dxa" w:w="4153"/>
+            <w:tcBorders>
+              <w:top w:val="single" w:sz="12" w:space="0" w:color="000000"/>
+              <w:left w:val="single" w:sz="12" w:space="0" w:color="000000"/>
+              <w:bottom w:val="single" w:sz="12" w:space="0" w:color="000000"/>
+              <w:right w:val="single" w:sz="12" w:space="0" w:color="000000"/>
+            </w:tcBorders>
+            <w:vAlign w:val="center"/>
+          </w:tcPr>
+          <w:p>
+            <w:pPr>
+              <w:jc w:val="left"/>
+            </w:pPr>
+            <w:r/>
+            <w:r>
+              <w:rPr>
+                <w:rFonts w:ascii="Times New Roman" w:hAnsi="Times New Roman"/>
+                <w:b w:val="0"/>
+                <w:sz w:val="22"/>
+              </w:rPr>
+              <w:t>8 weeks (about 10 hours per week)</w:t>
+            </w:r>
+          </w:p>
+        </w:tc>
+      </w:tr>
+      <w:tr>
+        <w:trPr>
+          <w:cantSplit/>
+        </w:trPr>
+        <w:tc>
+          <w:tcPr>
+            <w:tcW w:type="dxa" w:w="4153"/>
+            <w:tcBorders>
+              <w:top w:val="single" w:sz="12" w:space="0" w:color="000000"/>
+              <w:left w:val="single" w:sz="12" w:space="0" w:color="000000"/>
+              <w:bottom w:val="single" w:sz="12" w:space="0" w:color="000000"/>
+              <w:right w:val="single" w:sz="12" w:space="0" w:color="000000"/>
+            </w:tcBorders>
+            <w:vAlign w:val="center"/>
+          </w:tcPr>
+          <w:p>
+            <w:pPr>
+              <w:jc w:val="left"/>
+            </w:pPr>
+            <w:r/>
+            <w:r>
+              <w:rPr>
+                <w:rFonts w:ascii="Times New Roman" w:hAnsi="Times New Roman"/>
+                <w:b w:val="0"/>
+                <w:sz w:val="22"/>
+              </w:rPr>
+              <w:t>Writing and revision</w:t>
+            </w:r>
+          </w:p>
+        </w:tc>
+        <w:tc>
+          <w:tcPr>
+            <w:tcW w:type="dxa" w:w="4153"/>
+            <w:tcBorders>
+              <w:top w:val="single" w:sz="12" w:space="0" w:color="000000"/>
+              <w:left w:val="single" w:sz="12" w:space="0" w:color="000000"/>
+              <w:bottom w:val="single" w:sz="12" w:space="0" w:color="000000"/>
+              <w:right w:val="single" w:sz="12" w:space="0" w:color="000000"/>
+            </w:tcBorders>
+            <w:vAlign w:val="center"/>
+          </w:tcPr>
+          <w:p>
+            <w:pPr>
+              <w:jc w:val="left"/>
+            </w:pPr>
+            <w:r/>
+            <w:r>
+              <w:rPr>
+                <w:rFonts w:ascii="Times New Roman" w:hAnsi="Times New Roman"/>
+                <w:b w:val="0"/>
+                <w:sz w:val="22"/>
+              </w:rPr>
+              <w:t>8 weeks</w:t>
+            </w:r>
+          </w:p>
+        </w:tc>
+      </w:tr>
+      <w:tr>
+        <w:trPr>
+          <w:cantSplit/>
+        </w:trPr>
+        <w:tc>
+          <w:tcPr>
+            <w:tcW w:type="dxa" w:w="4153"/>
+            <w:tcBorders>
+              <w:top w:val="single" w:sz="12" w:space="0" w:color="000000"/>
+              <w:left w:val="single" w:sz="12" w:space="0" w:color="000000"/>
+              <w:bottom w:val="single" w:sz="12" w:space="0" w:color="000000"/>
+              <w:right w:val="single" w:sz="12" w:space="0" w:color="000000"/>
+            </w:tcBorders>
+            <w:vAlign w:val="center"/>
+            <w:shd w:fill="F2F2F2" w:val="clear"/>
+          </w:tcPr>
+          <w:p>
+            <w:pPr>
+              <w:jc w:val="left"/>
+            </w:pPr>
+            <w:r/>
+            <w:r>
+              <w:rPr>
+                <w:rFonts w:ascii="Times New Roman" w:hAnsi="Times New Roman"/>
+                <w:b/>
+                <w:sz w:val="22"/>
+              </w:rPr>
+              <w:t>Total</w:t>
+            </w:r>
+          </w:p>
+        </w:tc>
+        <w:tc>
+          <w:tcPr>
+            <w:tcW w:type="dxa" w:w="4153"/>
+            <w:tcBorders>
+              <w:top w:val="single" w:sz="12" w:space="0" w:color="000000"/>
+              <w:left w:val="single" w:sz="12" w:space="0" w:color="000000"/>
+              <w:bottom w:val="single" w:sz="12" w:space="0" w:color="000000"/>
+              <w:right w:val="single" w:sz="12" w:space="0" w:color="000000"/>
+            </w:tcBorders>
+            <w:vAlign w:val="center"/>
+            <w:shd w:fill="F2F2F2" w:val="clear"/>
+          </w:tcPr>
+          <w:p>
+            <w:pPr>
+              <w:jc w:val="left"/>
+            </w:pPr>
+            <w:r/>
+            <w:r>
+              <w:rPr>
+                <w:rFonts w:ascii="Times New Roman" w:hAnsi="Times New Roman"/>
+                <w:b/>
+                <w:sz w:val="22"/>
+              </w:rPr>
+              <w:t>About 5.5 months (24 weeks)</w:t>
+            </w:r>
+          </w:p>
+        </w:tc>
+      </w:tr>
+    </w:tbl>
     <w:p>
       <w:pPr>
         <w:keepNext w:val="1"/>

</xml_diff>

<commit_message>
Draft_124: L2 outside thematic, Figure 1 order, criteria bullets, caption align, CAR, Appendix headers
</commit_message>
<xml_diff>
--- a/thesis/003_ThesisProposal_Draft_124_body.docx
+++ b/thesis/003_ThesisProposal_Draft_124_body.docx
@@ -27,7 +27,7 @@
     <w:p>
       <w:pPr>
         <w:spacing w:after="0" w:before="0" w:line="480" w:lineRule="auto"/>
-        <w:jc w:val="center"/>
+        <w:jc w:val="left"/>
         <w:rPr>
           <w:sz w:val="28"/>
           <w:szCs w:val="28"/>
@@ -52,7 +52,7 @@
     <w:p>
       <w:pPr>
         <w:spacing w:after="0" w:before="0" w:line="480" w:lineRule="auto"/>
-        <w:jc w:val="center"/>
+        <w:jc w:val="left"/>
         <w:rPr>
           <w:sz w:val="28"/>
           <w:szCs w:val="28"/>
@@ -101,6 +101,84 @@
     <w:p>
       <w:pPr>
         <w:spacing w:after="0" w:before="0" w:line="480" w:lineRule="auto"/>
+        <w:jc w:val="left"/>
+        <w:rPr/>
+      </w:pPr>
+      <w:r>
+        <w:rPr>
+          <w:rtl w:val="0"/>
+        </w:rPr>
+        <w:t xml:space="preserve">A Thesis</w:t>
+      </w:r>
+    </w:p>
+    <w:p>
+      <w:pPr>
+        <w:spacing w:after="0" w:before="0" w:line="480" w:lineRule="auto"/>
+        <w:jc w:val="left"/>
+        <w:rPr/>
+      </w:pPr>
+      <w:r>
+        <w:rPr>
+          <w:rtl w:val="0"/>
+        </w:rPr>
+        <w:t xml:space="preserve">Presented to the Faculty of</w:t>
+      </w:r>
+    </w:p>
+    <w:p>
+      <w:pPr>
+        <w:spacing w:after="0" w:before="0" w:line="480" w:lineRule="auto"/>
+        <w:jc w:val="left"/>
+        <w:rPr/>
+      </w:pPr>
+      <w:r>
+        <w:rPr>
+          <w:rtl w:val="0"/>
+        </w:rPr>
+        <w:t xml:space="preserve">Department of English</w:t>
+      </w:r>
+    </w:p>
+    <w:p>
+      <w:pPr>
+        <w:spacing w:after="0" w:before="0" w:line="480" w:lineRule="auto"/>
+        <w:jc w:val="left"/>
+        <w:rPr/>
+      </w:pPr>
+      <w:r>
+        <w:rPr>
+          <w:rtl w:val="0"/>
+        </w:rPr>
+        <w:t xml:space="preserve">College of Arts and Sciences</w:t>
+      </w:r>
+    </w:p>
+    <w:p>
+      <w:pPr>
+        <w:spacing w:after="0" w:before="0" w:line="480" w:lineRule="auto"/>
+        <w:jc w:val="left"/>
+        <w:rPr/>
+      </w:pPr>
+      <w:r>
+        <w:rPr>
+          <w:rtl w:val="0"/>
+        </w:rPr>
+        <w:t xml:space="preserve">Pampanga State Agricultural University</w:t>
+      </w:r>
+    </w:p>
+    <w:p>
+      <w:pPr>
+        <w:spacing w:after="0" w:before="0" w:line="480" w:lineRule="auto"/>
+        <w:jc w:val="left"/>
+        <w:rPr/>
+      </w:pPr>
+      <w:r>
+        <w:rPr>
+          <w:rtl w:val="0"/>
+        </w:rPr>
+        <w:t xml:space="preserve">Magalang, Pampanga</w:t>
+      </w:r>
+    </w:p>
+    <w:p>
+      <w:pPr>
+        <w:spacing w:after="0" w:before="0" w:line="480" w:lineRule="auto"/>
         <w:jc w:val="center"/>
         <w:rPr/>
       </w:pPr>
@@ -108,7 +186,6 @@
         <w:rPr>
           <w:rtl w:val="0"/>
         </w:rPr>
-        <w:t xml:space="preserve">A Thesis</w:t>
       </w:r>
     </w:p>
     <w:p>
@@ -121,7 +198,45 @@
         <w:rPr>
           <w:rtl w:val="0"/>
         </w:rPr>
-        <w:t xml:space="preserve">Presented to the Faculty of</w:t>
+      </w:r>
+    </w:p>
+    <w:p>
+      <w:pPr>
+        <w:spacing w:after="0" w:before="0" w:line="480" w:lineRule="auto"/>
+        <w:jc w:val="left"/>
+        <w:rPr/>
+      </w:pPr>
+      <w:r>
+        <w:rPr>
+          <w:rtl w:val="0"/>
+        </w:rPr>
+        <w:t xml:space="preserve">In Partial Fulfillment</w:t>
+      </w:r>
+    </w:p>
+    <w:p>
+      <w:pPr>
+        <w:spacing w:after="0" w:before="0" w:line="480" w:lineRule="auto"/>
+        <w:jc w:val="left"/>
+        <w:rPr/>
+      </w:pPr>
+      <w:r>
+        <w:rPr>
+          <w:rtl w:val="0"/>
+        </w:rPr>
+        <w:t xml:space="preserve">of the Requirements for the Degree</w:t>
+      </w:r>
+    </w:p>
+    <w:p>
+      <w:pPr>
+        <w:spacing w:after="0" w:before="0" w:line="480" w:lineRule="auto"/>
+        <w:jc w:val="left"/>
+        <w:rPr/>
+      </w:pPr>
+      <w:r>
+        <w:rPr>
+          <w:rtl w:val="0"/>
+        </w:rPr>
+        <w:t xml:space="preserve">BACHELOR OF ARTS IN ENGLISH LANGUAGE STUDIES</w:t>
       </w:r>
     </w:p>
     <w:p>
@@ -134,7 +249,6 @@
         <w:rPr>
           <w:rtl w:val="0"/>
         </w:rPr>
-        <w:t xml:space="preserve">Department of English</w:t>
       </w:r>
     </w:p>
     <w:p>
@@ -147,11 +261,25 @@
         <w:rPr>
           <w:rtl w:val="0"/>
         </w:rPr>
-        <w:t xml:space="preserve">College of Arts and Sciences</w:t>
-      </w:r>
-    </w:p>
-    <w:p>
-      <w:pPr>
+      </w:r>
+    </w:p>
+    <w:p>
+      <w:pPr>
+        <w:keepNext w:val="1"/>
+        <w:spacing w:after="0" w:before="0" w:line="480" w:lineRule="auto"/>
+        <w:jc w:val="left"/>
+        <w:rPr/>
+      </w:pPr>
+      <w:r>
+        <w:rPr>
+          <w:rtl w:val="0"/>
+        </w:rPr>
+        <w:t xml:space="preserve">By</w:t>
+      </w:r>
+    </w:p>
+    <w:p>
+      <w:pPr>
+        <w:keepNext w:val="1"/>
         <w:spacing w:after="0" w:before="0" w:line="480" w:lineRule="auto"/>
         <w:jc w:val="center"/>
         <w:rPr/>
@@ -160,11 +288,11 @@
         <w:rPr>
           <w:rtl w:val="0"/>
         </w:rPr>
-        <w:t xml:space="preserve">Pampanga State Agricultural University</w:t>
-      </w:r>
-    </w:p>
-    <w:p>
-      <w:pPr>
+      </w:r>
+    </w:p>
+    <w:p>
+      <w:pPr>
+        <w:keepNext w:val="1"/>
         <w:spacing w:after="0" w:before="0" w:line="480" w:lineRule="auto"/>
         <w:jc w:val="center"/>
         <w:rPr/>
@@ -173,11 +301,11 @@
         <w:rPr>
           <w:rtl w:val="0"/>
         </w:rPr>
-        <w:t xml:space="preserve">Magalang, Pampanga</w:t>
-      </w:r>
-    </w:p>
-    <w:p>
-      <w:pPr>
+      </w:r>
+    </w:p>
+    <w:p>
+      <w:pPr>
+        <w:keepNext w:val="1"/>
         <w:spacing w:after="0" w:before="0" w:line="480" w:lineRule="auto"/>
         <w:jc w:val="center"/>
         <w:rPr/>
@@ -190,6 +318,7 @@
     </w:p>
     <w:p>
       <w:pPr>
+        <w:keepNext w:val="1"/>
         <w:spacing w:after="0" w:before="0" w:line="480" w:lineRule="auto"/>
         <w:jc w:val="center"/>
         <w:rPr/>
@@ -202,6 +331,7 @@
     </w:p>
     <w:p>
       <w:pPr>
+        <w:keepNext w:val="1"/>
         <w:spacing w:after="0" w:before="0" w:line="480" w:lineRule="auto"/>
         <w:jc w:val="center"/>
         <w:rPr/>
@@ -210,143 +340,13 @@
         <w:rPr>
           <w:rtl w:val="0"/>
         </w:rPr>
-        <w:t xml:space="preserve">In Partial Fulfillment</w:t>
-      </w:r>
-    </w:p>
-    <w:p>
-      <w:pPr>
-        <w:spacing w:after="0" w:before="0" w:line="480" w:lineRule="auto"/>
-        <w:jc w:val="center"/>
-        <w:rPr/>
-      </w:pPr>
-      <w:r>
-        <w:rPr>
-          <w:rtl w:val="0"/>
-        </w:rPr>
-        <w:t xml:space="preserve">of the Requirements for the Degree</w:t>
-      </w:r>
-    </w:p>
-    <w:p>
-      <w:pPr>
-        <w:spacing w:after="0" w:before="0" w:line="480" w:lineRule="auto"/>
-        <w:jc w:val="center"/>
-        <w:rPr/>
-      </w:pPr>
-      <w:r>
-        <w:rPr>
-          <w:rtl w:val="0"/>
-        </w:rPr>
-        <w:t xml:space="preserve">BACHELOR OF ARTS IN ENGLISH LANGUAGE STUDIES</w:t>
-      </w:r>
-    </w:p>
-    <w:p>
-      <w:pPr>
-        <w:spacing w:after="0" w:before="0" w:line="480" w:lineRule="auto"/>
-        <w:jc w:val="center"/>
-        <w:rPr/>
-      </w:pPr>
-      <w:r>
-        <w:rPr>
-          <w:rtl w:val="0"/>
-        </w:rPr>
-      </w:r>
-    </w:p>
-    <w:p>
-      <w:pPr>
-        <w:spacing w:after="0" w:before="0" w:line="480" w:lineRule="auto"/>
-        <w:jc w:val="center"/>
-        <w:rPr/>
-      </w:pPr>
-      <w:r>
-        <w:rPr>
-          <w:rtl w:val="0"/>
-        </w:rPr>
       </w:r>
     </w:p>
     <w:p>
       <w:pPr>
         <w:keepNext w:val="1"/>
         <w:spacing w:after="0" w:before="0" w:line="480" w:lineRule="auto"/>
-        <w:jc w:val="center"/>
-        <w:rPr/>
-      </w:pPr>
-      <w:r>
-        <w:rPr>
-          <w:rtl w:val="0"/>
-        </w:rPr>
-        <w:t xml:space="preserve">By</w:t>
-      </w:r>
-    </w:p>
-    <w:p>
-      <w:pPr>
-        <w:keepNext w:val="1"/>
-        <w:spacing w:after="0" w:before="0" w:line="480" w:lineRule="auto"/>
-        <w:jc w:val="center"/>
-        <w:rPr/>
-      </w:pPr>
-      <w:r>
-        <w:rPr>
-          <w:rtl w:val="0"/>
-        </w:rPr>
-      </w:r>
-    </w:p>
-    <w:p>
-      <w:pPr>
-        <w:keepNext w:val="1"/>
-        <w:spacing w:after="0" w:before="0" w:line="480" w:lineRule="auto"/>
-        <w:jc w:val="center"/>
-        <w:rPr/>
-      </w:pPr>
-      <w:r>
-        <w:rPr>
-          <w:rtl w:val="0"/>
-        </w:rPr>
-      </w:r>
-    </w:p>
-    <w:p>
-      <w:pPr>
-        <w:keepNext w:val="1"/>
-        <w:spacing w:after="0" w:before="0" w:line="480" w:lineRule="auto"/>
-        <w:jc w:val="center"/>
-        <w:rPr/>
-      </w:pPr>
-      <w:r>
-        <w:rPr>
-          <w:rtl w:val="0"/>
-        </w:rPr>
-      </w:r>
-    </w:p>
-    <w:p>
-      <w:pPr>
-        <w:keepNext w:val="1"/>
-        <w:spacing w:after="0" w:before="0" w:line="480" w:lineRule="auto"/>
-        <w:jc w:val="center"/>
-        <w:rPr/>
-      </w:pPr>
-      <w:r>
-        <w:rPr>
-          <w:rtl w:val="0"/>
-        </w:rPr>
-      </w:r>
-    </w:p>
-    <w:p>
-      <w:pPr>
-        <w:keepNext w:val="1"/>
-        <w:spacing w:after="0" w:before="0" w:line="480" w:lineRule="auto"/>
-        <w:jc w:val="center"/>
-        <w:rPr/>
-      </w:pPr>
-      <w:r>
-        <w:rPr>
-          <w:rtl w:val="0"/>
-        </w:rPr>
-      </w:r>
-    </w:p>
-    <w:p>
-      <w:pPr>
-        <w:keepNext w:val="1"/>
-        <w:spacing w:after="0" w:before="0" w:line="480" w:lineRule="auto"/>
-        <w:jc w:val="center"/>
+        <w:jc w:val="left"/>
         <w:rPr/>
       </w:pPr>
       <w:r>
@@ -367,7 +367,7 @@
       <w:pPr>
         <w:keepLines w:val="1"/>
         <w:spacing w:after="0" w:before="0" w:line="480" w:lineRule="auto"/>
-        <w:jc w:val="center"/>
+        <w:jc w:val="left"/>
         <w:rPr/>
         <w:sectPr>
           <w:headerReference r:id="rId6" w:type="default"/>
@@ -392,7 +392,7 @@
       <w:pPr>
         <w:spacing w:after="240" w:before="720" w:line="480" w:lineRule="auto"/>
         <w:ind w:firstLine="0"/>
-        <w:jc w:val="center"/>
+        <w:jc w:val="left"/>
         <w:rPr>
           <w:sz w:val="28"/>
           <w:szCs w:val="28"/>
@@ -582,7 +582,7 @@
           <w:rFonts w:ascii="Georgia" w:hAnsi="Georgia" w:cs="Georgia"/>
           <w:sz w:val="22"/>
         </w:rPr>
-        <w:t>Ghia et al. (2022) supply one of the clearest abstract-focused accounts. They built a corpus of 217 English-language bachelor’s thesis abstracts written by advanced Italian EFL undergraduates specializing in linguistic and cross-cultural mediation, totaling 287,048 words, and compared hedge use with a subsection of successful L1 student writing in MICUSP. Fifteen hedge forms were set against boosters and modals of logical possibility and inferential certainty. The EFL abstracts used fewer hedges overall and leaned more on boosters and on modals of epistemic certainty than the L1 comparison group. At the same time, patterns in the two corpora still showed parallelisms, which the authors read as awareness of hedging strategies rather than absence of the concept. The study matters for the present work because it isolates the thesis abstract as a genre and shows that advanced L2 writers can under-hedge even when their programs center on language. Mazidah et al. (2022) compared hedges and boosters in 50 undergraduate thesis abstracts from Qomaruddin University: 25 from an English Language Education program and 25 from a Mathematics program. Coding followed Hyland’s (2005) taxonomy throughout. Across the sample they recorded 53 hedge tokens (22 variants) against 130 booster tokens (17 variants), so boosters outnumbered hedges overall. Mathematics abstracts used more hedge tokens than the English-education abstracts, while the English-education group still showed a wider set of hedge word variants. The authors link student hedging to limited knowledge of English academic rhetoric. For the present study, the result underscores that undergraduate abstracts can favor certainty markers as much as caution, and that program differences need not follow a simple language-versus-science split.</w:t>
+        <w:t>Ghia et al. (2022) supply one of the clearest abstract-focused accounts. They built a corpus of 217 English-language bachelor’s thesis abstracts written by advanced Italian EFL undergraduates specializing in linguistic and cross-cultural mediation, totaling 287,048 words, and compared hedge use with a subsection of successful L1 student writing in MICUSP. Fifteen hedge forms were set against boosters and modals of logical possibility and inferential certainty. The EFL abstracts used fewer hedges overall and leaned more on boosters and on modals of epistemic certainty than the L1 comparison group. At the same time, patterns in the two corpora still showed parallelisms, which the authors read as awareness of hedging strategies rather than absence of the concept. The study matters for the present work because it isolates the thesis abstract as a genre and shows that advanced student writers can under-hedge even when their programs center on language. Mazidah et al. (2022) compared hedges and boosters in 50 undergraduate thesis abstracts from Qomaruddin University: 25 from an English Language Education program and 25 from a Mathematics program. Coding followed Hyland’s (2005) taxonomy throughout. Across the sample they recorded 53 hedge tokens (22 variants) against 130 booster tokens (17 variants), so boosters outnumbered hedges overall. Mathematics abstracts used more hedge tokens than the English-education abstracts, while the English-education group still showed a wider set of hedge word variants. The authors link student hedging to limited knowledge of English academic rhetoric. For the present study, the result underscores that undergraduate abstracts can favor certainty markers as much as caution, and that program differences need not follow a simple language-versus-science split.</w:t>
       </w:r>
     </w:p>
     <w:p>
@@ -616,7 +616,7 @@
           <w:rFonts w:ascii="Georgia" w:hAnsi="Georgia" w:cs="Georgia"/>
           <w:sz w:val="22"/>
         </w:rPr>
-        <w:t>Halabisaz et al. (2014) focus the comparison on thesis abstracts in applied linguistics. They sampled 300 master’s abstracts written between 2000 and 2013, split between English L1 writers and Iranian L2 writers, and coded hedges according to Crompton’s (1997) taxonomy. English L1 writers used more hedging devices overall, and L2 writers used fewer. The authors attribute the difference to rhetorical sensitivity, modality, awareness of audience and purpose, and cultural background. Because the unit of analysis is the thesis abstract, the study sits closer to the present design than full-paper comparisons do. It also shows that L1-L2 differences in hedging can appear even among writers who have completed substantial graduate coursework in a language-related field.</w:t>
+        <w:t>Halabisaz et al. (2014) focus the comparison on thesis abstracts in applied linguistics. They sampled 300 master’s abstracts written between 2000 and 2013, split between English L1 writers and Iranian student writers, and coded hedges according to Crompton’s (1997) taxonomy. English L1 writers used more hedging devices overall, and student writers used fewer. The authors attribute the difference to rhetorical sensitivity, modality, awareness of audience and purpose, and cultural background. Because the unit of analysis is the thesis abstract, the study sits closer to the present design than full-paper comparisons do. It also shows that L1-second-language differences in hedging can appear even among writers who have completed substantial graduate coursework in a language-related field.</w:t>
       </w:r>
     </w:p>
     <w:p>
@@ -630,7 +630,7 @@
           <w:rFonts w:ascii="Georgia" w:hAnsi="Georgia" w:cs="Georgia"/>
           <w:sz w:val="22"/>
         </w:rPr>
-        <w:t>Taken together, these studies show that undergraduate and master’s-level writers often under-deploy hedges, lean on a limited set of forms (often modals), and may differ by program without matching expert disciplinary profiles. Clear gaps remain for the present work: only a few of these studies examined abstracts specifically, and most of those focused on English or language majors rather than applied science programs. Others analyzed discussion sections or full papers, where rhetorical space is wider. None is set in a Philippine L2 context for Agriculture, Veterinary Medicine, and Biology undergraduate thesis abstracts.</w:t>
+        <w:t>Taken together, these studies show that undergraduate and master’s-level writers often under-deploy hedges, lean on a limited set of forms (often modals), and may differ by program without matching expert disciplinary profiles. Clear gaps remain for the present work: only a few of these studies examined abstracts specifically, and most of those focused on English or language majors rather than applied science programs. Others analyzed discussion sections or full papers, where rhetorical space is wider. None is set in a Philippine context for Agriculture, Veterinary Medicine, and Biology undergraduate thesis abstracts.</w:t>
       </w:r>
     </w:p>
     <w:p>
@@ -809,7 +809,7 @@
           <w:rFonts w:ascii="Georgia" w:hAnsi="Georgia" w:eastAsia="Georgia"/>
           <w:sz w:val="22"/>
         </w:rPr>
-        <w:t>Expert scientific English therefore shows measurable variation, but the variation is local to how each field, section, medium, and publication context handles evidence and claim risk. In medical and clinical writing, that local pattern includes categorical reporting of measured results and denser hedging when claims move into interpretation. For developing writers in L2 settings, the expert picture is a target rather than a description of current practice. The present study asks whether PSAU undergraduates in three applied programs already show any of that field-sensitive differentiation in the compressed genre of the thesis abstract.</w:t>
+        <w:t>Expert scientific English therefore shows measurable variation, but the variation is local to how each field, section, medium, and publication context handles evidence and claim risk. In medical and clinical writing, that local pattern includes categorical reporting of measured results and denser hedging when claims move into interpretation. For developing writers in second-language settings, the expert picture is a target rather than a description of current practice. The present study asks whether PSAU undergraduates in three applied programs already show any of that field-sensitive differentiation in the compressed genre of the thesis abstract.</w:t>
       </w:r>
     </w:p>
     <w:p>
@@ -954,7 +954,7 @@
         <w:rPr>
           <w:rFonts w:ascii="Georgia" w:hAnsi="Georgia" w:cs="Georgia"/>
         </w:rPr>
-        <w:t>Philippine and regional findings align with the broader L2 picture while adding local detail. Ningrum et al. (2024) analysed academic writing from the ICNALE learner corpus across ten ASEAN contexts, including the Philippines. ASEAN EFL learners preferred boosters over hedges. Overused boosters included completely, really, and always, while the most frequent hedges included usually, often, and maybe. The pattern suggests that regional learners often encode confidence more readily than caution in academic prose.</w:t>
+        <w:t>Philippine and regional findings align with the broader picture of English-medium student writing while adding local detail. Ningrum et al. (2024) analysed academic writing from the ICNALE learner corpus across ten ASEAN contexts, including the Philippines. ASEAN EFL learners preferred boosters over hedges. Overused boosters included completely, really, and always, while the most frequent hedges included usually, often, and maybe. The pattern suggests that regional learners often encode confidence more readily than caution in academic prose.</w:t>
       </w:r>
     </w:p>
     <w:p>
@@ -1010,7 +1010,7 @@
         <w:rPr>
           <w:rFonts w:ascii="Georgia" w:hAnsi="Georgia" w:cs="Georgia"/>
         </w:rPr>
-        <w:t xml:space="preserve">Outside student essays and research articles, Philippine editorial writing shows hedging as a context-sensitive resource rather than a fixed national style. Villanueva (2014) examined 30 editorials from three leading Philippine newspapers and found that nearly half of the hedges were references to official reports or authorities, with modals and adverbs making up a little over 30 percent. Those forms helped editors manage accountability and soften claims on politically sensitive topics. Grengia (2025) extended the editorial analysis to student publications, The Philippine Collegian and The LaSallian, and found deliberate but publication-specific hedge use tied to voice, audience, and rhetorical goals. Taken together, the Philippine evidence shows modal-heavy inventories, frequent booster preference in learner writing, and higher hedge density in some professional Filipino ELT research than in comparable EFL contexts. No published study identified in this review has examined hedging in undergraduate thesis abstracts from applied life sciences in a Philippine L2 setting. That gap is the present study's descriptive starting point.</w:t>
+        <w:t>Outside student essays and research articles, Philippine editorial writing shows hedging as a context-sensitive resource rather than a fixed national style. Villanueva (2014) examined 30 editorials from three leading Philippine newspapers and found that nearly half of the hedges were references to official reports or authorities, with modals and adverbs making up a little over 30 percent. Those forms helped editors manage accountability and soften claims on politically sensitive topics. Grengia (2025) extended the editorial analysis to student publications, The Philippine Collegian and The LaSallian, and found deliberate but publication-specific hedge use tied to voice, audience, and rhetorical goals. Taken together, the Philippine evidence shows modal-heavy inventories, frequent booster preference in learner writing, and higher hedge density in some professional Filipino ELT research than in comparable EFL contexts. No published study identified in this review has examined hedging in undergraduate thesis abstracts from applied life sciences in a Philippine setting. That gap is the present study's descriptive starting point.</w:t>
       </w:r>
     </w:p>
     <w:p>
@@ -1061,7 +1061,7 @@
         <w:rPr>
           <w:rFonts w:ascii="Georgia" w:hAnsi="Georgia" w:cs="Georgia"/>
         </w:rPr>
-        <w:t>Thesis and dissertation abstracts written by developing researchers add a second layer. Wahyuningsih and Sofwan (2014) analyzed hedges in graduate thesis abstracts at Semarang State University across five programs: English, Mathematics, Science, Social, and Education Management. Lexical hedges were coded with Salager-Meyer's (1994) and Hyland's (1998) taxonomies, and non-lexical forms followed Navratilova (2013). English, Social, and Education Management abstracts used more hedges than Mathematics and Science. English led the lexical counts overall. Agentless passives were the dominant non-lexical form in every program. The authors link higher soft-field density to interpretive claims and lower hard-field density to measurement-based reporting. The study shows that disciplinary contrast appears inside the thesis abstract even when writers share one institution and one L2 medium.</w:t>
+        <w:t>Thesis and dissertation abstracts written by developing researchers add a second layer. Wahyuningsih and Sofwan (2014) analyzed hedges in graduate thesis abstracts at Semarang State University across five programs: English, Mathematics, Science, Social, and Education Management. Lexical hedges were coded with Salager-Meyer's (1994) and Hyland's (1998) taxonomies, and non-lexical forms followed Navratilova (2013). English, Social, and Education Management abstracts used more hedges than Mathematics and Science. English led the lexical counts overall. Agentless passives were the dominant non-lexical form in every program. The authors link higher soft-field density to interpretive claims and lower hard-field density to measurement-based reporting. The study shows that disciplinary contrast appears inside the thesis abstract even when writers share one institution and one English medium.</w:t>
       </w:r>
     </w:p>
     <w:p>
@@ -1077,7 +1077,7 @@
         <w:jc w:val="both"/>
       </w:pPr>
       <w:r>
-        <w:t>Al-Zarieni and Alkhresheh (2024) studied hedges and boosters in 30 linguistics M.A. thesis abstracts at Yarmouk University, following Hyland's (2005) interpersonal model. Hedges outnumbered boosters (117 to 60, or 66% to 34% of the combined set). Hedges were read as ways of limiting opposition risk, marking politeness, and presenting results cautiously. Boosters were used to assert originality and stress certainty. The study adds an Arabic L2 postgraduate linguistics sample to the abstract-focused record and shows that even language-focused programs still balance caution against certainty marking under abstract constraints.</w:t>
+        <w:t>Al-Zarieni and Alkhresheh (2024) studied hedges and boosters in 30 linguistics M.A. thesis abstracts at Yarmouk University, following Hyland's (2005) interpersonal model. Hedges outnumbered boosters (117 to 60, or 66% to 34% of the combined set). Hedges were read as ways of limiting opposition risk, marking politeness, and presenting results cautiously. Boosters were used to assert originality and stress certainty. The study adds an Arabic postgraduate linguistics sample to the abstract-focused record and shows that even language-focused programs still balance caution against certainty marking under abstract constraints.</w:t>
       </w:r>
     </w:p>
     <w:p>
@@ -1118,15 +1118,15 @@
         <w:rPr>
           <w:rtl w:val="0"/>
         </w:rPr>
-        <w:t>What the review establishes is a set of durable patterns rather than a single ranking of fields. Expert writers adjust hedge density and form mix to the epistemic demands of their work, and that adjustment is visible even inside the short abstract. Density alone does not tell the full story. Form mix, interpersonal orientation, and the move in which a hedge appears also vary by field and by communicative purpose. Developing researchers, including advanced L2 writers, typically work with a smaller set of forms and lean on modals. That restriction holds not only in abstracts, where length pressure is high, but also in longer sections such as discussions, which suggests a developing stance repertoire rather than a pure genre effect. Regional student writing often pairs the modal preference with relatively strong boosting, so caution and certainty marking coexist in the same short texts rather than trading off cleanly.</w:t>
-      </w:r>
-    </w:p>
-    <w:p>
-      <w:pPr>
-        <w:jc w:val="both"/>
-      </w:pPr>
-      <w:r>
-        <w:t>Thesis and dissertation abstracts written by students add a further constraint. Soft-versus-hard density contrasts and program-level differences in interpersonal orientation appear inside that genre, yet almost all of that evidence comes from language, education, or social-science programs. Applied life sciences sit in a different relation to evidence. Claims are often tied to experimental outcomes, clinical observation, or field measurement, and the abstract must still package those claims under strict length limits. The open question is not whether undergraduates hedge at all. It is whether disciplinary differentiation of the kind documented for experts and for student writers in other fields appears inside applied life-science thesis abstracts under Philippine L2 institutional conditions, and whether that differentiation shows up in density, form mix, function, or some combination of the three.</w:t>
+        <w:t>What the review establishes is a set of durable patterns rather than a single ranking of fields. Expert writers adjust hedge density and form mix to the epistemic demands of their work, and that adjustment is visible even inside the short abstract. Density alone does not tell the full story. Form mix, interpersonal orientation, and the move in which a hedge appears also vary by field and by communicative purpose. Developing researchers, including advanced student writers, typically work with a smaller set of forms and lean on modals. That restriction holds not only in abstracts, where length pressure is high, but also in longer sections such as discussions, which suggests a developing stance repertoire rather than a pure genre effect. Regional student writing often pairs the modal preference with relatively strong boosting, so caution and certainty marking coexist in the same short texts rather than trading off cleanly.</w:t>
+      </w:r>
+    </w:p>
+    <w:p>
+      <w:pPr>
+        <w:jc w:val="both"/>
+      </w:pPr>
+      <w:r>
+        <w:t>Thesis and dissertation abstracts written by students add a further constraint. Soft-versus-hard density contrasts and program-level differences in interpersonal orientation appear inside that genre, yet almost all of that evidence comes from language, education, or social-science programs. Applied life sciences sit in a different relation to evidence. Claims are often tied to experimental outcomes, clinical observation, or field measurement, and the abstract must still package those claims under strict length limits. The open question is not whether undergraduates hedge at all. It is whether disciplinary differentiation of the kind documented for experts and for student writers in other fields appears inside applied life-science thesis abstracts under Philippine institutional conditions, and whether that differentiation shows up in density, form mix, function, or some combination of the three.</w:t>
       </w:r>
     </w:p>
     <w:p>
@@ -1159,15 +1159,15 @@
         <w:rPr>
           <w:rtl w:val="0"/>
         </w:rPr>
-        <w:t>The empirical gap was checked through searches of Google Scholar, ERIC, and ScienceDirect (2010–2025) using combinations of hedging, hedges, epistemic stance, undergraduate, thesis abstract, research abstract, Agriculture, Veterinary Medicine, Biology, Philippines, and L2, with follow-up citation chaining from key reviews and regional studies cited above. No published study identified in that search has examined hedging in undergraduate thesis abstracts from applied science disciplines in a Philippine L2 context.</w:t>
-      </w:r>
-    </w:p>
-    <w:p>
-      <w:pPr>
-        <w:jc w:val="both"/>
-      </w:pPr>
-      <w:r>
-        <w:t>The present study takes up that intersection at PSAU. It maps hedge type, density, and function across three applied life sciences programs that share one institution and one L2 medium but differ in how closely their claims are tied to experimental and clinical evidence. Agriculture, Veterinary Medicine, and Biology are treated as a local comparison set rather than as proxies for a global hard-or-soft divide. The aim is descriptive and comparative within that set: to show what hedge patterns appear in ratified undergraduate abstracts in these programs, and to read those patterns against the definitional and disciplinary background laid out above.</w:t>
+        <w:t>The empirical gap was checked through searches of Google Scholar, ERIC, and ScienceDirect (2010–2025) using combinations of hedging, hedges, epistemic stance, undergraduate, thesis abstract, research abstract, Agriculture, Veterinary Medicine, Biology, Philippines, and second language, with follow-up citation chaining from key reviews and regional studies cited above. No published study identified in that search has examined hedging in undergraduate thesis abstracts from applied science disciplines in a Philippine context.</w:t>
+      </w:r>
+    </w:p>
+    <w:p>
+      <w:pPr>
+        <w:jc w:val="both"/>
+      </w:pPr>
+      <w:r>
+        <w:t>The present study takes up that intersection at PSAU. It maps hedge type, density, and function across three applied life sciences programs that share one institution and one English medium but differ in how closely their claims are tied to experimental and clinical evidence. Agriculture, Veterinary Medicine, and Biology are treated as a local comparison set rather than as proxies for a global hard-or-soft divide. The aim is descriptive and comparative within that set: to show what hedge patterns appear in ratified undergraduate abstracts in these programs, and to read those patterns against the definitional and disciplinary background laid out above.</w:t>
       </w:r>
     </w:p>
     <w:p>
@@ -1207,7 +1207,7 @@
         <w:rPr>
           <w:rtl w:val="0"/>
         </w:rPr>
-        <w:t xml:space="preserve">Academic writing in the applied life sciences requires discipline-sensitive management of uncertainty in English. For English Language Studies, that problem is about how L2 writers use the language’s resources for stance when they compress research into an abstract. Prior work shows that expert hedging varies across fields such as agriculture and the basic sciences, yet there is no local corpus baseline for whether developing researchers at PSAU reflect those distinctions in their English abstracts, or whether they rely on a generic, undifferentiated approach.</w:t>
+        <w:t>Academic writing in the applied life sciences requires discipline-sensitive management of uncertainty in English. For English Language Studies, that problem is about how student writers use the language’s resources for stance when they compress research into an abstract. Prior work shows that expert hedging varies across fields such as agriculture and the basic sciences, yet there is no local corpus baseline for whether developing researchers at PSAU reflect those distinctions in their English abstracts, or whether they rely on a generic, undifferentiated approach.</w:t>
       </w:r>
     </w:p>
     <w:p>
@@ -1325,7 +1325,7 @@
       <w:pPr>
         <w:keepNext w:val="1"/>
         <w:spacing w:after="0" w:before="360" w:line="480" w:lineRule="auto"/>
-        <w:jc w:val="center"/>
+        <w:jc w:val="left"/>
         <w:rPr/>
       </w:pPr>
       <w:r>
@@ -1340,6 +1340,54 @@
         <w:rPr>
           <w:rtl w:val="0"/>
         </w:rPr>
+      </w:r>
+    </w:p>
+    <w:p>
+      <w:pPr>
+        <w:spacing w:after="0" w:before="0" w:line="480" w:lineRule="auto"/>
+        <w:jc w:val="left"/>
+        <w:rPr/>
+      </w:pPr>
+      <w:r>
+        <w:rPr>
+          <w:i w:val="1"/>
+          <w:iCs w:val="1"/>
+          <w:rtl w:val="0"/>
+        </w:rPr>
+        <w:t xml:space="preserve">Conceptual Framework of the Study</w:t>
+      </w:r>
+      <w:r>
+        <w:rPr>
+          <w:rtl w:val="0"/>
+        </w:rPr>
+      </w:r>
+    </w:p>
+    <w:p>
+      <w:pPr>
+        <w:spacing w:after="0" w:before="0" w:line="480" w:lineRule="auto"/>
+        <w:ind w:firstLine="720"/>
+        <w:jc w:val="both"/>
+        <w:rPr/>
+      </w:pPr>
+      <w:r>
+        <w:rPr>
+          <w:rtl w:val="0"/>
+        </w:rPr>
+        <w:t>Hyland (1998) is the type instrument and the broad start for epistemic caution and politeness/deference. Crompton (1997) supplies the boundary rule for epistemic caution alone: his restatement test operationalizes the Working Test for epistemic caution at Step 2. The study does not adopt Crompton’s full taxonomy. Salager-Meyer (1994) is an interpretive lens in Part IV. Her claim-responsibility account helps read density differences across programs. Hyland (2005) is a second interpretive lens. The stance model helps read what fewer hedges mean where results turn into implications. Neither interpretive lens is an operational coding criterion.</w:t>
+      </w:r>
+    </w:p>
+    <w:p>
+      <w:pPr>
+        <w:spacing w:after="0" w:before="0" w:line="480" w:lineRule="auto"/>
+        <w:ind w:firstLine="720"/>
+        <w:jc w:val="both"/>
+        <w:rPr/>
+      </w:pPr>
+      <w:r>
+        <w:rPr>
+          <w:rFonts w:ascii="Cardo" w:hAnsi="Cardo" w:cs="Cardo"/>
+        </w:rPr>
+        <w:t>Coding followed the decision rules in Appendix A. After a holistic reading of each abstract, Step 1 marked all possible hedge candidates without counting retained hedges. Step 2 applied a claim condition and two removal checks. Because a hedge changes the writer’s stance toward a proposition, the device must attach to a claim: a statement about data, the world, or prior work that evidence could show to be wrong. Aims, directives, and routine procedures are excluded by kind as a consequence of that definition, not as a coding convenience. Under the Working Test, the device is removed from the claim. If the writer’s commitment to the truth of the claim rises, the token is epistemic caution. Under the Reader Test, the device is removed from the claim. If commitment stays the same but the claim reaches the reader more bluntly, or the writer takes sole ownership against prior work, the token is politeness/deference. If neither check is met, the token is a false positive. Retention and function assignment are the same operation by design. A token qualifies as a hedge by passing at least one test, and which test it passes is its function. Epistemic caution and politeness/deference may be assigned together when a token both reduces commitment to the claim’s truth and softens how the claim meets the reader or prior work. In that case the Working Test still holds, and politeness/deference is recorded as a concurrent interpersonal reading rather than as a second independent pass of the Reader Test. The Reader Test alone is reserved for pure politeness/deference, where commitment does not rise. Step 3 assigned grammatical type only to retained epistemic caution and politeness/deference tokens. Residual rejects are labeled with reason codes such as recommendation, capability, procedure, or general false positive. Among retained hedges, the research questions on function ask how tokens split across epistemic caution and politeness/deference under this scope, not what functions hedges might serve outside it.</w:t>
       </w:r>
     </w:p>
     <w:p>
@@ -1391,54 +1439,6 @@
     </w:p>
     <w:p>
       <w:pPr>
-        <w:spacing w:after="0" w:before="0" w:line="480" w:lineRule="auto"/>
-        <w:jc w:val="center"/>
-        <w:rPr/>
-      </w:pPr>
-      <w:r>
-        <w:rPr>
-          <w:i w:val="1"/>
-          <w:iCs w:val="1"/>
-          <w:rtl w:val="0"/>
-        </w:rPr>
-        <w:t xml:space="preserve">Conceptual Framework of the Study</w:t>
-      </w:r>
-      <w:r>
-        <w:rPr>
-          <w:rtl w:val="0"/>
-        </w:rPr>
-      </w:r>
-    </w:p>
-    <w:p>
-      <w:pPr>
-        <w:spacing w:after="0" w:before="0" w:line="480" w:lineRule="auto"/>
-        <w:ind w:firstLine="720"/>
-        <w:jc w:val="both"/>
-        <w:rPr/>
-      </w:pPr>
-      <w:r>
-        <w:rPr>
-          <w:rtl w:val="0"/>
-        </w:rPr>
-        <w:t>Hyland (1998) is the type instrument and the broad start for epistemic caution and politeness/deference. Crompton (1997) supplies the boundary rule for epistemic caution alone: his restatement test operationalizes the Working Test for epistemic caution at Step 2. The study does not adopt Crompton’s full taxonomy. Salager-Meyer (1994) is an interpretive lens in Part IV. Her claim-responsibility account helps read density differences across programs. Hyland (2005) is a second interpretive lens. The stance model helps read what fewer hedges mean where results turn into implications. Neither interpretive lens is an operational coding criterion.</w:t>
-      </w:r>
-    </w:p>
-    <w:p>
-      <w:pPr>
-        <w:spacing w:after="0" w:before="0" w:line="480" w:lineRule="auto"/>
-        <w:ind w:firstLine="720"/>
-        <w:jc w:val="both"/>
-        <w:rPr/>
-      </w:pPr>
-      <w:r>
-        <w:rPr>
-          <w:rFonts w:ascii="Cardo" w:hAnsi="Cardo" w:cs="Cardo"/>
-        </w:rPr>
-        <w:t>Coding followed the decision rules in Appendix A. After a holistic reading of each abstract, Step 1 marked all possible hedge candidates without counting retained hedges. Step 2 applied a claim condition and two removal checks. Because a hedge changes the writer’s stance toward a proposition, the device must attach to a claim: a statement about data, the world, or prior work that evidence could show to be wrong. Aims, directives, and routine procedures are excluded by kind as a consequence of that definition, not as a coding convenience. Under the Working Test, the device is removed from the claim. If the writer’s commitment to the truth of the claim rises, the token is epistemic caution. Under the Reader Test, the device is removed from the claim. If commitment stays the same but the claim reaches the reader more bluntly, or the writer takes sole ownership against prior work, the token is politeness/deference. If neither check is met, the token is a false positive. Retention and function assignment are the same operation by design. A token qualifies as a hedge by passing at least one test, and which test it passes is its function. Epistemic caution and politeness/deference may be assigned together when a token both reduces commitment to the claim’s truth and softens how the claim meets the reader or prior work. In that case the Working Test still holds, and politeness/deference is recorded as a concurrent interpersonal reading rather than as a second independent pass of the Reader Test. The Reader Test alone is reserved for pure politeness/deference, where commitment does not rise. Step 3 assigned grammatical type only to retained epistemic caution and politeness/deference tokens. Residual rejects are labeled with reason codes such as recommendation, capability, procedure, or general false positive. Among retained hedges, the research questions on function ask how tokens split across epistemic caution and politeness/deference under this scope, not what functions hedges might serve outside it.</w:t>
-      </w:r>
-    </w:p>
-    <w:p>
-      <w:pPr>
         <w:keepNext w:val="1"/>
         <w:spacing w:after="120" w:before="240" w:line="480" w:lineRule="auto"/>
         <w:ind w:firstLine="0"/>
@@ -1632,7 +1632,7 @@
         <w:rPr>
           <w:rtl w:val="0"/>
         </w:rPr>
-        <w:t xml:space="preserve">The study is delimited to complete English-language abstracts. Abstracts with significant Filipino code-switching are excluded to maintain linguistic consistency. L2 proficiency is not measured, so the study makes no claims about learner English as such. Future work with proficiency controls could separate proficiency effects from disciplinary ones.</w:t>
+        <w:t>The study is delimited to complete English-language abstracts. Abstracts with significant Filipino code-switching are excluded to maintain linguistic consistency. English proficiency is not measured, so the study makes no claims about learner English as such. Future work with proficiency controls could separate proficiency effects from disciplinary ones.</w:t>
       </w:r>
     </w:p>
     <w:p>
@@ -2200,7 +2200,7 @@
       <w:pPr>
         <w:spacing w:after="240" w:before="720" w:line="480" w:lineRule="auto"/>
         <w:ind w:firstLine="0"/>
-        <w:jc w:val="center"/>
+        <w:jc w:val="left"/>
         <w:rPr>
           <w:sz w:val="28"/>
           <w:szCs w:val="28"/>
@@ -2300,7 +2300,7 @@
         <w:rPr>
           <w:rtl w:val="0"/>
         </w:rPr>
-        <w:t xml:space="preserve">The Philippine higher education context is relevant because English is the official medium of academic writing instruction at PSAU despite being a second language for most of the population. At PSAU, undergraduate writing instruction in the programs sampled for this study emphasizes structure and grammatical correctness more than stance. Hedging is not treated as a distinct rhetorical skill in the course materials reviewed for this project. Developing researchers writing thesis abstracts were therefore producing a genre that demanded hedging with limited explicit preparation for its epistemic requirements. These conditions made PSAU an appropriate institutional site for examining disciplinary hedging among developing researchers in a Philippine L2 context.</w:t>
+        <w:t>The Philippine higher education context is relevant because English is the official medium of academic writing instruction at PSAU despite being a second language for most of the population. At PSAU, undergraduate writing instruction in the programs sampled for this study emphasizes structure and grammatical correctness more than stance. Hedging is not treated as a distinct rhetorical skill in the course materials reviewed for this project. Developing researchers writing thesis abstracts were therefore producing a genre that demanded hedging with limited explicit preparation for its epistemic requirements. These conditions made PSAU an appropriate institutional site for examining disciplinary hedging among developing researchers in a Philippine context.</w:t>
       </w:r>
     </w:p>
     <w:p>
@@ -2612,7 +2612,7 @@
           </w:tcPr>
           <w:p>
             <w:pPr>
-              <w:jc w:val="left"/>
+              <w:jc w:val="center"/>
             </w:pPr>
             <w:r/>
             <w:r>
@@ -2638,7 +2638,7 @@
           </w:tcPr>
           <w:p>
             <w:pPr>
-              <w:jc w:val="left"/>
+              <w:jc w:val="center"/>
             </w:pPr>
             <w:r/>
             <w:r>
@@ -2669,7 +2669,7 @@
           </w:tcPr>
           <w:p>
             <w:pPr>
-              <w:jc w:val="left"/>
+              <w:jc w:val="center"/>
             </w:pPr>
             <w:r/>
             <w:r>
@@ -2695,7 +2695,7 @@
           </w:tcPr>
           <w:p>
             <w:pPr>
-              <w:jc w:val="left"/>
+              <w:jc w:val="center"/>
             </w:pPr>
             <w:r/>
             <w:r>
@@ -2726,7 +2726,7 @@
           </w:tcPr>
           <w:p>
             <w:pPr>
-              <w:jc w:val="left"/>
+              <w:jc w:val="center"/>
             </w:pPr>
             <w:r/>
             <w:r>
@@ -2752,7 +2752,7 @@
           </w:tcPr>
           <w:p>
             <w:pPr>
-              <w:jc w:val="left"/>
+              <w:jc w:val="center"/>
             </w:pPr>
             <w:r/>
             <w:r>
@@ -2783,7 +2783,7 @@
           </w:tcPr>
           <w:p>
             <w:pPr>
-              <w:jc w:val="left"/>
+              <w:jc w:val="center"/>
             </w:pPr>
             <w:r/>
             <w:r>
@@ -2809,7 +2809,7 @@
           </w:tcPr>
           <w:p>
             <w:pPr>
-              <w:jc w:val="left"/>
+              <w:jc w:val="center"/>
             </w:pPr>
             <w:r/>
             <w:r>
@@ -2840,7 +2840,7 @@
           </w:tcPr>
           <w:p>
             <w:pPr>
-              <w:jc w:val="left"/>
+              <w:jc w:val="center"/>
             </w:pPr>
             <w:r/>
             <w:r>
@@ -2866,7 +2866,7 @@
           </w:tcPr>
           <w:p>
             <w:pPr>
-              <w:jc w:val="left"/>
+              <w:jc w:val="center"/>
             </w:pPr>
             <w:r/>
             <w:r>
@@ -2897,7 +2897,7 @@
           </w:tcPr>
           <w:p>
             <w:pPr>
-              <w:jc w:val="left"/>
+              <w:jc w:val="center"/>
             </w:pPr>
             <w:r/>
             <w:r>
@@ -2923,7 +2923,7 @@
           </w:tcPr>
           <w:p>
             <w:pPr>
-              <w:jc w:val="left"/>
+              <w:jc w:val="center"/>
             </w:pPr>
             <w:r/>
             <w:r>
@@ -2955,7 +2955,7 @@
           </w:tcPr>
           <w:p>
             <w:pPr>
-              <w:jc w:val="left"/>
+              <w:jc w:val="center"/>
             </w:pPr>
             <w:r/>
             <w:r>
@@ -2982,7 +2982,7 @@
           </w:tcPr>
           <w:p>
             <w:pPr>
-              <w:jc w:val="left"/>
+              <w:jc w:val="center"/>
             </w:pPr>
             <w:r/>
             <w:r>
@@ -3041,7 +3041,7 @@
       <w:pPr>
         <w:spacing w:before="120" w:after="0" w:line="480" w:lineRule="auto"/>
         <w:ind w:firstLine="0"/>
-        <w:jc w:val="center"/>
+        <w:jc w:val="left"/>
       </w:pPr>
       <w:r>
         <w:rPr>
@@ -3056,7 +3056,7 @@
       <w:pPr>
         <w:spacing w:line="480" w:lineRule="auto"/>
         <w:ind w:firstLine="0"/>
-        <w:jc w:val="center"/>
+        <w:jc w:val="left"/>
       </w:pPr>
       <w:r>
         <w:rPr>
@@ -3105,7 +3105,7 @@
           <w:p>
             <w:pPr>
               <w:spacing w:before="0" w:after="0" w:line="240" w:lineRule="auto"/>
-              <w:jc w:val="left"/>
+              <w:jc w:val="center"/>
             </w:pPr>
             <w:r>
               <w:rPr>
@@ -3127,7 +3127,7 @@
           <w:p>
             <w:pPr>
               <w:spacing w:before="0" w:after="0" w:line="240" w:lineRule="auto"/>
-              <w:jc w:val="left"/>
+              <w:jc w:val="center"/>
             </w:pPr>
             <w:r>
               <w:rPr>
@@ -3149,7 +3149,7 @@
           <w:p>
             <w:pPr>
               <w:spacing w:before="0" w:after="0" w:line="240" w:lineRule="auto"/>
-              <w:jc w:val="left"/>
+              <w:jc w:val="center"/>
             </w:pPr>
             <w:r>
               <w:rPr>
@@ -3172,7 +3172,7 @@
           <w:p>
             <w:pPr>
               <w:spacing w:before="0" w:after="0" w:line="240" w:lineRule="auto"/>
-              <w:jc w:val="left"/>
+              <w:jc w:val="center"/>
             </w:pPr>
             <w:r>
               <w:rPr>
@@ -3190,7 +3190,7 @@
           <w:p>
             <w:pPr>
               <w:spacing w:before="0" w:after="0" w:line="240" w:lineRule="auto"/>
-              <w:jc w:val="left"/>
+              <w:jc w:val="center"/>
             </w:pPr>
             <w:r>
               <w:rPr>
@@ -3208,7 +3208,7 @@
           <w:p>
             <w:pPr>
               <w:spacing w:before="0" w:after="0" w:line="240" w:lineRule="auto"/>
-              <w:jc w:val="left"/>
+              <w:jc w:val="center"/>
             </w:pPr>
             <w:r>
               <w:rPr>
@@ -3231,7 +3231,7 @@
           <w:p>
             <w:pPr>
               <w:spacing w:before="0" w:after="0" w:line="240" w:lineRule="auto"/>
-              <w:jc w:val="left"/>
+              <w:jc w:val="center"/>
             </w:pPr>
             <w:r>
               <w:rPr>
@@ -3249,7 +3249,7 @@
           <w:p>
             <w:pPr>
               <w:spacing w:before="0" w:after="0" w:line="240" w:lineRule="auto"/>
-              <w:jc w:val="left"/>
+              <w:jc w:val="center"/>
             </w:pPr>
             <w:r>
               <w:rPr>
@@ -3267,7 +3267,7 @@
           <w:p>
             <w:pPr>
               <w:spacing w:before="0" w:after="0" w:line="240" w:lineRule="auto"/>
-              <w:jc w:val="left"/>
+              <w:jc w:val="center"/>
             </w:pPr>
             <w:r>
               <w:rPr>
@@ -3290,7 +3290,7 @@
           <w:p>
             <w:pPr>
               <w:spacing w:before="0" w:after="0" w:line="240" w:lineRule="auto"/>
-              <w:jc w:val="left"/>
+              <w:jc w:val="center"/>
             </w:pPr>
             <w:r>
               <w:rPr>
@@ -3308,7 +3308,7 @@
           <w:p>
             <w:pPr>
               <w:spacing w:before="0" w:after="0" w:line="240" w:lineRule="auto"/>
-              <w:jc w:val="left"/>
+              <w:jc w:val="center"/>
             </w:pPr>
             <w:r>
               <w:rPr>
@@ -3326,7 +3326,7 @@
           <w:p>
             <w:pPr>
               <w:spacing w:before="0" w:after="0" w:line="240" w:lineRule="auto"/>
-              <w:jc w:val="left"/>
+              <w:jc w:val="center"/>
             </w:pPr>
             <w:r>
               <w:rPr>
@@ -3349,7 +3349,7 @@
           <w:p>
             <w:pPr>
               <w:spacing w:before="0" w:after="0" w:line="240" w:lineRule="auto"/>
-              <w:jc w:val="left"/>
+              <w:jc w:val="center"/>
             </w:pPr>
             <w:r>
               <w:rPr>
@@ -3367,7 +3367,7 @@
           <w:p>
             <w:pPr>
               <w:spacing w:before="0" w:after="0" w:line="240" w:lineRule="auto"/>
-              <w:jc w:val="left"/>
+              <w:jc w:val="center"/>
             </w:pPr>
             <w:r>
               <w:rPr>
@@ -3385,7 +3385,7 @@
           <w:p>
             <w:pPr>
               <w:spacing w:before="0" w:after="0" w:line="240" w:lineRule="auto"/>
-              <w:jc w:val="left"/>
+              <w:jc w:val="center"/>
             </w:pPr>
             <w:r>
               <w:rPr>
@@ -3409,7 +3409,7 @@
           <w:p>
             <w:pPr>
               <w:spacing w:before="0" w:after="0" w:line="240" w:lineRule="auto"/>
-              <w:jc w:val="left"/>
+              <w:jc w:val="center"/>
             </w:pPr>
             <w:r>
               <w:rPr>
@@ -3428,7 +3428,7 @@
           <w:p>
             <w:pPr>
               <w:spacing w:before="0" w:after="0" w:line="240" w:lineRule="auto"/>
-              <w:jc w:val="left"/>
+              <w:jc w:val="center"/>
             </w:pPr>
             <w:r>
               <w:rPr>
@@ -3447,7 +3447,7 @@
           <w:p>
             <w:pPr>
               <w:spacing w:before="0" w:after="0" w:line="240" w:lineRule="auto"/>
-              <w:jc w:val="left"/>
+              <w:jc w:val="center"/>
             </w:pPr>
             <w:r>
               <w:rPr>
@@ -3470,6 +3470,7 @@
           <w:p>
             <w:pPr>
               <w:spacing w:before="0" w:after="0"/>
+              <w:jc w:val="center"/>
             </w:pPr>
             <w:r>
               <w:rPr>
@@ -3487,6 +3488,7 @@
           <w:p>
             <w:pPr>
               <w:spacing w:before="0" w:after="0"/>
+              <w:jc w:val="center"/>
             </w:pPr>
             <w:r>
               <w:rPr>
@@ -3504,6 +3506,7 @@
           <w:p>
             <w:pPr>
               <w:spacing w:before="0" w:after="0"/>
+              <w:jc w:val="center"/>
             </w:pPr>
             <w:r>
               <w:rPr>
@@ -3526,6 +3529,7 @@
           <w:p>
             <w:pPr>
               <w:spacing w:before="0" w:after="0"/>
+              <w:jc w:val="center"/>
             </w:pPr>
             <w:r>
               <w:rPr>
@@ -3543,6 +3547,7 @@
           <w:p>
             <w:pPr>
               <w:spacing w:before="0" w:after="0"/>
+              <w:jc w:val="center"/>
             </w:pPr>
             <w:r>
               <w:rPr>
@@ -3560,6 +3565,7 @@
           <w:p>
             <w:pPr>
               <w:spacing w:before="0" w:after="0"/>
+              <w:jc w:val="center"/>
             </w:pPr>
             <w:r>
               <w:rPr>
@@ -3585,6 +3591,7 @@
           <w:p>
             <w:pPr>
               <w:spacing w:before="0" w:after="0"/>
+              <w:jc w:val="center"/>
             </w:pPr>
             <w:r>
               <w:rPr>
@@ -3605,6 +3612,7 @@
           <w:p>
             <w:pPr>
               <w:spacing w:before="0" w:after="0"/>
+              <w:jc w:val="center"/>
             </w:pPr>
             <w:r>
               <w:rPr>
@@ -3625,6 +3633,7 @@
           <w:p>
             <w:pPr>
               <w:spacing w:before="0" w:after="0"/>
+              <w:jc w:val="center"/>
             </w:pPr>
             <w:r>
               <w:rPr>
@@ -3694,17 +3703,64 @@
       </w:pPr>
       <w:r>
         <w:rPr>
-          <w:b w:val="1"/>
+          <w:b/>
           <w:bCs w:val="1"/>
           <w:rtl w:val="0"/>
         </w:rPr>
-        <w:t xml:space="preserve">Inclusion Criteria. </w:t>
-      </w:r>
-      <w:r>
-        <w:rPr>
-          <w:rtl w:val="0"/>
-        </w:rPr>
-        <w:t xml:space="preserve">English-language undergraduate thesis abstracts. Complete abstracts available in the PSAU library archives. Clear disciplinary classification based on official degree program. Hard-bound submission year (as recorded in the PSAU library catalog) between 2023 and 2025.</w:t>
+        <w:t>Inclusion Criteria</w:t>
+      </w:r>
+      <w:r>
+        <w:rPr>
+          <w:rtl w:val="0"/>
+        </w:rPr>
+      </w:r>
+    </w:p>
+    <w:p>
+      <w:pPr>
+        <w:jc w:val="both"/>
+      </w:pPr>
+      <w:r>
+        <w:rPr>
+          <w:rFonts w:ascii="Times New Roman" w:hAnsi="Times New Roman"/>
+          <w:sz w:val="24"/>
+        </w:rPr>
+        <w:t>• English-language undergraduate thesis abstracts</w:t>
+      </w:r>
+    </w:p>
+    <w:p>
+      <w:pPr>
+        <w:jc w:val="both"/>
+      </w:pPr>
+      <w:r>
+        <w:rPr>
+          <w:rFonts w:ascii="Times New Roman" w:hAnsi="Times New Roman"/>
+          <w:sz w:val="24"/>
+        </w:rPr>
+        <w:t>• Complete abstracts available in the PSAU library archives</w:t>
+      </w:r>
+    </w:p>
+    <w:p>
+      <w:pPr>
+        <w:jc w:val="both"/>
+      </w:pPr>
+      <w:r>
+        <w:rPr>
+          <w:rFonts w:ascii="Times New Roman" w:hAnsi="Times New Roman"/>
+          <w:sz w:val="24"/>
+        </w:rPr>
+        <w:t>• Clear disciplinary classification based on official degree program</w:t>
+      </w:r>
+    </w:p>
+    <w:p>
+      <w:pPr>
+        <w:jc w:val="both"/>
+      </w:pPr>
+      <w:r>
+        <w:rPr>
+          <w:rFonts w:ascii="Times New Roman" w:hAnsi="Times New Roman"/>
+          <w:sz w:val="24"/>
+        </w:rPr>
+        <w:t>• Hard-bound submission year (as recorded in the PSAU library catalog) between 2023 and 2025</w:t>
       </w:r>
     </w:p>
     <w:p>
@@ -3717,17 +3773,64 @@
       </w:pPr>
       <w:r>
         <w:rPr>
-          <w:b w:val="1"/>
+          <w:b/>
           <w:bCs w:val="1"/>
           <w:rtl w:val="0"/>
         </w:rPr>
-        <w:t xml:space="preserve">Exclusion Criteria. </w:t>
-      </w:r>
-      <w:r>
-        <w:rPr>
-          <w:rtl w:val="0"/>
-        </w:rPr>
-        <w:t xml:space="preserve">Non-English abstracts or abstracts with significant Filipino code-switching. Graduate-level theses. Theses submitted under interdisciplinary degree programs (e.g., Environmental Science) where a single disciplinary affiliation cannot be determined. Theses whose hard-bound submission year (library catalog) is before 2023 or after 2025.</w:t>
+        <w:t>Exclusion Criteria</w:t>
+      </w:r>
+      <w:r>
+        <w:rPr>
+          <w:rtl w:val="0"/>
+        </w:rPr>
+      </w:r>
+    </w:p>
+    <w:p>
+      <w:pPr>
+        <w:jc w:val="both"/>
+      </w:pPr>
+      <w:r>
+        <w:rPr>
+          <w:rFonts w:ascii="Times New Roman" w:hAnsi="Times New Roman"/>
+          <w:sz w:val="24"/>
+        </w:rPr>
+        <w:t>• Non-English abstracts or abstracts with significant Filipino code-switching</w:t>
+      </w:r>
+    </w:p>
+    <w:p>
+      <w:pPr>
+        <w:jc w:val="both"/>
+      </w:pPr>
+      <w:r>
+        <w:rPr>
+          <w:rFonts w:ascii="Times New Roman" w:hAnsi="Times New Roman"/>
+          <w:sz w:val="24"/>
+        </w:rPr>
+        <w:t>• Graduate-level theses</w:t>
+      </w:r>
+    </w:p>
+    <w:p>
+      <w:pPr>
+        <w:jc w:val="both"/>
+      </w:pPr>
+      <w:r>
+        <w:rPr>
+          <w:rFonts w:ascii="Times New Roman" w:hAnsi="Times New Roman"/>
+          <w:sz w:val="24"/>
+        </w:rPr>
+        <w:t>• Theses submitted under interdisciplinary degree programs (for example, Environmental Science) where a single disciplinary affiliation cannot be determined</w:t>
+      </w:r>
+    </w:p>
+    <w:p>
+      <w:pPr>
+        <w:jc w:val="both"/>
+      </w:pPr>
+      <w:r>
+        <w:rPr>
+          <w:rFonts w:ascii="Times New Roman" w:hAnsi="Times New Roman"/>
+          <w:sz w:val="24"/>
+        </w:rPr>
+        <w:t>• Theses whose hard-bound submission year (library catalog) is before 2023 or after 2025</w:t>
       </w:r>
     </w:p>
     <w:p>
@@ -3766,7 +3869,7 @@
       <w:pPr>
         <w:spacing w:after="240" w:before="720" w:line="480" w:lineRule="auto"/>
         <w:ind w:firstLine="0"/>
-        <w:jc w:val="center"/>
+        <w:jc w:val="left"/>
         <w:rPr>
           <w:sz w:val="28"/>
           <w:szCs w:val="28"/>
@@ -3820,7 +3923,7 @@
         <w:keepNext w:val="1"/>
         <w:spacing w:after="0" w:before="240" w:line="480" w:lineRule="auto"/>
         <w:ind w:firstLine="0"/>
-        <w:jc w:val="center"/>
+        <w:jc w:val="left"/>
         <w:rPr/>
       </w:pPr>
       <w:r>
@@ -3836,7 +3939,7 @@
       <w:pPr>
         <w:keepNext w:val="1"/>
         <w:spacing w:after="60" w:before="0" w:line="480" w:lineRule="auto"/>
-        <w:jc w:val="center"/>
+        <w:jc w:val="left"/>
         <w:rPr/>
       </w:pPr>
       <w:r>
@@ -3895,6 +3998,7 @@
           <w:p>
             <w:pPr>
               <w:spacing w:after="0" w:before="0" w:line="480" w:lineRule="auto"/>
+              <w:jc w:val="center"/>
               <w:rPr>
                 <w:sz w:val="18"/>
                 <w:szCs w:val="18"/>
@@ -3928,6 +4032,7 @@
           <w:p>
             <w:pPr>
               <w:spacing w:after="0" w:before="0" w:line="480" w:lineRule="auto"/>
+              <w:jc w:val="center"/>
               <w:rPr>
                 <w:sz w:val="18"/>
                 <w:szCs w:val="18"/>
@@ -3961,6 +4066,7 @@
           <w:p>
             <w:pPr>
               <w:spacing w:after="0" w:before="0" w:line="480" w:lineRule="auto"/>
+              <w:jc w:val="center"/>
               <w:rPr>
                 <w:sz w:val="18"/>
                 <w:szCs w:val="18"/>
@@ -3994,6 +4100,7 @@
           <w:p>
             <w:pPr>
               <w:spacing w:after="0" w:before="0" w:line="480" w:lineRule="auto"/>
+              <w:jc w:val="center"/>
               <w:rPr>
                 <w:sz w:val="18"/>
                 <w:szCs w:val="18"/>
@@ -4027,6 +4134,7 @@
           <w:p>
             <w:pPr>
               <w:spacing w:after="0" w:before="0" w:line="480" w:lineRule="auto"/>
+              <w:jc w:val="center"/>
               <w:rPr>
                 <w:sz w:val="18"/>
                 <w:szCs w:val="18"/>
@@ -4060,6 +4168,7 @@
           <w:p>
             <w:pPr>
               <w:spacing w:after="0" w:before="0" w:line="480" w:lineRule="auto"/>
+              <w:jc w:val="center"/>
               <w:rPr>
                 <w:sz w:val="18"/>
                 <w:szCs w:val="18"/>
@@ -4094,6 +4203,7 @@
           <w:p>
             <w:pPr>
               <w:spacing w:after="0" w:before="0" w:line="480" w:lineRule="auto"/>
+              <w:jc w:val="center"/>
               <w:rPr>
                 <w:sz w:val="18"/>
                 <w:szCs w:val="18"/>
@@ -4121,6 +4231,7 @@
           <w:p>
             <w:pPr>
               <w:spacing w:after="0" w:before="0" w:line="480" w:lineRule="auto"/>
+              <w:jc w:val="center"/>
               <w:rPr>
                 <w:sz w:val="18"/>
                 <w:szCs w:val="18"/>
@@ -4148,6 +4259,7 @@
           <w:p>
             <w:pPr>
               <w:spacing w:after="0" w:before="0" w:line="480" w:lineRule="auto"/>
+              <w:jc w:val="center"/>
               <w:rPr>
                 <w:sz w:val="18"/>
                 <w:szCs w:val="18"/>
@@ -4175,6 +4287,7 @@
           <w:p>
             <w:pPr>
               <w:spacing w:after="0" w:before="0" w:line="480" w:lineRule="auto"/>
+              <w:jc w:val="center"/>
               <w:rPr>
                 <w:sz w:val="18"/>
                 <w:szCs w:val="18"/>
@@ -4202,6 +4315,7 @@
           <w:p>
             <w:pPr>
               <w:spacing w:after="0" w:before="0" w:line="480" w:lineRule="auto"/>
+              <w:jc w:val="center"/>
               <w:rPr>
                 <w:sz w:val="18"/>
                 <w:szCs w:val="18"/>
@@ -4229,6 +4343,7 @@
           <w:p>
             <w:pPr>
               <w:spacing w:after="0" w:before="0" w:line="480" w:lineRule="auto"/>
+              <w:jc w:val="center"/>
               <w:rPr>
                 <w:sz w:val="18"/>
                 <w:szCs w:val="18"/>
@@ -4261,6 +4376,7 @@
           <w:p>
             <w:pPr>
               <w:spacing w:after="0" w:before="0" w:line="480" w:lineRule="auto"/>
+              <w:jc w:val="center"/>
               <w:rPr>
                 <w:sz w:val="18"/>
                 <w:szCs w:val="18"/>
@@ -4281,6 +4397,7 @@
           <w:p>
             <w:pPr>
               <w:spacing w:after="0" w:before="0" w:line="480" w:lineRule="auto"/>
+              <w:jc w:val="center"/>
               <w:rPr>
                 <w:sz w:val="18"/>
                 <w:szCs w:val="18"/>
@@ -4308,6 +4425,7 @@
           <w:p>
             <w:pPr>
               <w:spacing w:after="0" w:before="0" w:line="480" w:lineRule="auto"/>
+              <w:jc w:val="center"/>
               <w:rPr>
                 <w:sz w:val="18"/>
                 <w:szCs w:val="18"/>
@@ -4335,6 +4453,7 @@
           <w:p>
             <w:pPr>
               <w:spacing w:after="0" w:before="0" w:line="480" w:lineRule="auto"/>
+              <w:jc w:val="center"/>
               <w:rPr>
                 <w:sz w:val="18"/>
                 <w:szCs w:val="18"/>
@@ -4362,6 +4481,7 @@
           <w:p>
             <w:pPr>
               <w:spacing w:after="0" w:before="0" w:line="480" w:lineRule="auto"/>
+              <w:jc w:val="center"/>
               <w:rPr>
                 <w:sz w:val="18"/>
                 <w:szCs w:val="18"/>
@@ -4389,6 +4509,7 @@
           <w:p>
             <w:pPr>
               <w:spacing w:after="0" w:before="0" w:line="480" w:lineRule="auto"/>
+              <w:jc w:val="center"/>
               <w:rPr>
                 <w:sz w:val="18"/>
                 <w:szCs w:val="18"/>
@@ -4421,6 +4542,7 @@
           <w:p>
             <w:pPr>
               <w:spacing w:after="0" w:before="0" w:line="480" w:lineRule="auto"/>
+              <w:jc w:val="center"/>
               <w:rPr>
                 <w:sz w:val="18"/>
                 <w:szCs w:val="18"/>
@@ -4448,6 +4570,7 @@
           <w:p>
             <w:pPr>
               <w:spacing w:after="0" w:before="0" w:line="480" w:lineRule="auto"/>
+              <w:jc w:val="center"/>
               <w:rPr>
                 <w:sz w:val="18"/>
                 <w:szCs w:val="18"/>
@@ -4475,6 +4598,7 @@
           <w:p>
             <w:pPr>
               <w:spacing w:after="0" w:before="0" w:line="480" w:lineRule="auto"/>
+              <w:jc w:val="center"/>
               <w:rPr>
                 <w:sz w:val="18"/>
                 <w:szCs w:val="18"/>
@@ -4502,6 +4626,7 @@
           <w:p>
             <w:pPr>
               <w:spacing w:after="0" w:before="0" w:line="480" w:lineRule="auto"/>
+              <w:jc w:val="center"/>
               <w:rPr>
                 <w:sz w:val="18"/>
                 <w:szCs w:val="18"/>
@@ -4529,6 +4654,7 @@
           <w:p>
             <w:pPr>
               <w:spacing w:after="0" w:before="0" w:line="480" w:lineRule="auto"/>
+              <w:jc w:val="center"/>
               <w:rPr>
                 <w:sz w:val="18"/>
                 <w:szCs w:val="18"/>
@@ -4556,6 +4682,7 @@
           <w:p>
             <w:pPr>
               <w:spacing w:after="0" w:before="0" w:line="480" w:lineRule="auto"/>
+              <w:jc w:val="center"/>
               <w:rPr>
                 <w:sz w:val="18"/>
                 <w:szCs w:val="18"/>
@@ -4588,6 +4715,7 @@
           <w:p>
             <w:pPr>
               <w:spacing w:after="0" w:before="0" w:line="480" w:lineRule="auto"/>
+              <w:jc w:val="center"/>
               <w:rPr>
                 <w:sz w:val="18"/>
                 <w:szCs w:val="18"/>
@@ -4615,6 +4743,7 @@
           <w:p>
             <w:pPr>
               <w:spacing w:after="0" w:before="0" w:line="480" w:lineRule="auto"/>
+              <w:jc w:val="center"/>
               <w:rPr>
                 <w:sz w:val="18"/>
                 <w:szCs w:val="18"/>
@@ -4642,6 +4771,7 @@
           <w:p>
             <w:pPr>
               <w:spacing w:after="0" w:before="0" w:line="480" w:lineRule="auto"/>
+              <w:jc w:val="center"/>
               <w:rPr>
                 <w:sz w:val="18"/>
                 <w:szCs w:val="18"/>
@@ -4669,6 +4799,7 @@
           <w:p>
             <w:pPr>
               <w:spacing w:after="0" w:before="0" w:line="480" w:lineRule="auto"/>
+              <w:jc w:val="center"/>
               <w:rPr>
                 <w:sz w:val="18"/>
                 <w:szCs w:val="18"/>
@@ -4696,6 +4827,7 @@
           <w:p>
             <w:pPr>
               <w:spacing w:after="0" w:before="0" w:line="480" w:lineRule="auto"/>
+              <w:jc w:val="center"/>
               <w:rPr>
                 <w:sz w:val="18"/>
                 <w:szCs w:val="18"/>
@@ -4723,6 +4855,7 @@
           <w:p>
             <w:pPr>
               <w:spacing w:after="0" w:before="0" w:line="480" w:lineRule="auto"/>
+              <w:jc w:val="center"/>
               <w:rPr>
                 <w:sz w:val="18"/>
                 <w:szCs w:val="18"/>
@@ -4759,6 +4892,7 @@
           <w:p>
             <w:pPr>
               <w:spacing w:after="0" w:before="0" w:line="480" w:lineRule="auto"/>
+              <w:jc w:val="center"/>
               <w:rPr>
                 <w:sz w:val="18"/>
                 <w:szCs w:val="18"/>
@@ -4790,6 +4924,7 @@
           <w:p>
             <w:pPr>
               <w:spacing w:after="0" w:before="0" w:line="480" w:lineRule="auto"/>
+              <w:jc w:val="center"/>
               <w:rPr>
                 <w:sz w:val="18"/>
                 <w:szCs w:val="18"/>
@@ -4821,6 +4956,7 @@
           <w:p>
             <w:pPr>
               <w:spacing w:after="0" w:before="0" w:line="480" w:lineRule="auto"/>
+              <w:jc w:val="center"/>
               <w:rPr>
                 <w:sz w:val="18"/>
                 <w:szCs w:val="18"/>
@@ -4852,6 +4988,7 @@
           <w:p>
             <w:pPr>
               <w:spacing w:after="0" w:before="0" w:line="480" w:lineRule="auto"/>
+              <w:jc w:val="center"/>
               <w:rPr>
                 <w:sz w:val="18"/>
                 <w:szCs w:val="18"/>
@@ -4883,6 +5020,7 @@
           <w:p>
             <w:pPr>
               <w:spacing w:after="0" w:before="0" w:line="480" w:lineRule="auto"/>
+              <w:jc w:val="center"/>
               <w:rPr>
                 <w:sz w:val="18"/>
                 <w:szCs w:val="18"/>
@@ -4914,6 +5052,7 @@
           <w:p>
             <w:pPr>
               <w:spacing w:after="0" w:before="0" w:line="480" w:lineRule="auto"/>
+              <w:jc w:val="center"/>
               <w:rPr>
                 <w:sz w:val="18"/>
                 <w:szCs w:val="18"/>
@@ -4942,7 +5081,7 @@
       <w:pPr>
         <w:spacing w:after="0" w:before="240" w:line="480" w:lineRule="auto"/>
         <w:ind w:firstLine="720"/>
-        <w:jc w:val="both"/>
+        <w:jc w:val="left"/>
         <w:rPr/>
       </w:pPr>
       <w:r>
@@ -5010,7 +5149,7 @@
         <w:pageBreakBefore w:val="1"/>
         <w:spacing w:after="0" w:before="720" w:line="480" w:lineRule="auto"/>
         <w:ind w:firstLine="0"/>
-        <w:jc w:val="center"/>
+        <w:jc w:val="left"/>
         <w:rPr/>
       </w:pPr>
       <w:r>
@@ -5026,7 +5165,7 @@
       <w:pPr>
         <w:keepNext w:val="1"/>
         <w:spacing w:after="60" w:before="0" w:line="480" w:lineRule="auto"/>
-        <w:jc w:val="center"/>
+        <w:jc w:val="left"/>
         <w:rPr/>
       </w:pPr>
       <w:r>
@@ -5078,6 +5217,7 @@
           <w:p>
             <w:pPr>
               <w:spacing w:before="0" w:after="0" w:line="240" w:lineRule="auto"/>
+              <w:jc w:val="center"/>
             </w:pPr>
             <w:r>
               <w:rPr>
@@ -5099,6 +5239,7 @@
           <w:p>
             <w:pPr>
               <w:spacing w:before="0" w:after="0" w:line="240" w:lineRule="auto"/>
+              <w:jc w:val="center"/>
             </w:pPr>
             <w:r>
               <w:rPr>
@@ -5120,6 +5261,7 @@
           <w:p>
             <w:pPr>
               <w:spacing w:before="0" w:after="0" w:line="240" w:lineRule="auto"/>
+              <w:jc w:val="center"/>
             </w:pPr>
             <w:r>
               <w:rPr>
@@ -5141,6 +5283,7 @@
           <w:p>
             <w:pPr>
               <w:spacing w:before="0" w:after="0" w:line="240" w:lineRule="auto"/>
+              <w:jc w:val="center"/>
             </w:pPr>
             <w:r>
               <w:rPr>
@@ -5162,6 +5305,7 @@
           <w:p>
             <w:pPr>
               <w:spacing w:before="0" w:after="0" w:line="240" w:lineRule="auto"/>
+              <w:jc w:val="center"/>
             </w:pPr>
             <w:r>
               <w:rPr>
@@ -5185,6 +5329,7 @@
           <w:p>
             <w:pPr>
               <w:spacing w:before="0" w:after="0" w:line="240" w:lineRule="auto"/>
+              <w:jc w:val="center"/>
             </w:pPr>
             <w:r>
               <w:rPr>
@@ -5203,6 +5348,7 @@
           <w:p>
             <w:pPr>
               <w:spacing w:before="0" w:after="0" w:line="240" w:lineRule="auto"/>
+              <w:jc w:val="center"/>
             </w:pPr>
             <w:r>
               <w:rPr>
@@ -5221,6 +5367,7 @@
           <w:p>
             <w:pPr>
               <w:spacing w:before="0" w:after="0" w:line="240" w:lineRule="auto"/>
+              <w:jc w:val="center"/>
             </w:pPr>
             <w:r>
               <w:rPr>
@@ -5239,6 +5386,7 @@
           <w:p>
             <w:pPr>
               <w:spacing w:before="0" w:after="0" w:line="240" w:lineRule="auto"/>
+              <w:jc w:val="center"/>
             </w:pPr>
             <w:r>
               <w:rPr>
@@ -5257,6 +5405,7 @@
           <w:p>
             <w:pPr>
               <w:spacing w:before="0" w:after="0" w:line="240" w:lineRule="auto"/>
+              <w:jc w:val="center"/>
             </w:pPr>
             <w:r>
               <w:rPr>
@@ -5280,6 +5429,7 @@
           <w:p>
             <w:pPr>
               <w:spacing w:before="0" w:after="0" w:line="240" w:lineRule="auto"/>
+              <w:jc w:val="center"/>
             </w:pPr>
             <w:r>
               <w:rPr>
@@ -5297,6 +5447,7 @@
           <w:p>
             <w:pPr>
               <w:spacing w:before="0" w:after="0" w:line="240" w:lineRule="auto"/>
+              <w:jc w:val="center"/>
             </w:pPr>
             <w:r>
               <w:rPr>
@@ -5315,6 +5466,7 @@
           <w:p>
             <w:pPr>
               <w:spacing w:before="0" w:after="0" w:line="240" w:lineRule="auto"/>
+              <w:jc w:val="center"/>
             </w:pPr>
             <w:r>
               <w:rPr>
@@ -5333,6 +5485,7 @@
           <w:p>
             <w:pPr>
               <w:spacing w:before="0" w:after="0" w:line="240" w:lineRule="auto"/>
+              <w:jc w:val="center"/>
             </w:pPr>
             <w:r>
               <w:rPr>
@@ -5351,6 +5504,7 @@
           <w:p>
             <w:pPr>
               <w:spacing w:before="0" w:after="0" w:line="240" w:lineRule="auto"/>
+              <w:jc w:val="center"/>
             </w:pPr>
             <w:r>
               <w:rPr>
@@ -5374,6 +5528,7 @@
           <w:p>
             <w:pPr>
               <w:spacing w:before="0" w:after="0" w:line="240" w:lineRule="auto"/>
+              <w:jc w:val="center"/>
             </w:pPr>
             <w:r>
               <w:rPr>
@@ -5391,6 +5546,7 @@
           <w:p>
             <w:pPr>
               <w:spacing w:before="0" w:after="0" w:line="240" w:lineRule="auto"/>
+              <w:jc w:val="center"/>
             </w:pPr>
             <w:r>
               <w:rPr>
@@ -5409,6 +5565,7 @@
           <w:p>
             <w:pPr>
               <w:spacing w:before="0" w:after="0" w:line="240" w:lineRule="auto"/>
+              <w:jc w:val="center"/>
             </w:pPr>
             <w:r>
               <w:rPr>
@@ -5427,6 +5584,7 @@
           <w:p>
             <w:pPr>
               <w:spacing w:before="0" w:after="0" w:line="240" w:lineRule="auto"/>
+              <w:jc w:val="center"/>
             </w:pPr>
             <w:r>
               <w:rPr>
@@ -5445,6 +5603,7 @@
           <w:p>
             <w:pPr>
               <w:spacing w:before="0" w:after="0" w:line="240" w:lineRule="auto"/>
+              <w:jc w:val="center"/>
             </w:pPr>
             <w:r>
               <w:rPr>
@@ -5468,6 +5627,7 @@
           <w:p>
             <w:pPr>
               <w:spacing w:before="0" w:after="0" w:line="240" w:lineRule="auto"/>
+              <w:jc w:val="center"/>
             </w:pPr>
             <w:r>
               <w:rPr>
@@ -5485,6 +5645,7 @@
           <w:p>
             <w:pPr>
               <w:spacing w:before="0" w:after="0" w:line="240" w:lineRule="auto"/>
+              <w:jc w:val="center"/>
             </w:pPr>
             <w:r>
               <w:rPr>
@@ -5503,6 +5664,7 @@
           <w:p>
             <w:pPr>
               <w:spacing w:before="0" w:after="0" w:line="240" w:lineRule="auto"/>
+              <w:jc w:val="center"/>
             </w:pPr>
             <w:r>
               <w:rPr>
@@ -5521,6 +5683,7 @@
           <w:p>
             <w:pPr>
               <w:spacing w:before="0" w:after="0" w:line="240" w:lineRule="auto"/>
+              <w:jc w:val="center"/>
             </w:pPr>
             <w:r>
               <w:rPr>
@@ -5539,6 +5702,7 @@
           <w:p>
             <w:pPr>
               <w:spacing w:before="0" w:after="0" w:line="240" w:lineRule="auto"/>
+              <w:jc w:val="center"/>
             </w:pPr>
             <w:r>
               <w:rPr>
@@ -5562,6 +5726,7 @@
           <w:p>
             <w:pPr>
               <w:spacing w:before="0" w:after="0" w:line="240" w:lineRule="auto"/>
+              <w:jc w:val="center"/>
             </w:pPr>
             <w:r>
               <w:rPr>
@@ -5580,6 +5745,7 @@
           <w:p>
             <w:pPr>
               <w:spacing w:before="0" w:after="0" w:line="240" w:lineRule="auto"/>
+              <w:jc w:val="center"/>
             </w:pPr>
             <w:r>
               <w:rPr>
@@ -5598,6 +5764,7 @@
           <w:p>
             <w:pPr>
               <w:spacing w:before="0" w:after="0" w:line="240" w:lineRule="auto"/>
+              <w:jc w:val="center"/>
             </w:pPr>
             <w:r>
               <w:rPr>
@@ -5616,6 +5783,7 @@
           <w:p>
             <w:pPr>
               <w:spacing w:before="0" w:after="0" w:line="240" w:lineRule="auto"/>
+              <w:jc w:val="center"/>
             </w:pPr>
             <w:r>
               <w:rPr>
@@ -5634,6 +5802,7 @@
           <w:p>
             <w:pPr>
               <w:spacing w:before="0" w:after="0" w:line="240" w:lineRule="auto"/>
+              <w:jc w:val="center"/>
             </w:pPr>
             <w:r>
               <w:rPr>
@@ -5657,6 +5826,7 @@
           <w:p>
             <w:pPr>
               <w:spacing w:before="0" w:after="0" w:line="240" w:lineRule="auto"/>
+              <w:jc w:val="center"/>
             </w:pPr>
             <w:r>
               <w:rPr>
@@ -5674,6 +5844,7 @@
           <w:p>
             <w:pPr>
               <w:spacing w:before="0" w:after="0" w:line="240" w:lineRule="auto"/>
+              <w:jc w:val="center"/>
             </w:pPr>
             <w:r>
               <w:rPr>
@@ -5692,6 +5863,7 @@
           <w:p>
             <w:pPr>
               <w:spacing w:before="0" w:after="0" w:line="240" w:lineRule="auto"/>
+              <w:jc w:val="center"/>
             </w:pPr>
             <w:r>
               <w:rPr>
@@ -5710,6 +5882,7 @@
           <w:p>
             <w:pPr>
               <w:spacing w:before="0" w:after="0" w:line="240" w:lineRule="auto"/>
+              <w:jc w:val="center"/>
             </w:pPr>
             <w:r>
               <w:rPr>
@@ -5728,6 +5901,7 @@
           <w:p>
             <w:pPr>
               <w:spacing w:before="0" w:after="0" w:line="240" w:lineRule="auto"/>
+              <w:jc w:val="center"/>
             </w:pPr>
             <w:r>
               <w:rPr>
@@ -5751,6 +5925,7 @@
           <w:p>
             <w:pPr>
               <w:spacing w:before="0" w:after="0" w:line="240" w:lineRule="auto"/>
+              <w:jc w:val="center"/>
             </w:pPr>
             <w:r>
               <w:rPr>
@@ -5768,6 +5943,7 @@
           <w:p>
             <w:pPr>
               <w:spacing w:before="0" w:after="0" w:line="240" w:lineRule="auto"/>
+              <w:jc w:val="center"/>
             </w:pPr>
             <w:r>
               <w:rPr>
@@ -5786,6 +5962,7 @@
           <w:p>
             <w:pPr>
               <w:spacing w:before="0" w:after="0" w:line="240" w:lineRule="auto"/>
+              <w:jc w:val="center"/>
             </w:pPr>
             <w:r>
               <w:rPr>
@@ -5804,6 +5981,7 @@
           <w:p>
             <w:pPr>
               <w:spacing w:before="0" w:after="0" w:line="240" w:lineRule="auto"/>
+              <w:jc w:val="center"/>
             </w:pPr>
             <w:r>
               <w:rPr>
@@ -5822,6 +6000,7 @@
           <w:p>
             <w:pPr>
               <w:spacing w:before="0" w:after="0" w:line="240" w:lineRule="auto"/>
+              <w:jc w:val="center"/>
             </w:pPr>
             <w:r>
               <w:rPr>
@@ -5845,6 +6024,7 @@
           <w:p>
             <w:pPr>
               <w:spacing w:before="0" w:after="0" w:line="240" w:lineRule="auto"/>
+              <w:jc w:val="center"/>
             </w:pPr>
             <w:r>
               <w:rPr>
@@ -5862,6 +6042,7 @@
           <w:p>
             <w:pPr>
               <w:spacing w:before="0" w:after="0" w:line="240" w:lineRule="auto"/>
+              <w:jc w:val="center"/>
             </w:pPr>
             <w:r>
               <w:rPr>
@@ -5880,6 +6061,7 @@
           <w:p>
             <w:pPr>
               <w:spacing w:before="0" w:after="0" w:line="240" w:lineRule="auto"/>
+              <w:jc w:val="center"/>
             </w:pPr>
             <w:r>
               <w:rPr>
@@ -5898,6 +6080,7 @@
           <w:p>
             <w:pPr>
               <w:spacing w:before="0" w:after="0" w:line="240" w:lineRule="auto"/>
+              <w:jc w:val="center"/>
             </w:pPr>
             <w:r>
               <w:rPr>
@@ -5916,6 +6099,7 @@
           <w:p>
             <w:pPr>
               <w:spacing w:before="0" w:after="0" w:line="240" w:lineRule="auto"/>
+              <w:jc w:val="center"/>
             </w:pPr>
             <w:r>
               <w:rPr>
@@ -5939,6 +6123,7 @@
           <w:p>
             <w:pPr>
               <w:spacing w:before="0" w:after="0" w:line="240" w:lineRule="auto"/>
+              <w:jc w:val="center"/>
             </w:pPr>
             <w:r>
               <w:rPr>
@@ -5956,6 +6141,7 @@
           <w:p>
             <w:pPr>
               <w:spacing w:before="0" w:after="0" w:line="240" w:lineRule="auto"/>
+              <w:jc w:val="center"/>
             </w:pPr>
             <w:r>
               <w:rPr>
@@ -5974,6 +6160,7 @@
           <w:p>
             <w:pPr>
               <w:spacing w:before="0" w:after="0" w:line="240" w:lineRule="auto"/>
+              <w:jc w:val="center"/>
             </w:pPr>
             <w:r>
               <w:rPr>
@@ -5992,6 +6179,7 @@
           <w:p>
             <w:pPr>
               <w:spacing w:before="0" w:after="0" w:line="240" w:lineRule="auto"/>
+              <w:jc w:val="center"/>
             </w:pPr>
             <w:r>
               <w:rPr>
@@ -6010,6 +6198,7 @@
           <w:p>
             <w:pPr>
               <w:spacing w:before="0" w:after="0" w:line="240" w:lineRule="auto"/>
+              <w:jc w:val="center"/>
             </w:pPr>
             <w:r>
               <w:rPr>
@@ -6033,6 +6222,7 @@
           <w:p>
             <w:pPr>
               <w:spacing w:before="0" w:after="0" w:line="240" w:lineRule="auto"/>
+              <w:jc w:val="center"/>
             </w:pPr>
             <w:r>
               <w:rPr>
@@ -6050,6 +6240,7 @@
           <w:p>
             <w:pPr>
               <w:spacing w:before="0" w:after="0" w:line="240" w:lineRule="auto"/>
+              <w:jc w:val="center"/>
             </w:pPr>
             <w:r>
               <w:rPr>
@@ -6068,6 +6259,7 @@
           <w:p>
             <w:pPr>
               <w:spacing w:before="0" w:after="0" w:line="240" w:lineRule="auto"/>
+              <w:jc w:val="center"/>
             </w:pPr>
             <w:r>
               <w:rPr>
@@ -6086,6 +6278,7 @@
           <w:p>
             <w:pPr>
               <w:spacing w:before="0" w:after="0" w:line="240" w:lineRule="auto"/>
+              <w:jc w:val="center"/>
             </w:pPr>
             <w:r>
               <w:rPr>
@@ -6104,6 +6297,7 @@
           <w:p>
             <w:pPr>
               <w:spacing w:before="0" w:after="0" w:line="240" w:lineRule="auto"/>
+              <w:jc w:val="center"/>
             </w:pPr>
             <w:r>
               <w:rPr>
@@ -6127,6 +6321,7 @@
           <w:p>
             <w:pPr>
               <w:spacing w:before="0" w:after="0" w:line="240" w:lineRule="auto"/>
+              <w:jc w:val="center"/>
             </w:pPr>
             <w:r>
               <w:rPr>
@@ -6144,6 +6339,7 @@
           <w:p>
             <w:pPr>
               <w:spacing w:before="0" w:after="0" w:line="240" w:lineRule="auto"/>
+              <w:jc w:val="center"/>
             </w:pPr>
             <w:r>
               <w:rPr>
@@ -6162,6 +6358,7 @@
           <w:p>
             <w:pPr>
               <w:spacing w:before="0" w:after="0" w:line="240" w:lineRule="auto"/>
+              <w:jc w:val="center"/>
             </w:pPr>
             <w:r>
               <w:rPr>
@@ -6180,6 +6377,7 @@
           <w:p>
             <w:pPr>
               <w:spacing w:before="0" w:after="0" w:line="240" w:lineRule="auto"/>
+              <w:jc w:val="center"/>
             </w:pPr>
             <w:r>
               <w:rPr>
@@ -6198,6 +6396,7 @@
           <w:p>
             <w:pPr>
               <w:spacing w:before="0" w:after="0" w:line="240" w:lineRule="auto"/>
+              <w:jc w:val="center"/>
             </w:pPr>
             <w:r>
               <w:rPr>
@@ -6221,6 +6420,7 @@
           <w:p>
             <w:pPr>
               <w:spacing w:before="0" w:after="0" w:line="240" w:lineRule="auto"/>
+              <w:jc w:val="center"/>
             </w:pPr>
             <w:r>
               <w:rPr>
@@ -6239,6 +6439,7 @@
           <w:p>
             <w:pPr>
               <w:spacing w:before="0" w:after="0" w:line="240" w:lineRule="auto"/>
+              <w:jc w:val="center"/>
             </w:pPr>
             <w:r>
               <w:rPr>
@@ -6257,6 +6458,7 @@
           <w:p>
             <w:pPr>
               <w:spacing w:before="0" w:after="0" w:line="240" w:lineRule="auto"/>
+              <w:jc w:val="center"/>
             </w:pPr>
             <w:r>
               <w:rPr>
@@ -6275,6 +6477,7 @@
           <w:p>
             <w:pPr>
               <w:spacing w:before="0" w:after="0" w:line="240" w:lineRule="auto"/>
+              <w:jc w:val="center"/>
             </w:pPr>
             <w:r>
               <w:rPr>
@@ -6293,6 +6496,7 @@
           <w:p>
             <w:pPr>
               <w:spacing w:before="0" w:after="0" w:line="240" w:lineRule="auto"/>
+              <w:jc w:val="center"/>
             </w:pPr>
             <w:r>
               <w:rPr>
@@ -6316,6 +6520,7 @@
           <w:p>
             <w:pPr>
               <w:spacing w:before="0" w:after="0" w:line="240" w:lineRule="auto"/>
+              <w:jc w:val="center"/>
             </w:pPr>
             <w:r>
               <w:rPr>
@@ -6334,6 +6539,7 @@
           <w:p>
             <w:pPr>
               <w:spacing w:before="0" w:after="0" w:line="240" w:lineRule="auto"/>
+              <w:jc w:val="center"/>
             </w:pPr>
             <w:r>
               <w:rPr>
@@ -6352,6 +6558,7 @@
           <w:p>
             <w:pPr>
               <w:spacing w:before="0" w:after="0" w:line="240" w:lineRule="auto"/>
+              <w:jc w:val="center"/>
             </w:pPr>
             <w:r>
               <w:rPr>
@@ -6370,6 +6577,7 @@
           <w:p>
             <w:pPr>
               <w:spacing w:before="0" w:after="0" w:line="240" w:lineRule="auto"/>
+              <w:jc w:val="center"/>
             </w:pPr>
             <w:r>
               <w:rPr>
@@ -6388,6 +6596,7 @@
           <w:p>
             <w:pPr>
               <w:spacing w:before="0" w:after="0" w:line="240" w:lineRule="auto"/>
+              <w:jc w:val="center"/>
             </w:pPr>
             <w:r>
               <w:rPr>
@@ -6415,6 +6624,7 @@
           <w:p>
             <w:pPr>
               <w:spacing w:before="0" w:after="0" w:line="240" w:lineRule="auto"/>
+              <w:jc w:val="center"/>
             </w:pPr>
             <w:r>
               <w:rPr>
@@ -6437,6 +6647,7 @@
           <w:p>
             <w:pPr>
               <w:spacing w:before="0" w:after="0" w:line="240" w:lineRule="auto"/>
+              <w:jc w:val="center"/>
             </w:pPr>
             <w:r>
               <w:rPr>
@@ -6458,6 +6669,7 @@
           <w:p>
             <w:pPr>
               <w:spacing w:before="0" w:after="0" w:line="240" w:lineRule="auto"/>
+              <w:jc w:val="center"/>
             </w:pPr>
             <w:r>
               <w:rPr>
@@ -6480,6 +6692,7 @@
           <w:p>
             <w:pPr>
               <w:spacing w:before="0" w:after="0" w:line="240" w:lineRule="auto"/>
+              <w:jc w:val="center"/>
             </w:pPr>
             <w:r>
               <w:rPr>
@@ -6502,6 +6715,7 @@
           <w:p>
             <w:pPr>
               <w:spacing w:before="0" w:after="0" w:line="240" w:lineRule="auto"/>
+              <w:jc w:val="center"/>
             </w:pPr>
             <w:r>
               <w:rPr>
@@ -6619,7 +6833,7 @@
         <w:keepNext w:val="1"/>
         <w:spacing w:after="0" w:before="720" w:line="480" w:lineRule="auto"/>
         <w:ind w:firstLine="0"/>
-        <w:jc w:val="center"/>
+        <w:jc w:val="left"/>
         <w:rPr/>
       </w:pPr>
       <w:r>
@@ -6635,7 +6849,7 @@
       <w:pPr>
         <w:keepNext w:val="1"/>
         <w:spacing w:after="60" w:before="0" w:line="480" w:lineRule="auto"/>
-        <w:jc w:val="center"/>
+        <w:jc w:val="left"/>
         <w:rPr/>
       </w:pPr>
       <w:r>
@@ -6684,6 +6898,7 @@
           <w:p>
             <w:pPr>
               <w:spacing w:before="0" w:after="0" w:line="240" w:lineRule="auto"/>
+              <w:jc w:val="center"/>
             </w:pPr>
             <w:r>
               <w:rPr>
@@ -6705,6 +6920,7 @@
           <w:p>
             <w:pPr>
               <w:spacing w:before="0" w:after="0" w:line="240" w:lineRule="auto"/>
+              <w:jc w:val="center"/>
             </w:pPr>
             <w:r>
               <w:rPr>
@@ -6726,6 +6942,7 @@
           <w:p>
             <w:pPr>
               <w:spacing w:before="0" w:after="0" w:line="240" w:lineRule="auto"/>
+              <w:jc w:val="center"/>
             </w:pPr>
             <w:r>
               <w:rPr>
@@ -6747,6 +6964,7 @@
           <w:p>
             <w:pPr>
               <w:spacing w:before="0" w:after="0" w:line="240" w:lineRule="auto"/>
+              <w:jc w:val="center"/>
             </w:pPr>
             <w:r>
               <w:rPr>
@@ -6768,6 +6986,7 @@
           <w:p>
             <w:pPr>
               <w:spacing w:before="0" w:after="0" w:line="240" w:lineRule="auto"/>
+              <w:jc w:val="center"/>
             </w:pPr>
             <w:r>
               <w:rPr>
@@ -6791,6 +7010,7 @@
           <w:p>
             <w:pPr>
               <w:spacing w:before="0" w:after="0" w:line="240" w:lineRule="auto"/>
+              <w:jc w:val="center"/>
             </w:pPr>
             <w:r>
               <w:rPr>
@@ -6809,6 +7029,7 @@
           <w:p>
             <w:pPr>
               <w:spacing w:before="0" w:after="0" w:line="240" w:lineRule="auto"/>
+              <w:jc w:val="center"/>
             </w:pPr>
             <w:r>
               <w:rPr>
@@ -6827,6 +7048,7 @@
           <w:p>
             <w:pPr>
               <w:spacing w:before="0" w:after="0" w:line="240" w:lineRule="auto"/>
+              <w:jc w:val="center"/>
             </w:pPr>
             <w:r>
               <w:rPr>
@@ -6845,6 +7067,7 @@
           <w:p>
             <w:pPr>
               <w:spacing w:before="0" w:after="0" w:line="240" w:lineRule="auto"/>
+              <w:jc w:val="center"/>
             </w:pPr>
             <w:r>
               <w:rPr>
@@ -6863,6 +7086,7 @@
           <w:p>
             <w:pPr>
               <w:spacing w:before="0" w:after="0" w:line="240" w:lineRule="auto"/>
+              <w:jc w:val="center"/>
             </w:pPr>
             <w:r>
               <w:rPr>
@@ -6886,6 +7110,7 @@
           <w:p>
             <w:pPr>
               <w:spacing w:before="0" w:after="0" w:line="240" w:lineRule="auto"/>
+              <w:jc w:val="center"/>
             </w:pPr>
             <w:r>
               <w:rPr>
@@ -6904,6 +7129,7 @@
           <w:p>
             <w:pPr>
               <w:spacing w:before="0" w:after="0" w:line="240" w:lineRule="auto"/>
+              <w:jc w:val="center"/>
             </w:pPr>
             <w:r>
               <w:rPr>
@@ -6922,6 +7148,7 @@
           <w:p>
             <w:pPr>
               <w:spacing w:before="0" w:after="0" w:line="240" w:lineRule="auto"/>
+              <w:jc w:val="center"/>
             </w:pPr>
             <w:r>
               <w:rPr>
@@ -6940,6 +7167,7 @@
           <w:p>
             <w:pPr>
               <w:spacing w:before="0" w:after="0" w:line="240" w:lineRule="auto"/>
+              <w:jc w:val="center"/>
             </w:pPr>
             <w:r>
               <w:rPr>
@@ -6958,6 +7186,7 @@
           <w:p>
             <w:pPr>
               <w:spacing w:before="0" w:after="0" w:line="240" w:lineRule="auto"/>
+              <w:jc w:val="center"/>
             </w:pPr>
             <w:r>
               <w:rPr>
@@ -6981,6 +7210,7 @@
           <w:p>
             <w:pPr>
               <w:spacing w:before="0" w:after="0" w:line="240" w:lineRule="auto"/>
+              <w:jc w:val="center"/>
             </w:pPr>
             <w:r>
               <w:rPr>
@@ -6999,6 +7229,7 @@
           <w:p>
             <w:pPr>
               <w:spacing w:before="0" w:after="0" w:line="240" w:lineRule="auto"/>
+              <w:jc w:val="center"/>
             </w:pPr>
             <w:r>
               <w:rPr>
@@ -7017,6 +7248,7 @@
           <w:p>
             <w:pPr>
               <w:spacing w:before="0" w:after="0" w:line="240" w:lineRule="auto"/>
+              <w:jc w:val="center"/>
             </w:pPr>
             <w:r>
               <w:rPr>
@@ -7035,6 +7267,7 @@
           <w:p>
             <w:pPr>
               <w:spacing w:before="0" w:after="0" w:line="240" w:lineRule="auto"/>
+              <w:jc w:val="center"/>
             </w:pPr>
             <w:r>
               <w:rPr>
@@ -7053,6 +7286,7 @@
           <w:p>
             <w:pPr>
               <w:spacing w:before="0" w:after="0" w:line="240" w:lineRule="auto"/>
+              <w:jc w:val="center"/>
             </w:pPr>
             <w:r>
               <w:rPr>
@@ -7076,6 +7310,7 @@
           <w:p>
             <w:pPr>
               <w:spacing w:before="0" w:after="0" w:line="240" w:lineRule="auto"/>
+              <w:jc w:val="center"/>
             </w:pPr>
             <w:r>
               <w:rPr>
@@ -7094,6 +7329,7 @@
           <w:p>
             <w:pPr>
               <w:spacing w:before="0" w:after="0" w:line="240" w:lineRule="auto"/>
+              <w:jc w:val="center"/>
             </w:pPr>
             <w:r>
               <w:rPr>
@@ -7112,6 +7348,7 @@
           <w:p>
             <w:pPr>
               <w:spacing w:before="0" w:after="0" w:line="240" w:lineRule="auto"/>
+              <w:jc w:val="center"/>
             </w:pPr>
             <w:r>
               <w:rPr>
@@ -7130,6 +7367,7 @@
           <w:p>
             <w:pPr>
               <w:spacing w:before="0" w:after="0" w:line="240" w:lineRule="auto"/>
+              <w:jc w:val="center"/>
             </w:pPr>
             <w:r>
               <w:rPr>
@@ -7148,6 +7386,7 @@
           <w:p>
             <w:pPr>
               <w:spacing w:before="0" w:after="0" w:line="240" w:lineRule="auto"/>
+              <w:jc w:val="center"/>
             </w:pPr>
             <w:r>
               <w:rPr>
@@ -7171,6 +7410,7 @@
           <w:p>
             <w:pPr>
               <w:spacing w:before="0" w:after="0" w:line="240" w:lineRule="auto"/>
+              <w:jc w:val="center"/>
             </w:pPr>
             <w:r>
               <w:rPr>
@@ -7189,6 +7429,7 @@
           <w:p>
             <w:pPr>
               <w:spacing w:before="0" w:after="0" w:line="240" w:lineRule="auto"/>
+              <w:jc w:val="center"/>
             </w:pPr>
             <w:r>
               <w:rPr>
@@ -7207,6 +7448,7 @@
           <w:p>
             <w:pPr>
               <w:spacing w:before="0" w:after="0" w:line="240" w:lineRule="auto"/>
+              <w:jc w:val="center"/>
             </w:pPr>
             <w:r>
               <w:rPr>
@@ -7225,6 +7467,7 @@
           <w:p>
             <w:pPr>
               <w:spacing w:before="0" w:after="0" w:line="240" w:lineRule="auto"/>
+              <w:jc w:val="center"/>
             </w:pPr>
             <w:r>
               <w:rPr>
@@ -7243,6 +7486,7 @@
           <w:p>
             <w:pPr>
               <w:spacing w:before="0" w:after="0" w:line="240" w:lineRule="auto"/>
+              <w:jc w:val="center"/>
             </w:pPr>
             <w:r>
               <w:rPr>
@@ -7266,6 +7510,7 @@
           <w:p>
             <w:pPr>
               <w:spacing w:before="0" w:after="0" w:line="240" w:lineRule="auto"/>
+              <w:jc w:val="center"/>
             </w:pPr>
             <w:r>
               <w:rPr>
@@ -7284,6 +7529,7 @@
           <w:p>
             <w:pPr>
               <w:spacing w:before="0" w:after="0" w:line="240" w:lineRule="auto"/>
+              <w:jc w:val="center"/>
             </w:pPr>
             <w:r>
               <w:rPr>
@@ -7302,6 +7548,7 @@
           <w:p>
             <w:pPr>
               <w:spacing w:before="0" w:after="0" w:line="240" w:lineRule="auto"/>
+              <w:jc w:val="center"/>
             </w:pPr>
             <w:r>
               <w:rPr>
@@ -7320,6 +7567,7 @@
           <w:p>
             <w:pPr>
               <w:spacing w:before="0" w:after="0" w:line="240" w:lineRule="auto"/>
+              <w:jc w:val="center"/>
             </w:pPr>
             <w:r>
               <w:rPr>
@@ -7338,6 +7586,7 @@
           <w:p>
             <w:pPr>
               <w:spacing w:before="0" w:after="0" w:line="240" w:lineRule="auto"/>
+              <w:jc w:val="center"/>
             </w:pPr>
             <w:r>
               <w:rPr>
@@ -7364,6 +7613,7 @@
           <w:p>
             <w:pPr>
               <w:spacing w:before="0" w:after="0" w:line="240" w:lineRule="auto"/>
+              <w:jc w:val="center"/>
             </w:pPr>
             <w:r>
               <w:rPr>
@@ -7385,6 +7635,7 @@
           <w:p>
             <w:pPr>
               <w:spacing w:before="0" w:after="0" w:line="240" w:lineRule="auto"/>
+              <w:jc w:val="center"/>
             </w:pPr>
             <w:r>
               <w:rPr>
@@ -7406,6 +7657,7 @@
           <w:p>
             <w:pPr>
               <w:spacing w:before="0" w:after="0" w:line="240" w:lineRule="auto"/>
+              <w:jc w:val="center"/>
             </w:pPr>
             <w:r>
               <w:rPr>
@@ -7427,6 +7679,7 @@
           <w:p>
             <w:pPr>
               <w:spacing w:before="0" w:after="0" w:line="240" w:lineRule="auto"/>
+              <w:jc w:val="center"/>
             </w:pPr>
             <w:r>
               <w:rPr>
@@ -7448,6 +7701,7 @@
           <w:p>
             <w:pPr>
               <w:spacing w:before="0" w:after="0" w:line="240" w:lineRule="auto"/>
+              <w:jc w:val="center"/>
             </w:pPr>
             <w:r>
               <w:rPr>
@@ -7495,7 +7749,7 @@
       <w:pPr>
         <w:spacing w:line="480" w:lineRule="auto" w:before="0" w:after="0"/>
         <w:ind w:firstLine="720"/>
-        <w:jc w:val="both"/>
+        <w:jc w:val="left"/>
       </w:pPr>
       <w:r>
         <w:rPr>
@@ -7509,7 +7763,7 @@
       <w:pPr>
         <w:spacing w:line="480" w:lineRule="auto"/>
         <w:ind w:firstLine="0"/>
-        <w:jc w:val="center"/>
+        <w:jc w:val="left"/>
       </w:pPr>
       <w:r>
         <w:rPr>
@@ -7523,7 +7777,7 @@
       <w:pPr>
         <w:spacing w:line="480" w:lineRule="auto"/>
         <w:ind w:firstLine="0"/>
-        <w:jc w:val="center"/>
+        <w:jc w:val="left"/>
       </w:pPr>
       <w:r>
         <w:rPr>
@@ -7573,6 +7827,7 @@
           <w:p>
             <w:pPr>
               <w:spacing w:before="0" w:after="0"/>
+              <w:jc w:val="center"/>
             </w:pPr>
             <w:r>
               <w:rPr>
@@ -7594,6 +7849,7 @@
           <w:p>
             <w:pPr>
               <w:spacing w:before="0" w:after="0"/>
+              <w:jc w:val="center"/>
             </w:pPr>
             <w:r>
               <w:rPr>
@@ -7615,6 +7871,7 @@
           <w:p>
             <w:pPr>
               <w:spacing w:before="0" w:after="0"/>
+              <w:jc w:val="center"/>
             </w:pPr>
             <w:r>
               <w:rPr>
@@ -7636,6 +7893,7 @@
           <w:p>
             <w:pPr>
               <w:spacing w:before="0" w:after="0"/>
+              <w:jc w:val="center"/>
             </w:pPr>
             <w:r>
               <w:rPr>
@@ -7657,6 +7915,7 @@
           <w:p>
             <w:pPr>
               <w:spacing w:before="0" w:after="0"/>
+              <w:jc w:val="center"/>
             </w:pPr>
             <w:r>
               <w:rPr>
@@ -7679,6 +7938,7 @@
           <w:p>
             <w:pPr>
               <w:spacing w:before="0" w:after="0"/>
+              <w:jc w:val="center"/>
             </w:pPr>
             <w:r>
               <w:rPr>
@@ -7696,6 +7956,7 @@
           <w:p>
             <w:pPr>
               <w:spacing w:before="0" w:after="0"/>
+              <w:jc w:val="center"/>
             </w:pPr>
             <w:r>
               <w:rPr>
@@ -7713,6 +7974,7 @@
           <w:p>
             <w:pPr>
               <w:spacing w:before="0" w:after="0"/>
+              <w:jc w:val="center"/>
             </w:pPr>
             <w:r>
               <w:rPr>
@@ -7730,6 +7992,7 @@
           <w:p>
             <w:pPr>
               <w:spacing w:before="0" w:after="0"/>
+              <w:jc w:val="center"/>
             </w:pPr>
             <w:r>
               <w:rPr>
@@ -7747,6 +8010,7 @@
           <w:p>
             <w:pPr>
               <w:spacing w:before="0" w:after="0"/>
+              <w:jc w:val="center"/>
             </w:pPr>
             <w:r>
               <w:rPr>
@@ -7769,6 +8033,7 @@
           <w:p>
             <w:pPr>
               <w:spacing w:before="0" w:after="0"/>
+              <w:jc w:val="center"/>
             </w:pPr>
             <w:r>
               <w:rPr>
@@ -7786,6 +8051,7 @@
           <w:p>
             <w:pPr>
               <w:spacing w:before="0" w:after="0"/>
+              <w:jc w:val="center"/>
             </w:pPr>
             <w:r>
               <w:rPr>
@@ -7803,6 +8069,7 @@
           <w:p>
             <w:pPr>
               <w:spacing w:before="0" w:after="0"/>
+              <w:jc w:val="center"/>
             </w:pPr>
             <w:r>
               <w:rPr>
@@ -7820,6 +8087,7 @@
           <w:p>
             <w:pPr>
               <w:spacing w:before="0" w:after="0"/>
+              <w:jc w:val="center"/>
             </w:pPr>
             <w:r>
               <w:rPr>
@@ -7837,6 +8105,7 @@
           <w:p>
             <w:pPr>
               <w:spacing w:before="0" w:after="0"/>
+              <w:jc w:val="center"/>
             </w:pPr>
             <w:r>
               <w:rPr>
@@ -7859,6 +8128,7 @@
           <w:p>
             <w:pPr>
               <w:spacing w:before="0" w:after="0"/>
+              <w:jc w:val="center"/>
             </w:pPr>
             <w:r>
               <w:rPr>
@@ -7876,6 +8146,7 @@
           <w:p>
             <w:pPr>
               <w:spacing w:before="0" w:after="0"/>
+              <w:jc w:val="center"/>
             </w:pPr>
             <w:r>
               <w:rPr>
@@ -7893,6 +8164,7 @@
           <w:p>
             <w:pPr>
               <w:spacing w:before="0" w:after="0"/>
+              <w:jc w:val="center"/>
             </w:pPr>
             <w:r>
               <w:rPr>
@@ -7910,6 +8182,7 @@
           <w:p>
             <w:pPr>
               <w:spacing w:before="0" w:after="0"/>
+              <w:jc w:val="center"/>
             </w:pPr>
             <w:r>
               <w:rPr>
@@ -7927,6 +8200,7 @@
           <w:p>
             <w:pPr>
               <w:spacing w:before="0" w:after="0"/>
+              <w:jc w:val="center"/>
             </w:pPr>
             <w:r>
               <w:rPr>
@@ -7952,6 +8226,7 @@
           <w:p>
             <w:pPr>
               <w:spacing w:before="0" w:after="0"/>
+              <w:jc w:val="center"/>
             </w:pPr>
             <w:r>
               <w:rPr>
@@ -7972,6 +8247,7 @@
           <w:p>
             <w:pPr>
               <w:spacing w:before="0" w:after="0"/>
+              <w:jc w:val="center"/>
             </w:pPr>
             <w:r>
               <w:rPr>
@@ -7992,6 +8268,7 @@
           <w:p>
             <w:pPr>
               <w:spacing w:before="0" w:after="0"/>
+              <w:jc w:val="center"/>
             </w:pPr>
             <w:r>
               <w:rPr>
@@ -8012,6 +8289,7 @@
           <w:p>
             <w:pPr>
               <w:spacing w:before="0" w:after="0"/>
+              <w:jc w:val="center"/>
             </w:pPr>
             <w:r>
               <w:rPr>
@@ -8032,6 +8310,7 @@
           <w:p>
             <w:pPr>
               <w:spacing w:before="0" w:after="0"/>
+              <w:jc w:val="center"/>
             </w:pPr>
             <w:r>
               <w:rPr>
@@ -8084,7 +8363,7 @@
           <w:rFonts w:ascii="Georgia" w:hAnsi="Georgia" w:cs="Georgia"/>
           <w:sz w:val="22"/>
         </w:rPr>
-        <w:t>Two further cautions apply. Abstracts within a program may share advisers, so patterns may reflect supervision as much as individual choice, and spread within each program remains large. If potential is set aside, the remaining inventory shrinks and Veterinary Medicine’s share of unsoftened abstracts rises further. Low rates of hedging are widely reported in undergraduate and L2 academic writing (Hyland &amp; Milton, 1997; Qiu et al., 2024). In this PSAU sample the sharpest contrast in how English marks caution is between Biology and Veterinary Medicine. That local pattern appears in ratified abstracts, and supervised texts may reflect program tolerance for soft claims as much as individual rhetorical choice.</w:t>
+        <w:t>Two further cautions apply. Abstracts within a program may share advisers, so patterns may reflect supervision as much as individual choice, and spread within each program remains large. If potential is set aside, the remaining inventory shrinks and Veterinary Medicine’s share of unsoftened abstracts rises further. Low rates of hedging are widely reported in undergraduate academic writing (Hyland &amp; Milton, 1997; Qiu et al., 2024). In this PSAU sample the sharpest contrast in how English marks caution is between Biology and Veterinary Medicine. That local pattern appears in ratified abstracts, and supervised texts may reflect program tolerance for soft claims as much as individual rhetorical choice.</w:t>
       </w:r>
     </w:p>
     <w:p>
@@ -8178,7 +8457,7 @@
         <w:keepNext w:val="1"/>
         <w:spacing w:after="0" w:before="720" w:line="480" w:lineRule="auto"/>
         <w:ind w:firstLine="0"/>
-        <w:jc w:val="center"/>
+        <w:jc w:val="left"/>
         <w:rPr/>
       </w:pPr>
       <w:r>
@@ -8193,7 +8472,7 @@
       <w:pPr>
         <w:keepNext w:val="1"/>
         <w:spacing w:after="60" w:before="0" w:line="480" w:lineRule="auto"/>
-        <w:jc w:val="center"/>
+        <w:jc w:val="left"/>
         <w:rPr/>
       </w:pPr>
       <w:r>
@@ -8249,6 +8528,7 @@
           <w:p>
             <w:pPr>
               <w:spacing w:after="0" w:before="0" w:line="240" w:lineRule="auto"/>
+              <w:jc w:val="center"/>
               <w:rPr>
                 <w:sz w:val="18"/>
                 <w:szCs w:val="18"/>
@@ -8273,6 +8553,7 @@
           <w:p>
             <w:pPr>
               <w:spacing w:after="0" w:before="0" w:line="240" w:lineRule="auto"/>
+              <w:jc w:val="center"/>
               <w:rPr>
                 <w:sz w:val="18"/>
                 <w:szCs w:val="18"/>
@@ -8297,6 +8578,7 @@
           <w:p>
             <w:pPr>
               <w:spacing w:after="0" w:before="0" w:line="240" w:lineRule="auto"/>
+              <w:jc w:val="center"/>
               <w:rPr>
                 <w:sz w:val="18"/>
                 <w:szCs w:val="18"/>
@@ -8322,6 +8604,7 @@
           <w:p>
             <w:pPr>
               <w:spacing w:after="0" w:before="0" w:line="240" w:lineRule="auto"/>
+              <w:jc w:val="center"/>
               <w:rPr>
                 <w:sz w:val="18"/>
                 <w:szCs w:val="18"/>
@@ -8342,6 +8625,7 @@
           <w:p>
             <w:pPr>
               <w:spacing w:after="0" w:before="0" w:line="240" w:lineRule="auto"/>
+              <w:jc w:val="center"/>
               <w:rPr>
                 <w:sz w:val="18"/>
                 <w:szCs w:val="18"/>
@@ -8362,6 +8646,7 @@
           <w:p>
             <w:pPr>
               <w:spacing w:after="0" w:before="0" w:line="240" w:lineRule="auto"/>
+              <w:jc w:val="center"/>
               <w:rPr>
                 <w:sz w:val="18"/>
                 <w:szCs w:val="18"/>
@@ -8387,6 +8672,7 @@
           <w:p>
             <w:pPr>
               <w:spacing w:after="0" w:before="0" w:line="240" w:lineRule="auto"/>
+              <w:jc w:val="center"/>
               <w:rPr>
                 <w:sz w:val="18"/>
                 <w:szCs w:val="18"/>
@@ -8407,6 +8693,7 @@
           <w:p>
             <w:pPr>
               <w:spacing w:after="0" w:before="0" w:line="240" w:lineRule="auto"/>
+              <w:jc w:val="center"/>
               <w:rPr>
                 <w:sz w:val="18"/>
                 <w:szCs w:val="18"/>
@@ -8427,6 +8714,7 @@
           <w:p>
             <w:pPr>
               <w:spacing w:after="0" w:before="0" w:line="240" w:lineRule="auto"/>
+              <w:jc w:val="center"/>
               <w:rPr>
                 <w:sz w:val="18"/>
                 <w:szCs w:val="18"/>
@@ -8452,6 +8740,7 @@
           <w:p>
             <w:pPr>
               <w:spacing w:after="0" w:before="0" w:line="240" w:lineRule="auto"/>
+              <w:jc w:val="center"/>
               <w:rPr>
                 <w:sz w:val="18"/>
                 <w:szCs w:val="18"/>
@@ -8472,6 +8761,7 @@
           <w:p>
             <w:pPr>
               <w:spacing w:after="0" w:before="0" w:line="240" w:lineRule="auto"/>
+              <w:jc w:val="center"/>
               <w:rPr>
                 <w:sz w:val="18"/>
                 <w:szCs w:val="18"/>
@@ -8492,6 +8782,7 @@
           <w:p>
             <w:pPr>
               <w:spacing w:after="0" w:before="0" w:line="240" w:lineRule="auto"/>
+              <w:jc w:val="center"/>
               <w:rPr>
                 <w:sz w:val="18"/>
                 <w:szCs w:val="18"/>
@@ -8522,6 +8813,7 @@
           <w:p>
             <w:pPr>
               <w:spacing w:after="0" w:before="0" w:line="240" w:lineRule="auto"/>
+              <w:jc w:val="center"/>
               <w:rPr>
                 <w:sz w:val="18"/>
                 <w:szCs w:val="18"/>
@@ -8547,6 +8839,7 @@
           <w:p>
             <w:pPr>
               <w:spacing w:after="0" w:before="0" w:line="240" w:lineRule="auto"/>
+              <w:jc w:val="center"/>
               <w:rPr>
                 <w:sz w:val="18"/>
                 <w:szCs w:val="18"/>
@@ -8572,6 +8865,7 @@
           <w:p>
             <w:pPr>
               <w:spacing w:after="0" w:before="0" w:line="240" w:lineRule="auto"/>
+              <w:jc w:val="center"/>
               <w:rPr>
                 <w:sz w:val="18"/>
                 <w:szCs w:val="18"/>
@@ -8638,7 +8932,7 @@
       <w:pPr>
         <w:spacing w:line="480" w:lineRule="auto"/>
         <w:ind w:firstLine="0"/>
-        <w:jc w:val="center"/>
+        <w:jc w:val="left"/>
       </w:pPr>
       <w:r>
         <w:rPr>
@@ -8652,7 +8946,7 @@
       <w:pPr>
         <w:spacing w:line="480" w:lineRule="auto"/>
         <w:ind w:firstLine="0"/>
-        <w:jc w:val="center"/>
+        <w:jc w:val="left"/>
       </w:pPr>
       <w:r>
         <w:rPr>
@@ -8702,6 +8996,7 @@
           <w:p>
             <w:pPr>
               <w:spacing w:before="0" w:after="0"/>
+              <w:jc w:val="center"/>
             </w:pPr>
             <w:r>
               <w:rPr>
@@ -8723,6 +9018,7 @@
           <w:p>
             <w:pPr>
               <w:spacing w:before="0" w:after="0"/>
+              <w:jc w:val="center"/>
             </w:pPr>
             <w:r>
               <w:rPr>
@@ -8744,6 +9040,7 @@
           <w:p>
             <w:pPr>
               <w:spacing w:before="0" w:after="0"/>
+              <w:jc w:val="center"/>
             </w:pPr>
             <w:r>
               <w:rPr>
@@ -8765,6 +9062,7 @@
           <w:p>
             <w:pPr>
               <w:spacing w:before="0" w:after="0"/>
+              <w:jc w:val="center"/>
             </w:pPr>
             <w:r>
               <w:rPr>
@@ -8786,6 +9084,7 @@
           <w:p>
             <w:pPr>
               <w:spacing w:before="0" w:after="0"/>
+              <w:jc w:val="center"/>
             </w:pPr>
             <w:r>
               <w:rPr>
@@ -8808,6 +9107,7 @@
           <w:p>
             <w:pPr>
               <w:spacing w:before="0" w:after="0"/>
+              <w:jc w:val="center"/>
             </w:pPr>
             <w:r>
               <w:rPr>
@@ -8825,6 +9125,7 @@
           <w:p>
             <w:pPr>
               <w:spacing w:before="0" w:after="0"/>
+              <w:jc w:val="center"/>
             </w:pPr>
             <w:r>
               <w:rPr>
@@ -8842,6 +9143,7 @@
           <w:p>
             <w:pPr>
               <w:spacing w:before="0" w:after="0"/>
+              <w:jc w:val="center"/>
             </w:pPr>
             <w:r>
               <w:rPr>
@@ -8859,6 +9161,7 @@
           <w:p>
             <w:pPr>
               <w:spacing w:before="0" w:after="0"/>
+              <w:jc w:val="center"/>
             </w:pPr>
             <w:r>
               <w:rPr>
@@ -8876,6 +9179,7 @@
           <w:p>
             <w:pPr>
               <w:spacing w:before="0" w:after="0"/>
+              <w:jc w:val="center"/>
             </w:pPr>
             <w:r>
               <w:rPr>
@@ -8898,6 +9202,7 @@
           <w:p>
             <w:pPr>
               <w:spacing w:before="0" w:after="0"/>
+              <w:jc w:val="center"/>
             </w:pPr>
             <w:r>
               <w:rPr>
@@ -8915,6 +9220,7 @@
           <w:p>
             <w:pPr>
               <w:spacing w:before="0" w:after="0"/>
+              <w:jc w:val="center"/>
             </w:pPr>
             <w:r>
               <w:rPr>
@@ -8932,6 +9238,7 @@
           <w:p>
             <w:pPr>
               <w:spacing w:before="0" w:after="0"/>
+              <w:jc w:val="center"/>
             </w:pPr>
             <w:r>
               <w:rPr>
@@ -8949,6 +9256,7 @@
           <w:p>
             <w:pPr>
               <w:spacing w:before="0" w:after="0"/>
+              <w:jc w:val="center"/>
             </w:pPr>
             <w:r>
               <w:rPr>
@@ -8966,6 +9274,7 @@
           <w:p>
             <w:pPr>
               <w:spacing w:before="0" w:after="0"/>
+              <w:jc w:val="center"/>
             </w:pPr>
             <w:r>
               <w:rPr>
@@ -8988,6 +9297,7 @@
           <w:p>
             <w:pPr>
               <w:spacing w:before="0" w:after="0"/>
+              <w:jc w:val="center"/>
             </w:pPr>
             <w:r>
               <w:rPr>
@@ -9005,6 +9315,7 @@
           <w:p>
             <w:pPr>
               <w:spacing w:before="0" w:after="0"/>
+              <w:jc w:val="center"/>
             </w:pPr>
             <w:r>
               <w:rPr>
@@ -9022,6 +9333,7 @@
           <w:p>
             <w:pPr>
               <w:spacing w:before="0" w:after="0"/>
+              <w:jc w:val="center"/>
             </w:pPr>
             <w:r>
               <w:rPr>
@@ -9039,6 +9351,7 @@
           <w:p>
             <w:pPr>
               <w:spacing w:before="0" w:after="0"/>
+              <w:jc w:val="center"/>
             </w:pPr>
             <w:r>
               <w:rPr>
@@ -9056,6 +9369,7 @@
           <w:p>
             <w:pPr>
               <w:spacing w:before="0" w:after="0"/>
+              <w:jc w:val="center"/>
             </w:pPr>
             <w:r>
               <w:rPr>
@@ -9078,6 +9392,7 @@
           <w:p>
             <w:pPr>
               <w:spacing w:before="0" w:after="0"/>
+              <w:jc w:val="center"/>
             </w:pPr>
             <w:r>
               <w:rPr>
@@ -9095,6 +9410,7 @@
           <w:p>
             <w:pPr>
               <w:spacing w:before="0" w:after="0"/>
+              <w:jc w:val="center"/>
             </w:pPr>
             <w:r>
               <w:rPr>
@@ -9112,6 +9428,7 @@
           <w:p>
             <w:pPr>
               <w:spacing w:before="0" w:after="0"/>
+              <w:jc w:val="center"/>
             </w:pPr>
             <w:r>
               <w:rPr>
@@ -9129,6 +9446,7 @@
           <w:p>
             <w:pPr>
               <w:spacing w:before="0" w:after="0"/>
+              <w:jc w:val="center"/>
             </w:pPr>
             <w:r>
               <w:rPr>
@@ -9146,6 +9464,7 @@
           <w:p>
             <w:pPr>
               <w:spacing w:before="0" w:after="0"/>
+              <w:jc w:val="center"/>
             </w:pPr>
             <w:r>
               <w:rPr>
@@ -9168,6 +9487,7 @@
           <w:p>
             <w:pPr>
               <w:spacing w:before="0" w:after="0"/>
+              <w:jc w:val="center"/>
             </w:pPr>
             <w:r>
               <w:rPr>
@@ -9185,6 +9505,7 @@
           <w:p>
             <w:pPr>
               <w:spacing w:before="0" w:after="0"/>
+              <w:jc w:val="center"/>
             </w:pPr>
             <w:r>
               <w:rPr>
@@ -9202,6 +9523,7 @@
           <w:p>
             <w:pPr>
               <w:spacing w:before="0" w:after="0"/>
+              <w:jc w:val="center"/>
             </w:pPr>
             <w:r>
               <w:rPr>
@@ -9219,6 +9541,7 @@
           <w:p>
             <w:pPr>
               <w:spacing w:before="0" w:after="0"/>
+              <w:jc w:val="center"/>
             </w:pPr>
             <w:r>
               <w:rPr>
@@ -9236,6 +9559,7 @@
           <w:p>
             <w:pPr>
               <w:spacing w:before="0" w:after="0"/>
+              <w:jc w:val="center"/>
             </w:pPr>
             <w:r>
               <w:rPr>
@@ -9261,6 +9585,7 @@
           <w:p>
             <w:pPr>
               <w:spacing w:before="0" w:after="0"/>
+              <w:jc w:val="center"/>
             </w:pPr>
             <w:r>
               <w:rPr>
@@ -9281,6 +9606,7 @@
           <w:p>
             <w:pPr>
               <w:spacing w:before="0" w:after="0"/>
+              <w:jc w:val="center"/>
             </w:pPr>
             <w:r>
               <w:rPr>
@@ -9301,6 +9627,7 @@
           <w:p>
             <w:pPr>
               <w:spacing w:before="0" w:after="0"/>
+              <w:jc w:val="center"/>
             </w:pPr>
             <w:r>
               <w:rPr>
@@ -9321,6 +9648,7 @@
           <w:p>
             <w:pPr>
               <w:spacing w:before="0" w:after="0"/>
+              <w:jc w:val="center"/>
             </w:pPr>
             <w:r>
               <w:rPr>
@@ -9341,6 +9669,7 @@
           <w:p>
             <w:pPr>
               <w:spacing w:before="0" w:after="0"/>
+              <w:jc w:val="center"/>
             </w:pPr>
             <w:r>
               <w:rPr>
@@ -9371,7 +9700,7 @@
       <w:pPr>
         <w:spacing w:line="480" w:lineRule="auto"/>
         <w:ind w:firstLine="0"/>
-        <w:jc w:val="center"/>
+        <w:jc w:val="left"/>
       </w:pPr>
       <w:r>
         <w:rPr>
@@ -9385,7 +9714,7 @@
       <w:pPr>
         <w:spacing w:line="480" w:lineRule="auto"/>
         <w:ind w:firstLine="0"/>
-        <w:jc w:val="center"/>
+        <w:jc w:val="left"/>
       </w:pPr>
       <w:r>
         <w:rPr>
@@ -9434,6 +9763,7 @@
           <w:p>
             <w:pPr>
               <w:spacing w:before="0" w:after="0"/>
+              <w:jc w:val="center"/>
             </w:pPr>
             <w:r>
               <w:rPr>
@@ -9455,6 +9785,7 @@
           <w:p>
             <w:pPr>
               <w:spacing w:before="0" w:after="0"/>
+              <w:jc w:val="center"/>
             </w:pPr>
             <w:r>
               <w:rPr>
@@ -9476,6 +9807,7 @@
           <w:p>
             <w:pPr>
               <w:spacing w:before="0" w:after="0"/>
+              <w:jc w:val="center"/>
             </w:pPr>
             <w:r>
               <w:rPr>
@@ -9497,6 +9829,7 @@
           <w:p>
             <w:pPr>
               <w:spacing w:before="0" w:after="0"/>
+              <w:jc w:val="center"/>
             </w:pPr>
             <w:r>
               <w:rPr>
@@ -9519,6 +9852,7 @@
           <w:p>
             <w:pPr>
               <w:spacing w:before="0" w:after="0"/>
+              <w:jc w:val="center"/>
             </w:pPr>
             <w:r>
               <w:rPr>
@@ -9536,6 +9870,7 @@
           <w:p>
             <w:pPr>
               <w:spacing w:before="0" w:after="0"/>
+              <w:jc w:val="center"/>
             </w:pPr>
             <w:r>
               <w:rPr>
@@ -9553,6 +9888,7 @@
           <w:p>
             <w:pPr>
               <w:spacing w:before="0" w:after="0"/>
+              <w:jc w:val="center"/>
             </w:pPr>
             <w:r>
               <w:rPr>
@@ -9570,6 +9906,7 @@
           <w:p>
             <w:pPr>
               <w:spacing w:before="0" w:after="0"/>
+              <w:jc w:val="center"/>
             </w:pPr>
             <w:r>
               <w:rPr>
@@ -9592,6 +9929,7 @@
           <w:p>
             <w:pPr>
               <w:spacing w:before="0" w:after="0"/>
+              <w:jc w:val="center"/>
             </w:pPr>
             <w:r>
               <w:rPr>
@@ -9609,6 +9947,7 @@
           <w:p>
             <w:pPr>
               <w:spacing w:before="0" w:after="0"/>
+              <w:jc w:val="center"/>
             </w:pPr>
             <w:r>
               <w:rPr>
@@ -9626,6 +9965,7 @@
           <w:p>
             <w:pPr>
               <w:spacing w:before="0" w:after="0"/>
+              <w:jc w:val="center"/>
             </w:pPr>
             <w:r>
               <w:rPr>
@@ -9643,6 +9983,7 @@
           <w:p>
             <w:pPr>
               <w:spacing w:before="0" w:after="0"/>
+              <w:jc w:val="center"/>
             </w:pPr>
             <w:r>
               <w:rPr>
@@ -9665,6 +10006,7 @@
           <w:p>
             <w:pPr>
               <w:spacing w:before="0" w:after="0"/>
+              <w:jc w:val="center"/>
             </w:pPr>
             <w:r>
               <w:rPr>
@@ -9682,6 +10024,7 @@
           <w:p>
             <w:pPr>
               <w:spacing w:before="0" w:after="0"/>
+              <w:jc w:val="center"/>
             </w:pPr>
             <w:r>
               <w:rPr>
@@ -9699,6 +10042,7 @@
           <w:p>
             <w:pPr>
               <w:spacing w:before="0" w:after="0"/>
+              <w:jc w:val="center"/>
             </w:pPr>
             <w:r>
               <w:rPr>
@@ -9716,6 +10060,7 @@
           <w:p>
             <w:pPr>
               <w:spacing w:before="0" w:after="0"/>
+              <w:jc w:val="center"/>
             </w:pPr>
             <w:r>
               <w:rPr>
@@ -9738,6 +10083,7 @@
           <w:p>
             <w:pPr>
               <w:spacing w:before="0" w:after="0"/>
+              <w:jc w:val="center"/>
             </w:pPr>
             <w:r>
               <w:rPr>
@@ -9755,6 +10101,7 @@
           <w:p>
             <w:pPr>
               <w:spacing w:before="0" w:after="0"/>
+              <w:jc w:val="center"/>
             </w:pPr>
             <w:r>
               <w:rPr>
@@ -9772,6 +10119,7 @@
           <w:p>
             <w:pPr>
               <w:spacing w:before="0" w:after="0"/>
+              <w:jc w:val="center"/>
             </w:pPr>
             <w:r>
               <w:rPr>
@@ -9789,6 +10137,7 @@
           <w:p>
             <w:pPr>
               <w:spacing w:before="0" w:after="0"/>
+              <w:jc w:val="center"/>
             </w:pPr>
             <w:r>
               <w:rPr>
@@ -9811,6 +10160,7 @@
           <w:p>
             <w:pPr>
               <w:spacing w:before="0" w:after="0"/>
+              <w:jc w:val="center"/>
             </w:pPr>
             <w:r>
               <w:rPr>
@@ -9828,6 +10178,7 @@
           <w:p>
             <w:pPr>
               <w:spacing w:before="0" w:after="0"/>
+              <w:jc w:val="center"/>
             </w:pPr>
             <w:r>
               <w:rPr>
@@ -9845,6 +10196,7 @@
           <w:p>
             <w:pPr>
               <w:spacing w:before="0" w:after="0"/>
+              <w:jc w:val="center"/>
             </w:pPr>
             <w:r>
               <w:rPr>
@@ -9862,6 +10214,7 @@
           <w:p>
             <w:pPr>
               <w:spacing w:before="0" w:after="0"/>
+              <w:jc w:val="center"/>
             </w:pPr>
             <w:r>
               <w:rPr>
@@ -9887,6 +10240,7 @@
           <w:p>
             <w:pPr>
               <w:spacing w:before="0" w:after="0"/>
+              <w:jc w:val="center"/>
             </w:pPr>
             <w:r>
               <w:rPr>
@@ -9907,6 +10261,7 @@
           <w:p>
             <w:pPr>
               <w:spacing w:before="0" w:after="0"/>
+              <w:jc w:val="center"/>
             </w:pPr>
             <w:r>
               <w:rPr>
@@ -9927,6 +10282,7 @@
           <w:p>
             <w:pPr>
               <w:spacing w:before="0" w:after="0"/>
+              <w:jc w:val="center"/>
             </w:pPr>
             <w:r>
               <w:rPr>
@@ -9947,6 +10303,7 @@
           <w:p>
             <w:pPr>
               <w:spacing w:before="0" w:after="0"/>
+              <w:jc w:val="center"/>
             </w:pPr>
             <w:r>
               <w:rPr>
@@ -10051,7 +10408,7 @@
         <w:pageBreakBefore w:val="0"/>
         <w:spacing w:after="0" w:before="720" w:line="480" w:lineRule="auto"/>
         <w:ind w:firstLine="0"/>
-        <w:jc w:val="center"/>
+        <w:jc w:val="left"/>
         <w:rPr/>
       </w:pPr>
       <w:r>
@@ -10066,7 +10423,7 @@
       <w:pPr>
         <w:keepNext w:val="1"/>
         <w:spacing w:after="60" w:before="0" w:line="480" w:lineRule="auto"/>
-        <w:jc w:val="center"/>
+        <w:jc w:val="left"/>
         <w:rPr/>
       </w:pPr>
       <w:r>
@@ -10123,6 +10480,7 @@
           <w:p>
             <w:pPr>
               <w:spacing w:after="0" w:before="0" w:line="480" w:lineRule="auto"/>
+              <w:jc w:val="center"/>
               <w:rPr>
                 <w:sz w:val="18"/>
                 <w:szCs w:val="18"/>
@@ -10154,6 +10512,7 @@
           <w:p>
             <w:pPr>
               <w:spacing w:after="0" w:before="0" w:line="480" w:lineRule="auto"/>
+              <w:jc w:val="center"/>
               <w:rPr>
                 <w:sz w:val="18"/>
                 <w:szCs w:val="18"/>
@@ -10185,6 +10544,7 @@
           <w:p>
             <w:pPr>
               <w:spacing w:after="0" w:before="0" w:line="480" w:lineRule="auto"/>
+              <w:jc w:val="center"/>
               <w:rPr>
                 <w:sz w:val="18"/>
                 <w:szCs w:val="18"/>
@@ -10216,6 +10576,7 @@
           <w:p>
             <w:pPr>
               <w:spacing w:after="0" w:before="0" w:line="480" w:lineRule="auto"/>
+              <w:jc w:val="center"/>
               <w:rPr>
                 <w:sz w:val="18"/>
                 <w:szCs w:val="18"/>
@@ -10247,6 +10608,7 @@
           <w:p>
             <w:pPr>
               <w:spacing w:after="0" w:before="0" w:line="480" w:lineRule="auto"/>
+              <w:jc w:val="center"/>
               <w:rPr>
                 <w:sz w:val="18"/>
                 <w:szCs w:val="18"/>
@@ -10279,6 +10641,7 @@
           <w:p>
             <w:pPr>
               <w:spacing w:after="0" w:before="0" w:line="480" w:lineRule="auto"/>
+              <w:jc w:val="center"/>
               <w:rPr>
                 <w:sz w:val="18"/>
                 <w:szCs w:val="18"/>
@@ -10299,6 +10662,7 @@
           <w:p>
             <w:pPr>
               <w:spacing w:after="0" w:before="0" w:line="480" w:lineRule="auto"/>
+              <w:jc w:val="center"/>
               <w:rPr>
                 <w:sz w:val="18"/>
                 <w:szCs w:val="18"/>
@@ -10319,6 +10683,7 @@
           <w:p>
             <w:pPr>
               <w:spacing w:after="0" w:before="0" w:line="480" w:lineRule="auto"/>
+              <w:jc w:val="center"/>
               <w:rPr>
                 <w:sz w:val="18"/>
                 <w:szCs w:val="18"/>
@@ -10339,6 +10704,7 @@
           <w:p>
             <w:pPr>
               <w:spacing w:after="0" w:before="0" w:line="480" w:lineRule="auto"/>
+              <w:jc w:val="center"/>
               <w:rPr>
                 <w:sz w:val="18"/>
                 <w:szCs w:val="18"/>
@@ -10359,6 +10725,7 @@
           <w:p>
             <w:pPr>
               <w:spacing w:after="0" w:before="0" w:line="480" w:lineRule="auto"/>
+              <w:jc w:val="center"/>
               <w:rPr>
                 <w:sz w:val="18"/>
                 <w:szCs w:val="18"/>
@@ -10384,6 +10751,7 @@
           <w:p>
             <w:pPr>
               <w:spacing w:after="0" w:before="0" w:line="480" w:lineRule="auto"/>
+              <w:jc w:val="center"/>
               <w:rPr>
                 <w:sz w:val="18"/>
                 <w:szCs w:val="18"/>
@@ -10404,6 +10772,7 @@
           <w:p>
             <w:pPr>
               <w:spacing w:after="0" w:before="0" w:line="480" w:lineRule="auto"/>
+              <w:jc w:val="center"/>
               <w:rPr>
                 <w:sz w:val="18"/>
                 <w:szCs w:val="18"/>
@@ -10424,6 +10793,7 @@
           <w:p>
             <w:pPr>
               <w:spacing w:after="0" w:before="0" w:line="480" w:lineRule="auto"/>
+              <w:jc w:val="center"/>
               <w:rPr>
                 <w:sz w:val="18"/>
                 <w:szCs w:val="18"/>
@@ -10444,6 +10814,7 @@
           <w:p>
             <w:pPr>
               <w:spacing w:after="0" w:before="0" w:line="480" w:lineRule="auto"/>
+              <w:jc w:val="center"/>
               <w:rPr>
                 <w:sz w:val="18"/>
                 <w:szCs w:val="18"/>
@@ -10464,6 +10835,7 @@
           <w:p>
             <w:pPr>
               <w:spacing w:after="0" w:before="0" w:line="480" w:lineRule="auto"/>
+              <w:jc w:val="center"/>
               <w:rPr>
                 <w:sz w:val="18"/>
                 <w:szCs w:val="18"/>
@@ -10489,6 +10861,7 @@
           <w:p>
             <w:pPr>
               <w:spacing w:after="0" w:before="0" w:line="480" w:lineRule="auto"/>
+              <w:jc w:val="center"/>
               <w:rPr>
                 <w:sz w:val="18"/>
                 <w:szCs w:val="18"/>
@@ -10509,6 +10882,7 @@
           <w:p>
             <w:pPr>
               <w:spacing w:after="0" w:before="0" w:line="480" w:lineRule="auto"/>
+              <w:jc w:val="center"/>
               <w:rPr>
                 <w:sz w:val="18"/>
                 <w:szCs w:val="18"/>
@@ -10529,6 +10903,7 @@
           <w:p>
             <w:pPr>
               <w:spacing w:after="0" w:before="0" w:line="480" w:lineRule="auto"/>
+              <w:jc w:val="center"/>
               <w:rPr>
                 <w:sz w:val="18"/>
                 <w:szCs w:val="18"/>
@@ -10549,6 +10924,7 @@
           <w:p>
             <w:pPr>
               <w:spacing w:after="0" w:before="0" w:line="480" w:lineRule="auto"/>
+              <w:jc w:val="center"/>
               <w:rPr>
                 <w:sz w:val="18"/>
                 <w:szCs w:val="18"/>
@@ -10569,6 +10945,7 @@
           <w:p>
             <w:pPr>
               <w:spacing w:after="0" w:before="0" w:line="480" w:lineRule="auto"/>
+              <w:jc w:val="center"/>
               <w:rPr>
                 <w:sz w:val="18"/>
                 <w:szCs w:val="18"/>
@@ -10594,6 +10971,7 @@
           <w:p>
             <w:pPr>
               <w:spacing w:after="0" w:before="0" w:line="480" w:lineRule="auto"/>
+              <w:jc w:val="center"/>
               <w:rPr>
                 <w:sz w:val="18"/>
                 <w:szCs w:val="18"/>
@@ -10614,6 +10992,7 @@
           <w:p>
             <w:pPr>
               <w:spacing w:after="0" w:before="0" w:line="480" w:lineRule="auto"/>
+              <w:jc w:val="center"/>
               <w:rPr>
                 <w:sz w:val="18"/>
                 <w:szCs w:val="18"/>
@@ -10634,6 +11013,7 @@
           <w:p>
             <w:pPr>
               <w:spacing w:after="0" w:before="0" w:line="480" w:lineRule="auto"/>
+              <w:jc w:val="center"/>
               <w:rPr>
                 <w:sz w:val="18"/>
                 <w:szCs w:val="18"/>
@@ -10654,6 +11034,7 @@
           <w:p>
             <w:pPr>
               <w:spacing w:after="0" w:before="0" w:line="480" w:lineRule="auto"/>
+              <w:jc w:val="center"/>
               <w:rPr>
                 <w:sz w:val="18"/>
                 <w:szCs w:val="18"/>
@@ -10674,6 +11055,7 @@
           <w:p>
             <w:pPr>
               <w:spacing w:after="0" w:before="0" w:line="480" w:lineRule="auto"/>
+              <w:jc w:val="center"/>
               <w:rPr>
                 <w:sz w:val="18"/>
                 <w:szCs w:val="18"/>
@@ -10699,6 +11081,7 @@
           <w:p>
             <w:pPr>
               <w:spacing w:after="0" w:before="0" w:line="480" w:lineRule="auto"/>
+              <w:jc w:val="center"/>
               <w:rPr>
                 <w:sz w:val="18"/>
                 <w:szCs w:val="18"/>
@@ -10719,6 +11102,7 @@
           <w:p>
             <w:pPr>
               <w:spacing w:after="0" w:before="0" w:line="480" w:lineRule="auto"/>
+              <w:jc w:val="center"/>
               <w:rPr>
                 <w:sz w:val="18"/>
                 <w:szCs w:val="18"/>
@@ -10739,6 +11123,7 @@
           <w:p>
             <w:pPr>
               <w:spacing w:after="0" w:before="0" w:line="480" w:lineRule="auto"/>
+              <w:jc w:val="center"/>
               <w:rPr>
                 <w:sz w:val="18"/>
                 <w:szCs w:val="18"/>
@@ -10759,6 +11144,7 @@
           <w:p>
             <w:pPr>
               <w:spacing w:after="0" w:before="0" w:line="480" w:lineRule="auto"/>
+              <w:jc w:val="center"/>
               <w:rPr>
                 <w:sz w:val="18"/>
                 <w:szCs w:val="18"/>
@@ -10779,6 +11165,7 @@
           <w:p>
             <w:pPr>
               <w:spacing w:after="0" w:before="0" w:line="480" w:lineRule="auto"/>
+              <w:jc w:val="center"/>
               <w:rPr>
                 <w:sz w:val="18"/>
                 <w:szCs w:val="18"/>
@@ -10809,6 +11196,7 @@
           <w:p>
             <w:pPr>
               <w:spacing w:after="0" w:before="0" w:line="480" w:lineRule="auto"/>
+              <w:jc w:val="center"/>
               <w:rPr>
                 <w:sz w:val="18"/>
                 <w:szCs w:val="18"/>
@@ -10834,6 +11222,7 @@
           <w:p>
             <w:pPr>
               <w:spacing w:after="0" w:before="0" w:line="480" w:lineRule="auto"/>
+              <w:jc w:val="center"/>
               <w:rPr>
                 <w:sz w:val="18"/>
                 <w:szCs w:val="18"/>
@@ -10859,6 +11248,7 @@
           <w:p>
             <w:pPr>
               <w:spacing w:after="0" w:before="0" w:line="480" w:lineRule="auto"/>
+              <w:jc w:val="center"/>
               <w:rPr>
                 <w:sz w:val="18"/>
                 <w:szCs w:val="18"/>
@@ -10884,6 +11274,7 @@
           <w:p>
             <w:pPr>
               <w:spacing w:after="0" w:before="0" w:line="480" w:lineRule="auto"/>
+              <w:jc w:val="center"/>
               <w:rPr>
                 <w:sz w:val="18"/>
                 <w:szCs w:val="18"/>
@@ -10909,6 +11300,7 @@
           <w:p>
             <w:pPr>
               <w:spacing w:after="0" w:before="0" w:line="480" w:lineRule="auto"/>
+              <w:jc w:val="center"/>
               <w:rPr>
                 <w:sz w:val="18"/>
                 <w:szCs w:val="18"/>
@@ -10975,7 +11367,7 @@
       <w:pPr>
         <w:spacing w:line="480" w:lineRule="auto"/>
         <w:ind w:firstLine="0"/>
-        <w:jc w:val="center"/>
+        <w:jc w:val="left"/>
       </w:pPr>
       <w:r>
         <w:rPr>
@@ -10989,7 +11381,7 @@
       <w:pPr>
         <w:spacing w:line="480" w:lineRule="auto"/>
         <w:ind w:firstLine="0"/>
-        <w:jc w:val="center"/>
+        <w:jc w:val="left"/>
       </w:pPr>
       <w:r>
         <w:rPr>
@@ -11039,6 +11431,7 @@
           <w:p>
             <w:pPr>
               <w:spacing w:before="0" w:after="0"/>
+              <w:jc w:val="center"/>
             </w:pPr>
             <w:r>
               <w:rPr>
@@ -11060,6 +11453,7 @@
           <w:p>
             <w:pPr>
               <w:spacing w:before="0" w:after="0"/>
+              <w:jc w:val="center"/>
             </w:pPr>
             <w:r>
               <w:rPr>
@@ -11081,6 +11475,7 @@
           <w:p>
             <w:pPr>
               <w:spacing w:before="0" w:after="0"/>
+              <w:jc w:val="center"/>
             </w:pPr>
             <w:r>
               <w:rPr>
@@ -11102,6 +11497,7 @@
           <w:p>
             <w:pPr>
               <w:spacing w:before="0" w:after="0"/>
+              <w:jc w:val="center"/>
             </w:pPr>
             <w:r>
               <w:rPr>
@@ -11123,6 +11519,7 @@
           <w:p>
             <w:pPr>
               <w:spacing w:before="0" w:after="0"/>
+              <w:jc w:val="center"/>
             </w:pPr>
             <w:r>
               <w:rPr>
@@ -11145,6 +11542,7 @@
           <w:p>
             <w:pPr>
               <w:spacing w:before="0" w:after="0"/>
+              <w:jc w:val="center"/>
             </w:pPr>
             <w:r>
               <w:rPr>
@@ -11162,6 +11560,7 @@
           <w:p>
             <w:pPr>
               <w:spacing w:before="0" w:after="0"/>
+              <w:jc w:val="center"/>
             </w:pPr>
             <w:r>
               <w:rPr>
@@ -11179,6 +11578,7 @@
           <w:p>
             <w:pPr>
               <w:spacing w:before="0" w:after="0"/>
+              <w:jc w:val="center"/>
             </w:pPr>
             <w:r>
               <w:rPr>
@@ -11196,6 +11596,7 @@
           <w:p>
             <w:pPr>
               <w:spacing w:before="0" w:after="0"/>
+              <w:jc w:val="center"/>
             </w:pPr>
             <w:r>
               <w:rPr>
@@ -11213,6 +11614,7 @@
           <w:p>
             <w:pPr>
               <w:spacing w:before="0" w:after="0"/>
+              <w:jc w:val="center"/>
             </w:pPr>
             <w:r>
               <w:rPr>
@@ -11235,6 +11637,7 @@
           <w:p>
             <w:pPr>
               <w:spacing w:before="0" w:after="0"/>
+              <w:jc w:val="center"/>
             </w:pPr>
             <w:r>
               <w:rPr>
@@ -11252,6 +11655,7 @@
           <w:p>
             <w:pPr>
               <w:spacing w:before="0" w:after="0"/>
+              <w:jc w:val="center"/>
             </w:pPr>
             <w:r>
               <w:rPr>
@@ -11269,6 +11673,7 @@
           <w:p>
             <w:pPr>
               <w:spacing w:before="0" w:after="0"/>
+              <w:jc w:val="center"/>
             </w:pPr>
             <w:r>
               <w:rPr>
@@ -11286,6 +11691,7 @@
           <w:p>
             <w:pPr>
               <w:spacing w:before="0" w:after="0"/>
+              <w:jc w:val="center"/>
             </w:pPr>
             <w:r>
               <w:rPr>
@@ -11303,6 +11709,7 @@
           <w:p>
             <w:pPr>
               <w:spacing w:before="0" w:after="0"/>
+              <w:jc w:val="center"/>
             </w:pPr>
             <w:r>
               <w:rPr>
@@ -11325,6 +11732,7 @@
           <w:p>
             <w:pPr>
               <w:spacing w:before="0" w:after="0"/>
+              <w:jc w:val="center"/>
             </w:pPr>
             <w:r>
               <w:rPr>
@@ -11342,6 +11750,7 @@
           <w:p>
             <w:pPr>
               <w:spacing w:before="0" w:after="0"/>
+              <w:jc w:val="center"/>
             </w:pPr>
             <w:r>
               <w:rPr>
@@ -11359,6 +11768,7 @@
           <w:p>
             <w:pPr>
               <w:spacing w:before="0" w:after="0"/>
+              <w:jc w:val="center"/>
             </w:pPr>
             <w:r>
               <w:rPr>
@@ -11376,6 +11786,7 @@
           <w:p>
             <w:pPr>
               <w:spacing w:before="0" w:after="0"/>
+              <w:jc w:val="center"/>
             </w:pPr>
             <w:r>
               <w:rPr>
@@ -11393,6 +11804,7 @@
           <w:p>
             <w:pPr>
               <w:spacing w:before="0" w:after="0"/>
+              <w:jc w:val="center"/>
             </w:pPr>
             <w:r>
               <w:rPr>
@@ -11415,6 +11827,7 @@
           <w:p>
             <w:pPr>
               <w:spacing w:before="0" w:after="0"/>
+              <w:jc w:val="center"/>
             </w:pPr>
             <w:r>
               <w:rPr>
@@ -11432,6 +11845,7 @@
           <w:p>
             <w:pPr>
               <w:spacing w:before="0" w:after="0"/>
+              <w:jc w:val="center"/>
             </w:pPr>
             <w:r>
               <w:rPr>
@@ -11449,6 +11863,7 @@
           <w:p>
             <w:pPr>
               <w:spacing w:before="0" w:after="0"/>
+              <w:jc w:val="center"/>
             </w:pPr>
             <w:r>
               <w:rPr>
@@ -11466,6 +11881,7 @@
           <w:p>
             <w:pPr>
               <w:spacing w:before="0" w:after="0"/>
+              <w:jc w:val="center"/>
             </w:pPr>
             <w:r>
               <w:rPr>
@@ -11483,6 +11899,7 @@
           <w:p>
             <w:pPr>
               <w:spacing w:before="0" w:after="0"/>
+              <w:jc w:val="center"/>
             </w:pPr>
             <w:r>
               <w:rPr>
@@ -11505,6 +11922,7 @@
           <w:p>
             <w:pPr>
               <w:spacing w:before="0" w:after="0"/>
+              <w:jc w:val="center"/>
             </w:pPr>
             <w:r>
               <w:rPr>
@@ -11522,6 +11940,7 @@
           <w:p>
             <w:pPr>
               <w:spacing w:before="0" w:after="0"/>
+              <w:jc w:val="center"/>
             </w:pPr>
             <w:r>
               <w:rPr>
@@ -11539,6 +11958,7 @@
           <w:p>
             <w:pPr>
               <w:spacing w:before="0" w:after="0"/>
+              <w:jc w:val="center"/>
             </w:pPr>
             <w:r>
               <w:rPr>
@@ -11556,6 +11976,7 @@
           <w:p>
             <w:pPr>
               <w:spacing w:before="0" w:after="0"/>
+              <w:jc w:val="center"/>
             </w:pPr>
             <w:r>
               <w:rPr>
@@ -11573,6 +11994,7 @@
           <w:p>
             <w:pPr>
               <w:spacing w:before="0" w:after="0"/>
+              <w:jc w:val="center"/>
             </w:pPr>
             <w:r>
               <w:rPr>
@@ -11597,6 +12019,7 @@
           <w:p>
             <w:pPr>
               <w:spacing w:before="0" w:after="0"/>
+              <w:jc w:val="center"/>
             </w:pPr>
             <w:r>
               <w:rPr>
@@ -11617,6 +12040,7 @@
           <w:p>
             <w:pPr>
               <w:spacing w:before="0" w:after="0"/>
+              <w:jc w:val="center"/>
             </w:pPr>
             <w:r>
               <w:rPr>
@@ -11637,6 +12061,7 @@
           <w:p>
             <w:pPr>
               <w:spacing w:before="0" w:after="0"/>
+              <w:jc w:val="center"/>
             </w:pPr>
             <w:r>
               <w:rPr>
@@ -11657,6 +12082,7 @@
           <w:p>
             <w:pPr>
               <w:spacing w:before="0" w:after="0"/>
+              <w:jc w:val="center"/>
             </w:pPr>
             <w:r>
               <w:rPr>
@@ -11677,6 +12103,7 @@
           <w:p>
             <w:pPr>
               <w:spacing w:before="0" w:after="0"/>
+              <w:jc w:val="center"/>
             </w:pPr>
             <w:r>
               <w:rPr>
@@ -11779,7 +12206,7 @@
       <w:pPr>
         <w:spacing w:after="240" w:before="0" w:line="480" w:lineRule="auto"/>
         <w:ind w:firstLine="0"/>
-        <w:jc w:val="center"/>
+        <w:jc w:val="left"/>
         <w:rPr>
           <w:sz w:val="28"/>
           <w:szCs w:val="28"/>
@@ -11839,7 +12266,6 @@
         <w:rPr>
           <w:rtl w:val="0"/>
         </w:rPr>
-        <w:t xml:space="preserve">What follows states what that design allows the study to conclude about hedging in this corpus.</w:t>
       </w:r>
     </w:p>
     <w:p>
@@ -12035,7 +12461,7 @@
       <w:pPr>
         <w:spacing w:after="240" w:before="720" w:line="480" w:lineRule="auto"/>
         <w:ind w:firstLine="0"/>
-        <w:jc w:val="center"/>
+        <w:jc w:val="left"/>
         <w:rPr>
           <w:sz w:val="28"/>
           <w:szCs w:val="28"/>

</xml_diff>

<commit_message>
Draft_124: restore center alignment on title page only
</commit_message>
<xml_diff>
--- a/thesis/003_ThesisProposal_Draft_124_body.docx
+++ b/thesis/003_ThesisProposal_Draft_124_body.docx
@@ -5,29 +5,31 @@
     <w:p>
       <w:pPr>
         <w:spacing w:after="0" w:before="0" w:line="480" w:lineRule="auto"/>
-        <w:rPr/>
-      </w:pPr>
-      <w:r>
-        <w:rPr>
-          <w:rtl w:val="0"/>
-        </w:rPr>
-      </w:r>
-    </w:p>
-    <w:p>
-      <w:pPr>
-        <w:spacing w:after="0" w:before="0" w:line="480" w:lineRule="auto"/>
-        <w:rPr/>
-      </w:pPr>
-      <w:r>
-        <w:rPr>
-          <w:rtl w:val="0"/>
-        </w:rPr>
-      </w:r>
-    </w:p>
-    <w:p>
-      <w:pPr>
-        <w:spacing w:after="0" w:before="0" w:line="480" w:lineRule="auto"/>
-        <w:jc w:val="left"/>
+        <w:jc w:val="center"/>
+        <w:rPr/>
+      </w:pPr>
+      <w:r>
+        <w:rPr>
+          <w:rtl w:val="0"/>
+        </w:rPr>
+      </w:r>
+    </w:p>
+    <w:p>
+      <w:pPr>
+        <w:spacing w:after="0" w:before="0" w:line="480" w:lineRule="auto"/>
+        <w:jc w:val="center"/>
+        <w:rPr/>
+      </w:pPr>
+      <w:r>
+        <w:rPr>
+          <w:rtl w:val="0"/>
+        </w:rPr>
+      </w:r>
+    </w:p>
+    <w:p>
+      <w:pPr>
+        <w:spacing w:after="0" w:before="0" w:line="480" w:lineRule="auto"/>
+        <w:jc w:val="center"/>
         <w:rPr>
           <w:sz w:val="28"/>
           <w:szCs w:val="28"/>
@@ -52,7 +54,7 @@
     <w:p>
       <w:pPr>
         <w:spacing w:after="0" w:before="0" w:line="480" w:lineRule="auto"/>
-        <w:jc w:val="left"/>
+        <w:jc w:val="center"/>
         <w:rPr>
           <w:sz w:val="28"/>
           <w:szCs w:val="28"/>
@@ -101,7 +103,7 @@
     <w:p>
       <w:pPr>
         <w:spacing w:after="0" w:before="0" w:line="480" w:lineRule="auto"/>
-        <w:jc w:val="left"/>
+        <w:jc w:val="center"/>
         <w:rPr/>
       </w:pPr>
       <w:r>
@@ -114,7 +116,7 @@
     <w:p>
       <w:pPr>
         <w:spacing w:after="0" w:before="0" w:line="480" w:lineRule="auto"/>
-        <w:jc w:val="left"/>
+        <w:jc w:val="center"/>
         <w:rPr/>
       </w:pPr>
       <w:r>
@@ -127,7 +129,7 @@
     <w:p>
       <w:pPr>
         <w:spacing w:after="0" w:before="0" w:line="480" w:lineRule="auto"/>
-        <w:jc w:val="left"/>
+        <w:jc w:val="center"/>
         <w:rPr/>
       </w:pPr>
       <w:r>
@@ -140,7 +142,7 @@
     <w:p>
       <w:pPr>
         <w:spacing w:after="0" w:before="0" w:line="480" w:lineRule="auto"/>
-        <w:jc w:val="left"/>
+        <w:jc w:val="center"/>
         <w:rPr/>
       </w:pPr>
       <w:r>
@@ -153,7 +155,7 @@
     <w:p>
       <w:pPr>
         <w:spacing w:after="0" w:before="0" w:line="480" w:lineRule="auto"/>
-        <w:jc w:val="left"/>
+        <w:jc w:val="center"/>
         <w:rPr/>
       </w:pPr>
       <w:r>
@@ -166,7 +168,7 @@
     <w:p>
       <w:pPr>
         <w:spacing w:after="0" w:before="0" w:line="480" w:lineRule="auto"/>
-        <w:jc w:val="left"/>
+        <w:jc w:val="center"/>
         <w:rPr/>
       </w:pPr>
       <w:r>
@@ -203,7 +205,7 @@
     <w:p>
       <w:pPr>
         <w:spacing w:after="0" w:before="0" w:line="480" w:lineRule="auto"/>
-        <w:jc w:val="left"/>
+        <w:jc w:val="center"/>
         <w:rPr/>
       </w:pPr>
       <w:r>
@@ -216,7 +218,7 @@
     <w:p>
       <w:pPr>
         <w:spacing w:after="0" w:before="0" w:line="480" w:lineRule="auto"/>
-        <w:jc w:val="left"/>
+        <w:jc w:val="center"/>
         <w:rPr/>
       </w:pPr>
       <w:r>
@@ -229,7 +231,7 @@
     <w:p>
       <w:pPr>
         <w:spacing w:after="0" w:before="0" w:line="480" w:lineRule="auto"/>
-        <w:jc w:val="left"/>
+        <w:jc w:val="center"/>
         <w:rPr/>
       </w:pPr>
       <w:r>
@@ -267,7 +269,7 @@
       <w:pPr>
         <w:keepNext w:val="1"/>
         <w:spacing w:after="0" w:before="0" w:line="480" w:lineRule="auto"/>
-        <w:jc w:val="left"/>
+        <w:jc w:val="center"/>
         <w:rPr/>
       </w:pPr>
       <w:r>
@@ -346,7 +348,7 @@
       <w:pPr>
         <w:keepNext w:val="1"/>
         <w:spacing w:after="0" w:before="0" w:line="480" w:lineRule="auto"/>
-        <w:jc w:val="left"/>
+        <w:jc w:val="center"/>
         <w:rPr/>
       </w:pPr>
       <w:r>
@@ -367,7 +369,7 @@
       <w:pPr>
         <w:keepLines w:val="1"/>
         <w:spacing w:after="0" w:before="0" w:line="480" w:lineRule="auto"/>
-        <w:jc w:val="left"/>
+        <w:jc w:val="center"/>
         <w:rPr/>
         <w:sectPr>
           <w:headerReference r:id="rId6" w:type="default"/>

</xml_diff>

<commit_message>
Draft_124_body: clear indent on all thematic minor headers
Lit-review and discussion subheads had kept body first-line
indent. Forced zero indent on the full minor-header set.
</commit_message>
<xml_diff>
--- a/thesis/003_ThesisProposal_Draft_124_body.docx
+++ b/thesis/003_ThesisProposal_Draft_124_body.docx
@@ -640,12 +640,12 @@
       <w:pPr>
         <w:keepNext w:val="1"/>
         <w:spacing w:after="0" w:before="0" w:line="480" w:lineRule="auto"/>
-        <w:ind w:firstLine="0" w:left="0"/>
         <w:jc w:val="left"/>
         <w:rPr>
           <w:sz w:val="24"/>
           <w:szCs w:val="24"/>
         </w:rPr>
+        <w:ind w:left="0" w:right="0" w:firstLineChars="0" w:hangingChars="0" w:firstLine="0"/>
       </w:pPr>
       <w:r>
         <w:rPr>
@@ -653,7 +653,7 @@
           <w:sz w:val="24"/>
           <w:szCs w:val="24"/>
           <w:rtl w:val="0"/>
-          <w:b w:val="1"/>
+          <w:b/>
           <w:bCs w:val="1"/>
           <w:i w:val="0"/>
           <w:iCs w:val="0"/>
@@ -665,7 +665,7 @@
           <w:rFonts w:ascii="Georgia" w:hAnsi="Georgia" w:cs="Georgia" w:eastAsia="Georgia"/>
           <w:sz w:val="24"/>
           <w:rtl w:val="0"/>
-          <w:b w:val="1"/>
+          <w:b/>
           <w:bCs w:val="1"/>
           <w:i w:val="0"/>
           <w:iCs w:val="0"/>
@@ -778,28 +778,32 @@
     <w:p>
       <w:pPr>
         <w:spacing w:after="0" w:before="0" w:line="480" w:lineRule="auto"/>
-        <w:ind w:firstLine="720" w:left="0"/>
-        <w:jc w:val="both"/>
+        <w:jc w:val="left"/>
         <w:rPr>
           <w:sz w:val="24"/>
           <w:szCs w:val="24"/>
         </w:rPr>
-      </w:pPr>
-      <w:r>
-        <w:rPr>
-          <w:rFonts w:ascii="Georgia" w:hAnsi="Georgia" w:cs="Georgia" w:eastAsia="Georgia"/>
-          <w:sz w:val="22"/>
+        <w:ind w:left="0" w:right="0" w:firstLineChars="0" w:hangingChars="0" w:firstLine="0"/>
+      </w:pPr>
+      <w:r>
+        <w:rPr>
+          <w:rFonts w:ascii="Georgia" w:hAnsi="Georgia" w:cs="Georgia" w:eastAsia="Georgia"/>
+          <w:sz w:val="24"/>
           <w:szCs w:val="24"/>
           <w:rtl w:val="0"/>
-          <w:b w:val="0"/>
-          <w:bCs w:val="0"/>
-          <w:i w:val="1"/>
+          <w:b/>
+          <w:bCs w:val="0"/>
+          <w:i w:val="0"/>
           <w:iCs w:val="1"/>
         </w:rPr>
         <w:t xml:space="preserve">Hedging in Undergraduate Writing</w:t>
       </w:r>
       <w:r>
         <w:rPr>
+          <w:rFonts w:ascii="Georgia" w:hAnsi="Georgia" w:cs="Georgia" w:eastAsia="Georgia"/>
+          <w:b/>
+          <w:i w:val="0"/>
+          <w:sz w:val="24"/>
           <w:rtl w:val="0"/>
         </w:rPr>
       </w:r>
@@ -906,28 +910,32 @@
     <w:p>
       <w:pPr>
         <w:spacing w:after="0" w:before="0" w:line="480" w:lineRule="auto"/>
-        <w:ind w:firstLine="720" w:left="0"/>
-        <w:jc w:val="both"/>
+        <w:jc w:val="left"/>
         <w:rPr>
           <w:sz w:val="24"/>
           <w:szCs w:val="24"/>
         </w:rPr>
-      </w:pPr>
-      <w:r>
-        <w:rPr>
-          <w:rFonts w:ascii="Georgia" w:hAnsi="Georgia" w:cs="Georgia" w:eastAsia="Georgia"/>
-          <w:sz w:val="22"/>
+        <w:ind w:left="0" w:right="0" w:firstLineChars="0" w:hangingChars="0" w:firstLine="0"/>
+      </w:pPr>
+      <w:r>
+        <w:rPr>
+          <w:rFonts w:ascii="Georgia" w:hAnsi="Georgia" w:cs="Georgia" w:eastAsia="Georgia"/>
+          <w:sz w:val="24"/>
           <w:szCs w:val="24"/>
           <w:rtl w:val="0"/>
-          <w:b w:val="0"/>
-          <w:bCs w:val="0"/>
-          <w:i w:val="1"/>
+          <w:b/>
+          <w:bCs w:val="0"/>
+          <w:i w:val="0"/>
           <w:iCs w:val="1"/>
         </w:rPr>
         <w:t xml:space="preserve">Disciplinary Variation in Scientific and Medical Writing</w:t>
       </w:r>
       <w:r>
         <w:rPr>
+          <w:rFonts w:ascii="Georgia" w:hAnsi="Georgia" w:cs="Georgia" w:eastAsia="Georgia"/>
+          <w:b/>
+          <w:i w:val="0"/>
+          <w:sz w:val="24"/>
           <w:rtl w:val="0"/>
         </w:rPr>
       </w:r>
@@ -1151,28 +1159,32 @@
     <w:p>
       <w:pPr>
         <w:spacing w:after="0" w:before="0" w:line="480" w:lineRule="auto"/>
-        <w:ind w:firstLine="720" w:left="0"/>
-        <w:jc w:val="both"/>
+        <w:jc w:val="left"/>
         <w:rPr>
           <w:sz w:val="24"/>
           <w:szCs w:val="24"/>
         </w:rPr>
-      </w:pPr>
-      <w:r>
-        <w:rPr>
-          <w:rFonts w:ascii="Georgia" w:hAnsi="Georgia" w:cs="Georgia" w:eastAsia="Georgia"/>
-          <w:sz w:val="22"/>
+        <w:ind w:left="0" w:right="0" w:firstLineChars="0" w:hangingChars="0" w:firstLine="0"/>
+      </w:pPr>
+      <w:r>
+        <w:rPr>
+          <w:rFonts w:ascii="Georgia" w:hAnsi="Georgia" w:cs="Georgia" w:eastAsia="Georgia"/>
+          <w:sz w:val="24"/>
           <w:szCs w:val="24"/>
           <w:rtl w:val="0"/>
-          <w:b w:val="0"/>
-          <w:bCs w:val="0"/>
-          <w:i w:val="1"/>
+          <w:b/>
+          <w:bCs w:val="0"/>
+          <w:i w:val="0"/>
           <w:iCs w:val="1"/>
         </w:rPr>
         <w:t xml:space="preserve">Hedging in L2 and EFL Contexts</w:t>
       </w:r>
       <w:r>
         <w:rPr>
+          <w:rFonts w:ascii="Georgia" w:hAnsi="Georgia" w:cs="Georgia" w:eastAsia="Georgia"/>
+          <w:b/>
+          <w:i w:val="0"/>
+          <w:sz w:val="24"/>
           <w:rtl w:val="0"/>
         </w:rPr>
       </w:r>
@@ -1288,28 +1300,32 @@
     <w:p>
       <w:pPr>
         <w:spacing w:after="0" w:before="0" w:line="480" w:lineRule="auto"/>
-        <w:ind w:firstLine="720" w:left="0"/>
-        <w:jc w:val="both"/>
+        <w:jc w:val="left"/>
         <w:rPr>
           <w:sz w:val="24"/>
           <w:szCs w:val="24"/>
         </w:rPr>
-      </w:pPr>
-      <w:r>
-        <w:rPr>
-          <w:rFonts w:ascii="Georgia" w:hAnsi="Georgia" w:cs="Georgia" w:eastAsia="Georgia"/>
-          <w:sz w:val="22"/>
+        <w:ind w:left="0" w:right="0" w:firstLineChars="0" w:hangingChars="0" w:firstLine="0"/>
+      </w:pPr>
+      <w:r>
+        <w:rPr>
+          <w:rFonts w:ascii="Georgia" w:hAnsi="Georgia" w:cs="Georgia" w:eastAsia="Georgia"/>
+          <w:sz w:val="24"/>
           <w:szCs w:val="24"/>
           <w:rtl w:val="0"/>
-          <w:b w:val="0"/>
-          <w:bCs w:val="0"/>
-          <w:i w:val="1"/>
+          <w:b/>
+          <w:bCs w:val="0"/>
+          <w:i w:val="0"/>
           <w:iCs w:val="1"/>
         </w:rPr>
         <w:t xml:space="preserve">Hedging in Philippine Academic Writing Contexts</w:t>
       </w:r>
       <w:r>
         <w:rPr>
+          <w:rFonts w:ascii="Georgia" w:hAnsi="Georgia" w:cs="Georgia" w:eastAsia="Georgia"/>
+          <w:b/>
+          <w:i w:val="0"/>
+          <w:sz w:val="24"/>
           <w:rtl w:val="0"/>
         </w:rPr>
       </w:r>
@@ -1412,28 +1428,32 @@
     <w:p>
       <w:pPr>
         <w:spacing w:after="0" w:before="0" w:line="480" w:lineRule="auto"/>
-        <w:ind w:firstLine="720" w:left="0"/>
-        <w:jc w:val="both"/>
+        <w:jc w:val="left"/>
         <w:rPr>
           <w:sz w:val="24"/>
           <w:szCs w:val="24"/>
         </w:rPr>
-      </w:pPr>
-      <w:r>
-        <w:rPr>
-          <w:rFonts w:ascii="Georgia" w:hAnsi="Georgia" w:cs="Georgia" w:eastAsia="Georgia"/>
-          <w:sz w:val="22"/>
+        <w:ind w:left="0" w:right="0" w:firstLineChars="0" w:hangingChars="0" w:firstLine="0"/>
+      </w:pPr>
+      <w:r>
+        <w:rPr>
+          <w:rFonts w:ascii="Georgia" w:hAnsi="Georgia" w:cs="Georgia" w:eastAsia="Georgia"/>
+          <w:sz w:val="24"/>
           <w:szCs w:val="24"/>
           <w:rtl w:val="0"/>
-          <w:b w:val="0"/>
-          <w:bCs w:val="0"/>
-          <w:i w:val="1"/>
+          <w:b/>
+          <w:bCs w:val="0"/>
+          <w:i w:val="0"/>
           <w:iCs w:val="1"/>
         </w:rPr>
         <w:t xml:space="preserve">Disciplinary Variation in Abstracts and Undergraduate Theses</w:t>
       </w:r>
       <w:r>
         <w:rPr>
+          <w:rFonts w:ascii="Georgia" w:hAnsi="Georgia" w:cs="Georgia" w:eastAsia="Georgia"/>
+          <w:b/>
+          <w:i w:val="0"/>
+          <w:sz w:val="24"/>
           <w:rtl w:val="0"/>
         </w:rPr>
       </w:r>
@@ -1682,12 +1702,12 @@
       <w:pPr>
         <w:keepNext w:val="1"/>
         <w:spacing w:after="0" w:before="240" w:line="480" w:lineRule="auto"/>
-        <w:ind w:firstLine="0" w:left="0"/>
         <w:jc w:val="left"/>
         <w:rPr>
           <w:sz w:val="24"/>
           <w:szCs w:val="24"/>
         </w:rPr>
+        <w:ind w:left="0" w:right="0" w:firstLineChars="0" w:hangingChars="0" w:firstLine="0"/>
       </w:pPr>
       <w:r>
         <w:rPr>
@@ -1695,7 +1715,7 @@
           <w:sz w:val="24"/>
           <w:szCs w:val="24"/>
           <w:rtl w:val="0"/>
-          <w:b w:val="1"/>
+          <w:b/>
           <w:bCs w:val="1"/>
           <w:i w:val="0"/>
           <w:iCs w:val="0"/>
@@ -1707,7 +1727,7 @@
           <w:rFonts w:ascii="Georgia" w:hAnsi="Georgia" w:cs="Georgia" w:eastAsia="Georgia"/>
           <w:sz w:val="24"/>
           <w:rtl w:val="0"/>
-          <w:b w:val="1"/>
+          <w:b/>
           <w:bCs w:val="1"/>
           <w:i w:val="0"/>
           <w:iCs w:val="0"/>
@@ -1838,12 +1858,12 @@
       <w:pPr>
         <w:keepNext w:val="1"/>
         <w:spacing w:after="0" w:before="240" w:line="480" w:lineRule="auto"/>
-        <w:ind w:firstLine="0" w:left="0"/>
         <w:jc w:val="left"/>
         <w:rPr>
           <w:sz w:val="24"/>
           <w:szCs w:val="24"/>
         </w:rPr>
+        <w:ind w:left="0" w:right="0" w:firstLineChars="0" w:hangingChars="0" w:firstLine="0"/>
       </w:pPr>
       <w:r>
         <w:rPr>
@@ -1851,7 +1871,7 @@
           <w:sz w:val="24"/>
           <w:szCs w:val="24"/>
           <w:rtl w:val="0"/>
-          <w:b w:val="1"/>
+          <w:b/>
           <w:bCs w:val="1"/>
           <w:i w:val="0"/>
           <w:iCs w:val="0"/>
@@ -1863,7 +1883,7 @@
           <w:rFonts w:ascii="Georgia" w:hAnsi="Georgia" w:cs="Georgia" w:eastAsia="Georgia"/>
           <w:sz w:val="24"/>
           <w:rtl w:val="0"/>
-          <w:b w:val="1"/>
+          <w:b/>
           <w:bCs w:val="1"/>
           <w:i w:val="0"/>
           <w:iCs w:val="0"/>
@@ -1892,16 +1912,16 @@
     <w:p>
       <w:pPr>
         <w:spacing w:after="0" w:before="0" w:line="480" w:lineRule="auto"/>
-        <w:jc w:val="both"/>
+        <w:jc w:val="left"/>
         <w:rPr/>
-        <w:ind w:firstLine="720" w:left="0"/>
-      </w:pPr>
-      <w:r>
-        <w:rPr>
-          <w:rFonts w:ascii="Georgia" w:hAnsi="Georgia" w:cs="Georgia" w:eastAsia="Georgia"/>
-          <w:sz w:val="22"/>
+        <w:ind w:left="0" w:right="0" w:firstLineChars="0" w:hangingChars="0" w:firstLine="0"/>
+      </w:pPr>
+      <w:r>
+        <w:rPr>
+          <w:rFonts w:ascii="Georgia" w:hAnsi="Georgia" w:cs="Georgia" w:eastAsia="Georgia"/>
+          <w:sz w:val="24"/>
           <w:rtl w:val="0"/>
-          <w:b w:val="0"/>
+          <w:b/>
           <w:bCs w:val="0"/>
           <w:i w:val="0"/>
           <w:iCs w:val="0"/>
@@ -1910,6 +1930,10 @@
       </w:r>
       <w:r>
         <w:rPr>
+          <w:rFonts w:ascii="Georgia" w:hAnsi="Georgia" w:cs="Georgia" w:eastAsia="Georgia"/>
+          <w:b/>
+          <w:i w:val="0"/>
+          <w:sz w:val="24"/>
           <w:rtl w:val="0"/>
         </w:rPr>
       </w:r>
@@ -1917,24 +1941,28 @@
     <w:p>
       <w:pPr>
         <w:spacing w:after="0" w:before="0" w:line="480" w:lineRule="auto"/>
-        <w:jc w:val="both"/>
+        <w:jc w:val="left"/>
         <w:rPr/>
-        <w:ind w:firstLine="720" w:left="0"/>
-      </w:pPr>
-      <w:r>
-        <w:rPr>
-          <w:rFonts w:ascii="Georgia" w:hAnsi="Georgia" w:cs="Georgia" w:eastAsia="Georgia"/>
-          <w:sz w:val="22"/>
+        <w:ind w:left="0" w:right="0" w:firstLineChars="0" w:hangingChars="0" w:firstLine="0"/>
+      </w:pPr>
+      <w:r>
+        <w:rPr>
+          <w:rFonts w:ascii="Georgia" w:hAnsi="Georgia" w:cs="Georgia" w:eastAsia="Georgia"/>
+          <w:sz w:val="24"/>
           <w:rtl w:val="0"/>
-          <w:b w:val="0"/>
-          <w:bCs w:val="0"/>
-          <w:i w:val="1"/>
+          <w:b/>
+          <w:bCs w:val="0"/>
+          <w:i w:val="0"/>
           <w:iCs w:val="1"/>
         </w:rPr>
         <w:t xml:space="preserve">Conceptual Framework of the Study</w:t>
       </w:r>
       <w:r>
         <w:rPr>
+          <w:rFonts w:ascii="Georgia" w:hAnsi="Georgia" w:cs="Georgia" w:eastAsia="Georgia"/>
+          <w:b/>
+          <w:i w:val="0"/>
+          <w:sz w:val="24"/>
           <w:rtl w:val="0"/>
         </w:rPr>
       </w:r>
@@ -2030,12 +2058,12 @@
       <w:pPr>
         <w:keepNext w:val="1"/>
         <w:spacing w:after="0" w:before="240" w:line="480" w:lineRule="auto"/>
-        <w:ind w:firstLine="0" w:left="0"/>
         <w:jc w:val="left"/>
         <w:rPr>
           <w:sz w:val="24"/>
           <w:szCs w:val="24"/>
         </w:rPr>
+        <w:ind w:left="0" w:right="0" w:firstLineChars="0" w:hangingChars="0" w:firstLine="0"/>
       </w:pPr>
       <w:r>
         <w:rPr>
@@ -2043,7 +2071,7 @@
           <w:sz w:val="24"/>
           <w:szCs w:val="24"/>
           <w:rtl w:val="0"/>
-          <w:b w:val="1"/>
+          <w:b/>
           <w:bCs w:val="1"/>
           <w:i w:val="0"/>
           <w:iCs w:val="0"/>
@@ -2055,7 +2083,7 @@
           <w:rFonts w:ascii="Georgia" w:hAnsi="Georgia" w:cs="Georgia" w:eastAsia="Georgia"/>
           <w:sz w:val="24"/>
           <w:rtl w:val="0"/>
-          <w:b w:val="1"/>
+          <w:b/>
           <w:bCs w:val="1"/>
           <w:i w:val="0"/>
           <w:iCs w:val="0"/>
@@ -2186,12 +2214,12 @@
       <w:pPr>
         <w:keepNext w:val="1"/>
         <w:spacing w:after="0" w:before="240" w:line="480" w:lineRule="auto"/>
-        <w:ind w:firstLine="0" w:left="0"/>
         <w:jc w:val="left"/>
         <w:rPr>
           <w:sz w:val="24"/>
           <w:szCs w:val="24"/>
         </w:rPr>
+        <w:ind w:left="0" w:right="0" w:firstLineChars="0" w:hangingChars="0" w:firstLine="0"/>
       </w:pPr>
       <w:r>
         <w:rPr>
@@ -2199,7 +2227,7 @@
           <w:sz w:val="24"/>
           <w:szCs w:val="24"/>
           <w:rtl w:val="0"/>
-          <w:b w:val="1"/>
+          <w:b/>
           <w:bCs w:val="1"/>
           <w:i w:val="0"/>
           <w:iCs w:val="0"/>
@@ -2211,7 +2239,7 @@
           <w:rFonts w:ascii="Georgia" w:hAnsi="Georgia" w:cs="Georgia" w:eastAsia="Georgia"/>
           <w:sz w:val="24"/>
           <w:rtl w:val="0"/>
-          <w:b w:val="1"/>
+          <w:b/>
           <w:bCs w:val="1"/>
           <w:i w:val="0"/>
           <w:iCs w:val="0"/>
@@ -2362,12 +2390,12 @@
       <w:pPr>
         <w:keepNext w:val="1"/>
         <w:spacing w:after="0" w:before="240" w:line="480" w:lineRule="auto"/>
-        <w:ind w:firstLine="0" w:left="0"/>
         <w:jc w:val="left"/>
         <w:rPr>
           <w:sz w:val="24"/>
           <w:szCs w:val="24"/>
         </w:rPr>
+        <w:ind w:left="0" w:right="0" w:firstLineChars="0" w:hangingChars="0" w:firstLine="0"/>
       </w:pPr>
       <w:r>
         <w:rPr>
@@ -2375,7 +2403,7 @@
           <w:sz w:val="24"/>
           <w:szCs w:val="24"/>
           <w:rtl w:val="0"/>
-          <w:b w:val="1"/>
+          <w:b/>
           <w:bCs w:val="1"/>
           <w:i w:val="0"/>
           <w:iCs w:val="0"/>
@@ -2387,7 +2415,7 @@
           <w:rFonts w:ascii="Georgia" w:hAnsi="Georgia" w:cs="Georgia" w:eastAsia="Georgia"/>
           <w:sz w:val="24"/>
           <w:rtl w:val="0"/>
-          <w:b w:val="1"/>
+          <w:b/>
           <w:bCs w:val="1"/>
           <w:i w:val="0"/>
           <w:iCs w:val="0"/>
@@ -3036,12 +3064,12 @@
       <w:pPr>
         <w:keepNext w:val="1"/>
         <w:spacing w:after="0" w:before="240" w:line="480" w:lineRule="auto"/>
-        <w:ind w:firstLine="0" w:left="0"/>
         <w:jc w:val="left"/>
         <w:rPr>
           <w:sz w:val="24"/>
           <w:szCs w:val="24"/>
         </w:rPr>
+        <w:ind w:left="0" w:right="0" w:firstLineChars="0" w:hangingChars="0" w:firstLine="0"/>
       </w:pPr>
       <w:r>
         <w:rPr>
@@ -3049,7 +3077,7 @@
           <w:sz w:val="24"/>
           <w:szCs w:val="24"/>
           <w:rtl w:val="0"/>
-          <w:b w:val="1"/>
+          <w:b/>
           <w:bCs w:val="1"/>
           <w:i w:val="0"/>
           <w:iCs w:val="0"/>
@@ -3061,7 +3089,7 @@
           <w:rFonts w:ascii="Georgia" w:hAnsi="Georgia" w:cs="Georgia" w:eastAsia="Georgia"/>
           <w:sz w:val="24"/>
           <w:rtl w:val="0"/>
-          <w:b w:val="1"/>
+          <w:b/>
           <w:bCs w:val="1"/>
           <w:i w:val="0"/>
           <w:iCs w:val="0"/>
@@ -3132,12 +3160,12 @@
       <w:pPr>
         <w:keepNext w:val="1"/>
         <w:spacing w:after="0" w:before="240" w:line="480" w:lineRule="auto"/>
-        <w:ind w:firstLine="0" w:left="0"/>
         <w:jc w:val="left"/>
         <w:rPr>
           <w:sz w:val="24"/>
           <w:szCs w:val="24"/>
         </w:rPr>
+        <w:ind w:left="0" w:right="0" w:firstLineChars="0" w:hangingChars="0" w:firstLine="0"/>
       </w:pPr>
       <w:r>
         <w:rPr>
@@ -3145,7 +3173,7 @@
           <w:sz w:val="24"/>
           <w:szCs w:val="24"/>
           <w:rtl w:val="0"/>
-          <w:b w:val="1"/>
+          <w:b/>
           <w:bCs w:val="1"/>
           <w:i w:val="0"/>
           <w:iCs w:val="0"/>
@@ -3157,7 +3185,7 @@
           <w:rFonts w:ascii="Georgia" w:hAnsi="Georgia" w:cs="Georgia" w:eastAsia="Georgia"/>
           <w:sz w:val="24"/>
           <w:rtl w:val="0"/>
-          <w:b w:val="1"/>
+          <w:b/>
           <w:bCs w:val="1"/>
           <w:i w:val="0"/>
           <w:iCs w:val="0"/>
@@ -3188,12 +3216,12 @@
       <w:pPr>
         <w:keepNext w:val="1"/>
         <w:spacing w:after="0" w:before="240" w:line="480" w:lineRule="auto"/>
-        <w:ind w:firstLine="0" w:left="0"/>
         <w:jc w:val="left"/>
         <w:rPr>
           <w:sz w:val="24"/>
           <w:szCs w:val="24"/>
         </w:rPr>
+        <w:ind w:left="0" w:right="0" w:firstLineChars="0" w:hangingChars="0" w:firstLine="0"/>
       </w:pPr>
       <w:r>
         <w:rPr>
@@ -3201,7 +3229,7 @@
           <w:sz w:val="24"/>
           <w:szCs w:val="24"/>
           <w:rtl w:val="0"/>
-          <w:b w:val="1"/>
+          <w:b/>
           <w:bCs w:val="1"/>
           <w:i w:val="0"/>
           <w:iCs w:val="0"/>
@@ -3213,7 +3241,7 @@
           <w:rFonts w:ascii="Georgia" w:hAnsi="Georgia" w:cs="Georgia" w:eastAsia="Georgia"/>
           <w:sz w:val="24"/>
           <w:rtl w:val="0"/>
-          <w:b w:val="1"/>
+          <w:b/>
           <w:bCs w:val="1"/>
           <w:i w:val="0"/>
           <w:iCs w:val="0"/>
@@ -4121,20 +4149,20 @@
     <w:p>
       <w:pPr>
         <w:spacing w:after="0" w:before="0" w:line="480" w:lineRule="auto"/>
-        <w:ind w:firstLine="720" w:left="0"/>
-        <w:jc w:val="both"/>
+        <w:jc w:val="left"/>
         <w:rPr>
           <w:sz w:val="24"/>
           <w:szCs w:val="24"/>
         </w:rPr>
-      </w:pPr>
-      <w:r>
-        <w:rPr>
-          <w:rFonts w:ascii="Georgia" w:hAnsi="Georgia" w:cs="Georgia" w:eastAsia="Georgia"/>
-          <w:sz w:val="22"/>
+        <w:ind w:left="0" w:right="0" w:firstLineChars="0" w:hangingChars="0" w:firstLine="0"/>
+      </w:pPr>
+      <w:r>
+        <w:rPr>
+          <w:rFonts w:ascii="Georgia" w:hAnsi="Georgia" w:cs="Georgia" w:eastAsia="Georgia"/>
+          <w:sz w:val="24"/>
           <w:szCs w:val="24"/>
           <w:rtl w:val="0"/>
-          <w:b w:val="0"/>
+          <w:b/>
           <w:bCs w:val="0"/>
           <w:i w:val="0"/>
           <w:iCs w:val="0"/>
@@ -4143,6 +4171,10 @@
       </w:r>
       <w:r>
         <w:rPr>
+          <w:rFonts w:ascii="Georgia" w:hAnsi="Georgia" w:cs="Georgia" w:eastAsia="Georgia"/>
+          <w:b/>
+          <w:i w:val="0"/>
+          <w:sz w:val="24"/>
           <w:rtl w:val="0"/>
         </w:rPr>
       </w:r>
@@ -5060,12 +5092,12 @@
       <w:pPr>
         <w:keepNext w:val="1"/>
         <w:spacing w:after="0" w:before="240" w:line="480" w:lineRule="auto"/>
-        <w:ind w:firstLine="0" w:left="0"/>
         <w:jc w:val="left"/>
         <w:rPr>
           <w:sz w:val="24"/>
           <w:szCs w:val="24"/>
         </w:rPr>
+        <w:ind w:left="0" w:right="0" w:firstLineChars="0" w:hangingChars="0" w:firstLine="0"/>
       </w:pPr>
       <w:r>
         <w:rPr>
@@ -5073,7 +5105,7 @@
           <w:sz w:val="24"/>
           <w:szCs w:val="24"/>
           <w:rtl w:val="0"/>
-          <w:b w:val="1"/>
+          <w:b/>
           <w:bCs w:val="1"/>
           <w:i w:val="0"/>
           <w:iCs w:val="0"/>
@@ -5085,7 +5117,7 @@
           <w:rFonts w:ascii="Georgia" w:hAnsi="Georgia" w:cs="Georgia" w:eastAsia="Georgia"/>
           <w:sz w:val="24"/>
           <w:rtl w:val="0"/>
-          <w:b w:val="1"/>
+          <w:b/>
           <w:bCs w:val="1"/>
           <w:i w:val="0"/>
           <w:iCs w:val="0"/>
@@ -5123,16 +5155,16 @@
     <w:p>
       <w:pPr>
         <w:spacing w:after="0" w:before="0" w:line="480" w:lineRule="auto"/>
-        <w:ind w:firstLine="720" w:left="0"/>
-        <w:jc w:val="both"/>
+        <w:jc w:val="left"/>
         <w:rPr/>
-      </w:pPr>
-      <w:r>
-        <w:rPr>
-          <w:rFonts w:ascii="Georgia" w:hAnsi="Georgia" w:cs="Georgia" w:eastAsia="Georgia"/>
-          <w:sz w:val="22"/>
+        <w:ind w:left="0" w:right="0" w:firstLineChars="0" w:hangingChars="0" w:firstLine="0"/>
+      </w:pPr>
+      <w:r>
+        <w:rPr>
+          <w:rFonts w:ascii="Georgia" w:hAnsi="Georgia" w:cs="Georgia" w:eastAsia="Georgia"/>
+          <w:sz w:val="24"/>
           <w:rtl w:val="0"/>
-          <w:b w:val="0"/>
+          <w:b/>
           <w:bCs w:val="0"/>
           <w:i w:val="0"/>
           <w:iCs w:val="0"/>
@@ -5141,6 +5173,10 @@
       </w:r>
       <w:r>
         <w:rPr>
+          <w:rFonts w:ascii="Georgia" w:hAnsi="Georgia" w:cs="Georgia" w:eastAsia="Georgia"/>
+          <w:b/>
+          <w:i w:val="0"/>
+          <w:sz w:val="24"/>
           <w:rtl w:val="0"/>
         </w:rPr>
       </w:r>
@@ -5221,16 +5257,16 @@
       <w:pPr>
         <w:keepLines w:val="1"/>
         <w:spacing w:after="0" w:before="0" w:line="480" w:lineRule="auto"/>
-        <w:ind w:firstLine="720" w:left="0"/>
-        <w:jc w:val="both"/>
+        <w:jc w:val="left"/>
         <w:rPr/>
-      </w:pPr>
-      <w:r>
-        <w:rPr>
-          <w:rFonts w:ascii="Georgia" w:hAnsi="Georgia" w:cs="Georgia" w:eastAsia="Georgia"/>
-          <w:sz w:val="22"/>
+        <w:ind w:left="0" w:right="0" w:firstLineChars="0" w:hangingChars="0" w:firstLine="0"/>
+      </w:pPr>
+      <w:r>
+        <w:rPr>
+          <w:rFonts w:ascii="Georgia" w:hAnsi="Georgia" w:cs="Georgia" w:eastAsia="Georgia"/>
+          <w:sz w:val="24"/>
           <w:rtl w:val="0"/>
-          <w:b w:val="0"/>
+          <w:b/>
           <w:bCs w:val="0"/>
           <w:i w:val="0"/>
           <w:iCs w:val="0"/>
@@ -5239,6 +5275,10 @@
       </w:r>
       <w:r>
         <w:rPr>
+          <w:rFonts w:ascii="Georgia" w:hAnsi="Georgia" w:cs="Georgia" w:eastAsia="Georgia"/>
+          <w:b/>
+          <w:i w:val="0"/>
+          <w:sz w:val="24"/>
           <w:rtl w:val="0"/>
         </w:rPr>
       </w:r>
@@ -7165,9 +7205,9 @@
       <w:pPr>
         <w:keepNext w:val="1"/>
         <w:spacing w:after="0" w:before="240" w:line="480" w:lineRule="auto"/>
-        <w:ind w:firstLine="0" w:left="0"/>
         <w:jc w:val="left"/>
         <w:rPr/>
+        <w:ind w:left="0" w:right="0" w:firstLineChars="0" w:hangingChars="0" w:firstLine="0"/>
       </w:pPr>
       <w:r>
         <w:rPr>
@@ -7176,7 +7216,7 @@
           <w:rtl w:val="0"/>
           <w:b w:val="0"/>
           <w:bCs w:val="0"/>
-          <w:i w:val="1"/>
+          <w:i/>
           <w:iCs w:val="1"/>
         </w:rPr>
         <w:t xml:space="preserve">Part I: The Formal Repertoire of Student Hedging</w:t>
@@ -7188,7 +7228,7 @@
           <w:rtl w:val="0"/>
           <w:b w:val="0"/>
           <w:bCs w:val="0"/>
-          <w:i w:val="1"/>
+          <w:i/>
           <w:iCs w:val="1"/>
         </w:rPr>
       </w:r>
@@ -9615,12 +9655,12 @@
       <w:pPr>
         <w:keepNext w:val="1"/>
         <w:spacing w:after="0" w:before="240" w:line="480" w:lineRule="auto"/>
-        <w:ind w:firstLine="0" w:left="0"/>
         <w:jc w:val="left"/>
         <w:rPr>
           <w:sz w:val="24"/>
           <w:szCs w:val="24"/>
         </w:rPr>
+        <w:ind w:left="0" w:right="0" w:firstLineChars="0" w:hangingChars="0" w:firstLine="0"/>
       </w:pPr>
       <w:r>
         <w:rPr>
@@ -9630,7 +9670,7 @@
           <w:rtl w:val="0"/>
           <w:b w:val="0"/>
           <w:bCs w:val="0"/>
-          <w:i w:val="1"/>
+          <w:i/>
           <w:iCs w:val="1"/>
         </w:rPr>
         <w:t xml:space="preserve">Part II: How Much Caution the Abstracts Display</w:t>
@@ -9642,7 +9682,7 @@
           <w:rtl w:val="0"/>
           <w:b w:val="0"/>
           <w:bCs w:val="0"/>
-          <w:i w:val="1"/>
+          <w:i/>
           <w:iCs w:val="1"/>
         </w:rPr>
       </w:r>
@@ -11901,12 +11941,12 @@
       <w:pPr>
         <w:keepNext w:val="1"/>
         <w:spacing w:after="0" w:before="240" w:line="480" w:lineRule="auto"/>
-        <w:ind w:firstLine="0" w:left="0"/>
         <w:jc w:val="left"/>
         <w:rPr>
           <w:sz w:val="24"/>
           <w:szCs w:val="24"/>
         </w:rPr>
+        <w:ind w:left="0" w:right="0" w:firstLineChars="0" w:hangingChars="0" w:firstLine="0"/>
       </w:pPr>
       <w:r>
         <w:rPr>
@@ -11916,7 +11956,7 @@
           <w:rtl w:val="0"/>
           <w:b w:val="0"/>
           <w:bCs w:val="0"/>
-          <w:i w:val="1"/>
+          <w:i/>
           <w:iCs w:val="1"/>
         </w:rPr>
         <w:t xml:space="preserve">Part III: What Hedging Does When It Appears</w:t>
@@ -11928,7 +11968,7 @@
           <w:rtl w:val="0"/>
           <w:b w:val="0"/>
           <w:bCs w:val="0"/>
-          <w:i w:val="1"/>
+          <w:i/>
           <w:iCs w:val="1"/>
         </w:rPr>
       </w:r>
@@ -11936,14 +11976,14 @@
     <w:p>
       <w:pPr>
         <w:spacing w:line="480" w:lineRule="auto" w:before="0" w:after="0"/>
-        <w:ind w:firstLine="720" w:left="0"/>
-        <w:jc w:val="both"/>
-      </w:pPr>
-      <w:r>
-        <w:rPr>
-          <w:rFonts w:ascii="Georgia" w:hAnsi="Georgia" w:cs="Georgia" w:eastAsia="Georgia"/>
-          <w:sz w:val="22"/>
-          <w:b w:val="0"/>
+        <w:jc w:val="left"/>
+        <w:ind w:left="0" w:right="0" w:firstLineChars="0" w:hangingChars="0" w:firstLine="0"/>
+      </w:pPr>
+      <w:r>
+        <w:rPr>
+          <w:rFonts w:ascii="Georgia" w:hAnsi="Georgia" w:cs="Georgia" w:eastAsia="Georgia"/>
+          <w:sz w:val="24"/>
+          <w:b/>
           <w:bCs w:val="0"/>
           <w:i w:val="0"/>
           <w:iCs w:val="0"/>
@@ -12588,14 +12628,14 @@
     <w:p>
       <w:pPr>
         <w:spacing w:line="480" w:lineRule="auto" w:before="0" w:after="0"/>
-        <w:ind w:firstLine="720" w:left="0"/>
-        <w:jc w:val="both"/>
-      </w:pPr>
-      <w:r>
-        <w:rPr>
-          <w:rFonts w:ascii="Georgia" w:hAnsi="Georgia" w:cs="Georgia" w:eastAsia="Georgia"/>
-          <w:sz w:val="22"/>
-          <w:b w:val="0"/>
+        <w:jc w:val="left"/>
+        <w:ind w:left="0" w:right="0" w:firstLineChars="0" w:hangingChars="0" w:firstLine="0"/>
+      </w:pPr>
+      <w:r>
+        <w:rPr>
+          <w:rFonts w:ascii="Georgia" w:hAnsi="Georgia" w:cs="Georgia" w:eastAsia="Georgia"/>
+          <w:sz w:val="24"/>
+          <w:b/>
           <w:bCs w:val="0"/>
           <w:i w:val="0"/>
           <w:iCs w:val="0"/>
@@ -14668,12 +14708,12 @@
       <w:pPr>
         <w:keepNext w:val="1"/>
         <w:spacing w:after="0" w:before="240" w:line="480" w:lineRule="auto"/>
-        <w:ind w:firstLine="0" w:left="0"/>
         <w:jc w:val="left"/>
         <w:rPr>
           <w:sz w:val="24"/>
           <w:szCs w:val="24"/>
         </w:rPr>
+        <w:ind w:left="0" w:right="0" w:firstLineChars="0" w:hangingChars="0" w:firstLine="0"/>
       </w:pPr>
       <w:r>
         <w:rPr>
@@ -14683,7 +14723,7 @@
           <w:rtl w:val="0"/>
           <w:b w:val="0"/>
           <w:bCs w:val="0"/>
-          <w:i w:val="1"/>
+          <w:i/>
           <w:iCs w:val="1"/>
         </w:rPr>
         <w:t xml:space="preserve">Part IV: Uneven Caution across Programs</w:t>
@@ -14695,7 +14735,7 @@
           <w:rtl w:val="0"/>
           <w:b w:val="0"/>
           <w:bCs w:val="0"/>
-          <w:i w:val="1"/>
+          <w:i/>
           <w:iCs w:val="1"/>
         </w:rPr>
       </w:r>
@@ -14722,14 +14762,14 @@
     <w:p>
       <w:pPr>
         <w:spacing w:line="480" w:lineRule="auto" w:before="0" w:after="0"/>
-        <w:ind w:firstLine="720" w:left="0"/>
-        <w:jc w:val="both"/>
-      </w:pPr>
-      <w:r>
-        <w:rPr>
-          <w:rFonts w:ascii="Georgia" w:hAnsi="Georgia" w:cs="Georgia" w:eastAsia="Georgia"/>
-          <w:sz w:val="22"/>
-          <w:b w:val="0"/>
+        <w:jc w:val="left"/>
+        <w:ind w:left="0" w:right="0" w:firstLineChars="0" w:hangingChars="0" w:firstLine="0"/>
+      </w:pPr>
+      <w:r>
+        <w:rPr>
+          <w:rFonts w:ascii="Georgia" w:hAnsi="Georgia" w:cs="Georgia" w:eastAsia="Georgia"/>
+          <w:sz w:val="24"/>
+          <w:b/>
           <w:bCs w:val="0"/>
           <w:i w:val="0"/>
           <w:iCs w:val="0"/>
@@ -16115,14 +16155,14 @@
     <w:p>
       <w:pPr>
         <w:spacing w:line="480" w:lineRule="auto" w:before="0" w:after="0"/>
-        <w:ind w:firstLine="720" w:left="0"/>
-        <w:jc w:val="both"/>
-      </w:pPr>
-      <w:r>
-        <w:rPr>
-          <w:rFonts w:ascii="Georgia" w:hAnsi="Georgia" w:cs="Georgia" w:eastAsia="Georgia"/>
-          <w:sz w:val="22"/>
-          <w:b w:val="0"/>
+        <w:jc w:val="left"/>
+        <w:ind w:left="0" w:right="0" w:firstLineChars="0" w:hangingChars="0" w:firstLine="0"/>
+      </w:pPr>
+      <w:r>
+        <w:rPr>
+          <w:rFonts w:ascii="Georgia" w:hAnsi="Georgia" w:cs="Georgia" w:eastAsia="Georgia"/>
+          <w:sz w:val="24"/>
+          <w:b/>
           <w:bCs w:val="0"/>
           <w:i w:val="0"/>
           <w:iCs w:val="0"/>
@@ -17285,14 +17325,14 @@
     <w:p>
       <w:pPr>
         <w:spacing w:line="480" w:lineRule="auto" w:before="0" w:after="0"/>
-        <w:ind w:firstLine="720" w:left="0"/>
-        <w:jc w:val="both"/>
-      </w:pPr>
-      <w:r>
-        <w:rPr>
-          <w:rFonts w:ascii="Georgia" w:hAnsi="Georgia" w:cs="Georgia" w:eastAsia="Georgia"/>
-          <w:sz w:val="22"/>
-          <w:b w:val="0"/>
+        <w:jc w:val="left"/>
+        <w:ind w:left="0" w:right="0" w:firstLineChars="0" w:hangingChars="0" w:firstLine="0"/>
+      </w:pPr>
+      <w:r>
+        <w:rPr>
+          <w:rFonts w:ascii="Georgia" w:hAnsi="Georgia" w:cs="Georgia" w:eastAsia="Georgia"/>
+          <w:sz w:val="24"/>
+          <w:b/>
           <w:bCs w:val="0"/>
           <w:i w:val="0"/>
           <w:iCs w:val="0"/>
@@ -17322,14 +17362,14 @@
     <w:p>
       <w:pPr>
         <w:spacing w:line="480" w:lineRule="auto" w:before="0" w:after="0"/>
-        <w:ind w:firstLine="720" w:left="0"/>
-        <w:jc w:val="both"/>
-      </w:pPr>
-      <w:r>
-        <w:rPr>
-          <w:rFonts w:ascii="Georgia" w:hAnsi="Georgia" w:cs="Georgia" w:eastAsia="Georgia"/>
-          <w:sz w:val="22"/>
-          <w:b w:val="0"/>
+        <w:jc w:val="left"/>
+        <w:ind w:left="0" w:right="0" w:firstLineChars="0" w:hangingChars="0" w:firstLine="0"/>
+      </w:pPr>
+      <w:r>
+        <w:rPr>
+          <w:rFonts w:ascii="Georgia" w:hAnsi="Georgia" w:cs="Georgia" w:eastAsia="Georgia"/>
+          <w:sz w:val="24"/>
+          <w:b/>
           <w:bCs w:val="0"/>
           <w:i w:val="0"/>
           <w:iCs w:val="0"/>
@@ -17467,20 +17507,20 @@
     <w:p>
       <w:pPr>
         <w:spacing w:after="0" w:before="0" w:line="480" w:lineRule="auto"/>
-        <w:ind w:firstLine="720" w:left="0"/>
-        <w:jc w:val="both"/>
+        <w:jc w:val="left"/>
         <w:rPr>
           <w:sz w:val="24"/>
           <w:szCs w:val="24"/>
         </w:rPr>
-      </w:pPr>
-      <w:r>
-        <w:rPr>
-          <w:rFonts w:ascii="Georgia" w:hAnsi="Georgia" w:cs="Georgia" w:eastAsia="Georgia"/>
-          <w:sz w:val="22"/>
+        <w:ind w:left="0" w:right="0" w:firstLineChars="0" w:hangingChars="0" w:firstLine="0"/>
+      </w:pPr>
+      <w:r>
+        <w:rPr>
+          <w:rFonts w:ascii="Georgia" w:hAnsi="Georgia" w:cs="Georgia" w:eastAsia="Georgia"/>
+          <w:sz w:val="24"/>
           <w:szCs w:val="24"/>
           <w:rtl w:val="0"/>
-          <w:b w:val="0"/>
+          <w:b/>
           <w:bCs w:val="0"/>
           <w:i w:val="0"/>
           <w:iCs w:val="0"/>
@@ -17489,6 +17529,10 @@
       </w:r>
       <w:r>
         <w:rPr>
+          <w:rFonts w:ascii="Georgia" w:hAnsi="Georgia" w:cs="Georgia" w:eastAsia="Georgia"/>
+          <w:b/>
+          <w:i w:val="0"/>
+          <w:sz w:val="24"/>
           <w:rtl w:val="0"/>
         </w:rPr>
       </w:r>
@@ -17555,20 +17599,20 @@
     <w:p>
       <w:pPr>
         <w:spacing w:after="0" w:before="0" w:line="480" w:lineRule="auto"/>
-        <w:ind w:firstLine="720" w:left="0"/>
-        <w:jc w:val="both"/>
+        <w:jc w:val="left"/>
         <w:rPr>
           <w:sz w:val="24"/>
           <w:szCs w:val="24"/>
         </w:rPr>
-      </w:pPr>
-      <w:r>
-        <w:rPr>
-          <w:rFonts w:ascii="Georgia" w:hAnsi="Georgia" w:cs="Georgia" w:eastAsia="Georgia"/>
-          <w:sz w:val="22"/>
+        <w:ind w:left="0" w:right="0" w:firstLineChars="0" w:hangingChars="0" w:firstLine="0"/>
+      </w:pPr>
+      <w:r>
+        <w:rPr>
+          <w:rFonts w:ascii="Georgia" w:hAnsi="Georgia" w:cs="Georgia" w:eastAsia="Georgia"/>
+          <w:sz w:val="24"/>
           <w:szCs w:val="24"/>
           <w:rtl w:val="0"/>
-          <w:b w:val="0"/>
+          <w:b/>
           <w:bCs w:val="0"/>
           <w:i w:val="0"/>
           <w:iCs w:val="0"/>
@@ -17577,6 +17621,10 @@
       </w:r>
       <w:r>
         <w:rPr>
+          <w:rFonts w:ascii="Georgia" w:hAnsi="Georgia" w:cs="Georgia" w:eastAsia="Georgia"/>
+          <w:b/>
+          <w:i w:val="0"/>
+          <w:sz w:val="24"/>
           <w:rtl w:val="0"/>
         </w:rPr>
       </w:r>

</xml_diff>

<commit_message>
Draft_124_body: thematic titles italic, not bold
Restore Part and theme heads to 12 italic. Keep structural
subsections 12 bold. Clarify in formatting.md.
</commit_message>
<xml_diff>
--- a/thesis/003_ThesisProposal_Draft_124_body.docx
+++ b/thesis/003_ThesisProposal_Draft_124_body.docx
@@ -653,7 +653,7 @@
           <w:sz w:val="24"/>
           <w:szCs w:val="24"/>
           <w:rtl w:val="0"/>
-          <w:b/>
+          <w:b w:val="1"/>
           <w:bCs w:val="1"/>
           <w:i w:val="0"/>
           <w:iCs w:val="0"/>
@@ -665,7 +665,7 @@
           <w:rFonts w:ascii="Georgia" w:hAnsi="Georgia" w:cs="Georgia" w:eastAsia="Georgia"/>
           <w:sz w:val="24"/>
           <w:rtl w:val="0"/>
-          <w:b/>
+          <w:b w:val="1"/>
           <w:bCs w:val="1"/>
           <w:i w:val="0"/>
           <w:iCs w:val="0"/>
@@ -791,9 +791,9 @@
           <w:sz w:val="24"/>
           <w:szCs w:val="24"/>
           <w:rtl w:val="0"/>
-          <w:b/>
-          <w:bCs w:val="0"/>
-          <w:i w:val="0"/>
+          <w:b w:val="0"/>
+          <w:bCs w:val="0"/>
+          <w:i w:val="1"/>
           <w:iCs w:val="1"/>
         </w:rPr>
         <w:t xml:space="preserve">Hedging in Undergraduate Writing</w:t>
@@ -801,10 +801,12 @@
       <w:r>
         <w:rPr>
           <w:rFonts w:ascii="Georgia" w:hAnsi="Georgia" w:cs="Georgia" w:eastAsia="Georgia"/>
-          <w:b/>
-          <w:i w:val="0"/>
           <w:sz w:val="24"/>
           <w:rtl w:val="0"/>
+          <w:b w:val="0"/>
+          <w:bCs w:val="0"/>
+          <w:i w:val="1"/>
+          <w:iCs w:val="1"/>
         </w:rPr>
       </w:r>
     </w:p>
@@ -923,9 +925,9 @@
           <w:sz w:val="24"/>
           <w:szCs w:val="24"/>
           <w:rtl w:val="0"/>
-          <w:b/>
-          <w:bCs w:val="0"/>
-          <w:i w:val="0"/>
+          <w:b w:val="0"/>
+          <w:bCs w:val="0"/>
+          <w:i w:val="1"/>
           <w:iCs w:val="1"/>
         </w:rPr>
         <w:t xml:space="preserve">Disciplinary Variation in Scientific and Medical Writing</w:t>
@@ -933,10 +935,12 @@
       <w:r>
         <w:rPr>
           <w:rFonts w:ascii="Georgia" w:hAnsi="Georgia" w:cs="Georgia" w:eastAsia="Georgia"/>
-          <w:b/>
-          <w:i w:val="0"/>
           <w:sz w:val="24"/>
           <w:rtl w:val="0"/>
+          <w:b w:val="0"/>
+          <w:bCs w:val="0"/>
+          <w:i w:val="1"/>
+          <w:iCs w:val="1"/>
         </w:rPr>
       </w:r>
     </w:p>
@@ -1172,9 +1176,9 @@
           <w:sz w:val="24"/>
           <w:szCs w:val="24"/>
           <w:rtl w:val="0"/>
-          <w:b/>
-          <w:bCs w:val="0"/>
-          <w:i w:val="0"/>
+          <w:b w:val="0"/>
+          <w:bCs w:val="0"/>
+          <w:i w:val="1"/>
           <w:iCs w:val="1"/>
         </w:rPr>
         <w:t xml:space="preserve">Hedging in L2 and EFL Contexts</w:t>
@@ -1182,10 +1186,12 @@
       <w:r>
         <w:rPr>
           <w:rFonts w:ascii="Georgia" w:hAnsi="Georgia" w:cs="Georgia" w:eastAsia="Georgia"/>
-          <w:b/>
-          <w:i w:val="0"/>
           <w:sz w:val="24"/>
           <w:rtl w:val="0"/>
+          <w:b w:val="0"/>
+          <w:bCs w:val="0"/>
+          <w:i w:val="1"/>
+          <w:iCs w:val="1"/>
         </w:rPr>
       </w:r>
     </w:p>
@@ -1313,9 +1319,9 @@
           <w:sz w:val="24"/>
           <w:szCs w:val="24"/>
           <w:rtl w:val="0"/>
-          <w:b/>
-          <w:bCs w:val="0"/>
-          <w:i w:val="0"/>
+          <w:b w:val="0"/>
+          <w:bCs w:val="0"/>
+          <w:i w:val="1"/>
           <w:iCs w:val="1"/>
         </w:rPr>
         <w:t xml:space="preserve">Hedging in Philippine Academic Writing Contexts</w:t>
@@ -1323,10 +1329,12 @@
       <w:r>
         <w:rPr>
           <w:rFonts w:ascii="Georgia" w:hAnsi="Georgia" w:cs="Georgia" w:eastAsia="Georgia"/>
-          <w:b/>
-          <w:i w:val="0"/>
           <w:sz w:val="24"/>
           <w:rtl w:val="0"/>
+          <w:b w:val="0"/>
+          <w:bCs w:val="0"/>
+          <w:i w:val="1"/>
+          <w:iCs w:val="1"/>
         </w:rPr>
       </w:r>
     </w:p>
@@ -1441,9 +1449,9 @@
           <w:sz w:val="24"/>
           <w:szCs w:val="24"/>
           <w:rtl w:val="0"/>
-          <w:b/>
-          <w:bCs w:val="0"/>
-          <w:i w:val="0"/>
+          <w:b w:val="0"/>
+          <w:bCs w:val="0"/>
+          <w:i w:val="1"/>
           <w:iCs w:val="1"/>
         </w:rPr>
         <w:t xml:space="preserve">Disciplinary Variation in Abstracts and Undergraduate Theses</w:t>
@@ -1451,10 +1459,12 @@
       <w:r>
         <w:rPr>
           <w:rFonts w:ascii="Georgia" w:hAnsi="Georgia" w:cs="Georgia" w:eastAsia="Georgia"/>
-          <w:b/>
-          <w:i w:val="0"/>
           <w:sz w:val="24"/>
           <w:rtl w:val="0"/>
+          <w:b w:val="0"/>
+          <w:bCs w:val="0"/>
+          <w:i w:val="1"/>
+          <w:iCs w:val="1"/>
         </w:rPr>
       </w:r>
     </w:p>
@@ -1715,7 +1725,7 @@
           <w:sz w:val="24"/>
           <w:szCs w:val="24"/>
           <w:rtl w:val="0"/>
-          <w:b/>
+          <w:b w:val="1"/>
           <w:bCs w:val="1"/>
           <w:i w:val="0"/>
           <w:iCs w:val="0"/>
@@ -1727,7 +1737,7 @@
           <w:rFonts w:ascii="Georgia" w:hAnsi="Georgia" w:cs="Georgia" w:eastAsia="Georgia"/>
           <w:sz w:val="24"/>
           <w:rtl w:val="0"/>
-          <w:b/>
+          <w:b w:val="1"/>
           <w:bCs w:val="1"/>
           <w:i w:val="0"/>
           <w:iCs w:val="0"/>
@@ -1871,7 +1881,7 @@
           <w:sz w:val="24"/>
           <w:szCs w:val="24"/>
           <w:rtl w:val="0"/>
-          <w:b/>
+          <w:b w:val="1"/>
           <w:bCs w:val="1"/>
           <w:i w:val="0"/>
           <w:iCs w:val="0"/>
@@ -1883,7 +1893,7 @@
           <w:rFonts w:ascii="Georgia" w:hAnsi="Georgia" w:cs="Georgia" w:eastAsia="Georgia"/>
           <w:sz w:val="24"/>
           <w:rtl w:val="0"/>
-          <w:b/>
+          <w:b w:val="1"/>
           <w:bCs w:val="1"/>
           <w:i w:val="0"/>
           <w:iCs w:val="0"/>
@@ -1948,22 +1958,24 @@
       <w:r>
         <w:rPr>
           <w:rFonts w:ascii="Georgia" w:hAnsi="Georgia" w:cs="Georgia" w:eastAsia="Georgia"/>
-          <w:sz w:val="24"/>
+          <w:sz w:val="22"/>
           <w:rtl w:val="0"/>
-          <w:b/>
-          <w:bCs w:val="0"/>
-          <w:i w:val="0"/>
-          <w:iCs w:val="1"/>
+          <w:b w:val="0"/>
+          <w:bCs w:val="0"/>
+          <w:i w:val="0"/>
+          <w:iCs w:val="0"/>
         </w:rPr>
         <w:t xml:space="preserve">Conceptual Framework of the Study</w:t>
       </w:r>
       <w:r>
         <w:rPr>
           <w:rFonts w:ascii="Georgia" w:hAnsi="Georgia" w:cs="Georgia" w:eastAsia="Georgia"/>
-          <w:b/>
-          <w:i w:val="0"/>
-          <w:sz w:val="24"/>
+          <w:sz w:val="22"/>
           <w:rtl w:val="0"/>
+          <w:b w:val="0"/>
+          <w:bCs w:val="0"/>
+          <w:i w:val="0"/>
+          <w:iCs w:val="0"/>
         </w:rPr>
       </w:r>
     </w:p>
@@ -2071,7 +2083,7 @@
           <w:sz w:val="24"/>
           <w:szCs w:val="24"/>
           <w:rtl w:val="0"/>
-          <w:b/>
+          <w:b w:val="1"/>
           <w:bCs w:val="1"/>
           <w:i w:val="0"/>
           <w:iCs w:val="0"/>
@@ -2083,7 +2095,7 @@
           <w:rFonts w:ascii="Georgia" w:hAnsi="Georgia" w:cs="Georgia" w:eastAsia="Georgia"/>
           <w:sz w:val="24"/>
           <w:rtl w:val="0"/>
-          <w:b/>
+          <w:b w:val="1"/>
           <w:bCs w:val="1"/>
           <w:i w:val="0"/>
           <w:iCs w:val="0"/>
@@ -2227,7 +2239,7 @@
           <w:sz w:val="24"/>
           <w:szCs w:val="24"/>
           <w:rtl w:val="0"/>
-          <w:b/>
+          <w:b w:val="1"/>
           <w:bCs w:val="1"/>
           <w:i w:val="0"/>
           <w:iCs w:val="0"/>
@@ -2239,7 +2251,7 @@
           <w:rFonts w:ascii="Georgia" w:hAnsi="Georgia" w:cs="Georgia" w:eastAsia="Georgia"/>
           <w:sz w:val="24"/>
           <w:rtl w:val="0"/>
-          <w:b/>
+          <w:b w:val="1"/>
           <w:bCs w:val="1"/>
           <w:i w:val="0"/>
           <w:iCs w:val="0"/>
@@ -2403,7 +2415,7 @@
           <w:sz w:val="24"/>
           <w:szCs w:val="24"/>
           <w:rtl w:val="0"/>
-          <w:b/>
+          <w:b w:val="1"/>
           <w:bCs w:val="1"/>
           <w:i w:val="0"/>
           <w:iCs w:val="0"/>
@@ -2415,7 +2427,7 @@
           <w:rFonts w:ascii="Georgia" w:hAnsi="Georgia" w:cs="Georgia" w:eastAsia="Georgia"/>
           <w:sz w:val="24"/>
           <w:rtl w:val="0"/>
-          <w:b/>
+          <w:b w:val="1"/>
           <w:bCs w:val="1"/>
           <w:i w:val="0"/>
           <w:iCs w:val="0"/>
@@ -3077,7 +3089,7 @@
           <w:sz w:val="24"/>
           <w:szCs w:val="24"/>
           <w:rtl w:val="0"/>
-          <w:b/>
+          <w:b w:val="1"/>
           <w:bCs w:val="1"/>
           <w:i w:val="0"/>
           <w:iCs w:val="0"/>
@@ -3089,7 +3101,7 @@
           <w:rFonts w:ascii="Georgia" w:hAnsi="Georgia" w:cs="Georgia" w:eastAsia="Georgia"/>
           <w:sz w:val="24"/>
           <w:rtl w:val="0"/>
-          <w:b/>
+          <w:b w:val="1"/>
           <w:bCs w:val="1"/>
           <w:i w:val="0"/>
           <w:iCs w:val="0"/>
@@ -3173,7 +3185,7 @@
           <w:sz w:val="24"/>
           <w:szCs w:val="24"/>
           <w:rtl w:val="0"/>
-          <w:b/>
+          <w:b w:val="1"/>
           <w:bCs w:val="1"/>
           <w:i w:val="0"/>
           <w:iCs w:val="0"/>
@@ -3185,7 +3197,7 @@
           <w:rFonts w:ascii="Georgia" w:hAnsi="Georgia" w:cs="Georgia" w:eastAsia="Georgia"/>
           <w:sz w:val="24"/>
           <w:rtl w:val="0"/>
-          <w:b/>
+          <w:b w:val="1"/>
           <w:bCs w:val="1"/>
           <w:i w:val="0"/>
           <w:iCs w:val="0"/>
@@ -3229,7 +3241,7 @@
           <w:sz w:val="24"/>
           <w:szCs w:val="24"/>
           <w:rtl w:val="0"/>
-          <w:b/>
+          <w:b w:val="1"/>
           <w:bCs w:val="1"/>
           <w:i w:val="0"/>
           <w:iCs w:val="0"/>
@@ -3241,7 +3253,7 @@
           <w:rFonts w:ascii="Georgia" w:hAnsi="Georgia" w:cs="Georgia" w:eastAsia="Georgia"/>
           <w:sz w:val="24"/>
           <w:rtl w:val="0"/>
-          <w:b/>
+          <w:b w:val="1"/>
           <w:bCs w:val="1"/>
           <w:i w:val="0"/>
           <w:iCs w:val="0"/>
@@ -4162,20 +4174,22 @@
           <w:sz w:val="24"/>
           <w:szCs w:val="24"/>
           <w:rtl w:val="0"/>
-          <w:b/>
-          <w:bCs w:val="0"/>
-          <w:i w:val="0"/>
-          <w:iCs w:val="0"/>
+          <w:b w:val="0"/>
+          <w:bCs w:val="0"/>
+          <w:i w:val="1"/>
+          <w:iCs w:val="1"/>
         </w:rPr>
         <w:t xml:space="preserve">Coding Decision Rules for Ambiguous Cases</w:t>
       </w:r>
       <w:r>
         <w:rPr>
           <w:rFonts w:ascii="Georgia" w:hAnsi="Georgia" w:cs="Georgia" w:eastAsia="Georgia"/>
-          <w:b/>
-          <w:i w:val="0"/>
           <w:sz w:val="24"/>
           <w:rtl w:val="0"/>
+          <w:b w:val="0"/>
+          <w:bCs w:val="0"/>
+          <w:i w:val="1"/>
+          <w:iCs w:val="1"/>
         </w:rPr>
       </w:r>
     </w:p>
@@ -5105,7 +5119,7 @@
           <w:sz w:val="24"/>
           <w:szCs w:val="24"/>
           <w:rtl w:val="0"/>
-          <w:b/>
+          <w:b w:val="1"/>
           <w:bCs w:val="1"/>
           <w:i w:val="0"/>
           <w:iCs w:val="0"/>
@@ -5117,7 +5131,7 @@
           <w:rFonts w:ascii="Georgia" w:hAnsi="Georgia" w:cs="Georgia" w:eastAsia="Georgia"/>
           <w:sz w:val="24"/>
           <w:rtl w:val="0"/>
-          <w:b/>
+          <w:b w:val="1"/>
           <w:bCs w:val="1"/>
           <w:i w:val="0"/>
           <w:iCs w:val="0"/>
@@ -5164,8 +5178,8 @@
           <w:rFonts w:ascii="Georgia" w:hAnsi="Georgia" w:cs="Georgia" w:eastAsia="Georgia"/>
           <w:sz w:val="24"/>
           <w:rtl w:val="0"/>
-          <w:b/>
-          <w:bCs w:val="0"/>
+          <w:b w:val="1"/>
+          <w:bCs w:val="1"/>
           <w:i w:val="0"/>
           <w:iCs w:val="0"/>
         </w:rPr>
@@ -5174,10 +5188,12 @@
       <w:r>
         <w:rPr>
           <w:rFonts w:ascii="Georgia" w:hAnsi="Georgia" w:cs="Georgia" w:eastAsia="Georgia"/>
-          <w:b/>
-          <w:i w:val="0"/>
           <w:sz w:val="24"/>
           <w:rtl w:val="0"/>
+          <w:b w:val="1"/>
+          <w:bCs w:val="1"/>
+          <w:i w:val="0"/>
+          <w:iCs w:val="0"/>
         </w:rPr>
       </w:r>
     </w:p>
@@ -5266,8 +5282,8 @@
           <w:rFonts w:ascii="Georgia" w:hAnsi="Georgia" w:cs="Georgia" w:eastAsia="Georgia"/>
           <w:sz w:val="24"/>
           <w:rtl w:val="0"/>
-          <w:b/>
-          <w:bCs w:val="0"/>
+          <w:b w:val="1"/>
+          <w:bCs w:val="1"/>
           <w:i w:val="0"/>
           <w:iCs w:val="0"/>
         </w:rPr>
@@ -5276,10 +5292,12 @@
       <w:r>
         <w:rPr>
           <w:rFonts w:ascii="Georgia" w:hAnsi="Georgia" w:cs="Georgia" w:eastAsia="Georgia"/>
-          <w:b/>
-          <w:i w:val="0"/>
           <w:sz w:val="24"/>
           <w:rtl w:val="0"/>
+          <w:b w:val="1"/>
+          <w:bCs w:val="1"/>
+          <w:i w:val="0"/>
+          <w:iCs w:val="0"/>
         </w:rPr>
       </w:r>
     </w:p>
@@ -7216,7 +7234,7 @@
           <w:rtl w:val="0"/>
           <w:b w:val="0"/>
           <w:bCs w:val="0"/>
-          <w:i/>
+          <w:i w:val="1"/>
           <w:iCs w:val="1"/>
         </w:rPr>
         <w:t xml:space="preserve">Part I: The Formal Repertoire of Student Hedging</w:t>
@@ -7228,7 +7246,7 @@
           <w:rtl w:val="0"/>
           <w:b w:val="0"/>
           <w:bCs w:val="0"/>
-          <w:i/>
+          <w:i w:val="1"/>
           <w:iCs w:val="1"/>
         </w:rPr>
       </w:r>
@@ -9670,7 +9688,7 @@
           <w:rtl w:val="0"/>
           <w:b w:val="0"/>
           <w:bCs w:val="0"/>
-          <w:i/>
+          <w:i w:val="1"/>
           <w:iCs w:val="1"/>
         </w:rPr>
         <w:t xml:space="preserve">Part II: How Much Caution the Abstracts Display</w:t>
@@ -9682,7 +9700,7 @@
           <w:rtl w:val="0"/>
           <w:b w:val="0"/>
           <w:bCs w:val="0"/>
-          <w:i/>
+          <w:i w:val="1"/>
           <w:iCs w:val="1"/>
         </w:rPr>
       </w:r>
@@ -11956,7 +11974,7 @@
           <w:rtl w:val="0"/>
           <w:b w:val="0"/>
           <w:bCs w:val="0"/>
-          <w:i/>
+          <w:i w:val="1"/>
           <w:iCs w:val="1"/>
         </w:rPr>
         <w:t xml:space="preserve">Part III: What Hedging Does When It Appears</w:t>
@@ -11968,7 +11986,7 @@
           <w:rtl w:val="0"/>
           <w:b w:val="0"/>
           <w:bCs w:val="0"/>
-          <w:i/>
+          <w:i w:val="1"/>
           <w:iCs w:val="1"/>
         </w:rPr>
       </w:r>
@@ -11983,10 +12001,10 @@
         <w:rPr>
           <w:rFonts w:ascii="Georgia" w:hAnsi="Georgia" w:cs="Georgia" w:eastAsia="Georgia"/>
           <w:sz w:val="24"/>
-          <w:b/>
-          <w:bCs w:val="0"/>
-          <w:i w:val="0"/>
-          <w:iCs w:val="0"/>
+          <w:b w:val="0"/>
+          <w:bCs w:val="0"/>
+          <w:i w:val="1"/>
+          <w:iCs w:val="1"/>
         </w:rPr>
         <w:t>Function Profile of Retained Hedges</w:t>
       </w:r>
@@ -12635,10 +12653,10 @@
         <w:rPr>
           <w:rFonts w:ascii="Georgia" w:hAnsi="Georgia" w:cs="Georgia" w:eastAsia="Georgia"/>
           <w:sz w:val="24"/>
-          <w:b/>
-          <w:bCs w:val="0"/>
-          <w:i w:val="0"/>
-          <w:iCs w:val="0"/>
+          <w:b w:val="0"/>
+          <w:bCs w:val="0"/>
+          <w:i w:val="1"/>
+          <w:iCs w:val="1"/>
         </w:rPr>
         <w:t>Hedge versus False Positive in the Wording</w:t>
       </w:r>
@@ -14723,7 +14741,7 @@
           <w:rtl w:val="0"/>
           <w:b w:val="0"/>
           <w:bCs w:val="0"/>
-          <w:i/>
+          <w:i w:val="1"/>
           <w:iCs w:val="1"/>
         </w:rPr>
         <w:t xml:space="preserve">Part IV: Uneven Caution across Programs</w:t>
@@ -14735,7 +14753,7 @@
           <w:rtl w:val="0"/>
           <w:b w:val="0"/>
           <w:bCs w:val="0"/>
-          <w:i/>
+          <w:i w:val="1"/>
           <w:iCs w:val="1"/>
         </w:rPr>
       </w:r>
@@ -14769,10 +14787,10 @@
         <w:rPr>
           <w:rFonts w:ascii="Georgia" w:hAnsi="Georgia" w:cs="Georgia" w:eastAsia="Georgia"/>
           <w:sz w:val="24"/>
-          <w:b/>
-          <w:bCs w:val="0"/>
-          <w:i w:val="0"/>
-          <w:iCs w:val="0"/>
+          <w:b w:val="0"/>
+          <w:bCs w:val="0"/>
+          <w:i w:val="1"/>
+          <w:iCs w:val="1"/>
         </w:rPr>
         <w:t>Outcome Type and the Limits of a Design Explanation</w:t>
       </w:r>
@@ -16162,10 +16180,10 @@
         <w:rPr>
           <w:rFonts w:ascii="Georgia" w:hAnsi="Georgia" w:cs="Georgia" w:eastAsia="Georgia"/>
           <w:sz w:val="24"/>
-          <w:b/>
-          <w:bCs w:val="0"/>
-          <w:i w:val="0"/>
-          <w:iCs w:val="0"/>
+          <w:b w:val="0"/>
+          <w:bCs w:val="0"/>
+          <w:i w:val="1"/>
+          <w:iCs w:val="1"/>
         </w:rPr>
         <w:t>How Programs Word Caution</w:t>
       </w:r>
@@ -17332,10 +17350,10 @@
         <w:rPr>
           <w:rFonts w:ascii="Georgia" w:hAnsi="Georgia" w:cs="Georgia" w:eastAsia="Georgia"/>
           <w:sz w:val="24"/>
-          <w:b/>
-          <w:bCs w:val="0"/>
-          <w:i w:val="0"/>
-          <w:iCs w:val="0"/>
+          <w:b w:val="0"/>
+          <w:bCs w:val="0"/>
+          <w:i w:val="1"/>
+          <w:iCs w:val="1"/>
         </w:rPr>
         <w:t>What the Contrast Can and Cannot Mean</w:t>
       </w:r>
@@ -17369,10 +17387,10 @@
         <w:rPr>
           <w:rFonts w:ascii="Georgia" w:hAnsi="Georgia" w:cs="Georgia" w:eastAsia="Georgia"/>
           <w:sz w:val="24"/>
-          <w:b/>
-          <w:bCs w:val="0"/>
-          <w:i w:val="0"/>
-          <w:iCs w:val="0"/>
+          <w:b w:val="0"/>
+          <w:bCs w:val="0"/>
+          <w:i w:val="1"/>
+          <w:iCs w:val="1"/>
         </w:rPr>
         <w:t>Open Readings</w:t>
       </w:r>
@@ -17520,8 +17538,8 @@
           <w:sz w:val="24"/>
           <w:szCs w:val="24"/>
           <w:rtl w:val="0"/>
-          <w:b/>
-          <w:bCs w:val="0"/>
+          <w:b w:val="1"/>
+          <w:bCs w:val="1"/>
           <w:i w:val="0"/>
           <w:iCs w:val="0"/>
         </w:rPr>
@@ -17530,10 +17548,12 @@
       <w:r>
         <w:rPr>
           <w:rFonts w:ascii="Georgia" w:hAnsi="Georgia" w:cs="Georgia" w:eastAsia="Georgia"/>
-          <w:b/>
-          <w:i w:val="0"/>
           <w:sz w:val="24"/>
           <w:rtl w:val="0"/>
+          <w:b w:val="1"/>
+          <w:bCs w:val="1"/>
+          <w:i w:val="0"/>
+          <w:iCs w:val="0"/>
         </w:rPr>
       </w:r>
     </w:p>
@@ -17612,8 +17632,8 @@
           <w:sz w:val="24"/>
           <w:szCs w:val="24"/>
           <w:rtl w:val="0"/>
-          <w:b/>
-          <w:bCs w:val="0"/>
+          <w:b w:val="1"/>
+          <w:bCs w:val="1"/>
           <w:i w:val="0"/>
           <w:iCs w:val="0"/>
         </w:rPr>
@@ -17622,10 +17642,12 @@
       <w:r>
         <w:rPr>
           <w:rFonts w:ascii="Georgia" w:hAnsi="Georgia" w:cs="Georgia" w:eastAsia="Georgia"/>
-          <w:b/>
-          <w:i w:val="0"/>
           <w:sz w:val="24"/>
           <w:rtl w:val="0"/>
+          <w:b w:val="1"/>
+          <w:bCs w:val="1"/>
+          <w:i w:val="0"/>
+          <w:iCs w:val="0"/>
         </w:rPr>
       </w:r>
     </w:p>

</xml_diff>

<commit_message>
Draft_124_body: place Figure 1 image under its caption
Image was orphaned after framework body text. Move drawing
paragraph to follow the Figure 1 caption block.
</commit_message>
<xml_diff>
--- a/thesis/003_ThesisProposal_Draft_124_body.docx
+++ b/thesis/003_ThesisProposal_Draft_124_body.docx
@@ -1929,15 +1929,15 @@
         <w:spacing w:after="0" w:before="240" w:line="480" w:lineRule="auto"/>
         <w:jc w:val="left"/>
         <w:rPr/>
-        <w:ind w:left="0" w:right="0" w:firstLineChars="0" w:hangingChars="0" w:firstLine="0"/>
         <w:keepNext/>
+        <w:ind w:left="0" w:right="0" w:firstLine="0" w:firstLineChars="0" w:hanging="0" w:hangingChars="0"/>
       </w:pPr>
       <w:r>
         <w:rPr>
           <w:rFonts w:ascii="Georgia" w:hAnsi="Georgia" w:cs="Georgia" w:eastAsia="Georgia"/>
           <w:sz w:val="22"/>
           <w:rtl w:val="0"/>
-          <w:b w:val="1"/>
+          <w:b/>
           <w:bCs w:val="1"/>
           <w:i w:val="0"/>
           <w:iCs w:val="0"/>
@@ -1949,7 +1949,7 @@
           <w:rFonts w:ascii="Georgia" w:hAnsi="Georgia" w:cs="Georgia" w:eastAsia="Georgia"/>
           <w:sz w:val="22"/>
           <w:rtl w:val="0"/>
-          <w:b w:val="1"/>
+          <w:b/>
           <w:bCs w:val="1"/>
           <w:i w:val="0"/>
           <w:iCs w:val="0"/>
@@ -1958,11 +1958,11 @@
     </w:p>
     <w:p>
       <w:pPr>
-        <w:spacing w:after="240" w:before="0" w:line="480" w:lineRule="auto"/>
+        <w:spacing w:after="120" w:before="0" w:line="480" w:lineRule="auto"/>
         <w:jc w:val="left"/>
         <w:rPr/>
-        <w:ind w:left="0" w:right="0" w:firstLineChars="0" w:hangingChars="0" w:firstLine="0"/>
         <w:keepNext/>
+        <w:ind w:left="0" w:right="0" w:firstLine="0" w:firstLineChars="0" w:hanging="0" w:hangingChars="0"/>
       </w:pPr>
       <w:r>
         <w:rPr>
@@ -1990,49 +1990,10 @@
     </w:p>
     <w:p>
       <w:pPr>
-        <w:spacing w:after="0" w:before="0" w:line="480" w:lineRule="auto"/>
-        <w:jc w:val="both"/>
-        <w:rPr/>
-        <w:ind w:firstLine="720" w:left="0" w:firstLineChars="0"/>
-      </w:pPr>
-      <w:r>
-        <w:rPr>
-          <w:rFonts w:ascii="Georgia" w:hAnsi="Georgia" w:cs="Georgia" w:eastAsia="Georgia"/>
-          <w:sz w:val="22"/>
-          <w:rtl w:val="0"/>
-          <w:b w:val="0"/>
-          <w:bCs w:val="0"/>
-          <w:i w:val="0"/>
-          <w:iCs w:val="0"/>
-        </w:rPr>
-        <w:t>Hyland (1998) is the type instrument and the broad start for epistemic caution and politeness/deference. Crompton (1997) supplies the boundary rule for epistemic caution alone: his restatement test operationalizes the Working Test for epistemic caution at Step 2. The study does not adopt Crompton’s full taxonomy. Salager-Meyer (1994) is an interpretive lens in Part IV. Her claim-responsibility account helps read density differences across programs. Hyland (2005) is a second interpretive lens. The stance model helps read what fewer hedges mean where results turn into implications. Neither interpretive lens is an operational coding criterion.</w:t>
-      </w:r>
-    </w:p>
-    <w:p>
-      <w:pPr>
-        <w:spacing w:after="0" w:before="0" w:line="480" w:lineRule="auto"/>
-        <w:jc w:val="both"/>
-        <w:rPr/>
-        <w:ind w:firstLine="720" w:left="0" w:firstLineChars="0"/>
-      </w:pPr>
-      <w:r>
-        <w:rPr>
-          <w:rFonts w:ascii="Georgia" w:hAnsi="Georgia" w:cs="Georgia" w:eastAsia="Georgia"/>
-          <w:sz w:val="22"/>
-          <w:b w:val="0"/>
-          <w:bCs w:val="0"/>
-          <w:i w:val="0"/>
-          <w:iCs w:val="0"/>
-        </w:rPr>
-        <w:t>Coding followed the decision rules in Appendix A. After a holistic reading of each abstract, Step 1 marked all possible hedge candidates without counting retained hedges. Step 2 applied a claim condition and two removal checks. Because a hedge changes the writer’s stance toward a proposition, the device must attach to a claim: a statement about data, the world, or prior work that evidence could show to be wrong. Aims, directives, and routine procedures are excluded by kind as a consequence of that definition, not as a coding convenience. Under the Working Test, the device is removed from the claim. If the writer’s commitment to the truth of the claim rises, the token is epistemic caution. Under the Reader Test, the device is removed from the claim. If commitment stays the same but the claim reaches the reader more bluntly, or the writer takes sole ownership against prior work, the token is politeness/deference. If neither check is met, the token is a false positive. Retention and function assignment are the same operation by design. A token qualifies as a hedge by passing at least one test, and which test it passes is its function. Epistemic caution and politeness/deference may be assigned together when a token both reduces commitment to the claim’s truth and softens how the claim meets the reader or prior work. In that case the Working Test still holds, and politeness/deference is recorded as a concurrent interpersonal reading rather than as a second independent pass of the Reader Test. The Reader Test alone is reserved for pure politeness/deference, where commitment does not rise. Step 3 assigned grammatical type only to retained epistemic caution and politeness/deference tokens. Residual rejects are labeled with reason codes such as recommendation, capability, procedure, or general false positive. Among retained hedges, the research questions on function ask how tokens split across epistemic caution and politeness/deference under this scope, not what functions hedges might serve outside it.</w:t>
-      </w:r>
-    </w:p>
-    <w:p>
-      <w:pPr>
-        <w:spacing w:after="0" w:before="0" w:line="480" w:lineRule="auto"/>
+        <w:spacing w:after="240" w:before="0" w:line="480" w:lineRule="auto"/>
         <w:jc w:val="center"/>
         <w:rPr/>
-        <w:ind w:left="0" w:right="0" w:firstLineChars="0" w:hangingChars="0" w:firstLine="0"/>
+        <w:ind w:left="0" w:right="0" w:firstLine="0" w:firstLineChars="0" w:hanging="0" w:hangingChars="0"/>
       </w:pPr>
       <w:r>
         <w:rPr/>
@@ -2073,6 +2034,45 @@
         <w:rPr>
           <w:rtl w:val="0"/>
         </w:rPr>
+      </w:r>
+    </w:p>
+    <w:p>
+      <w:pPr>
+        <w:spacing w:after="0" w:before="0" w:line="480" w:lineRule="auto"/>
+        <w:jc w:val="both"/>
+        <w:rPr/>
+        <w:ind w:firstLine="720" w:left="0" w:firstLineChars="0"/>
+      </w:pPr>
+      <w:r>
+        <w:rPr>
+          <w:rFonts w:ascii="Georgia" w:hAnsi="Georgia" w:cs="Georgia" w:eastAsia="Georgia"/>
+          <w:sz w:val="22"/>
+          <w:rtl w:val="0"/>
+          <w:b w:val="0"/>
+          <w:bCs w:val="0"/>
+          <w:i w:val="0"/>
+          <w:iCs w:val="0"/>
+        </w:rPr>
+        <w:t>Hyland (1998) is the type instrument and the broad start for epistemic caution and politeness/deference. Crompton (1997) supplies the boundary rule for epistemic caution alone: his restatement test operationalizes the Working Test for epistemic caution at Step 2. The study does not adopt Crompton’s full taxonomy. Salager-Meyer (1994) is an interpretive lens in Part IV. Her claim-responsibility account helps read density differences across programs. Hyland (2005) is a second interpretive lens. The stance model helps read what fewer hedges mean where results turn into implications. Neither interpretive lens is an operational coding criterion.</w:t>
+      </w:r>
+    </w:p>
+    <w:p>
+      <w:pPr>
+        <w:spacing w:after="0" w:before="0" w:line="480" w:lineRule="auto"/>
+        <w:jc w:val="both"/>
+        <w:rPr/>
+        <w:ind w:firstLine="720" w:left="0" w:firstLineChars="0"/>
+      </w:pPr>
+      <w:r>
+        <w:rPr>
+          <w:rFonts w:ascii="Georgia" w:hAnsi="Georgia" w:cs="Georgia" w:eastAsia="Georgia"/>
+          <w:sz w:val="22"/>
+          <w:b w:val="0"/>
+          <w:bCs w:val="0"/>
+          <w:i w:val="0"/>
+          <w:iCs w:val="0"/>
+        </w:rPr>
+        <w:t>Coding followed the decision rules in Appendix A. After a holistic reading of each abstract, Step 1 marked all possible hedge candidates without counting retained hedges. Step 2 applied a claim condition and two removal checks. Because a hedge changes the writer’s stance toward a proposition, the device must attach to a claim: a statement about data, the world, or prior work that evidence could show to be wrong. Aims, directives, and routine procedures are excluded by kind as a consequence of that definition, not as a coding convenience. Under the Working Test, the device is removed from the claim. If the writer’s commitment to the truth of the claim rises, the token is epistemic caution. Under the Reader Test, the device is removed from the claim. If commitment stays the same but the claim reaches the reader more bluntly, or the writer takes sole ownership against prior work, the token is politeness/deference. If neither check is met, the token is a false positive. Retention and function assignment are the same operation by design. A token qualifies as a hedge by passing at least one test, and which test it passes is its function. Epistemic caution and politeness/deference may be assigned together when a token both reduces commitment to the claim’s truth and softens how the claim meets the reader or prior work. In that case the Working Test still holds, and politeness/deference is recorded as a concurrent interpersonal reading rather than as a second independent pass of the Reader Test. The Reader Test alone is reserved for pure politeness/deference, where commitment does not rise. Step 3 assigned grammatical type only to retained epistemic caution and politeness/deference tokens. Residual rejects are labeled with reason codes such as recommendation, capability, procedure, or general false positive. Among retained hedges, the research questions on function ask how tokens split across epistemic caution and politeness/deference under this scope, not what functions hedges might serve outside it.</w:t>
       </w:r>
     </w:p>
     <w:p>

</xml_diff>

<commit_message>
Draft_124_body: clear false bold in Scope and Limitations
Generic For-lead matcher had bolded ordinary Scope prose.
</commit_message>
<xml_diff>
--- a/thesis/003_ThesisProposal_Draft_124_body.docx
+++ b/thesis/003_ThesisProposal_Draft_124_body.docx
@@ -2297,8 +2297,8 @@
         <w:rPr>
           <w:rFonts w:ascii="Georgia" w:hAnsi="Georgia" w:cs="Georgia" w:eastAsia="Georgia"/>
           <w:sz w:val="22"/>
-          <w:b w:val="1"/>
-          <w:bCs w:val="1"/>
+          <w:b w:val="0"/>
+          <w:bCs w:val="0"/>
           <w:i w:val="0"/>
           <w:iCs w:val="0"/>
         </w:rPr>

</xml_diff>

<commit_message>
Draft_124_body: keep Token definition from isolating
keepNext chain on Definition of Terms entries so the last
term is not left alone before the METHODOLOGY page break.
</commit_message>
<xml_diff>
--- a/thesis/003_ThesisProposal_Draft_124_body.docx
+++ b/thesis/003_ThesisProposal_Draft_124_body.docx
@@ -2427,6 +2427,7 @@
           <w:szCs w:val="24"/>
         </w:rPr>
         <w:ind w:left="0" w:right="0" w:firstLineChars="0" w:hangingChars="0" w:firstLine="0"/>
+        <w:keepLines/>
       </w:pPr>
       <w:r>
         <w:rPr>
@@ -2459,6 +2460,8 @@
         <w:jc w:val="both"/>
         <w:rPr/>
         <w:ind w:firstLine="720" w:left="0" w:firstLineChars="0"/>
+        <w:keepLines/>
+        <w:keepNext/>
       </w:pPr>
       <w:r>
         <w:rPr>
@@ -2479,6 +2482,8 @@
         <w:jc w:val="both"/>
         <w:rPr/>
         <w:ind w:firstLine="720" w:left="0" w:firstLineChars="0"/>
+        <w:keepLines/>
+        <w:keepNext/>
       </w:pPr>
       <w:r>
         <w:rPr>
@@ -2509,6 +2514,8 @@
         <w:jc w:val="both"/>
         <w:rPr/>
         <w:ind w:firstLine="720" w:left="0" w:firstLineChars="0"/>
+        <w:keepLines/>
+        <w:keepNext/>
       </w:pPr>
       <w:r>
         <w:rPr>
@@ -2539,6 +2546,8 @@
         <w:jc w:val="both"/>
         <w:rPr/>
         <w:ind w:firstLine="720" w:left="0" w:firstLineChars="0"/>
+        <w:keepLines/>
+        <w:keepNext/>
       </w:pPr>
       <w:r>
         <w:rPr>
@@ -2569,6 +2578,8 @@
         <w:jc w:val="both"/>
         <w:rPr/>
         <w:ind w:firstLine="720" w:left="0" w:firstLineChars="0"/>
+        <w:keepLines/>
+        <w:keepNext/>
       </w:pPr>
       <w:r>
         <w:rPr>
@@ -2599,6 +2610,8 @@
         <w:jc w:val="both"/>
         <w:rPr/>
         <w:ind w:firstLine="720" w:left="0" w:firstLineChars="0"/>
+        <w:keepLines/>
+        <w:keepNext/>
       </w:pPr>
       <w:r>
         <w:rPr>
@@ -2629,6 +2642,8 @@
         <w:jc w:val="both"/>
         <w:rPr/>
         <w:ind w:firstLine="720" w:left="0" w:firstLineChars="0"/>
+        <w:keepLines/>
+        <w:keepNext/>
       </w:pPr>
       <w:r>
         <w:rPr>
@@ -2659,6 +2674,8 @@
         <w:jc w:val="both"/>
         <w:rPr/>
         <w:ind w:firstLine="720" w:left="0" w:firstLineChars="0"/>
+        <w:keepLines/>
+        <w:keepNext/>
       </w:pPr>
       <w:r>
         <w:rPr>
@@ -2689,6 +2706,8 @@
         <w:jc w:val="both"/>
         <w:rPr/>
         <w:ind w:firstLine="720" w:left="0" w:firstLineChars="0"/>
+        <w:keepLines/>
+        <w:keepNext/>
       </w:pPr>
       <w:r>
         <w:rPr>
@@ -2719,6 +2738,8 @@
         <w:jc w:val="both"/>
         <w:rPr/>
         <w:ind w:firstLine="720" w:left="0" w:firstLineChars="0"/>
+        <w:keepLines/>
+        <w:keepNext/>
       </w:pPr>
       <w:r>
         <w:rPr>
@@ -2749,6 +2770,8 @@
         <w:jc w:val="both"/>
         <w:rPr/>
         <w:ind w:firstLine="720" w:left="0" w:firstLineChars="0"/>
+        <w:keepLines/>
+        <w:keepNext/>
       </w:pPr>
       <w:r>
         <w:rPr>
@@ -2779,6 +2802,8 @@
         <w:jc w:val="both"/>
         <w:rPr/>
         <w:ind w:firstLine="720" w:left="0" w:firstLineChars="0"/>
+        <w:keepLines/>
+        <w:keepNext/>
       </w:pPr>
       <w:r>
         <w:rPr>
@@ -2809,6 +2834,8 @@
         <w:jc w:val="both"/>
         <w:rPr/>
         <w:ind w:firstLine="720" w:left="0" w:firstLineChars="0"/>
+        <w:keepLines/>
+        <w:keepNext/>
       </w:pPr>
       <w:r>
         <w:rPr>
@@ -2839,6 +2866,8 @@
         <w:jc w:val="both"/>
         <w:rPr/>
         <w:ind w:firstLine="720" w:left="0" w:firstLineChars="0"/>
+        <w:keepLines/>
+        <w:keepNext/>
       </w:pPr>
       <w:r>
         <w:rPr>
@@ -2869,6 +2898,8 @@
         <w:jc w:val="both"/>
         <w:rPr/>
         <w:ind w:firstLine="720" w:left="0" w:firstLineChars="0"/>
+        <w:keepLines/>
+        <w:keepNext/>
       </w:pPr>
       <w:r>
         <w:rPr>
@@ -2899,6 +2930,8 @@
         <w:jc w:val="both"/>
         <w:rPr/>
         <w:ind w:firstLine="720" w:left="0" w:firstLineChars="0"/>
+        <w:keepLines/>
+        <w:keepNext/>
       </w:pPr>
       <w:r>
         <w:rPr>
@@ -2929,6 +2962,8 @@
         <w:jc w:val="both"/>
         <w:rPr/>
         <w:ind w:firstLine="720" w:left="0" w:firstLineChars="0"/>
+        <w:keepLines/>
+        <w:keepNext/>
       </w:pPr>
       <w:r>
         <w:rPr>
@@ -2969,6 +3004,8 @@
           <w:titlePg w:val="1"/>
         </w:sectPr>
         <w:ind w:firstLine="720" w:left="0" w:firstLineChars="0"/>
+        <w:keepLines/>
+        <w:keepNext/>
       </w:pPr>
       <w:r>
         <w:rPr>
@@ -2998,6 +3035,7 @@
         <w:jc w:val="both"/>
         <w:spacing w:before="0" w:after="0" w:line="480" w:lineRule="auto"/>
         <w:ind w:firstLine="720" w:left="0" w:firstLineChars="0"/>
+        <w:keepLines/>
       </w:pPr>
       <w:r>
         <w:rPr>

</xml_diff>

<commit_message>
Draft_124_body: limit Definition keepNext to closing terms
Avoid locking the whole glossary on one page; keep only the
last three entries with Token.
</commit_message>
<xml_diff>
--- a/thesis/003_ThesisProposal_Draft_124_body.docx
+++ b/thesis/003_ThesisProposal_Draft_124_body.docx
@@ -2483,7 +2483,6 @@
         <w:rPr/>
         <w:ind w:firstLine="720" w:left="0" w:firstLineChars="0"/>
         <w:keepLines/>
-        <w:keepNext/>
       </w:pPr>
       <w:r>
         <w:rPr>
@@ -2515,7 +2514,6 @@
         <w:rPr/>
         <w:ind w:firstLine="720" w:left="0" w:firstLineChars="0"/>
         <w:keepLines/>
-        <w:keepNext/>
       </w:pPr>
       <w:r>
         <w:rPr>
@@ -2547,7 +2545,6 @@
         <w:rPr/>
         <w:ind w:firstLine="720" w:left="0" w:firstLineChars="0"/>
         <w:keepLines/>
-        <w:keepNext/>
       </w:pPr>
       <w:r>
         <w:rPr>
@@ -2579,7 +2576,6 @@
         <w:rPr/>
         <w:ind w:firstLine="720" w:left="0" w:firstLineChars="0"/>
         <w:keepLines/>
-        <w:keepNext/>
       </w:pPr>
       <w:r>
         <w:rPr>
@@ -2611,7 +2607,6 @@
         <w:rPr/>
         <w:ind w:firstLine="720" w:left="0" w:firstLineChars="0"/>
         <w:keepLines/>
-        <w:keepNext/>
       </w:pPr>
       <w:r>
         <w:rPr>
@@ -2643,7 +2638,6 @@
         <w:rPr/>
         <w:ind w:firstLine="720" w:left="0" w:firstLineChars="0"/>
         <w:keepLines/>
-        <w:keepNext/>
       </w:pPr>
       <w:r>
         <w:rPr>
@@ -2675,7 +2669,6 @@
         <w:rPr/>
         <w:ind w:firstLine="720" w:left="0" w:firstLineChars="0"/>
         <w:keepLines/>
-        <w:keepNext/>
       </w:pPr>
       <w:r>
         <w:rPr>
@@ -2707,7 +2700,6 @@
         <w:rPr/>
         <w:ind w:firstLine="720" w:left="0" w:firstLineChars="0"/>
         <w:keepLines/>
-        <w:keepNext/>
       </w:pPr>
       <w:r>
         <w:rPr>
@@ -2739,7 +2731,6 @@
         <w:rPr/>
         <w:ind w:firstLine="720" w:left="0" w:firstLineChars="0"/>
         <w:keepLines/>
-        <w:keepNext/>
       </w:pPr>
       <w:r>
         <w:rPr>
@@ -2771,7 +2762,6 @@
         <w:rPr/>
         <w:ind w:firstLine="720" w:left="0" w:firstLineChars="0"/>
         <w:keepLines/>
-        <w:keepNext/>
       </w:pPr>
       <w:r>
         <w:rPr>
@@ -2803,7 +2793,6 @@
         <w:rPr/>
         <w:ind w:firstLine="720" w:left="0" w:firstLineChars="0"/>
         <w:keepLines/>
-        <w:keepNext/>
       </w:pPr>
       <w:r>
         <w:rPr>
@@ -2835,7 +2824,6 @@
         <w:rPr/>
         <w:ind w:firstLine="720" w:left="0" w:firstLineChars="0"/>
         <w:keepLines/>
-        <w:keepNext/>
       </w:pPr>
       <w:r>
         <w:rPr>
@@ -2867,7 +2855,6 @@
         <w:rPr/>
         <w:ind w:firstLine="720" w:left="0" w:firstLineChars="0"/>
         <w:keepLines/>
-        <w:keepNext/>
       </w:pPr>
       <w:r>
         <w:rPr>
@@ -2899,7 +2886,6 @@
         <w:rPr/>
         <w:ind w:firstLine="720" w:left="0" w:firstLineChars="0"/>
         <w:keepLines/>
-        <w:keepNext/>
       </w:pPr>
       <w:r>
         <w:rPr>
@@ -2931,7 +2917,6 @@
         <w:rPr/>
         <w:ind w:firstLine="720" w:left="0" w:firstLineChars="0"/>
         <w:keepLines/>
-        <w:keepNext/>
       </w:pPr>
       <w:r>
         <w:rPr>

</xml_diff>

<commit_message>
Draft_124_body: Figure 1 after second framework paragraph
Precision move of caption and image only.
</commit_message>
<xml_diff>
--- a/thesis/003_ThesisProposal_Draft_124_body.docx
+++ b/thesis/003_ThesisProposal_Draft_124_body.docx
@@ -1922,6 +1922,26 @@
           <w:iCs w:val="0"/>
         </w:rPr>
         <w:t>This study is grounded in a coding scheme adapted from Hyland’s (1998) classification of hedging forms, with function coded through an epistemic Working Test and a Reader Test under a claim condition. Figure 1 presents the conceptual framework. The grouping variable is discipline (Agriculture, Veterinary Medicine, and Biology). The dependent measures are hedge frequency, formal type, and function. The figure also marks the boundary between retained epistemic caution and false positives excluded under the decision rules.</w:t>
+      </w:r>
+    </w:p>
+    <w:p>
+      <w:pPr>
+        <w:spacing w:after="0" w:before="0" w:line="480" w:lineRule="auto"/>
+        <w:jc w:val="both"/>
+        <w:rPr/>
+        <w:ind w:firstLine="720" w:left="0"/>
+      </w:pPr>
+      <w:r>
+        <w:rPr>
+          <w:rFonts w:ascii="Georgia" w:hAnsi="Georgia" w:cs="Georgia" w:eastAsia="Georgia"/>
+          <w:sz w:val="22"/>
+          <w:rtl w:val="0"/>
+          <w:b w:val="0"/>
+          <w:bCs w:val="0"/>
+          <w:i w:val="0"/>
+          <w:iCs w:val="0"/>
+        </w:rPr>
+        <w:t>Hyland (1998) is the type instrument and the broad start for epistemic caution and politeness/deference. Crompton (1997) supplies the boundary rule for epistemic caution alone: his restatement test operationalizes the Working Test for epistemic caution at Step 2. The study does not adopt Crompton’s full taxonomy. Salager-Meyer (1994) is an interpretive lens in Part IV. Her claim-responsibility account helps read density differences across programs. Hyland (2005) is a second interpretive lens. The stance model helps read what fewer hedges mean where results turn into implications. Neither interpretive lens is an operational coding criterion.</w:t>
       </w:r>
     </w:p>
     <w:p>
@@ -2034,26 +2054,6 @@
         <w:rPr>
           <w:rtl w:val="0"/>
         </w:rPr>
-      </w:r>
-    </w:p>
-    <w:p>
-      <w:pPr>
-        <w:spacing w:after="0" w:before="0" w:line="480" w:lineRule="auto"/>
-        <w:jc w:val="both"/>
-        <w:rPr/>
-        <w:ind w:firstLine="720" w:left="0"/>
-      </w:pPr>
-      <w:r>
-        <w:rPr>
-          <w:rFonts w:ascii="Georgia" w:hAnsi="Georgia" w:cs="Georgia" w:eastAsia="Georgia"/>
-          <w:sz w:val="22"/>
-          <w:rtl w:val="0"/>
-          <w:b w:val="0"/>
-          <w:bCs w:val="0"/>
-          <w:i w:val="0"/>
-          <w:iCs w:val="0"/>
-        </w:rPr>
-        <w:t>Hyland (1998) is the type instrument and the broad start for epistemic caution and politeness/deference. Crompton (1997) supplies the boundary rule for epistemic caution alone: his restatement test operationalizes the Working Test for epistemic caution at Step 2. The study does not adopt Crompton’s full taxonomy. Salager-Meyer (1994) is an interpretive lens in Part IV. Her claim-responsibility account helps read density differences across programs. Hyland (2005) is a second interpretive lens. The stance model helps read what fewer hedges mean where results turn into implications. Neither interpretive lens is an operational coding criterion.</w:t>
       </w:r>
     </w:p>
     <w:p>

</xml_diff>

<commit_message>
Draft_124_body: fix Definition end orphans without empty gap
Rescue no longer chained keepNext. Softening keeps with Token
only. Document rule in formatting.md so reapply does not drop it.
</commit_message>
<xml_diff>
--- a/thesis/003_ThesisProposal_Draft_124_body.docx
+++ b/thesis/003_ThesisProposal_Draft_124_body.docx
@@ -2419,7 +2419,6 @@
     </w:p>
     <w:p>
       <w:pPr>
-        <w:keepNext w:val="1"/>
         <w:spacing w:after="0" w:before="240" w:line="480" w:lineRule="auto"/>
         <w:jc w:val="left"/>
         <w:rPr>
@@ -2428,6 +2427,8 @@
         </w:rPr>
         <w:keepLines/>
         <w:ind w:left="0" w:right="0" w:firstLine="0" w:firstLineChars="0" w:hanging="0" w:hangingChars="0"/>
+        <w:widowControl w:val="1"/>
+        <w:keepNext/>
       </w:pPr>
       <w:r>
         <w:rPr>
@@ -2461,6 +2462,7 @@
         <w:rPr/>
         <w:keepLines/>
         <w:ind w:firstLine="720" w:left="0"/>
+        <w:widowControl w:val="1"/>
         <w:keepNext/>
       </w:pPr>
       <w:r>
@@ -2483,6 +2485,7 @@
         <w:rPr/>
         <w:keepLines/>
         <w:ind w:firstLine="720" w:left="0"/>
+        <w:widowControl w:val="1"/>
       </w:pPr>
       <w:r>
         <w:rPr>
@@ -2514,6 +2517,7 @@
         <w:rPr/>
         <w:keepLines/>
         <w:ind w:firstLine="720" w:left="0"/>
+        <w:widowControl w:val="1"/>
       </w:pPr>
       <w:r>
         <w:rPr>
@@ -2545,6 +2549,7 @@
         <w:rPr/>
         <w:keepLines/>
         <w:ind w:firstLine="720" w:left="0"/>
+        <w:widowControl w:val="1"/>
       </w:pPr>
       <w:r>
         <w:rPr>
@@ -2576,6 +2581,7 @@
         <w:rPr/>
         <w:keepLines/>
         <w:ind w:firstLine="720" w:left="0"/>
+        <w:widowControl w:val="1"/>
       </w:pPr>
       <w:r>
         <w:rPr>
@@ -2607,6 +2613,7 @@
         <w:rPr/>
         <w:keepLines/>
         <w:ind w:firstLine="720" w:left="0"/>
+        <w:widowControl w:val="1"/>
       </w:pPr>
       <w:r>
         <w:rPr>
@@ -2638,6 +2645,7 @@
         <w:rPr/>
         <w:keepLines/>
         <w:ind w:firstLine="720" w:left="0"/>
+        <w:widowControl w:val="1"/>
       </w:pPr>
       <w:r>
         <w:rPr>
@@ -2669,6 +2677,7 @@
         <w:rPr/>
         <w:keepLines/>
         <w:ind w:firstLine="720" w:left="0"/>
+        <w:widowControl w:val="1"/>
       </w:pPr>
       <w:r>
         <w:rPr>
@@ -2700,6 +2709,7 @@
         <w:rPr/>
         <w:keepLines/>
         <w:ind w:firstLine="720" w:left="0"/>
+        <w:widowControl w:val="1"/>
       </w:pPr>
       <w:r>
         <w:rPr>
@@ -2731,6 +2741,7 @@
         <w:rPr/>
         <w:keepLines/>
         <w:ind w:firstLine="720" w:left="0"/>
+        <w:widowControl w:val="1"/>
       </w:pPr>
       <w:r>
         <w:rPr>
@@ -2762,6 +2773,7 @@
         <w:rPr/>
         <w:keepLines/>
         <w:ind w:firstLine="720" w:left="0"/>
+        <w:widowControl w:val="1"/>
       </w:pPr>
       <w:r>
         <w:rPr>
@@ -2793,6 +2805,7 @@
         <w:rPr/>
         <w:keepLines/>
         <w:ind w:firstLine="720" w:left="0"/>
+        <w:widowControl w:val="1"/>
       </w:pPr>
       <w:r>
         <w:rPr>
@@ -2824,6 +2837,7 @@
         <w:rPr/>
         <w:keepLines/>
         <w:ind w:firstLine="720" w:left="0"/>
+        <w:widowControl w:val="1"/>
       </w:pPr>
       <w:r>
         <w:rPr>
@@ -2855,6 +2869,7 @@
         <w:rPr/>
         <w:keepLines/>
         <w:ind w:firstLine="720" w:left="0"/>
+        <w:widowControl w:val="1"/>
       </w:pPr>
       <w:r>
         <w:rPr>
@@ -2886,6 +2901,7 @@
         <w:rPr/>
         <w:keepLines/>
         <w:ind w:firstLine="720" w:left="0"/>
+        <w:widowControl w:val="1"/>
       </w:pPr>
       <w:r>
         <w:rPr>
@@ -2917,6 +2933,7 @@
         <w:rPr/>
         <w:keepLines/>
         <w:ind w:firstLine="720" w:left="0"/>
+        <w:widowControl w:val="1"/>
       </w:pPr>
       <w:r>
         <w:rPr>
@@ -2948,7 +2965,7 @@
         <w:rPr/>
         <w:keepLines/>
         <w:ind w:firstLine="720" w:left="0"/>
-        <w:keepNext/>
+        <w:widowControl w:val="1"/>
       </w:pPr>
       <w:r>
         <w:rPr>
@@ -2990,6 +3007,7 @@
         </w:sectPr>
         <w:keepLines/>
         <w:ind w:firstLine="720" w:left="0"/>
+        <w:widowControl w:val="1"/>
         <w:keepNext/>
       </w:pPr>
       <w:r>
@@ -3021,6 +3039,7 @@
         <w:spacing w:before="0" w:after="0" w:line="480" w:lineRule="auto"/>
         <w:keepLines/>
         <w:ind w:firstLine="720" w:left="0"/>
+        <w:widowControl w:val="1"/>
       </w:pPr>
       <w:r>
         <w:rPr>

</xml_diff>

<commit_message>
Draft_124_body: Definition of Terms natural flow only
Strip keepNext/keepLines/widow flags from glossary entries.
</commit_message>
<xml_diff>
--- a/thesis/003_ThesisProposal_Draft_124_body.docx
+++ b/thesis/003_ThesisProposal_Draft_124_body.docx
@@ -2425,10 +2425,7 @@
           <w:sz w:val="24"/>
           <w:szCs w:val="24"/>
         </w:rPr>
-        <w:keepLines/>
         <w:ind w:left="0" w:right="0" w:firstLine="0" w:firstLineChars="0" w:hanging="0" w:hangingChars="0"/>
-        <w:widowControl w:val="1"/>
-        <w:keepNext/>
       </w:pPr>
       <w:r>
         <w:rPr>
@@ -2460,10 +2457,7 @@
         <w:spacing w:after="0" w:before="0" w:line="480" w:lineRule="auto"/>
         <w:jc w:val="both"/>
         <w:rPr/>
-        <w:keepLines/>
         <w:ind w:firstLine="720" w:left="0"/>
-        <w:widowControl w:val="1"/>
-        <w:keepNext/>
       </w:pPr>
       <w:r>
         <w:rPr>
@@ -2483,9 +2477,7 @@
         <w:spacing w:after="0" w:before="0" w:line="480" w:lineRule="auto"/>
         <w:jc w:val="both"/>
         <w:rPr/>
-        <w:keepLines/>
         <w:ind w:firstLine="720" w:left="0"/>
-        <w:widowControl w:val="1"/>
       </w:pPr>
       <w:r>
         <w:rPr>
@@ -2515,9 +2507,7 @@
         <w:spacing w:after="0" w:before="0" w:line="480" w:lineRule="auto"/>
         <w:jc w:val="both"/>
         <w:rPr/>
-        <w:keepLines/>
         <w:ind w:firstLine="720" w:left="0"/>
-        <w:widowControl w:val="1"/>
       </w:pPr>
       <w:r>
         <w:rPr>
@@ -2547,9 +2537,7 @@
         <w:spacing w:after="0" w:before="0" w:line="480" w:lineRule="auto"/>
         <w:jc w:val="both"/>
         <w:rPr/>
-        <w:keepLines/>
         <w:ind w:firstLine="720" w:left="0"/>
-        <w:widowControl w:val="1"/>
       </w:pPr>
       <w:r>
         <w:rPr>
@@ -2579,9 +2567,7 @@
         <w:spacing w:after="0" w:before="0" w:line="480" w:lineRule="auto"/>
         <w:jc w:val="both"/>
         <w:rPr/>
-        <w:keepLines/>
         <w:ind w:firstLine="720" w:left="0"/>
-        <w:widowControl w:val="1"/>
       </w:pPr>
       <w:r>
         <w:rPr>
@@ -2611,9 +2597,7 @@
         <w:spacing w:after="0" w:before="0" w:line="480" w:lineRule="auto"/>
         <w:jc w:val="both"/>
         <w:rPr/>
-        <w:keepLines/>
         <w:ind w:firstLine="720" w:left="0"/>
-        <w:widowControl w:val="1"/>
       </w:pPr>
       <w:r>
         <w:rPr>
@@ -2643,9 +2627,7 @@
         <w:spacing w:after="0" w:before="0" w:line="480" w:lineRule="auto"/>
         <w:jc w:val="both"/>
         <w:rPr/>
-        <w:keepLines/>
         <w:ind w:firstLine="720" w:left="0"/>
-        <w:widowControl w:val="1"/>
       </w:pPr>
       <w:r>
         <w:rPr>
@@ -2675,9 +2657,7 @@
         <w:spacing w:after="0" w:before="0" w:line="480" w:lineRule="auto"/>
         <w:jc w:val="both"/>
         <w:rPr/>
-        <w:keepLines/>
         <w:ind w:firstLine="720" w:left="0"/>
-        <w:widowControl w:val="1"/>
       </w:pPr>
       <w:r>
         <w:rPr>
@@ -2707,9 +2687,7 @@
         <w:spacing w:after="0" w:before="0" w:line="480" w:lineRule="auto"/>
         <w:jc w:val="both"/>
         <w:rPr/>
-        <w:keepLines/>
         <w:ind w:firstLine="720" w:left="0"/>
-        <w:widowControl w:val="1"/>
       </w:pPr>
       <w:r>
         <w:rPr>
@@ -2739,9 +2717,7 @@
         <w:spacing w:after="0" w:before="0" w:line="480" w:lineRule="auto"/>
         <w:jc w:val="both"/>
         <w:rPr/>
-        <w:keepLines/>
         <w:ind w:firstLine="720" w:left="0"/>
-        <w:widowControl w:val="1"/>
       </w:pPr>
       <w:r>
         <w:rPr>
@@ -2771,9 +2747,7 @@
         <w:spacing w:after="0" w:before="0" w:line="480" w:lineRule="auto"/>
         <w:jc w:val="both"/>
         <w:rPr/>
-        <w:keepLines/>
         <w:ind w:firstLine="720" w:left="0"/>
-        <w:widowControl w:val="1"/>
       </w:pPr>
       <w:r>
         <w:rPr>
@@ -2803,9 +2777,7 @@
         <w:spacing w:after="0" w:before="0" w:line="480" w:lineRule="auto"/>
         <w:jc w:val="both"/>
         <w:rPr/>
-        <w:keepLines/>
         <w:ind w:firstLine="720" w:left="0"/>
-        <w:widowControl w:val="1"/>
       </w:pPr>
       <w:r>
         <w:rPr>
@@ -2835,9 +2807,7 @@
         <w:spacing w:after="0" w:before="0" w:line="480" w:lineRule="auto"/>
         <w:jc w:val="both"/>
         <w:rPr/>
-        <w:keepLines/>
         <w:ind w:firstLine="720" w:left="0"/>
-        <w:widowControl w:val="1"/>
       </w:pPr>
       <w:r>
         <w:rPr>
@@ -2867,9 +2837,7 @@
         <w:spacing w:after="0" w:before="0" w:line="480" w:lineRule="auto"/>
         <w:jc w:val="both"/>
         <w:rPr/>
-        <w:keepLines/>
         <w:ind w:firstLine="720" w:left="0"/>
-        <w:widowControl w:val="1"/>
       </w:pPr>
       <w:r>
         <w:rPr>
@@ -2899,9 +2867,7 @@
         <w:spacing w:after="0" w:before="0" w:line="480" w:lineRule="auto"/>
         <w:jc w:val="both"/>
         <w:rPr/>
-        <w:keepLines/>
         <w:ind w:firstLine="720" w:left="0"/>
-        <w:widowControl w:val="1"/>
       </w:pPr>
       <w:r>
         <w:rPr>
@@ -2931,9 +2897,7 @@
         <w:spacing w:after="0" w:before="0" w:line="480" w:lineRule="auto"/>
         <w:jc w:val="both"/>
         <w:rPr/>
-        <w:keepLines/>
         <w:ind w:firstLine="720" w:left="0"/>
-        <w:widowControl w:val="1"/>
       </w:pPr>
       <w:r>
         <w:rPr>
@@ -2963,9 +2927,7 @@
         <w:spacing w:after="0" w:before="0" w:line="480" w:lineRule="auto"/>
         <w:jc w:val="both"/>
         <w:rPr/>
-        <w:keepLines/>
         <w:ind w:firstLine="720" w:left="0"/>
-        <w:widowControl w:val="1"/>
       </w:pPr>
       <w:r>
         <w:rPr>
@@ -3005,10 +2967,7 @@
           <w:pgMar w:bottom="1440" w:top="1440" w:left="2160" w:right="1440" w:header="720" w:footer="720"/>
           <w:titlePg w:val="1"/>
         </w:sectPr>
-        <w:keepLines/>
         <w:ind w:firstLine="720" w:left="0"/>
-        <w:widowControl w:val="1"/>
-        <w:keepNext/>
       </w:pPr>
       <w:r>
         <w:rPr>
@@ -3037,9 +2996,7 @@
       <w:pPr>
         <w:jc w:val="both"/>
         <w:spacing w:before="0" w:after="0" w:line="480" w:lineRule="auto"/>
-        <w:keepLines/>
         <w:ind w:firstLine="720" w:left="0"/>
-        <w:widowControl w:val="1"/>
       </w:pPr>
       <w:r>
         <w:rPr>

</xml_diff>

<commit_message>
Draft_124_body: remove mid-body section and page breaks
Softening had an embedded section break that isolated Token.
Page breaks remain only on major headings.
</commit_message>
<xml_diff>
--- a/thesis/003_ThesisProposal_Draft_124_body.docx
+++ b/thesis/003_ThesisProposal_Draft_124_body.docx
@@ -552,7 +552,6 @@
     </w:p>
     <w:p>
       <w:pPr>
-        <w:keepLines w:val="1"/>
         <w:spacing w:after="0" w:before="0" w:line="360" w:lineRule="auto"/>
         <w:jc w:val="center"/>
         <w:rPr/>
@@ -620,7 +619,6 @@
     </w:p>
     <w:p>
       <w:pPr>
-        <w:keepNext w:val="1"/>
         <w:spacing w:after="0" w:before="0" w:line="480" w:lineRule="auto"/>
         <w:rPr>
           <w:b w:val="1"/>
@@ -638,7 +636,6 @@
     </w:p>
     <w:p>
       <w:pPr>
-        <w:keepNext w:val="1"/>
         <w:spacing w:after="0" w:before="0" w:line="480" w:lineRule="auto"/>
         <w:jc w:val="left"/>
         <w:rPr>
@@ -783,7 +780,6 @@
           <w:sz w:val="24"/>
           <w:szCs w:val="24"/>
         </w:rPr>
-        <w:keepNext/>
         <w:ind w:left="0" w:right="0" w:firstLine="0" w:firstLineChars="0" w:hanging="0" w:hangingChars="0"/>
       </w:pPr>
       <w:r>
@@ -918,7 +914,6 @@
           <w:sz w:val="24"/>
           <w:szCs w:val="24"/>
         </w:rPr>
-        <w:keepNext/>
         <w:ind w:left="0" w:right="0" w:firstLine="0" w:firstLineChars="0" w:hanging="0" w:hangingChars="0"/>
       </w:pPr>
       <w:r>
@@ -1170,7 +1165,6 @@
           <w:sz w:val="24"/>
           <w:szCs w:val="24"/>
         </w:rPr>
-        <w:keepNext/>
         <w:ind w:left="0" w:right="0" w:firstLine="0" w:firstLineChars="0" w:hanging="0" w:hangingChars="0"/>
       </w:pPr>
       <w:r>
@@ -1314,7 +1308,6 @@
           <w:sz w:val="24"/>
           <w:szCs w:val="24"/>
         </w:rPr>
-        <w:keepNext/>
         <w:ind w:left="0" w:right="0" w:firstLine="0" w:firstLineChars="0" w:hanging="0" w:hangingChars="0"/>
       </w:pPr>
       <w:r>
@@ -1445,7 +1438,6 @@
           <w:sz w:val="24"/>
           <w:szCs w:val="24"/>
         </w:rPr>
-        <w:keepNext/>
         <w:ind w:left="0" w:right="0" w:firstLine="0" w:firstLineChars="0" w:hanging="0" w:hangingChars="0"/>
       </w:pPr>
       <w:r>
@@ -1715,7 +1707,6 @@
     </w:p>
     <w:p>
       <w:pPr>
-        <w:keepNext w:val="1"/>
         <w:spacing w:after="0" w:before="240" w:line="480" w:lineRule="auto"/>
         <w:jc w:val="left"/>
         <w:rPr>
@@ -1871,7 +1862,6 @@
     </w:p>
     <w:p>
       <w:pPr>
-        <w:keepNext w:val="1"/>
         <w:spacing w:after="0" w:before="240" w:line="480" w:lineRule="auto"/>
         <w:jc w:val="left"/>
         <w:rPr>
@@ -1949,7 +1939,6 @@
         <w:spacing w:after="0" w:before="240" w:line="480" w:lineRule="auto"/>
         <w:jc w:val="left"/>
         <w:rPr/>
-        <w:keepNext/>
         <w:ind w:left="0" w:right="0" w:firstLine="0" w:firstLineChars="0" w:hanging="0" w:hangingChars="0"/>
       </w:pPr>
       <w:r>
@@ -1981,7 +1970,6 @@
         <w:spacing w:after="240" w:before="0" w:line="480" w:lineRule="auto"/>
         <w:jc w:val="left"/>
         <w:rPr/>
-        <w:keepNext/>
         <w:ind w:left="0" w:right="0" w:firstLine="0" w:firstLineChars="0" w:hanging="0" w:hangingChars="0"/>
       </w:pPr>
       <w:r>
@@ -2077,7 +2065,6 @@
     </w:p>
     <w:p>
       <w:pPr>
-        <w:keepNext w:val="1"/>
         <w:spacing w:after="0" w:before="240" w:line="480" w:lineRule="auto"/>
         <w:jc w:val="left"/>
         <w:rPr>
@@ -2233,7 +2220,6 @@
     </w:p>
     <w:p>
       <w:pPr>
-        <w:keepNext w:val="1"/>
         <w:spacing w:after="0" w:before="240" w:line="480" w:lineRule="auto"/>
         <w:jc w:val="left"/>
         <w:rPr>
@@ -2957,18 +2943,7 @@
         <w:spacing w:after="0" w:before="0" w:line="480" w:lineRule="auto"/>
         <w:jc w:val="both"/>
         <w:rPr/>
-        <w:sectPr>
-          <w:headerReference r:id="rId13" w:type="default"/>
-          <w:headerReference r:id="rId14" w:type="first"/>
-          <w:footerReference r:id="rId15" w:type="default"/>
-          <w:footerReference r:id="rId16" w:type="first"/>
-          <w:type w:val="nextPage"/>
-          <w:pgSz w:h="16838" w:w="11906" w:orient="portrait"/>
-          <w:pgMar w:bottom="1440" w:top="1440" w:left="2160" w:right="1440" w:header="720" w:footer="720"/>
-          <w:titlePg w:val="1"/>
-        </w:sectPr>
         <w:ind w:firstLine="720" w:left="0"/>
-        <w:keepNext/>
       </w:pPr>
       <w:r>
         <w:rPr>
@@ -3093,7 +3068,6 @@
     </w:p>
     <w:p>
       <w:pPr>
-        <w:keepNext w:val="1"/>
         <w:spacing w:after="0" w:before="240" w:line="480" w:lineRule="auto"/>
         <w:jc w:val="left"/>
         <w:rPr>
@@ -3189,7 +3163,6 @@
     </w:p>
     <w:p>
       <w:pPr>
-        <w:keepNext w:val="1"/>
         <w:spacing w:after="0" w:before="240" w:line="480" w:lineRule="auto"/>
         <w:jc w:val="left"/>
         <w:rPr>
@@ -3245,7 +3218,6 @@
     </w:p>
     <w:p>
       <w:pPr>
-        <w:keepNext w:val="1"/>
         <w:spacing w:after="0" w:before="240" w:line="480" w:lineRule="auto"/>
         <w:jc w:val="left"/>
         <w:rPr>
@@ -4179,7 +4151,6 @@
           <w:sz w:val="24"/>
           <w:szCs w:val="24"/>
         </w:rPr>
-        <w:keepNext/>
         <w:ind w:left="0" w:right="0" w:firstLine="0" w:firstLineChars="0" w:hanging="0" w:hangingChars="0"/>
       </w:pPr>
       <w:r>
@@ -4230,7 +4201,6 @@
       <w:pPr>
         <w:spacing w:before="240" w:after="0" w:line="480" w:lineRule="auto"/>
         <w:jc w:val="left"/>
-        <w:keepNext/>
         <w:ind w:left="0" w:right="0" w:firstLine="0" w:firstLineChars="0" w:hanging="0" w:hangingChars="0"/>
       </w:pPr>
       <w:r>
@@ -4249,7 +4219,6 @@
       <w:pPr>
         <w:spacing w:line="480" w:lineRule="auto" w:before="0" w:after="240"/>
         <w:jc w:val="left"/>
-        <w:keepNext/>
         <w:ind w:left="0" w:right="0" w:firstLine="0" w:firstLineChars="0" w:hanging="0" w:hangingChars="0"/>
       </w:pPr>
       <w:r>
@@ -5118,7 +5087,6 @@
     </w:tbl>
     <w:p>
       <w:pPr>
-        <w:keepNext w:val="1"/>
         <w:spacing w:after="0" w:before="240" w:line="480" w:lineRule="auto"/>
         <w:jc w:val="left"/>
         <w:rPr>
@@ -5171,9 +5139,7 @@
         </w:rPr>
         <w:t xml:space="preserve">This study used a text corpus rather than human participants. The corpus consisted of 60 undergraduate thesis abstracts from Agriculture, Veterinary Medicine, and Biology programs at PSAU. This study employed disproportionate stratified systematic sampling, with discipline as the stratification variable and fixed analytical targets per stratum (n=20 for Biology, n=20 for Veterinary Medicine, n=10 for Animal Science, and n=10 for Crop Science) to ensure equal representation regardless of population size. This meant the sampling rate varied by population size, prioritizing equal sample sizes over proportional representation. For the Agriculture discipline, the sample was equally split between Crop Science (n=10) and Animal Science (n=10) to ensure balanced representation of the sub-disciplines. Stratum intervals and the sampling procedure are given under Research Process, step b. For a manually coded functional analysis at a single institution, 60 texts allow sufficient depth of interpretation within the timeframe and resources of a BA thesis. The study treated findings as baseline descriptive data for institutional curriculum review.</w:t>
       </w:r>
-      <w:r>
-        <w:br w:type="page"/>
-      </w:r>
+      <w:r/>
       <w:r>
         <w:rPr>
           <w:rtl w:val="0"/>
@@ -5185,7 +5151,6 @@
         <w:spacing w:after="0" w:before="240" w:line="480" w:lineRule="auto"/>
         <w:jc w:val="left"/>
         <w:rPr/>
-        <w:keepNext/>
         <w:ind w:left="0" w:right="0" w:firstLine="0" w:firstLineChars="0" w:hanging="0" w:hangingChars="0"/>
       </w:pPr>
       <w:r>
@@ -5286,11 +5251,9 @@
     </w:p>
     <w:p>
       <w:pPr>
-        <w:keepLines w:val="1"/>
         <w:spacing w:after="0" w:before="240" w:line="480" w:lineRule="auto"/>
         <w:jc w:val="left"/>
         <w:rPr/>
-        <w:keepNext/>
         <w:ind w:left="0" w:right="0" w:firstLine="0" w:firstLineChars="0" w:hanging="0" w:hangingChars="0"/>
       </w:pPr>
       <w:r>
@@ -5394,16 +5357,6 @@
         <w:spacing w:after="0" w:before="0" w:line="480" w:lineRule="auto"/>
         <w:jc w:val="both"/>
         <w:rPr/>
-        <w:sectPr>
-          <w:headerReference r:id="rId17" w:type="default"/>
-          <w:headerReference r:id="rId18" w:type="first"/>
-          <w:footerReference r:id="rId19" w:type="default"/>
-          <w:footerReference r:id="rId20" w:type="first"/>
-          <w:type w:val="nextPage"/>
-          <w:pgSz w:h="16838" w:w="11906" w:orient="portrait"/>
-          <w:pgMar w:bottom="1440" w:top="1440" w:left="2160" w:right="1440" w:header="720" w:footer="720"/>
-          <w:titlePg w:val="1"/>
-        </w:sectPr>
         <w:ind w:firstLine="720" w:left="0"/>
       </w:pPr>
       <w:r>
@@ -5500,7 +5453,6 @@
     </w:p>
     <w:p>
       <w:pPr>
-        <w:keepNext w:val="1"/>
         <w:spacing w:after="0" w:before="240" w:line="480" w:lineRule="auto"/>
         <w:jc w:val="left"/>
         <w:rPr/>
@@ -5520,7 +5472,6 @@
     </w:p>
     <w:p>
       <w:pPr>
-        <w:keepNext w:val="1"/>
         <w:spacing w:after="240" w:before="0" w:line="480" w:lineRule="auto"/>
         <w:jc w:val="left"/>
         <w:rPr/>
@@ -7236,7 +7187,6 @@
     </w:p>
     <w:p>
       <w:pPr>
-        <w:keepNext w:val="1"/>
         <w:spacing w:after="0" w:before="240" w:line="480" w:lineRule="auto"/>
         <w:jc w:val="left"/>
         <w:rPr/>
@@ -7305,7 +7255,6 @@
     </w:p>
     <w:p>
       <w:pPr>
-        <w:keepNext w:val="1"/>
         <w:spacing w:after="0" w:before="240" w:line="480" w:lineRule="auto"/>
         <w:jc w:val="left"/>
         <w:rPr/>
@@ -7325,7 +7274,6 @@
     </w:p>
     <w:p>
       <w:pPr>
-        <w:keepNext w:val="1"/>
         <w:spacing w:after="240" w:before="0" w:line="480" w:lineRule="auto"/>
         <w:jc w:val="left"/>
         <w:rPr/>
@@ -9686,7 +9634,6 @@
     </w:p>
     <w:p>
       <w:pPr>
-        <w:keepNext w:val="1"/>
         <w:spacing w:after="0" w:before="240" w:line="480" w:lineRule="auto"/>
         <w:jc w:val="left"/>
         <w:rPr>
@@ -9741,7 +9688,6 @@
     </w:p>
     <w:p>
       <w:pPr>
-        <w:keepNext w:val="1"/>
         <w:spacing w:after="0" w:before="240" w:line="480" w:lineRule="auto"/>
         <w:jc w:val="left"/>
         <w:rPr/>
@@ -9761,7 +9707,6 @@
     </w:p>
     <w:p>
       <w:pPr>
-        <w:keepNext w:val="1"/>
         <w:spacing w:after="240" w:before="0" w:line="480" w:lineRule="auto"/>
         <w:jc w:val="left"/>
         <w:rPr/>
@@ -11969,7 +11914,6 @@
     </w:p>
     <w:p>
       <w:pPr>
-        <w:keepNext w:val="1"/>
         <w:spacing w:after="0" w:before="240" w:line="480" w:lineRule="auto"/>
         <w:jc w:val="left"/>
         <w:rPr>
@@ -12007,7 +11951,6 @@
       <w:pPr>
         <w:spacing w:line="480" w:lineRule="auto" w:before="240" w:after="0"/>
         <w:jc w:val="left"/>
-        <w:keepNext/>
         <w:ind w:left="0" w:right="0" w:firstLine="0" w:firstLineChars="0" w:hanging="0" w:hangingChars="0"/>
       </w:pPr>
       <w:r>
@@ -12043,7 +11986,6 @@
     </w:p>
     <w:p>
       <w:pPr>
-        <w:keepNext w:val="1"/>
         <w:spacing w:after="0" w:before="240" w:line="480" w:lineRule="auto"/>
         <w:jc w:val="left"/>
         <w:rPr/>
@@ -12063,7 +12005,6 @@
     </w:p>
     <w:p>
       <w:pPr>
-        <w:keepNext w:val="1"/>
         <w:spacing w:after="240" w:before="0" w:line="480" w:lineRule="auto"/>
         <w:jc w:val="left"/>
         <w:rPr/>
@@ -12660,7 +12601,6 @@
       <w:pPr>
         <w:spacing w:line="480" w:lineRule="auto" w:before="240" w:after="0"/>
         <w:jc w:val="left"/>
-        <w:keepNext/>
         <w:ind w:left="0" w:right="0" w:firstLine="0" w:firstLineChars="0" w:hanging="0" w:hangingChars="0"/>
       </w:pPr>
       <w:r>
@@ -14734,7 +14674,6 @@
     </w:p>
     <w:p>
       <w:pPr>
-        <w:keepNext w:val="1"/>
         <w:spacing w:after="0" w:before="240" w:line="480" w:lineRule="auto"/>
         <w:jc w:val="left"/>
         <w:rPr>
@@ -14791,7 +14730,6 @@
       <w:pPr>
         <w:spacing w:line="480" w:lineRule="auto" w:before="240" w:after="0"/>
         <w:jc w:val="left"/>
-        <w:keepNext/>
         <w:ind w:left="0" w:right="0" w:firstLine="0" w:firstLineChars="0" w:hanging="0" w:hangingChars="0"/>
       </w:pPr>
       <w:r>
@@ -14827,7 +14765,6 @@
     </w:p>
     <w:p>
       <w:pPr>
-        <w:keepNext w:val="1"/>
         <w:spacing w:after="0" w:before="240" w:line="480" w:lineRule="auto"/>
         <w:jc w:val="left"/>
         <w:rPr/>
@@ -14847,7 +14784,6 @@
     </w:p>
     <w:p>
       <w:pPr>
-        <w:keepNext w:val="1"/>
         <w:spacing w:after="240" w:before="0" w:line="480" w:lineRule="auto"/>
         <w:jc w:val="left"/>
         <w:rPr/>
@@ -16185,7 +16121,6 @@
       <w:pPr>
         <w:spacing w:line="480" w:lineRule="auto" w:before="240" w:after="0"/>
         <w:jc w:val="left"/>
-        <w:keepNext/>
         <w:ind w:left="0" w:right="0" w:firstLine="0" w:firstLineChars="0" w:hanging="0" w:hangingChars="0"/>
       </w:pPr>
       <w:r>
@@ -17354,7 +17289,6 @@
       <w:pPr>
         <w:spacing w:line="480" w:lineRule="auto" w:before="240" w:after="0"/>
         <w:jc w:val="left"/>
-        <w:keepNext/>
         <w:ind w:left="0" w:right="0" w:firstLine="0" w:firstLineChars="0" w:hanging="0" w:hangingChars="0"/>
       </w:pPr>
       <w:r>
@@ -17392,7 +17326,6 @@
       <w:pPr>
         <w:spacing w:line="480" w:lineRule="auto" w:before="240" w:after="0"/>
         <w:jc w:val="left"/>
-        <w:keepNext/>
         <w:ind w:left="0" w:right="0" w:firstLine="0" w:firstLineChars="0" w:hanging="0" w:hangingChars="0"/>
       </w:pPr>
       <w:r>
@@ -17431,21 +17364,9 @@
         <w:spacing w:after="0" w:before="0" w:line="480" w:lineRule="auto"/>
         <w:jc w:val="both"/>
         <w:rPr/>
-        <w:sectPr>
-          <w:headerReference r:id="rId21" w:type="default"/>
-          <w:headerReference r:id="rId22" w:type="first"/>
-          <w:footerReference r:id="rId23" w:type="default"/>
-          <w:footerReference r:id="rId24" w:type="first"/>
-          <w:type w:val="nextPage"/>
-          <w:pgSz w:h="16838" w:w="11906" w:orient="portrait"/>
-          <w:pgMar w:bottom="1440" w:top="1440" w:left="2160" w:right="1440" w:header="720" w:footer="720"/>
-          <w:titlePg w:val="1"/>
-        </w:sectPr>
         <w:ind w:left="0" w:right="0" w:firstLine="0" w:firstLineChars="0" w:hanging="0" w:hangingChars="0"/>
       </w:pPr>
-      <w:r>
-        <w:br w:type="page"/>
-      </w:r>
+      <w:r/>
       <w:r>
         <w:rPr>
           <w:rtl w:val="0"/>
@@ -17542,7 +17463,6 @@
           <w:sz w:val="24"/>
           <w:szCs w:val="24"/>
         </w:rPr>
-        <w:keepNext/>
         <w:ind w:left="0" w:right="0" w:firstLine="0" w:firstLineChars="0" w:hanging="0" w:hangingChars="0"/>
       </w:pPr>
       <w:r>
@@ -17637,7 +17557,6 @@
           <w:sz w:val="24"/>
           <w:szCs w:val="24"/>
         </w:rPr>
-        <w:keepNext/>
         <w:ind w:left="0" w:right="0" w:firstLine="0" w:firstLineChars="0" w:hanging="0" w:hangingChars="0"/>
       </w:pPr>
       <w:r>
@@ -17778,16 +17697,6 @@
         <w:spacing w:after="0" w:before="0" w:line="480" w:lineRule="auto"/>
         <w:jc w:val="both"/>
         <w:rPr/>
-        <w:sectPr>
-          <w:headerReference r:id="rId25" w:type="default"/>
-          <w:headerReference r:id="rId26" w:type="first"/>
-          <w:footerReference r:id="rId27" w:type="default"/>
-          <w:footerReference r:id="rId28" w:type="first"/>
-          <w:type w:val="nextPage"/>
-          <w:pgSz w:h="16838" w:w="11906" w:orient="portrait"/>
-          <w:pgMar w:bottom="1440" w:top="1440" w:left="2160" w:right="1440" w:header="720" w:footer="720"/>
-          <w:titlePg w:val="1"/>
-        </w:sectPr>
         <w:ind w:firstLine="720" w:left="0"/>
       </w:pPr>
       <w:r>
@@ -19181,16 +19090,6 @@
         <w:spacing w:after="0" w:before="0" w:line="480" w:lineRule="auto"/>
         <w:jc w:val="both"/>
         <w:rPr/>
-        <w:sectPr>
-          <w:headerReference r:id="rId51" w:type="default"/>
-          <w:headerReference r:id="rId52" w:type="first"/>
-          <w:footerReference r:id="rId53" w:type="default"/>
-          <w:footerReference r:id="rId54" w:type="first"/>
-          <w:type w:val="nextPage"/>
-          <w:pgSz w:h="16838" w:w="11906" w:orient="portrait"/>
-          <w:pgMar w:bottom="1440" w:top="1440" w:left="2160" w:right="1440" w:header="720" w:footer="720"/>
-          <w:titlePg w:val="1"/>
-        </w:sectPr>
         <w:ind w:left="720" w:hanging="720"/>
       </w:pPr>
       <w:r>

</xml_diff>

<commit_message>
Draft_124_body: keepNext on every minor header
Subsections and thematic titles stay with the following body
paragraph. Body text left without keep chains.
</commit_message>
<xml_diff>
--- a/thesis/003_ThesisProposal_Draft_124_body.docx
+++ b/thesis/003_ThesisProposal_Draft_124_body.docx
@@ -643,6 +643,7 @@
           <w:szCs w:val="24"/>
         </w:rPr>
         <w:ind w:left="0" w:right="0" w:firstLine="0" w:firstLineChars="0" w:hanging="0" w:hangingChars="0"/>
+        <w:keepNext/>
       </w:pPr>
       <w:r>
         <w:rPr>
@@ -781,6 +782,7 @@
           <w:szCs w:val="24"/>
         </w:rPr>
         <w:ind w:left="0" w:right="0" w:firstLine="0" w:firstLineChars="0" w:hanging="0" w:hangingChars="0"/>
+        <w:keepNext/>
       </w:pPr>
       <w:r>
         <w:rPr>
@@ -915,6 +917,7 @@
           <w:szCs w:val="24"/>
         </w:rPr>
         <w:ind w:left="0" w:right="0" w:firstLine="0" w:firstLineChars="0" w:hanging="0" w:hangingChars="0"/>
+        <w:keepNext/>
       </w:pPr>
       <w:r>
         <w:rPr>
@@ -1166,6 +1169,7 @@
           <w:szCs w:val="24"/>
         </w:rPr>
         <w:ind w:left="0" w:right="0" w:firstLine="0" w:firstLineChars="0" w:hanging="0" w:hangingChars="0"/>
+        <w:keepNext/>
       </w:pPr>
       <w:r>
         <w:rPr>
@@ -1309,6 +1313,7 @@
           <w:szCs w:val="24"/>
         </w:rPr>
         <w:ind w:left="0" w:right="0" w:firstLine="0" w:firstLineChars="0" w:hanging="0" w:hangingChars="0"/>
+        <w:keepNext/>
       </w:pPr>
       <w:r>
         <w:rPr>
@@ -1439,6 +1444,7 @@
           <w:szCs w:val="24"/>
         </w:rPr>
         <w:ind w:left="0" w:right="0" w:firstLine="0" w:firstLineChars="0" w:hanging="0" w:hangingChars="0"/>
+        <w:keepNext/>
       </w:pPr>
       <w:r>
         <w:rPr>
@@ -1714,6 +1720,7 @@
           <w:szCs w:val="24"/>
         </w:rPr>
         <w:ind w:left="0" w:right="0" w:firstLine="0" w:firstLineChars="0" w:hanging="0" w:hangingChars="0"/>
+        <w:keepNext/>
       </w:pPr>
       <w:r>
         <w:rPr>
@@ -1869,6 +1876,7 @@
           <w:szCs w:val="24"/>
         </w:rPr>
         <w:ind w:left="0" w:right="0" w:firstLine="0" w:firstLineChars="0" w:hanging="0" w:hangingChars="0"/>
+        <w:keepNext/>
       </w:pPr>
       <w:r>
         <w:rPr>
@@ -2072,6 +2080,7 @@
           <w:szCs w:val="24"/>
         </w:rPr>
         <w:ind w:left="0" w:right="0" w:firstLine="0" w:firstLineChars="0" w:hanging="0" w:hangingChars="0"/>
+        <w:keepNext/>
       </w:pPr>
       <w:r>
         <w:rPr>
@@ -2227,6 +2236,7 @@
           <w:szCs w:val="24"/>
         </w:rPr>
         <w:ind w:left="0" w:right="0" w:firstLine="0" w:firstLineChars="0" w:hanging="0" w:hangingChars="0"/>
+        <w:keepNext/>
       </w:pPr>
       <w:r>
         <w:rPr>
@@ -2412,6 +2422,7 @@
           <w:szCs w:val="24"/>
         </w:rPr>
         <w:ind w:left="0" w:right="0" w:firstLine="0" w:firstLineChars="0" w:hanging="0" w:hangingChars="0"/>
+        <w:keepNext/>
       </w:pPr>
       <w:r>
         <w:rPr>
@@ -3075,6 +3086,7 @@
           <w:szCs w:val="24"/>
         </w:rPr>
         <w:ind w:left="0" w:right="0" w:firstLine="0" w:firstLineChars="0" w:hanging="0" w:hangingChars="0"/>
+        <w:keepNext/>
       </w:pPr>
       <w:r>
         <w:rPr>
@@ -3170,6 +3182,7 @@
           <w:szCs w:val="24"/>
         </w:rPr>
         <w:ind w:left="0" w:right="0" w:firstLine="0" w:firstLineChars="0" w:hanging="0" w:hangingChars="0"/>
+        <w:keepNext/>
       </w:pPr>
       <w:r>
         <w:rPr>
@@ -3225,6 +3238,7 @@
           <w:szCs w:val="24"/>
         </w:rPr>
         <w:ind w:left="0" w:right="0" w:firstLine="0" w:firstLineChars="0" w:hanging="0" w:hangingChars="0"/>
+        <w:keepNext/>
       </w:pPr>
       <w:r>
         <w:rPr>
@@ -4152,6 +4166,7 @@
           <w:szCs w:val="24"/>
         </w:rPr>
         <w:ind w:left="0" w:right="0" w:firstLine="0" w:firstLineChars="0" w:hanging="0" w:hangingChars="0"/>
+        <w:keepNext/>
       </w:pPr>
       <w:r>
         <w:rPr>
@@ -5094,6 +5109,7 @@
           <w:szCs w:val="24"/>
         </w:rPr>
         <w:ind w:left="0" w:right="0" w:firstLine="0" w:firstLineChars="0" w:hanging="0" w:hangingChars="0"/>
+        <w:keepNext/>
       </w:pPr>
       <w:r>
         <w:rPr>
@@ -5152,6 +5168,7 @@
         <w:jc w:val="left"/>
         <w:rPr/>
         <w:ind w:left="0" w:right="0" w:firstLine="0" w:firstLineChars="0" w:hanging="0" w:hangingChars="0"/>
+        <w:keepNext/>
       </w:pPr>
       <w:r>
         <w:rPr>
@@ -5255,6 +5272,7 @@
         <w:jc w:val="left"/>
         <w:rPr/>
         <w:ind w:left="0" w:right="0" w:firstLine="0" w:firstLineChars="0" w:hanging="0" w:hangingChars="0"/>
+        <w:keepNext/>
       </w:pPr>
       <w:r>
         <w:rPr>
@@ -7191,6 +7209,7 @@
         <w:jc w:val="left"/>
         <w:rPr/>
         <w:ind w:left="0" w:right="0" w:firstLine="0" w:firstLineChars="0" w:hanging="0" w:hangingChars="0"/>
+        <w:keepNext/>
       </w:pPr>
       <w:r>
         <w:rPr>
@@ -9641,6 +9660,7 @@
           <w:szCs w:val="24"/>
         </w:rPr>
         <w:ind w:left="0" w:right="0" w:firstLine="0" w:firstLineChars="0" w:hanging="0" w:hangingChars="0"/>
+        <w:keepNext/>
       </w:pPr>
       <w:r>
         <w:rPr>
@@ -11921,6 +11941,7 @@
           <w:szCs w:val="24"/>
         </w:rPr>
         <w:ind w:left="0" w:right="0" w:firstLine="0" w:firstLineChars="0" w:hanging="0" w:hangingChars="0"/>
+        <w:keepNext/>
       </w:pPr>
       <w:r>
         <w:rPr>
@@ -11952,6 +11973,7 @@
         <w:spacing w:line="480" w:lineRule="auto" w:before="240" w:after="0"/>
         <w:jc w:val="left"/>
         <w:ind w:left="0" w:right="0" w:firstLine="0" w:firstLineChars="0" w:hanging="0" w:hangingChars="0"/>
+        <w:keepNext/>
       </w:pPr>
       <w:r>
         <w:rPr>
@@ -12602,6 +12624,7 @@
         <w:spacing w:line="480" w:lineRule="auto" w:before="240" w:after="0"/>
         <w:jc w:val="left"/>
         <w:ind w:left="0" w:right="0" w:firstLine="0" w:firstLineChars="0" w:hanging="0" w:hangingChars="0"/>
+        <w:keepNext/>
       </w:pPr>
       <w:r>
         <w:rPr>
@@ -14681,6 +14704,7 @@
           <w:szCs w:val="24"/>
         </w:rPr>
         <w:ind w:left="0" w:right="0" w:firstLine="0" w:firstLineChars="0" w:hanging="0" w:hangingChars="0"/>
+        <w:keepNext/>
       </w:pPr>
       <w:r>
         <w:rPr>
@@ -14731,6 +14755,7 @@
         <w:spacing w:line="480" w:lineRule="auto" w:before="240" w:after="0"/>
         <w:jc w:val="left"/>
         <w:ind w:left="0" w:right="0" w:firstLine="0" w:firstLineChars="0" w:hanging="0" w:hangingChars="0"/>
+        <w:keepNext/>
       </w:pPr>
       <w:r>
         <w:rPr>
@@ -16122,6 +16147,7 @@
         <w:spacing w:line="480" w:lineRule="auto" w:before="240" w:after="0"/>
         <w:jc w:val="left"/>
         <w:ind w:left="0" w:right="0" w:firstLine="0" w:firstLineChars="0" w:hanging="0" w:hangingChars="0"/>
+        <w:keepNext/>
       </w:pPr>
       <w:r>
         <w:rPr>
@@ -17290,6 +17316,7 @@
         <w:spacing w:line="480" w:lineRule="auto" w:before="240" w:after="0"/>
         <w:jc w:val="left"/>
         <w:ind w:left="0" w:right="0" w:firstLine="0" w:firstLineChars="0" w:hanging="0" w:hangingChars="0"/>
+        <w:keepNext/>
       </w:pPr>
       <w:r>
         <w:rPr>
@@ -17327,6 +17354,7 @@
         <w:spacing w:line="480" w:lineRule="auto" w:before="240" w:after="0"/>
         <w:jc w:val="left"/>
         <w:ind w:left="0" w:right="0" w:firstLine="0" w:firstLineChars="0" w:hanging="0" w:hangingChars="0"/>
+        <w:keepNext/>
       </w:pPr>
       <w:r>
         <w:rPr>
@@ -17464,6 +17492,7 @@
           <w:szCs w:val="24"/>
         </w:rPr>
         <w:ind w:left="0" w:right="0" w:firstLine="0" w:firstLineChars="0" w:hanging="0" w:hangingChars="0"/>
+        <w:keepNext/>
       </w:pPr>
       <w:r>
         <w:rPr>
@@ -17558,6 +17587,7 @@
           <w:szCs w:val="24"/>
         </w:rPr>
         <w:ind w:left="0" w:right="0" w:firstLine="0" w:firstLineChars="0" w:hanging="0" w:hangingChars="0"/>
+        <w:keepNext/>
       </w:pPr>
       <w:r>
         <w:rPr>

</xml_diff>

<commit_message>
Draft_124_body: reinforce keepNext on all minor headers
keepNext + keepLines via XML and paragraph_format so headers
cannot sit alone without following text.
</commit_message>
<xml_diff>
--- a/thesis/003_ThesisProposal_Draft_124_body.docx
+++ b/thesis/003_ThesisProposal_Draft_124_body.docx
@@ -644,6 +644,7 @@
         </w:rPr>
         <w:ind w:left="0" w:right="0" w:firstLine="0" w:firstLineChars="0" w:hanging="0" w:hangingChars="0"/>
         <w:keepNext/>
+        <w:keepLines/>
       </w:pPr>
       <w:r>
         <w:rPr>
@@ -783,6 +784,7 @@
         </w:rPr>
         <w:ind w:left="0" w:right="0" w:firstLine="0" w:firstLineChars="0" w:hanging="0" w:hangingChars="0"/>
         <w:keepNext/>
+        <w:keepLines/>
       </w:pPr>
       <w:r>
         <w:rPr>
@@ -918,6 +920,7 @@
         </w:rPr>
         <w:ind w:left="0" w:right="0" w:firstLine="0" w:firstLineChars="0" w:hanging="0" w:hangingChars="0"/>
         <w:keepNext/>
+        <w:keepLines/>
       </w:pPr>
       <w:r>
         <w:rPr>
@@ -1170,6 +1173,7 @@
         </w:rPr>
         <w:ind w:left="0" w:right="0" w:firstLine="0" w:firstLineChars="0" w:hanging="0" w:hangingChars="0"/>
         <w:keepNext/>
+        <w:keepLines/>
       </w:pPr>
       <w:r>
         <w:rPr>
@@ -1314,6 +1318,7 @@
         </w:rPr>
         <w:ind w:left="0" w:right="0" w:firstLine="0" w:firstLineChars="0" w:hanging="0" w:hangingChars="0"/>
         <w:keepNext/>
+        <w:keepLines/>
       </w:pPr>
       <w:r>
         <w:rPr>
@@ -1445,6 +1450,7 @@
         </w:rPr>
         <w:ind w:left="0" w:right="0" w:firstLine="0" w:firstLineChars="0" w:hanging="0" w:hangingChars="0"/>
         <w:keepNext/>
+        <w:keepLines/>
       </w:pPr>
       <w:r>
         <w:rPr>
@@ -1721,6 +1727,7 @@
         </w:rPr>
         <w:ind w:left="0" w:right="0" w:firstLine="0" w:firstLineChars="0" w:hanging="0" w:hangingChars="0"/>
         <w:keepNext/>
+        <w:keepLines/>
       </w:pPr>
       <w:r>
         <w:rPr>
@@ -1877,6 +1884,7 @@
         </w:rPr>
         <w:ind w:left="0" w:right="0" w:firstLine="0" w:firstLineChars="0" w:hanging="0" w:hangingChars="0"/>
         <w:keepNext/>
+        <w:keepLines/>
       </w:pPr>
       <w:r>
         <w:rPr>
@@ -2081,6 +2089,7 @@
         </w:rPr>
         <w:ind w:left="0" w:right="0" w:firstLine="0" w:firstLineChars="0" w:hanging="0" w:hangingChars="0"/>
         <w:keepNext/>
+        <w:keepLines/>
       </w:pPr>
       <w:r>
         <w:rPr>
@@ -2237,6 +2246,7 @@
         </w:rPr>
         <w:ind w:left="0" w:right="0" w:firstLine="0" w:firstLineChars="0" w:hanging="0" w:hangingChars="0"/>
         <w:keepNext/>
+        <w:keepLines/>
       </w:pPr>
       <w:r>
         <w:rPr>
@@ -2423,6 +2433,7 @@
         </w:rPr>
         <w:ind w:left="0" w:right="0" w:firstLine="0" w:firstLineChars="0" w:hanging="0" w:hangingChars="0"/>
         <w:keepNext/>
+        <w:keepLines/>
       </w:pPr>
       <w:r>
         <w:rPr>
@@ -3087,6 +3098,7 @@
         </w:rPr>
         <w:ind w:left="0" w:right="0" w:firstLine="0" w:firstLineChars="0" w:hanging="0" w:hangingChars="0"/>
         <w:keepNext/>
+        <w:keepLines/>
       </w:pPr>
       <w:r>
         <w:rPr>
@@ -3183,6 +3195,7 @@
         </w:rPr>
         <w:ind w:left="0" w:right="0" w:firstLine="0" w:firstLineChars="0" w:hanging="0" w:hangingChars="0"/>
         <w:keepNext/>
+        <w:keepLines/>
       </w:pPr>
       <w:r>
         <w:rPr>
@@ -3239,6 +3252,7 @@
         </w:rPr>
         <w:ind w:left="0" w:right="0" w:firstLine="0" w:firstLineChars="0" w:hanging="0" w:hangingChars="0"/>
         <w:keepNext/>
+        <w:keepLines/>
       </w:pPr>
       <w:r>
         <w:rPr>
@@ -4167,6 +4181,7 @@
         </w:rPr>
         <w:ind w:left="0" w:right="0" w:firstLine="0" w:firstLineChars="0" w:hanging="0" w:hangingChars="0"/>
         <w:keepNext/>
+        <w:keepLines/>
       </w:pPr>
       <w:r>
         <w:rPr>
@@ -5110,6 +5125,7 @@
         </w:rPr>
         <w:ind w:left="0" w:right="0" w:firstLine="0" w:firstLineChars="0" w:hanging="0" w:hangingChars="0"/>
         <w:keepNext/>
+        <w:keepLines/>
       </w:pPr>
       <w:r>
         <w:rPr>
@@ -5169,6 +5185,7 @@
         <w:rPr/>
         <w:ind w:left="0" w:right="0" w:firstLine="0" w:firstLineChars="0" w:hanging="0" w:hangingChars="0"/>
         <w:keepNext/>
+        <w:keepLines/>
       </w:pPr>
       <w:r>
         <w:rPr>
@@ -5273,6 +5290,7 @@
         <w:rPr/>
         <w:ind w:left="0" w:right="0" w:firstLine="0" w:firstLineChars="0" w:hanging="0" w:hangingChars="0"/>
         <w:keepNext/>
+        <w:keepLines/>
       </w:pPr>
       <w:r>
         <w:rPr>
@@ -7210,6 +7228,7 @@
         <w:rPr/>
         <w:ind w:left="0" w:right="0" w:firstLine="0" w:firstLineChars="0" w:hanging="0" w:hangingChars="0"/>
         <w:keepNext/>
+        <w:keepLines/>
       </w:pPr>
       <w:r>
         <w:rPr>
@@ -9661,6 +9680,7 @@
         </w:rPr>
         <w:ind w:left="0" w:right="0" w:firstLine="0" w:firstLineChars="0" w:hanging="0" w:hangingChars="0"/>
         <w:keepNext/>
+        <w:keepLines/>
       </w:pPr>
       <w:r>
         <w:rPr>
@@ -11942,6 +11962,7 @@
         </w:rPr>
         <w:ind w:left="0" w:right="0" w:firstLine="0" w:firstLineChars="0" w:hanging="0" w:hangingChars="0"/>
         <w:keepNext/>
+        <w:keepLines/>
       </w:pPr>
       <w:r>
         <w:rPr>
@@ -11974,6 +11995,7 @@
         <w:jc w:val="left"/>
         <w:ind w:left="0" w:right="0" w:firstLine="0" w:firstLineChars="0" w:hanging="0" w:hangingChars="0"/>
         <w:keepNext/>
+        <w:keepLines/>
       </w:pPr>
       <w:r>
         <w:rPr>
@@ -12625,6 +12647,7 @@
         <w:jc w:val="left"/>
         <w:ind w:left="0" w:right="0" w:firstLine="0" w:firstLineChars="0" w:hanging="0" w:hangingChars="0"/>
         <w:keepNext/>
+        <w:keepLines/>
       </w:pPr>
       <w:r>
         <w:rPr>
@@ -14705,6 +14728,7 @@
         </w:rPr>
         <w:ind w:left="0" w:right="0" w:firstLine="0" w:firstLineChars="0" w:hanging="0" w:hangingChars="0"/>
         <w:keepNext/>
+        <w:keepLines/>
       </w:pPr>
       <w:r>
         <w:rPr>
@@ -14756,6 +14780,7 @@
         <w:jc w:val="left"/>
         <w:ind w:left="0" w:right="0" w:firstLine="0" w:firstLineChars="0" w:hanging="0" w:hangingChars="0"/>
         <w:keepNext/>
+        <w:keepLines/>
       </w:pPr>
       <w:r>
         <w:rPr>
@@ -16148,6 +16173,7 @@
         <w:jc w:val="left"/>
         <w:ind w:left="0" w:right="0" w:firstLine="0" w:firstLineChars="0" w:hanging="0" w:hangingChars="0"/>
         <w:keepNext/>
+        <w:keepLines/>
       </w:pPr>
       <w:r>
         <w:rPr>
@@ -17317,6 +17343,7 @@
         <w:jc w:val="left"/>
         <w:ind w:left="0" w:right="0" w:firstLine="0" w:firstLineChars="0" w:hanging="0" w:hangingChars="0"/>
         <w:keepNext/>
+        <w:keepLines/>
       </w:pPr>
       <w:r>
         <w:rPr>
@@ -17355,6 +17382,7 @@
         <w:jc w:val="left"/>
         <w:ind w:left="0" w:right="0" w:firstLine="0" w:firstLineChars="0" w:hanging="0" w:hangingChars="0"/>
         <w:keepNext/>
+        <w:keepLines/>
       </w:pPr>
       <w:r>
         <w:rPr>
@@ -17493,6 +17521,7 @@
         </w:rPr>
         <w:ind w:left="0" w:right="0" w:firstLine="0" w:firstLineChars="0" w:hanging="0" w:hangingChars="0"/>
         <w:keepNext/>
+        <w:keepLines/>
       </w:pPr>
       <w:r>
         <w:rPr>
@@ -17588,6 +17617,7 @@
         </w:rPr>
         <w:ind w:left="0" w:right="0" w:firstLine="0" w:firstLineChars="0" w:hanging="0" w:hangingChars="0"/>
         <w:keepNext/>
+        <w:keepLines/>
       </w:pPr>
       <w:r>
         <w:rPr>

</xml_diff>

<commit_message>
Draft_124_body: uniform 3-space before/after all major headers
before=720 after=720 on every major heading.
</commit_message>
<xml_diff>
--- a/thesis/003_ThesisProposal_Draft_124_body.docx
+++ b/thesis/003_ThesisProposal_Draft_124_body.docx
@@ -598,10 +598,10 @@
           <w:sz w:val="28"/>
           <w:szCs w:val="28"/>
           <w:rtl w:val="0"/>
+          <w:i w:val="0"/>
+          <w:iCs w:val="0"/>
           <w:b w:val="1"/>
           <w:bCs w:val="1"/>
-          <w:i w:val="0"/>
-          <w:iCs w:val="0"/>
         </w:rPr>
         <w:t xml:space="preserve">INTRODUCTION</w:t>
       </w:r>
@@ -610,10 +610,10 @@
           <w:rFonts w:ascii="Georgia" w:hAnsi="Georgia" w:cs="Georgia" w:eastAsia="Georgia"/>
           <w:sz w:val="28"/>
           <w:rtl w:val="0"/>
+          <w:i w:val="0"/>
+          <w:iCs w:val="0"/>
           <w:b w:val="1"/>
           <w:bCs w:val="1"/>
-          <w:i w:val="0"/>
-          <w:iCs w:val="0"/>
         </w:rPr>
       </w:r>
     </w:p>
@@ -3036,10 +3036,10 @@
           <w:sz w:val="28"/>
           <w:szCs w:val="28"/>
           <w:rtl w:val="0"/>
+          <w:i w:val="0"/>
+          <w:iCs w:val="0"/>
           <w:b w:val="1"/>
           <w:bCs w:val="1"/>
-          <w:i w:val="0"/>
-          <w:iCs w:val="0"/>
         </w:rPr>
         <w:t xml:space="preserve">METHODOLOGY</w:t>
       </w:r>
@@ -3048,10 +3048,10 @@
           <w:rFonts w:ascii="Georgia" w:hAnsi="Georgia" w:cs="Georgia" w:eastAsia="Georgia"/>
           <w:sz w:val="28"/>
           <w:rtl w:val="0"/>
+          <w:i w:val="0"/>
+          <w:iCs w:val="0"/>
           <w:b w:val="1"/>
           <w:bCs w:val="1"/>
-          <w:i w:val="0"/>
-          <w:iCs w:val="0"/>
         </w:rPr>
       </w:r>
     </w:p>
@@ -5435,10 +5435,10 @@
           <w:sz w:val="28"/>
           <w:szCs w:val="28"/>
           <w:rtl w:val="0"/>
+          <w:i w:val="0"/>
+          <w:iCs w:val="0"/>
           <w:b w:val="1"/>
           <w:bCs w:val="1"/>
-          <w:i w:val="0"/>
-          <w:iCs w:val="0"/>
         </w:rPr>
         <w:t xml:space="preserve">RESULTS, ANALYSIS, AND DISCUSSION</w:t>
       </w:r>
@@ -5447,10 +5447,10 @@
           <w:rFonts w:ascii="Georgia" w:hAnsi="Georgia" w:cs="Georgia" w:eastAsia="Georgia"/>
           <w:sz w:val="28"/>
           <w:rtl w:val="0"/>
+          <w:i w:val="0"/>
+          <w:iCs w:val="0"/>
           <w:b w:val="1"/>
           <w:bCs w:val="1"/>
-          <w:i w:val="0"/>
-          <w:iCs w:val="0"/>
         </w:rPr>
       </w:r>
     </w:p>
@@ -17446,10 +17446,10 @@
           <w:sz w:val="28"/>
           <w:szCs w:val="28"/>
           <w:rtl w:val="0"/>
+          <w:i w:val="0"/>
+          <w:iCs w:val="0"/>
           <w:b w:val="1"/>
           <w:bCs w:val="1"/>
-          <w:i w:val="0"/>
-          <w:iCs w:val="0"/>
         </w:rPr>
         <w:t xml:space="preserve">CONCLUSIONS AND RECOMMENDATIONS</w:t>
       </w:r>
@@ -17458,10 +17458,10 @@
           <w:rFonts w:ascii="Georgia" w:hAnsi="Georgia" w:cs="Georgia" w:eastAsia="Georgia"/>
           <w:sz w:val="28"/>
           <w:rtl w:val="0"/>
+          <w:i w:val="0"/>
+          <w:iCs w:val="0"/>
           <w:b w:val="1"/>
           <w:bCs w:val="1"/>
-          <w:i w:val="0"/>
-          <w:iCs w:val="0"/>
         </w:rPr>
       </w:r>
     </w:p>
@@ -17789,10 +17789,10 @@
           <w:sz w:val="28"/>
           <w:szCs w:val="28"/>
           <w:rtl w:val="0"/>
+          <w:i w:val="0"/>
+          <w:iCs w:val="0"/>
           <w:b w:val="1"/>
           <w:bCs w:val="1"/>
-          <w:i w:val="0"/>
-          <w:iCs w:val="0"/>
         </w:rPr>
         <w:t xml:space="preserve">REFERENCES</w:t>
       </w:r>
@@ -17801,10 +17801,10 @@
           <w:rFonts w:ascii="Georgia" w:hAnsi="Georgia" w:cs="Georgia" w:eastAsia="Georgia"/>
           <w:sz w:val="28"/>
           <w:rtl w:val="0"/>
+          <w:i w:val="0"/>
+          <w:iCs w:val="0"/>
           <w:b w:val="1"/>
           <w:bCs w:val="1"/>
-          <w:i w:val="0"/>
-          <w:iCs w:val="0"/>
         </w:rPr>
       </w:r>
     </w:p>

</xml_diff>

<commit_message>
Draft_124_body: section breaks only before major headers
Remove pageBreakBefore from majors. Next-page section break
on the prior paragraph so space-before shows like INTRODUCTION.
</commit_message>
<xml_diff>
--- a/thesis/003_ThesisProposal_Draft_124_body.docx
+++ b/thesis/003_ThesisProposal_Draft_124_body.docx
@@ -555,18 +555,17 @@
         <w:spacing w:after="0" w:before="0" w:line="360" w:lineRule="auto"/>
         <w:jc w:val="center"/>
         <w:rPr/>
+        <w:ind w:left="0" w:right="0" w:firstLine="0" w:firstLineChars="0" w:hanging="0" w:hangingChars="0"/>
         <w:sectPr>
-          <w:headerReference r:id="rId6" w:type="default"/>
-          <w:headerReference r:id="rId7" w:type="first"/>
-          <w:headerReference r:id="rId8" w:type="even"/>
-          <w:footerReference r:id="rId9" w:type="default"/>
-          <w:footerReference r:id="rId10" w:type="first"/>
-          <w:footerReference r:id="rId11" w:type="even"/>
+          <w:headerReference r:id="rId59" w:type="default"/>
+          <w:headerReference r:id="rId60" w:type="first"/>
+          <w:footerReference r:id="rId61" w:type="default"/>
+          <w:footerReference r:id="rId62" w:type="first"/>
+          <w:type w:val="nextPage"/>
           <w:pgSz w:h="16838" w:w="11906" w:orient="portrait"/>
           <w:pgMar w:bottom="1440" w:top="1440" w:left="2160" w:right="1440" w:header="720" w:footer="720"/>
-          <w:pgNumType w:start="1"/>
+          <w:titlePg w:val="1"/>
         </w:sectPr>
-        <w:ind w:left="0" w:right="0" w:firstLine="0" w:firstLineChars="0" w:hanging="0" w:hangingChars="0"/>
       </w:pPr>
       <w:r>
         <w:rPr>
@@ -583,7 +582,6 @@
     </w:p>
     <w:p>
       <w:pPr>
-        <w:pageBreakBefore/>
         <w:spacing w:after="720" w:before="720" w:line="480" w:lineRule="auto"/>
         <w:jc w:val="center"/>
         <w:rPr>
@@ -600,7 +598,7 @@
           <w:rtl w:val="0"/>
           <w:i w:val="0"/>
           <w:iCs w:val="0"/>
-          <w:b w:val="1"/>
+          <w:b/>
           <w:bCs w:val="1"/>
         </w:rPr>
         <w:t xml:space="preserve">INTRODUCTION</w:t>
@@ -2995,6 +2993,16 @@
         <w:jc w:val="both"/>
         <w:spacing w:before="0" w:after="0" w:line="480" w:lineRule="auto"/>
         <w:ind w:firstLine="720" w:left="0"/>
+        <w:sectPr>
+          <w:headerReference r:id="rId59" w:type="default"/>
+          <w:headerReference r:id="rId60" w:type="first"/>
+          <w:footerReference r:id="rId61" w:type="default"/>
+          <w:footerReference r:id="rId62" w:type="first"/>
+          <w:type w:val="nextPage"/>
+          <w:pgSz w:h="16838" w:w="11906" w:orient="portrait"/>
+          <w:pgMar w:bottom="1440" w:top="1440" w:left="2160" w:right="1440" w:header="720" w:footer="720"/>
+          <w:titlePg w:val="1"/>
+        </w:sectPr>
       </w:pPr>
       <w:r>
         <w:rPr>
@@ -3021,7 +3029,6 @@
     </w:p>
     <w:p>
       <w:pPr>
-        <w:pageBreakBefore/>
         <w:spacing w:after="720" w:before="720" w:line="480" w:lineRule="auto"/>
         <w:jc w:val="center"/>
         <w:rPr>
@@ -3038,7 +3045,7 @@
           <w:rtl w:val="0"/>
           <w:i w:val="0"/>
           <w:iCs w:val="0"/>
-          <w:b w:val="1"/>
+          <w:b/>
           <w:bCs w:val="1"/>
         </w:rPr>
         <w:t xml:space="preserve">METHODOLOGY</w:t>
@@ -5394,6 +5401,16 @@
         <w:jc w:val="both"/>
         <w:rPr/>
         <w:ind w:firstLine="720" w:left="0"/>
+        <w:sectPr>
+          <w:headerReference r:id="rId59" w:type="default"/>
+          <w:headerReference r:id="rId60" w:type="first"/>
+          <w:footerReference r:id="rId61" w:type="default"/>
+          <w:footerReference r:id="rId62" w:type="first"/>
+          <w:type w:val="nextPage"/>
+          <w:pgSz w:h="16838" w:w="11906" w:orient="portrait"/>
+          <w:pgMar w:bottom="1440" w:top="1440" w:left="2160" w:right="1440" w:header="720" w:footer="720"/>
+          <w:titlePg w:val="1"/>
+        </w:sectPr>
       </w:pPr>
       <w:r>
         <w:rPr>
@@ -5420,7 +5437,6 @@
     </w:p>
     <w:p>
       <w:pPr>
-        <w:pageBreakBefore/>
         <w:spacing w:after="720" w:before="720" w:line="480" w:lineRule="auto"/>
         <w:jc w:val="center"/>
         <w:rPr>
@@ -5437,7 +5453,7 @@
           <w:rtl w:val="0"/>
           <w:i w:val="0"/>
           <w:iCs w:val="0"/>
-          <w:b w:val="1"/>
+          <w:b/>
           <w:bCs w:val="1"/>
         </w:rPr>
         <w:t xml:space="preserve">RESULTS, ANALYSIS, AND DISCUSSION</w:t>
@@ -17421,6 +17437,16 @@
         <w:jc w:val="both"/>
         <w:rPr/>
         <w:ind w:left="0" w:right="0" w:firstLine="0" w:firstLineChars="0" w:hanging="0" w:hangingChars="0"/>
+        <w:sectPr>
+          <w:headerReference r:id="rId59" w:type="default"/>
+          <w:headerReference r:id="rId60" w:type="first"/>
+          <w:footerReference r:id="rId61" w:type="default"/>
+          <w:footerReference r:id="rId62" w:type="first"/>
+          <w:type w:val="nextPage"/>
+          <w:pgSz w:h="16838" w:w="11906" w:orient="portrait"/>
+          <w:pgMar w:bottom="1440" w:top="1440" w:left="2160" w:right="1440" w:header="720" w:footer="720"/>
+          <w:titlePg w:val="1"/>
+        </w:sectPr>
       </w:pPr>
       <w:r/>
       <w:r>
@@ -17431,7 +17457,6 @@
     </w:p>
     <w:p>
       <w:pPr>
-        <w:pageBreakBefore/>
         <w:spacing w:after="720" w:before="720" w:line="480" w:lineRule="auto"/>
         <w:jc w:val="center"/>
         <w:rPr>
@@ -17448,7 +17473,7 @@
           <w:rtl w:val="0"/>
           <w:i w:val="0"/>
           <w:iCs w:val="0"/>
-          <w:b w:val="1"/>
+          <w:b/>
           <w:bCs w:val="1"/>
         </w:rPr>
         <w:t xml:space="preserve">CONCLUSIONS AND RECOMMENDATIONS</w:t>
@@ -17758,6 +17783,16 @@
         <w:jc w:val="both"/>
         <w:rPr/>
         <w:ind w:firstLine="720" w:left="0"/>
+        <w:sectPr>
+          <w:headerReference r:id="rId59" w:type="default"/>
+          <w:headerReference r:id="rId60" w:type="first"/>
+          <w:footerReference r:id="rId61" w:type="default"/>
+          <w:footerReference r:id="rId62" w:type="first"/>
+          <w:type w:val="nextPage"/>
+          <w:pgSz w:h="16838" w:w="11906" w:orient="portrait"/>
+          <w:pgMar w:bottom="1440" w:top="1440" w:left="2160" w:right="1440" w:header="720" w:footer="720"/>
+          <w:titlePg w:val="1"/>
+        </w:sectPr>
       </w:pPr>
       <w:r>
         <w:rPr>
@@ -17774,7 +17809,6 @@
     </w:p>
     <w:p>
       <w:pPr>
-        <w:pageBreakBefore/>
         <w:spacing w:after="720" w:before="720" w:line="480" w:lineRule="auto"/>
         <w:jc w:val="center"/>
         <w:rPr>
@@ -17791,7 +17825,7 @@
           <w:rtl w:val="0"/>
           <w:i w:val="0"/>
           <w:iCs w:val="0"/>
-          <w:b w:val="1"/>
+          <w:b/>
           <w:bCs w:val="1"/>
         </w:rPr>
         <w:t xml:space="preserve">REFERENCES</w:t>

</xml_diff>

<commit_message>
Draft_124_body: vertical center all table cells
Horizontal center alone left text top-aligned. Set vAlign
center on every cell; record in formatting.md.
</commit_message>
<xml_diff>
--- a/thesis/003_ThesisProposal_Draft_124_body.docx
+++ b/thesis/003_ThesisProposal_Draft_124_body.docx
@@ -4306,6 +4306,7 @@
               <w:bottom w:val="single" w:sz="4" w:space="0" w:color="000000"/>
               <w:right w:val="nil"/>
             </w:tcBorders>
+            <w:vAlign w:val="center"/>
           </w:tcPr>
           <w:p>
             <w:pPr>
@@ -4335,6 +4336,7 @@
               <w:bottom w:val="single" w:sz="4" w:space="0" w:color="000000"/>
               <w:right w:val="nil"/>
             </w:tcBorders>
+            <w:vAlign w:val="center"/>
           </w:tcPr>
           <w:p>
             <w:pPr>
@@ -4364,6 +4366,7 @@
               <w:bottom w:val="single" w:sz="4" w:space="0" w:color="000000"/>
               <w:right w:val="nil"/>
             </w:tcBorders>
+            <w:vAlign w:val="center"/>
           </w:tcPr>
           <w:p>
             <w:pPr>
@@ -4398,6 +4401,7 @@
               <w:bottom w:val="nil"/>
               <w:right w:val="nil"/>
             </w:tcBorders>
+            <w:vAlign w:val="center"/>
           </w:tcPr>
           <w:p>
             <w:pPr>
@@ -4427,6 +4431,7 @@
               <w:bottom w:val="nil"/>
               <w:right w:val="nil"/>
             </w:tcBorders>
+            <w:vAlign w:val="center"/>
           </w:tcPr>
           <w:p>
             <w:pPr>
@@ -4456,6 +4461,7 @@
               <w:bottom w:val="nil"/>
               <w:right w:val="nil"/>
             </w:tcBorders>
+            <w:vAlign w:val="center"/>
           </w:tcPr>
           <w:p>
             <w:pPr>
@@ -4490,6 +4496,7 @@
               <w:bottom w:val="nil"/>
               <w:right w:val="nil"/>
             </w:tcBorders>
+            <w:vAlign w:val="center"/>
           </w:tcPr>
           <w:p>
             <w:pPr>
@@ -4519,6 +4526,7 @@
               <w:bottom w:val="nil"/>
               <w:right w:val="nil"/>
             </w:tcBorders>
+            <w:vAlign w:val="center"/>
           </w:tcPr>
           <w:p>
             <w:pPr>
@@ -4548,6 +4556,7 @@
               <w:bottom w:val="nil"/>
               <w:right w:val="nil"/>
             </w:tcBorders>
+            <w:vAlign w:val="center"/>
           </w:tcPr>
           <w:p>
             <w:pPr>
@@ -4582,6 +4591,7 @@
               <w:bottom w:val="nil"/>
               <w:right w:val="nil"/>
             </w:tcBorders>
+            <w:vAlign w:val="center"/>
           </w:tcPr>
           <w:p>
             <w:pPr>
@@ -4611,6 +4621,7 @@
               <w:bottom w:val="nil"/>
               <w:right w:val="nil"/>
             </w:tcBorders>
+            <w:vAlign w:val="center"/>
           </w:tcPr>
           <w:p>
             <w:pPr>
@@ -4640,6 +4651,7 @@
               <w:bottom w:val="nil"/>
               <w:right w:val="nil"/>
             </w:tcBorders>
+            <w:vAlign w:val="center"/>
           </w:tcPr>
           <w:p>
             <w:pPr>
@@ -4674,6 +4686,7 @@
               <w:bottom w:val="nil"/>
               <w:right w:val="nil"/>
             </w:tcBorders>
+            <w:vAlign w:val="center"/>
           </w:tcPr>
           <w:p>
             <w:pPr>
@@ -4703,6 +4716,7 @@
               <w:bottom w:val="nil"/>
               <w:right w:val="nil"/>
             </w:tcBorders>
+            <w:vAlign w:val="center"/>
           </w:tcPr>
           <w:p>
             <w:pPr>
@@ -4732,6 +4746,7 @@
               <w:bottom w:val="nil"/>
               <w:right w:val="nil"/>
             </w:tcBorders>
+            <w:vAlign w:val="center"/>
           </w:tcPr>
           <w:p>
             <w:pPr>
@@ -4766,6 +4781,7 @@
               <w:bottom w:val="nil"/>
               <w:right w:val="nil"/>
             </w:tcBorders>
+            <w:vAlign w:val="center"/>
           </w:tcPr>
           <w:p>
             <w:pPr>
@@ -4795,6 +4811,7 @@
               <w:bottom w:val="nil"/>
               <w:right w:val="nil"/>
             </w:tcBorders>
+            <w:vAlign w:val="center"/>
           </w:tcPr>
           <w:p>
             <w:pPr>
@@ -4824,6 +4841,7 @@
               <w:bottom w:val="nil"/>
               <w:right w:val="nil"/>
             </w:tcBorders>
+            <w:vAlign w:val="center"/>
           </w:tcPr>
           <w:p>
             <w:pPr>
@@ -4858,6 +4876,7 @@
               <w:bottom w:val="nil"/>
               <w:right w:val="nil"/>
             </w:tcBorders>
+            <w:vAlign w:val="center"/>
           </w:tcPr>
           <w:p>
             <w:pPr>
@@ -4887,6 +4906,7 @@
               <w:bottom w:val="nil"/>
               <w:right w:val="nil"/>
             </w:tcBorders>
+            <w:vAlign w:val="center"/>
           </w:tcPr>
           <w:p>
             <w:pPr>
@@ -4916,6 +4936,7 @@
               <w:bottom w:val="nil"/>
               <w:right w:val="nil"/>
             </w:tcBorders>
+            <w:vAlign w:val="center"/>
           </w:tcPr>
           <w:p>
             <w:pPr>
@@ -4950,6 +4971,7 @@
               <w:bottom w:val="nil"/>
               <w:right w:val="nil"/>
             </w:tcBorders>
+            <w:vAlign w:val="center"/>
           </w:tcPr>
           <w:p>
             <w:pPr>
@@ -4979,6 +5001,7 @@
               <w:bottom w:val="nil"/>
               <w:right w:val="nil"/>
             </w:tcBorders>
+            <w:vAlign w:val="center"/>
           </w:tcPr>
           <w:p>
             <w:pPr>
@@ -5008,6 +5031,7 @@
               <w:bottom w:val="nil"/>
               <w:right w:val="nil"/>
             </w:tcBorders>
+            <w:vAlign w:val="center"/>
           </w:tcPr>
           <w:p>
             <w:pPr>
@@ -5042,6 +5066,7 @@
               <w:bottom w:val="single" w:sz="18" w:space="0" w:color="000000"/>
               <w:right w:val="nil"/>
             </w:tcBorders>
+            <w:vAlign w:val="center"/>
           </w:tcPr>
           <w:p>
             <w:pPr>
@@ -5071,6 +5096,7 @@
               <w:bottom w:val="single" w:sz="18" w:space="0" w:color="000000"/>
               <w:right w:val="nil"/>
             </w:tcBorders>
+            <w:vAlign w:val="center"/>
           </w:tcPr>
           <w:p>
             <w:pPr>
@@ -5100,6 +5126,7 @@
               <w:bottom w:val="single" w:sz="18" w:space="0" w:color="000000"/>
               <w:right w:val="nil"/>
             </w:tcBorders>
+            <w:vAlign w:val="center"/>
           </w:tcPr>
           <w:p>
             <w:pPr>
@@ -5590,6 +5617,7 @@
               <w:bottom w:val="single" w:sz="4" w:space="0" w:color="000000"/>
               <w:right w:val="nil"/>
             </w:tcBorders>
+            <w:vAlign w:val="center"/>
           </w:tcPr>
           <w:p>
             <w:pPr>
@@ -5635,6 +5663,7 @@
               <w:bottom w:val="single" w:sz="4" w:space="0" w:color="000000"/>
               <w:right w:val="nil"/>
             </w:tcBorders>
+            <w:vAlign w:val="center"/>
           </w:tcPr>
           <w:p>
             <w:pPr>
@@ -5680,6 +5709,7 @@
               <w:bottom w:val="single" w:sz="4" w:space="0" w:color="000000"/>
               <w:right w:val="nil"/>
             </w:tcBorders>
+            <w:vAlign w:val="center"/>
           </w:tcPr>
           <w:p>
             <w:pPr>
@@ -5725,6 +5755,7 @@
               <w:bottom w:val="single" w:sz="4" w:space="0" w:color="000000"/>
               <w:right w:val="nil"/>
             </w:tcBorders>
+            <w:vAlign w:val="center"/>
           </w:tcPr>
           <w:p>
             <w:pPr>
@@ -5770,6 +5801,7 @@
               <w:bottom w:val="single" w:sz="4" w:space="0" w:color="000000"/>
               <w:right w:val="nil"/>
             </w:tcBorders>
+            <w:vAlign w:val="center"/>
           </w:tcPr>
           <w:p>
             <w:pPr>
@@ -5815,6 +5847,7 @@
               <w:bottom w:val="single" w:sz="4" w:space="0" w:color="000000"/>
               <w:right w:val="nil"/>
             </w:tcBorders>
+            <w:vAlign w:val="center"/>
           </w:tcPr>
           <w:p>
             <w:pPr>
@@ -5865,6 +5898,7 @@
               <w:bottom w:val="nil"/>
               <w:right w:val="nil"/>
             </w:tcBorders>
+            <w:vAlign w:val="center"/>
           </w:tcPr>
           <w:p>
             <w:pPr>
@@ -5910,6 +5944,7 @@
               <w:bottom w:val="nil"/>
               <w:right w:val="nil"/>
             </w:tcBorders>
+            <w:vAlign w:val="center"/>
           </w:tcPr>
           <w:p>
             <w:pPr>
@@ -5955,6 +5990,7 @@
               <w:bottom w:val="nil"/>
               <w:right w:val="nil"/>
             </w:tcBorders>
+            <w:vAlign w:val="center"/>
           </w:tcPr>
           <w:p>
             <w:pPr>
@@ -6000,6 +6036,7 @@
               <w:bottom w:val="nil"/>
               <w:right w:val="nil"/>
             </w:tcBorders>
+            <w:vAlign w:val="center"/>
           </w:tcPr>
           <w:p>
             <w:pPr>
@@ -6045,6 +6082,7 @@
               <w:bottom w:val="nil"/>
               <w:right w:val="nil"/>
             </w:tcBorders>
+            <w:vAlign w:val="center"/>
           </w:tcPr>
           <w:p>
             <w:pPr>
@@ -6090,6 +6128,7 @@
               <w:bottom w:val="nil"/>
               <w:right w:val="nil"/>
             </w:tcBorders>
+            <w:vAlign w:val="center"/>
           </w:tcPr>
           <w:p>
             <w:pPr>
@@ -6140,6 +6179,7 @@
               <w:bottom w:val="nil"/>
               <w:right w:val="nil"/>
             </w:tcBorders>
+            <w:vAlign w:val="center"/>
           </w:tcPr>
           <w:p>
             <w:pPr>
@@ -6174,6 +6214,7 @@
               <w:bottom w:val="nil"/>
               <w:right w:val="nil"/>
             </w:tcBorders>
+            <w:vAlign w:val="center"/>
           </w:tcPr>
           <w:p>
             <w:pPr>
@@ -6219,6 +6260,7 @@
               <w:bottom w:val="nil"/>
               <w:right w:val="nil"/>
             </w:tcBorders>
+            <w:vAlign w:val="center"/>
           </w:tcPr>
           <w:p>
             <w:pPr>
@@ -6264,6 +6306,7 @@
               <w:bottom w:val="nil"/>
               <w:right w:val="nil"/>
             </w:tcBorders>
+            <w:vAlign w:val="center"/>
           </w:tcPr>
           <w:p>
             <w:pPr>
@@ -6309,6 +6352,7 @@
               <w:bottom w:val="nil"/>
               <w:right w:val="nil"/>
             </w:tcBorders>
+            <w:vAlign w:val="center"/>
           </w:tcPr>
           <w:p>
             <w:pPr>
@@ -6354,6 +6398,7 @@
               <w:bottom w:val="nil"/>
               <w:right w:val="nil"/>
             </w:tcBorders>
+            <w:vAlign w:val="center"/>
           </w:tcPr>
           <w:p>
             <w:pPr>
@@ -6404,6 +6449,7 @@
               <w:bottom w:val="nil"/>
               <w:right w:val="nil"/>
             </w:tcBorders>
+            <w:vAlign w:val="center"/>
           </w:tcPr>
           <w:p>
             <w:pPr>
@@ -6449,6 +6495,7 @@
               <w:bottom w:val="nil"/>
               <w:right w:val="nil"/>
             </w:tcBorders>
+            <w:vAlign w:val="center"/>
           </w:tcPr>
           <w:p>
             <w:pPr>
@@ -6494,6 +6541,7 @@
               <w:bottom w:val="nil"/>
               <w:right w:val="nil"/>
             </w:tcBorders>
+            <w:vAlign w:val="center"/>
           </w:tcPr>
           <w:p>
             <w:pPr>
@@ -6539,6 +6587,7 @@
               <w:bottom w:val="nil"/>
               <w:right w:val="nil"/>
             </w:tcBorders>
+            <w:vAlign w:val="center"/>
           </w:tcPr>
           <w:p>
             <w:pPr>
@@ -6584,6 +6633,7 @@
               <w:bottom w:val="nil"/>
               <w:right w:val="nil"/>
             </w:tcBorders>
+            <w:vAlign w:val="center"/>
           </w:tcPr>
           <w:p>
             <w:pPr>
@@ -6629,6 +6679,7 @@
               <w:bottom w:val="nil"/>
               <w:right w:val="nil"/>
             </w:tcBorders>
+            <w:vAlign w:val="center"/>
           </w:tcPr>
           <w:p>
             <w:pPr>
@@ -6679,6 +6730,7 @@
               <w:bottom w:val="nil"/>
               <w:right w:val="nil"/>
             </w:tcBorders>
+            <w:vAlign w:val="center"/>
           </w:tcPr>
           <w:p>
             <w:pPr>
@@ -6724,6 +6776,7 @@
               <w:bottom w:val="nil"/>
               <w:right w:val="nil"/>
             </w:tcBorders>
+            <w:vAlign w:val="center"/>
           </w:tcPr>
           <w:p>
             <w:pPr>
@@ -6769,6 +6822,7 @@
               <w:bottom w:val="nil"/>
               <w:right w:val="nil"/>
             </w:tcBorders>
+            <w:vAlign w:val="center"/>
           </w:tcPr>
           <w:p>
             <w:pPr>
@@ -6814,6 +6868,7 @@
               <w:bottom w:val="nil"/>
               <w:right w:val="nil"/>
             </w:tcBorders>
+            <w:vAlign w:val="center"/>
           </w:tcPr>
           <w:p>
             <w:pPr>
@@ -6859,6 +6914,7 @@
               <w:bottom w:val="nil"/>
               <w:right w:val="nil"/>
             </w:tcBorders>
+            <w:vAlign w:val="center"/>
           </w:tcPr>
           <w:p>
             <w:pPr>
@@ -6904,6 +6960,7 @@
               <w:bottom w:val="nil"/>
               <w:right w:val="nil"/>
             </w:tcBorders>
+            <w:vAlign w:val="center"/>
           </w:tcPr>
           <w:p>
             <w:pPr>
@@ -6954,6 +7011,7 @@
               <w:bottom w:val="single" w:sz="18" w:space="0" w:color="000000"/>
               <w:right w:val="nil"/>
             </w:tcBorders>
+            <w:vAlign w:val="center"/>
           </w:tcPr>
           <w:p>
             <w:pPr>
@@ -6999,6 +7057,7 @@
               <w:bottom w:val="single" w:sz="18" w:space="0" w:color="000000"/>
               <w:right w:val="nil"/>
             </w:tcBorders>
+            <w:vAlign w:val="center"/>
           </w:tcPr>
           <w:p>
             <w:pPr>
@@ -7044,6 +7103,7 @@
               <w:bottom w:val="single" w:sz="18" w:space="0" w:color="000000"/>
               <w:right w:val="nil"/>
             </w:tcBorders>
+            <w:vAlign w:val="center"/>
           </w:tcPr>
           <w:p>
             <w:pPr>
@@ -7089,6 +7149,7 @@
               <w:bottom w:val="single" w:sz="18" w:space="0" w:color="000000"/>
               <w:right w:val="nil"/>
             </w:tcBorders>
+            <w:vAlign w:val="center"/>
           </w:tcPr>
           <w:p>
             <w:pPr>
@@ -7134,6 +7195,7 @@
               <w:bottom w:val="single" w:sz="18" w:space="0" w:color="000000"/>
               <w:right w:val="nil"/>
             </w:tcBorders>
+            <w:vAlign w:val="center"/>
           </w:tcPr>
           <w:p>
             <w:pPr>
@@ -7179,6 +7241,7 @@
               <w:bottom w:val="single" w:sz="18" w:space="0" w:color="000000"/>
               <w:right w:val="nil"/>
             </w:tcBorders>
+            <w:vAlign w:val="center"/>
           </w:tcPr>
           <w:p>
             <w:pPr>
@@ -7384,6 +7447,7 @@
               <w:bottom w:val="single" w:sz="4" w:space="0" w:color="000000"/>
               <w:right w:val="nil"/>
             </w:tcBorders>
+            <w:vAlign w:val="center"/>
           </w:tcPr>
           <w:p>
             <w:pPr>
@@ -7413,6 +7477,7 @@
               <w:bottom w:val="single" w:sz="4" w:space="0" w:color="000000"/>
               <w:right w:val="nil"/>
             </w:tcBorders>
+            <w:vAlign w:val="center"/>
           </w:tcPr>
           <w:p>
             <w:pPr>
@@ -7442,6 +7507,7 @@
               <w:bottom w:val="single" w:sz="4" w:space="0" w:color="000000"/>
               <w:right w:val="nil"/>
             </w:tcBorders>
+            <w:vAlign w:val="center"/>
           </w:tcPr>
           <w:p>
             <w:pPr>
@@ -7471,6 +7537,7 @@
               <w:bottom w:val="single" w:sz="4" w:space="0" w:color="000000"/>
               <w:right w:val="nil"/>
             </w:tcBorders>
+            <w:vAlign w:val="center"/>
           </w:tcPr>
           <w:p>
             <w:pPr>
@@ -7500,6 +7567,7 @@
               <w:bottom w:val="single" w:sz="4" w:space="0" w:color="000000"/>
               <w:right w:val="nil"/>
             </w:tcBorders>
+            <w:vAlign w:val="center"/>
           </w:tcPr>
           <w:p>
             <w:pPr>
@@ -7534,6 +7602,7 @@
               <w:bottom w:val="nil"/>
               <w:right w:val="nil"/>
             </w:tcBorders>
+            <w:vAlign w:val="center"/>
           </w:tcPr>
           <w:p>
             <w:pPr>
@@ -7563,6 +7632,7 @@
               <w:bottom w:val="nil"/>
               <w:right w:val="nil"/>
             </w:tcBorders>
+            <w:vAlign w:val="center"/>
           </w:tcPr>
           <w:p>
             <w:pPr>
@@ -7592,6 +7662,7 @@
               <w:bottom w:val="nil"/>
               <w:right w:val="nil"/>
             </w:tcBorders>
+            <w:vAlign w:val="center"/>
           </w:tcPr>
           <w:p>
             <w:pPr>
@@ -7621,6 +7692,7 @@
               <w:bottom w:val="nil"/>
               <w:right w:val="nil"/>
             </w:tcBorders>
+            <w:vAlign w:val="center"/>
           </w:tcPr>
           <w:p>
             <w:pPr>
@@ -7650,6 +7722,7 @@
               <w:bottom w:val="nil"/>
               <w:right w:val="nil"/>
             </w:tcBorders>
+            <w:vAlign w:val="center"/>
           </w:tcPr>
           <w:p>
             <w:pPr>
@@ -7684,6 +7757,7 @@
               <w:bottom w:val="nil"/>
               <w:right w:val="nil"/>
             </w:tcBorders>
+            <w:vAlign w:val="center"/>
           </w:tcPr>
           <w:p>
             <w:pPr>
@@ -7712,6 +7786,7 @@
               <w:bottom w:val="nil"/>
               <w:right w:val="nil"/>
             </w:tcBorders>
+            <w:vAlign w:val="center"/>
           </w:tcPr>
           <w:p>
             <w:pPr>
@@ -7741,6 +7816,7 @@
               <w:bottom w:val="nil"/>
               <w:right w:val="nil"/>
             </w:tcBorders>
+            <w:vAlign w:val="center"/>
           </w:tcPr>
           <w:p>
             <w:pPr>
@@ -7770,6 +7846,7 @@
               <w:bottom w:val="nil"/>
               <w:right w:val="nil"/>
             </w:tcBorders>
+            <w:vAlign w:val="center"/>
           </w:tcPr>
           <w:p>
             <w:pPr>
@@ -7799,6 +7876,7 @@
               <w:bottom w:val="nil"/>
               <w:right w:val="nil"/>
             </w:tcBorders>
+            <w:vAlign w:val="center"/>
           </w:tcPr>
           <w:p>
             <w:pPr>
@@ -7833,6 +7911,7 @@
               <w:bottom w:val="nil"/>
               <w:right w:val="nil"/>
             </w:tcBorders>
+            <w:vAlign w:val="center"/>
           </w:tcPr>
           <w:p>
             <w:pPr>
@@ -7861,6 +7940,7 @@
               <w:bottom w:val="nil"/>
               <w:right w:val="nil"/>
             </w:tcBorders>
+            <w:vAlign w:val="center"/>
           </w:tcPr>
           <w:p>
             <w:pPr>
@@ -7890,6 +7970,7 @@
               <w:bottom w:val="nil"/>
               <w:right w:val="nil"/>
             </w:tcBorders>
+            <w:vAlign w:val="center"/>
           </w:tcPr>
           <w:p>
             <w:pPr>
@@ -7919,6 +8000,7 @@
               <w:bottom w:val="nil"/>
               <w:right w:val="nil"/>
             </w:tcBorders>
+            <w:vAlign w:val="center"/>
           </w:tcPr>
           <w:p>
             <w:pPr>
@@ -7948,6 +8030,7 @@
               <w:bottom w:val="nil"/>
               <w:right w:val="nil"/>
             </w:tcBorders>
+            <w:vAlign w:val="center"/>
           </w:tcPr>
           <w:p>
             <w:pPr>
@@ -7982,6 +8065,7 @@
               <w:bottom w:val="nil"/>
               <w:right w:val="nil"/>
             </w:tcBorders>
+            <w:vAlign w:val="center"/>
           </w:tcPr>
           <w:p>
             <w:pPr>
@@ -8010,6 +8094,7 @@
               <w:bottom w:val="nil"/>
               <w:right w:val="nil"/>
             </w:tcBorders>
+            <w:vAlign w:val="center"/>
           </w:tcPr>
           <w:p>
             <w:pPr>
@@ -8039,6 +8124,7 @@
               <w:bottom w:val="nil"/>
               <w:right w:val="nil"/>
             </w:tcBorders>
+            <w:vAlign w:val="center"/>
           </w:tcPr>
           <w:p>
             <w:pPr>
@@ -8068,6 +8154,7 @@
               <w:bottom w:val="nil"/>
               <w:right w:val="nil"/>
             </w:tcBorders>
+            <w:vAlign w:val="center"/>
           </w:tcPr>
           <w:p>
             <w:pPr>
@@ -8097,6 +8184,7 @@
               <w:bottom w:val="nil"/>
               <w:right w:val="nil"/>
             </w:tcBorders>
+            <w:vAlign w:val="center"/>
           </w:tcPr>
           <w:p>
             <w:pPr>
@@ -8131,6 +8219,7 @@
               <w:bottom w:val="nil"/>
               <w:right w:val="nil"/>
             </w:tcBorders>
+            <w:vAlign w:val="center"/>
           </w:tcPr>
           <w:p>
             <w:pPr>
@@ -8160,6 +8249,7 @@
               <w:bottom w:val="nil"/>
               <w:right w:val="nil"/>
             </w:tcBorders>
+            <w:vAlign w:val="center"/>
           </w:tcPr>
           <w:p>
             <w:pPr>
@@ -8189,6 +8279,7 @@
               <w:bottom w:val="nil"/>
               <w:right w:val="nil"/>
             </w:tcBorders>
+            <w:vAlign w:val="center"/>
           </w:tcPr>
           <w:p>
             <w:pPr>
@@ -8218,6 +8309,7 @@
               <w:bottom w:val="nil"/>
               <w:right w:val="nil"/>
             </w:tcBorders>
+            <w:vAlign w:val="center"/>
           </w:tcPr>
           <w:p>
             <w:pPr>
@@ -8247,6 +8339,7 @@
               <w:bottom w:val="nil"/>
               <w:right w:val="nil"/>
             </w:tcBorders>
+            <w:vAlign w:val="center"/>
           </w:tcPr>
           <w:p>
             <w:pPr>
@@ -8281,6 +8374,7 @@
               <w:bottom w:val="nil"/>
               <w:right w:val="nil"/>
             </w:tcBorders>
+            <w:vAlign w:val="center"/>
           </w:tcPr>
           <w:p>
             <w:pPr>
@@ -8309,6 +8403,7 @@
               <w:bottom w:val="nil"/>
               <w:right w:val="nil"/>
             </w:tcBorders>
+            <w:vAlign w:val="center"/>
           </w:tcPr>
           <w:p>
             <w:pPr>
@@ -8338,6 +8433,7 @@
               <w:bottom w:val="nil"/>
               <w:right w:val="nil"/>
             </w:tcBorders>
+            <w:vAlign w:val="center"/>
           </w:tcPr>
           <w:p>
             <w:pPr>
@@ -8367,6 +8463,7 @@
               <w:bottom w:val="nil"/>
               <w:right w:val="nil"/>
             </w:tcBorders>
+            <w:vAlign w:val="center"/>
           </w:tcPr>
           <w:p>
             <w:pPr>
@@ -8396,6 +8493,7 @@
               <w:bottom w:val="nil"/>
               <w:right w:val="nil"/>
             </w:tcBorders>
+            <w:vAlign w:val="center"/>
           </w:tcPr>
           <w:p>
             <w:pPr>
@@ -8430,6 +8528,7 @@
               <w:bottom w:val="nil"/>
               <w:right w:val="nil"/>
             </w:tcBorders>
+            <w:vAlign w:val="center"/>
           </w:tcPr>
           <w:p>
             <w:pPr>
@@ -8458,6 +8557,7 @@
               <w:bottom w:val="nil"/>
               <w:right w:val="nil"/>
             </w:tcBorders>
+            <w:vAlign w:val="center"/>
           </w:tcPr>
           <w:p>
             <w:pPr>
@@ -8487,6 +8587,7 @@
               <w:bottom w:val="nil"/>
               <w:right w:val="nil"/>
             </w:tcBorders>
+            <w:vAlign w:val="center"/>
           </w:tcPr>
           <w:p>
             <w:pPr>
@@ -8516,6 +8617,7 @@
               <w:bottom w:val="nil"/>
               <w:right w:val="nil"/>
             </w:tcBorders>
+            <w:vAlign w:val="center"/>
           </w:tcPr>
           <w:p>
             <w:pPr>
@@ -8545,6 +8647,7 @@
               <w:bottom w:val="nil"/>
               <w:right w:val="nil"/>
             </w:tcBorders>
+            <w:vAlign w:val="center"/>
           </w:tcPr>
           <w:p>
             <w:pPr>
@@ -8579,6 +8682,7 @@
               <w:bottom w:val="nil"/>
               <w:right w:val="nil"/>
             </w:tcBorders>
+            <w:vAlign w:val="center"/>
           </w:tcPr>
           <w:p>
             <w:pPr>
@@ -8607,6 +8711,7 @@
               <w:bottom w:val="nil"/>
               <w:right w:val="nil"/>
             </w:tcBorders>
+            <w:vAlign w:val="center"/>
           </w:tcPr>
           <w:p>
             <w:pPr>
@@ -8636,6 +8741,7 @@
               <w:bottom w:val="nil"/>
               <w:right w:val="nil"/>
             </w:tcBorders>
+            <w:vAlign w:val="center"/>
           </w:tcPr>
           <w:p>
             <w:pPr>
@@ -8665,6 +8771,7 @@
               <w:bottom w:val="nil"/>
               <w:right w:val="nil"/>
             </w:tcBorders>
+            <w:vAlign w:val="center"/>
           </w:tcPr>
           <w:p>
             <w:pPr>
@@ -8694,6 +8801,7 @@
               <w:bottom w:val="nil"/>
               <w:right w:val="nil"/>
             </w:tcBorders>
+            <w:vAlign w:val="center"/>
           </w:tcPr>
           <w:p>
             <w:pPr>
@@ -8728,6 +8836,7 @@
               <w:bottom w:val="nil"/>
               <w:right w:val="nil"/>
             </w:tcBorders>
+            <w:vAlign w:val="center"/>
           </w:tcPr>
           <w:p>
             <w:pPr>
@@ -8756,6 +8865,7 @@
               <w:bottom w:val="nil"/>
               <w:right w:val="nil"/>
             </w:tcBorders>
+            <w:vAlign w:val="center"/>
           </w:tcPr>
           <w:p>
             <w:pPr>
@@ -8785,6 +8895,7 @@
               <w:bottom w:val="nil"/>
               <w:right w:val="nil"/>
             </w:tcBorders>
+            <w:vAlign w:val="center"/>
           </w:tcPr>
           <w:p>
             <w:pPr>
@@ -8814,6 +8925,7 @@
               <w:bottom w:val="nil"/>
               <w:right w:val="nil"/>
             </w:tcBorders>
+            <w:vAlign w:val="center"/>
           </w:tcPr>
           <w:p>
             <w:pPr>
@@ -8843,6 +8955,7 @@
               <w:bottom w:val="nil"/>
               <w:right w:val="nil"/>
             </w:tcBorders>
+            <w:vAlign w:val="center"/>
           </w:tcPr>
           <w:p>
             <w:pPr>
@@ -8877,6 +8990,7 @@
               <w:bottom w:val="nil"/>
               <w:right w:val="nil"/>
             </w:tcBorders>
+            <w:vAlign w:val="center"/>
           </w:tcPr>
           <w:p>
             <w:pPr>
@@ -8905,6 +9019,7 @@
               <w:bottom w:val="nil"/>
               <w:right w:val="nil"/>
             </w:tcBorders>
+            <w:vAlign w:val="center"/>
           </w:tcPr>
           <w:p>
             <w:pPr>
@@ -8934,6 +9049,7 @@
               <w:bottom w:val="nil"/>
               <w:right w:val="nil"/>
             </w:tcBorders>
+            <w:vAlign w:val="center"/>
           </w:tcPr>
           <w:p>
             <w:pPr>
@@ -8963,6 +9079,7 @@
               <w:bottom w:val="nil"/>
               <w:right w:val="nil"/>
             </w:tcBorders>
+            <w:vAlign w:val="center"/>
           </w:tcPr>
           <w:p>
             <w:pPr>
@@ -8992,6 +9109,7 @@
               <w:bottom w:val="nil"/>
               <w:right w:val="nil"/>
             </w:tcBorders>
+            <w:vAlign w:val="center"/>
           </w:tcPr>
           <w:p>
             <w:pPr>
@@ -9026,6 +9144,7 @@
               <w:bottom w:val="nil"/>
               <w:right w:val="nil"/>
             </w:tcBorders>
+            <w:vAlign w:val="center"/>
           </w:tcPr>
           <w:p>
             <w:pPr>
@@ -9054,6 +9173,7 @@
               <w:bottom w:val="nil"/>
               <w:right w:val="nil"/>
             </w:tcBorders>
+            <w:vAlign w:val="center"/>
           </w:tcPr>
           <w:p>
             <w:pPr>
@@ -9083,6 +9203,7 @@
               <w:bottom w:val="nil"/>
               <w:right w:val="nil"/>
             </w:tcBorders>
+            <w:vAlign w:val="center"/>
           </w:tcPr>
           <w:p>
             <w:pPr>
@@ -9112,6 +9233,7 @@
               <w:bottom w:val="nil"/>
               <w:right w:val="nil"/>
             </w:tcBorders>
+            <w:vAlign w:val="center"/>
           </w:tcPr>
           <w:p>
             <w:pPr>
@@ -9141,6 +9263,7 @@
               <w:bottom w:val="nil"/>
               <w:right w:val="nil"/>
             </w:tcBorders>
+            <w:vAlign w:val="center"/>
           </w:tcPr>
           <w:p>
             <w:pPr>
@@ -9175,6 +9298,7 @@
               <w:bottom w:val="nil"/>
               <w:right w:val="nil"/>
             </w:tcBorders>
+            <w:vAlign w:val="center"/>
           </w:tcPr>
           <w:p>
             <w:pPr>
@@ -9204,6 +9328,7 @@
               <w:bottom w:val="nil"/>
               <w:right w:val="nil"/>
             </w:tcBorders>
+            <w:vAlign w:val="center"/>
           </w:tcPr>
           <w:p>
             <w:pPr>
@@ -9233,6 +9358,7 @@
               <w:bottom w:val="nil"/>
               <w:right w:val="nil"/>
             </w:tcBorders>
+            <w:vAlign w:val="center"/>
           </w:tcPr>
           <w:p>
             <w:pPr>
@@ -9262,6 +9388,7 @@
               <w:bottom w:val="nil"/>
               <w:right w:val="nil"/>
             </w:tcBorders>
+            <w:vAlign w:val="center"/>
           </w:tcPr>
           <w:p>
             <w:pPr>
@@ -9291,6 +9418,7 @@
               <w:bottom w:val="nil"/>
               <w:right w:val="nil"/>
             </w:tcBorders>
+            <w:vAlign w:val="center"/>
           </w:tcPr>
           <w:p>
             <w:pPr>
@@ -9325,6 +9453,7 @@
               <w:bottom w:val="nil"/>
               <w:right w:val="nil"/>
             </w:tcBorders>
+            <w:vAlign w:val="center"/>
           </w:tcPr>
           <w:p>
             <w:pPr>
@@ -9354,6 +9483,7 @@
               <w:bottom w:val="nil"/>
               <w:right w:val="nil"/>
             </w:tcBorders>
+            <w:vAlign w:val="center"/>
           </w:tcPr>
           <w:p>
             <w:pPr>
@@ -9383,6 +9513,7 @@
               <w:bottom w:val="nil"/>
               <w:right w:val="nil"/>
             </w:tcBorders>
+            <w:vAlign w:val="center"/>
           </w:tcPr>
           <w:p>
             <w:pPr>
@@ -9412,6 +9543,7 @@
               <w:bottom w:val="nil"/>
               <w:right w:val="nil"/>
             </w:tcBorders>
+            <w:vAlign w:val="center"/>
           </w:tcPr>
           <w:p>
             <w:pPr>
@@ -9441,6 +9573,7 @@
               <w:bottom w:val="nil"/>
               <w:right w:val="nil"/>
             </w:tcBorders>
+            <w:vAlign w:val="center"/>
           </w:tcPr>
           <w:p>
             <w:pPr>
@@ -9475,6 +9608,7 @@
               <w:bottom w:val="single" w:sz="18" w:space="0" w:color="000000"/>
               <w:right w:val="nil"/>
             </w:tcBorders>
+            <w:vAlign w:val="center"/>
           </w:tcPr>
           <w:p>
             <w:pPr>
@@ -9504,6 +9638,7 @@
               <w:bottom w:val="single" w:sz="18" w:space="0" w:color="000000"/>
               <w:right w:val="nil"/>
             </w:tcBorders>
+            <w:vAlign w:val="center"/>
           </w:tcPr>
           <w:p>
             <w:pPr>
@@ -9532,6 +9667,7 @@
               <w:bottom w:val="single" w:sz="18" w:space="0" w:color="000000"/>
               <w:right w:val="nil"/>
             </w:tcBorders>
+            <w:vAlign w:val="center"/>
           </w:tcPr>
           <w:p>
             <w:pPr>
@@ -9561,6 +9697,7 @@
               <w:bottom w:val="single" w:sz="18" w:space="0" w:color="000000"/>
               <w:right w:val="nil"/>
             </w:tcBorders>
+            <w:vAlign w:val="center"/>
           </w:tcPr>
           <w:p>
             <w:pPr>
@@ -9590,6 +9727,7 @@
               <w:bottom w:val="single" w:sz="18" w:space="0" w:color="000000"/>
               <w:right w:val="nil"/>
             </w:tcBorders>
+            <w:vAlign w:val="center"/>
           </w:tcPr>
           <w:p>
             <w:pPr>
@@ -9819,6 +9957,7 @@
               <w:bottom w:val="single" w:sz="4" w:space="0" w:color="000000"/>
               <w:right w:val="nil"/>
             </w:tcBorders>
+            <w:vAlign w:val="center"/>
           </w:tcPr>
           <w:p>
             <w:pPr>
@@ -9848,6 +9987,7 @@
               <w:bottom w:val="single" w:sz="4" w:space="0" w:color="000000"/>
               <w:right w:val="nil"/>
             </w:tcBorders>
+            <w:vAlign w:val="center"/>
           </w:tcPr>
           <w:p>
             <w:pPr>
@@ -9877,6 +10017,7 @@
               <w:bottom w:val="single" w:sz="4" w:space="0" w:color="000000"/>
               <w:right w:val="nil"/>
             </w:tcBorders>
+            <w:vAlign w:val="center"/>
           </w:tcPr>
           <w:p>
             <w:pPr>
@@ -9906,6 +10047,7 @@
               <w:bottom w:val="single" w:sz="4" w:space="0" w:color="000000"/>
               <w:right w:val="nil"/>
             </w:tcBorders>
+            <w:vAlign w:val="center"/>
           </w:tcPr>
           <w:p>
             <w:pPr>
@@ -9935,6 +10077,7 @@
               <w:bottom w:val="single" w:sz="4" w:space="0" w:color="000000"/>
               <w:right w:val="nil"/>
             </w:tcBorders>
+            <w:vAlign w:val="center"/>
           </w:tcPr>
           <w:p>
             <w:pPr>
@@ -9969,6 +10112,7 @@
               <w:bottom w:val="nil"/>
               <w:right w:val="nil"/>
             </w:tcBorders>
+            <w:vAlign w:val="center"/>
           </w:tcPr>
           <w:p>
             <w:pPr>
@@ -9998,6 +10142,7 @@
               <w:bottom w:val="nil"/>
               <w:right w:val="nil"/>
             </w:tcBorders>
+            <w:vAlign w:val="center"/>
           </w:tcPr>
           <w:p>
             <w:pPr>
@@ -10027,6 +10172,7 @@
               <w:bottom w:val="nil"/>
               <w:right w:val="nil"/>
             </w:tcBorders>
+            <w:vAlign w:val="center"/>
           </w:tcPr>
           <w:p>
             <w:pPr>
@@ -10056,6 +10202,7 @@
               <w:bottom w:val="nil"/>
               <w:right w:val="nil"/>
             </w:tcBorders>
+            <w:vAlign w:val="center"/>
           </w:tcPr>
           <w:p>
             <w:pPr>
@@ -10085,6 +10232,7 @@
               <w:bottom w:val="nil"/>
               <w:right w:val="nil"/>
             </w:tcBorders>
+            <w:vAlign w:val="center"/>
           </w:tcPr>
           <w:p>
             <w:pPr>
@@ -10119,6 +10267,7 @@
               <w:bottom w:val="nil"/>
               <w:right w:val="nil"/>
             </w:tcBorders>
+            <w:vAlign w:val="center"/>
           </w:tcPr>
           <w:p>
             <w:pPr>
@@ -10148,6 +10297,7 @@
               <w:bottom w:val="nil"/>
               <w:right w:val="nil"/>
             </w:tcBorders>
+            <w:vAlign w:val="center"/>
           </w:tcPr>
           <w:p>
             <w:pPr>
@@ -10177,6 +10327,7 @@
               <w:bottom w:val="nil"/>
               <w:right w:val="nil"/>
             </w:tcBorders>
+            <w:vAlign w:val="center"/>
           </w:tcPr>
           <w:p>
             <w:pPr>
@@ -10206,6 +10357,7 @@
               <w:bottom w:val="nil"/>
               <w:right w:val="nil"/>
             </w:tcBorders>
+            <w:vAlign w:val="center"/>
           </w:tcPr>
           <w:p>
             <w:pPr>
@@ -10235,6 +10387,7 @@
               <w:bottom w:val="nil"/>
               <w:right w:val="nil"/>
             </w:tcBorders>
+            <w:vAlign w:val="center"/>
           </w:tcPr>
           <w:p>
             <w:pPr>
@@ -10269,6 +10422,7 @@
               <w:bottom w:val="nil"/>
               <w:right w:val="nil"/>
             </w:tcBorders>
+            <w:vAlign w:val="center"/>
           </w:tcPr>
           <w:p>
             <w:pPr>
@@ -10298,6 +10452,7 @@
               <w:bottom w:val="nil"/>
               <w:right w:val="nil"/>
             </w:tcBorders>
+            <w:vAlign w:val="center"/>
           </w:tcPr>
           <w:p>
             <w:pPr>
@@ -10327,6 +10482,7 @@
               <w:bottom w:val="nil"/>
               <w:right w:val="nil"/>
             </w:tcBorders>
+            <w:vAlign w:val="center"/>
           </w:tcPr>
           <w:p>
             <w:pPr>
@@ -10356,6 +10512,7 @@
               <w:bottom w:val="nil"/>
               <w:right w:val="nil"/>
             </w:tcBorders>
+            <w:vAlign w:val="center"/>
           </w:tcPr>
           <w:p>
             <w:pPr>
@@ -10385,6 +10542,7 @@
               <w:bottom w:val="nil"/>
               <w:right w:val="nil"/>
             </w:tcBorders>
+            <w:vAlign w:val="center"/>
           </w:tcPr>
           <w:p>
             <w:pPr>
@@ -10419,6 +10577,7 @@
               <w:bottom w:val="nil"/>
               <w:right w:val="nil"/>
             </w:tcBorders>
+            <w:vAlign w:val="center"/>
           </w:tcPr>
           <w:p>
             <w:pPr>
@@ -10448,6 +10607,7 @@
               <w:bottom w:val="nil"/>
               <w:right w:val="nil"/>
             </w:tcBorders>
+            <w:vAlign w:val="center"/>
           </w:tcPr>
           <w:p>
             <w:pPr>
@@ -10477,6 +10637,7 @@
               <w:bottom w:val="nil"/>
               <w:right w:val="nil"/>
             </w:tcBorders>
+            <w:vAlign w:val="center"/>
           </w:tcPr>
           <w:p>
             <w:pPr>
@@ -10506,6 +10667,7 @@
               <w:bottom w:val="nil"/>
               <w:right w:val="nil"/>
             </w:tcBorders>
+            <w:vAlign w:val="center"/>
           </w:tcPr>
           <w:p>
             <w:pPr>
@@ -10535,6 +10697,7 @@
               <w:bottom w:val="nil"/>
               <w:right w:val="nil"/>
             </w:tcBorders>
+            <w:vAlign w:val="center"/>
           </w:tcPr>
           <w:p>
             <w:pPr>
@@ -10569,6 +10732,7 @@
               <w:bottom w:val="nil"/>
               <w:right w:val="nil"/>
             </w:tcBorders>
+            <w:vAlign w:val="center"/>
           </w:tcPr>
           <w:p>
             <w:pPr>
@@ -10598,6 +10762,7 @@
               <w:bottom w:val="nil"/>
               <w:right w:val="nil"/>
             </w:tcBorders>
+            <w:vAlign w:val="center"/>
           </w:tcPr>
           <w:p>
             <w:pPr>
@@ -10627,6 +10792,7 @@
               <w:bottom w:val="nil"/>
               <w:right w:val="nil"/>
             </w:tcBorders>
+            <w:vAlign w:val="center"/>
           </w:tcPr>
           <w:p>
             <w:pPr>
@@ -10656,6 +10822,7 @@
               <w:bottom w:val="nil"/>
               <w:right w:val="nil"/>
             </w:tcBorders>
+            <w:vAlign w:val="center"/>
           </w:tcPr>
           <w:p>
             <w:pPr>
@@ -10685,6 +10852,7 @@
               <w:bottom w:val="nil"/>
               <w:right w:val="nil"/>
             </w:tcBorders>
+            <w:vAlign w:val="center"/>
           </w:tcPr>
           <w:p>
             <w:pPr>
@@ -10719,6 +10887,7 @@
               <w:bottom w:val="nil"/>
               <w:right w:val="nil"/>
             </w:tcBorders>
+            <w:vAlign w:val="center"/>
           </w:tcPr>
           <w:p>
             <w:pPr>
@@ -10748,6 +10917,7 @@
               <w:bottom w:val="nil"/>
               <w:right w:val="nil"/>
             </w:tcBorders>
+            <w:vAlign w:val="center"/>
           </w:tcPr>
           <w:p>
             <w:pPr>
@@ -10777,6 +10947,7 @@
               <w:bottom w:val="nil"/>
               <w:right w:val="nil"/>
             </w:tcBorders>
+            <w:vAlign w:val="center"/>
           </w:tcPr>
           <w:p>
             <w:pPr>
@@ -10806,6 +10977,7 @@
               <w:bottom w:val="nil"/>
               <w:right w:val="nil"/>
             </w:tcBorders>
+            <w:vAlign w:val="center"/>
           </w:tcPr>
           <w:p>
             <w:pPr>
@@ -10835,6 +11007,7 @@
               <w:bottom w:val="nil"/>
               <w:right w:val="nil"/>
             </w:tcBorders>
+            <w:vAlign w:val="center"/>
           </w:tcPr>
           <w:p>
             <w:pPr>
@@ -10869,6 +11042,7 @@
               <w:bottom w:val="single" w:sz="18" w:space="0" w:color="000000"/>
               <w:right w:val="nil"/>
             </w:tcBorders>
+            <w:vAlign w:val="center"/>
           </w:tcPr>
           <w:p>
             <w:pPr>
@@ -10898,6 +11072,7 @@
               <w:bottom w:val="single" w:sz="18" w:space="0" w:color="000000"/>
               <w:right w:val="nil"/>
             </w:tcBorders>
+            <w:vAlign w:val="center"/>
           </w:tcPr>
           <w:p>
             <w:pPr>
@@ -10927,6 +11102,7 @@
               <w:bottom w:val="single" w:sz="18" w:space="0" w:color="000000"/>
               <w:right w:val="nil"/>
             </w:tcBorders>
+            <w:vAlign w:val="center"/>
           </w:tcPr>
           <w:p>
             <w:pPr>
@@ -10956,6 +11132,7 @@
               <w:bottom w:val="single" w:sz="18" w:space="0" w:color="000000"/>
               <w:right w:val="nil"/>
             </w:tcBorders>
+            <w:vAlign w:val="center"/>
           </w:tcPr>
           <w:p>
             <w:pPr>
@@ -10985,6 +11162,7 @@
               <w:bottom w:val="single" w:sz="18" w:space="0" w:color="000000"/>
               <w:right w:val="nil"/>
             </w:tcBorders>
+            <w:vAlign w:val="center"/>
           </w:tcPr>
           <w:p>
             <w:pPr>
@@ -11137,6 +11315,7 @@
               <w:bottom w:val="single" w:sz="4" w:space="0" w:color="000000"/>
               <w:right w:val="nil"/>
             </w:tcBorders>
+            <w:vAlign w:val="center"/>
           </w:tcPr>
           <w:p>
             <w:pPr>
@@ -11166,6 +11345,7 @@
               <w:bottom w:val="single" w:sz="4" w:space="0" w:color="000000"/>
               <w:right w:val="nil"/>
             </w:tcBorders>
+            <w:vAlign w:val="center"/>
           </w:tcPr>
           <w:p>
             <w:pPr>
@@ -11195,6 +11375,7 @@
               <w:bottom w:val="single" w:sz="4" w:space="0" w:color="000000"/>
               <w:right w:val="nil"/>
             </w:tcBorders>
+            <w:vAlign w:val="center"/>
           </w:tcPr>
           <w:p>
             <w:pPr>
@@ -11224,6 +11405,7 @@
               <w:bottom w:val="single" w:sz="4" w:space="0" w:color="000000"/>
               <w:right w:val="nil"/>
             </w:tcBorders>
+            <w:vAlign w:val="center"/>
           </w:tcPr>
           <w:p>
             <w:pPr>
@@ -11253,6 +11435,7 @@
               <w:bottom w:val="single" w:sz="4" w:space="0" w:color="000000"/>
               <w:right w:val="nil"/>
             </w:tcBorders>
+            <w:vAlign w:val="center"/>
           </w:tcPr>
           <w:p>
             <w:pPr>
@@ -11287,6 +11470,7 @@
               <w:bottom w:val="nil"/>
               <w:right w:val="nil"/>
             </w:tcBorders>
+            <w:vAlign w:val="center"/>
           </w:tcPr>
           <w:p>
             <w:pPr>
@@ -11316,6 +11500,7 @@
               <w:bottom w:val="nil"/>
               <w:right w:val="nil"/>
             </w:tcBorders>
+            <w:vAlign w:val="center"/>
           </w:tcPr>
           <w:p>
             <w:pPr>
@@ -11345,6 +11530,7 @@
               <w:bottom w:val="nil"/>
               <w:right w:val="nil"/>
             </w:tcBorders>
+            <w:vAlign w:val="center"/>
           </w:tcPr>
           <w:p>
             <w:pPr>
@@ -11374,6 +11560,7 @@
               <w:bottom w:val="nil"/>
               <w:right w:val="nil"/>
             </w:tcBorders>
+            <w:vAlign w:val="center"/>
           </w:tcPr>
           <w:p>
             <w:pPr>
@@ -11403,6 +11590,7 @@
               <w:bottom w:val="nil"/>
               <w:right w:val="nil"/>
             </w:tcBorders>
+            <w:vAlign w:val="center"/>
           </w:tcPr>
           <w:p>
             <w:pPr>
@@ -11437,6 +11625,7 @@
               <w:bottom w:val="nil"/>
               <w:right w:val="nil"/>
             </w:tcBorders>
+            <w:vAlign w:val="center"/>
           </w:tcPr>
           <w:p>
             <w:pPr>
@@ -11466,6 +11655,7 @@
               <w:bottom w:val="nil"/>
               <w:right w:val="nil"/>
             </w:tcBorders>
+            <w:vAlign w:val="center"/>
           </w:tcPr>
           <w:p>
             <w:pPr>
@@ -11495,6 +11685,7 @@
               <w:bottom w:val="nil"/>
               <w:right w:val="nil"/>
             </w:tcBorders>
+            <w:vAlign w:val="center"/>
           </w:tcPr>
           <w:p>
             <w:pPr>
@@ -11524,6 +11715,7 @@
               <w:bottom w:val="nil"/>
               <w:right w:val="nil"/>
             </w:tcBorders>
+            <w:vAlign w:val="center"/>
           </w:tcPr>
           <w:p>
             <w:pPr>
@@ -11553,6 +11745,7 @@
               <w:bottom w:val="nil"/>
               <w:right w:val="nil"/>
             </w:tcBorders>
+            <w:vAlign w:val="center"/>
           </w:tcPr>
           <w:p>
             <w:pPr>
@@ -11587,6 +11780,7 @@
               <w:bottom w:val="nil"/>
               <w:right w:val="nil"/>
             </w:tcBorders>
+            <w:vAlign w:val="center"/>
           </w:tcPr>
           <w:p>
             <w:pPr>
@@ -11616,6 +11810,7 @@
               <w:bottom w:val="nil"/>
               <w:right w:val="nil"/>
             </w:tcBorders>
+            <w:vAlign w:val="center"/>
           </w:tcPr>
           <w:p>
             <w:pPr>
@@ -11645,6 +11840,7 @@
               <w:bottom w:val="nil"/>
               <w:right w:val="nil"/>
             </w:tcBorders>
+            <w:vAlign w:val="center"/>
           </w:tcPr>
           <w:p>
             <w:pPr>
@@ -11674,6 +11870,7 @@
               <w:bottom w:val="nil"/>
               <w:right w:val="nil"/>
             </w:tcBorders>
+            <w:vAlign w:val="center"/>
           </w:tcPr>
           <w:p>
             <w:pPr>
@@ -11703,6 +11900,7 @@
               <w:bottom w:val="nil"/>
               <w:right w:val="nil"/>
             </w:tcBorders>
+            <w:vAlign w:val="center"/>
           </w:tcPr>
           <w:p>
             <w:pPr>
@@ -11737,6 +11935,7 @@
               <w:bottom w:val="single" w:sz="18" w:space="0" w:color="000000"/>
               <w:right w:val="nil"/>
             </w:tcBorders>
+            <w:vAlign w:val="center"/>
           </w:tcPr>
           <w:p>
             <w:pPr>
@@ -11766,6 +11965,7 @@
               <w:bottom w:val="single" w:sz="18" w:space="0" w:color="000000"/>
               <w:right w:val="nil"/>
             </w:tcBorders>
+            <w:vAlign w:val="center"/>
           </w:tcPr>
           <w:p>
             <w:pPr>
@@ -11795,6 +11995,7 @@
               <w:bottom w:val="single" w:sz="18" w:space="0" w:color="000000"/>
               <w:right w:val="nil"/>
             </w:tcBorders>
+            <w:vAlign w:val="center"/>
           </w:tcPr>
           <w:p>
             <w:pPr>
@@ -11824,6 +12025,7 @@
               <w:bottom w:val="single" w:sz="18" w:space="0" w:color="000000"/>
               <w:right w:val="nil"/>
             </w:tcBorders>
+            <w:vAlign w:val="center"/>
           </w:tcPr>
           <w:p>
             <w:pPr>
@@ -11853,6 +12055,7 @@
               <w:bottom w:val="single" w:sz="18" w:space="0" w:color="000000"/>
               <w:right w:val="nil"/>
             </w:tcBorders>
+            <w:vAlign w:val="center"/>
           </w:tcPr>
           <w:p>
             <w:pPr>
@@ -12125,6 +12328,7 @@
               <w:bottom w:val="single" w:sz="4" w:space="0" w:color="000000"/>
               <w:right w:val="nil"/>
             </w:tcBorders>
+            <w:vAlign w:val="center"/>
           </w:tcPr>
           <w:p>
             <w:pPr>
@@ -12157,6 +12361,7 @@
               <w:bottom w:val="single" w:sz="4" w:space="0" w:color="000000"/>
               <w:right w:val="nil"/>
             </w:tcBorders>
+            <w:vAlign w:val="center"/>
           </w:tcPr>
           <w:p>
             <w:pPr>
@@ -12189,6 +12394,7 @@
               <w:bottom w:val="single" w:sz="4" w:space="0" w:color="000000"/>
               <w:right w:val="nil"/>
             </w:tcBorders>
+            <w:vAlign w:val="center"/>
           </w:tcPr>
           <w:p>
             <w:pPr>
@@ -12226,6 +12432,7 @@
               <w:bottom w:val="nil"/>
               <w:right w:val="nil"/>
             </w:tcBorders>
+            <w:vAlign w:val="center"/>
           </w:tcPr>
           <w:p>
             <w:pPr>
@@ -12258,6 +12465,7 @@
               <w:bottom w:val="nil"/>
               <w:right w:val="nil"/>
             </w:tcBorders>
+            <w:vAlign w:val="center"/>
           </w:tcPr>
           <w:p>
             <w:pPr>
@@ -12290,6 +12498,7 @@
               <w:bottom w:val="nil"/>
               <w:right w:val="nil"/>
             </w:tcBorders>
+            <w:vAlign w:val="center"/>
           </w:tcPr>
           <w:p>
             <w:pPr>
@@ -12327,6 +12536,7 @@
               <w:bottom w:val="nil"/>
               <w:right w:val="nil"/>
             </w:tcBorders>
+            <w:vAlign w:val="center"/>
           </w:tcPr>
           <w:p>
             <w:pPr>
@@ -12359,6 +12569,7 @@
               <w:bottom w:val="nil"/>
               <w:right w:val="nil"/>
             </w:tcBorders>
+            <w:vAlign w:val="center"/>
           </w:tcPr>
           <w:p>
             <w:pPr>
@@ -12391,6 +12602,7 @@
               <w:bottom w:val="nil"/>
               <w:right w:val="nil"/>
             </w:tcBorders>
+            <w:vAlign w:val="center"/>
           </w:tcPr>
           <w:p>
             <w:pPr>
@@ -12428,6 +12640,7 @@
               <w:bottom w:val="nil"/>
               <w:right w:val="nil"/>
             </w:tcBorders>
+            <w:vAlign w:val="center"/>
           </w:tcPr>
           <w:p>
             <w:pPr>
@@ -12460,6 +12673,7 @@
               <w:bottom w:val="nil"/>
               <w:right w:val="nil"/>
             </w:tcBorders>
+            <w:vAlign w:val="center"/>
           </w:tcPr>
           <w:p>
             <w:pPr>
@@ -12492,6 +12706,7 @@
               <w:bottom w:val="nil"/>
               <w:right w:val="nil"/>
             </w:tcBorders>
+            <w:vAlign w:val="center"/>
           </w:tcPr>
           <w:p>
             <w:pPr>
@@ -12529,6 +12744,7 @@
               <w:bottom w:val="single" w:sz="18" w:space="0" w:color="000000"/>
               <w:right w:val="nil"/>
             </w:tcBorders>
+            <w:vAlign w:val="center"/>
           </w:tcPr>
           <w:p>
             <w:pPr>
@@ -12561,6 +12777,7 @@
               <w:bottom w:val="single" w:sz="18" w:space="0" w:color="000000"/>
               <w:right w:val="nil"/>
             </w:tcBorders>
+            <w:vAlign w:val="center"/>
           </w:tcPr>
           <w:p>
             <w:pPr>
@@ -12593,6 +12810,7 @@
               <w:bottom w:val="single" w:sz="18" w:space="0" w:color="000000"/>
               <w:right w:val="nil"/>
             </w:tcBorders>
+            <w:vAlign w:val="center"/>
           </w:tcPr>
           <w:p>
             <w:pPr>
@@ -12751,6 +12969,7 @@
               <w:bottom w:val="single" w:sz="4" w:space="0" w:color="000000"/>
               <w:right w:val="nil"/>
             </w:tcBorders>
+            <w:vAlign w:val="center"/>
           </w:tcPr>
           <w:p>
             <w:pPr>
@@ -12780,6 +12999,7 @@
               <w:bottom w:val="single" w:sz="4" w:space="0" w:color="000000"/>
               <w:right w:val="nil"/>
             </w:tcBorders>
+            <w:vAlign w:val="center"/>
           </w:tcPr>
           <w:p>
             <w:pPr>
@@ -12809,6 +13029,7 @@
               <w:bottom w:val="single" w:sz="4" w:space="0" w:color="000000"/>
               <w:right w:val="nil"/>
             </w:tcBorders>
+            <w:vAlign w:val="center"/>
           </w:tcPr>
           <w:p>
             <w:pPr>
@@ -12838,6 +13059,7 @@
               <w:bottom w:val="single" w:sz="4" w:space="0" w:color="000000"/>
               <w:right w:val="nil"/>
             </w:tcBorders>
+            <w:vAlign w:val="center"/>
           </w:tcPr>
           <w:p>
             <w:pPr>
@@ -12867,6 +13089,7 @@
               <w:bottom w:val="single" w:sz="4" w:space="0" w:color="000000"/>
               <w:right w:val="nil"/>
             </w:tcBorders>
+            <w:vAlign w:val="center"/>
           </w:tcPr>
           <w:p>
             <w:pPr>
@@ -12901,6 +13124,7 @@
               <w:bottom w:val="nil"/>
               <w:right w:val="nil"/>
             </w:tcBorders>
+            <w:vAlign w:val="center"/>
           </w:tcPr>
           <w:p>
             <w:pPr>
@@ -12930,6 +13154,7 @@
               <w:bottom w:val="nil"/>
               <w:right w:val="nil"/>
             </w:tcBorders>
+            <w:vAlign w:val="center"/>
           </w:tcPr>
           <w:p>
             <w:pPr>
@@ -12959,6 +13184,7 @@
               <w:bottom w:val="nil"/>
               <w:right w:val="nil"/>
             </w:tcBorders>
+            <w:vAlign w:val="center"/>
           </w:tcPr>
           <w:p>
             <w:pPr>
@@ -12988,6 +13214,7 @@
               <w:bottom w:val="nil"/>
               <w:right w:val="nil"/>
             </w:tcBorders>
+            <w:vAlign w:val="center"/>
           </w:tcPr>
           <w:p>
             <w:pPr>
@@ -13017,6 +13244,7 @@
               <w:bottom w:val="nil"/>
               <w:right w:val="nil"/>
             </w:tcBorders>
+            <w:vAlign w:val="center"/>
           </w:tcPr>
           <w:p>
             <w:pPr>
@@ -13051,6 +13279,7 @@
               <w:bottom w:val="nil"/>
               <w:right w:val="nil"/>
             </w:tcBorders>
+            <w:vAlign w:val="center"/>
           </w:tcPr>
           <w:p>
             <w:pPr>
@@ -13080,6 +13309,7 @@
               <w:bottom w:val="nil"/>
               <w:right w:val="nil"/>
             </w:tcBorders>
+            <w:vAlign w:val="center"/>
           </w:tcPr>
           <w:p>
             <w:pPr>
@@ -13109,6 +13339,7 @@
               <w:bottom w:val="nil"/>
               <w:right w:val="nil"/>
             </w:tcBorders>
+            <w:vAlign w:val="center"/>
           </w:tcPr>
           <w:p>
             <w:pPr>
@@ -13138,6 +13369,7 @@
               <w:bottom w:val="nil"/>
               <w:right w:val="nil"/>
             </w:tcBorders>
+            <w:vAlign w:val="center"/>
           </w:tcPr>
           <w:p>
             <w:pPr>
@@ -13167,6 +13399,7 @@
               <w:bottom w:val="nil"/>
               <w:right w:val="nil"/>
             </w:tcBorders>
+            <w:vAlign w:val="center"/>
           </w:tcPr>
           <w:p>
             <w:pPr>
@@ -13201,6 +13434,7 @@
               <w:bottom w:val="nil"/>
               <w:right w:val="nil"/>
             </w:tcBorders>
+            <w:vAlign w:val="center"/>
           </w:tcPr>
           <w:p>
             <w:pPr>
@@ -13230,6 +13464,7 @@
               <w:bottom w:val="nil"/>
               <w:right w:val="nil"/>
             </w:tcBorders>
+            <w:vAlign w:val="center"/>
           </w:tcPr>
           <w:p>
             <w:pPr>
@@ -13259,6 +13494,7 @@
               <w:bottom w:val="nil"/>
               <w:right w:val="nil"/>
             </w:tcBorders>
+            <w:vAlign w:val="center"/>
           </w:tcPr>
           <w:p>
             <w:pPr>
@@ -13288,6 +13524,7 @@
               <w:bottom w:val="nil"/>
               <w:right w:val="nil"/>
             </w:tcBorders>
+            <w:vAlign w:val="center"/>
           </w:tcPr>
           <w:p>
             <w:pPr>
@@ -13317,6 +13554,7 @@
               <w:bottom w:val="nil"/>
               <w:right w:val="nil"/>
             </w:tcBorders>
+            <w:vAlign w:val="center"/>
           </w:tcPr>
           <w:p>
             <w:pPr>
@@ -13351,6 +13589,7 @@
               <w:bottom w:val="nil"/>
               <w:right w:val="nil"/>
             </w:tcBorders>
+            <w:vAlign w:val="center"/>
           </w:tcPr>
           <w:p>
             <w:pPr>
@@ -13380,6 +13619,7 @@
               <w:bottom w:val="nil"/>
               <w:right w:val="nil"/>
             </w:tcBorders>
+            <w:vAlign w:val="center"/>
           </w:tcPr>
           <w:p>
             <w:pPr>
@@ -13409,6 +13649,7 @@
               <w:bottom w:val="nil"/>
               <w:right w:val="nil"/>
             </w:tcBorders>
+            <w:vAlign w:val="center"/>
           </w:tcPr>
           <w:p>
             <w:pPr>
@@ -13438,6 +13679,7 @@
               <w:bottom w:val="nil"/>
               <w:right w:val="nil"/>
             </w:tcBorders>
+            <w:vAlign w:val="center"/>
           </w:tcPr>
           <w:p>
             <w:pPr>
@@ -13467,6 +13709,7 @@
               <w:bottom w:val="nil"/>
               <w:right w:val="nil"/>
             </w:tcBorders>
+            <w:vAlign w:val="center"/>
           </w:tcPr>
           <w:p>
             <w:pPr>
@@ -13501,6 +13744,7 @@
               <w:bottom w:val="nil"/>
               <w:right w:val="nil"/>
             </w:tcBorders>
+            <w:vAlign w:val="center"/>
           </w:tcPr>
           <w:p>
             <w:pPr>
@@ -13530,6 +13774,7 @@
               <w:bottom w:val="nil"/>
               <w:right w:val="nil"/>
             </w:tcBorders>
+            <w:vAlign w:val="center"/>
           </w:tcPr>
           <w:p>
             <w:pPr>
@@ -13559,6 +13804,7 @@
               <w:bottom w:val="nil"/>
               <w:right w:val="nil"/>
             </w:tcBorders>
+            <w:vAlign w:val="center"/>
           </w:tcPr>
           <w:p>
             <w:pPr>
@@ -13588,6 +13834,7 @@
               <w:bottom w:val="nil"/>
               <w:right w:val="nil"/>
             </w:tcBorders>
+            <w:vAlign w:val="center"/>
           </w:tcPr>
           <w:p>
             <w:pPr>
@@ -13617,6 +13864,7 @@
               <w:bottom w:val="nil"/>
               <w:right w:val="nil"/>
             </w:tcBorders>
+            <w:vAlign w:val="center"/>
           </w:tcPr>
           <w:p>
             <w:pPr>
@@ -13651,6 +13899,7 @@
               <w:bottom w:val="single" w:sz="18" w:space="0" w:color="000000"/>
               <w:right w:val="nil"/>
             </w:tcBorders>
+            <w:vAlign w:val="center"/>
           </w:tcPr>
           <w:p>
             <w:pPr>
@@ -13680,6 +13929,7 @@
               <w:bottom w:val="single" w:sz="18" w:space="0" w:color="000000"/>
               <w:right w:val="nil"/>
             </w:tcBorders>
+            <w:vAlign w:val="center"/>
           </w:tcPr>
           <w:p>
             <w:pPr>
@@ -13709,6 +13959,7 @@
               <w:bottom w:val="single" w:sz="18" w:space="0" w:color="000000"/>
               <w:right w:val="nil"/>
             </w:tcBorders>
+            <w:vAlign w:val="center"/>
           </w:tcPr>
           <w:p>
             <w:pPr>
@@ -13738,6 +13989,7 @@
               <w:bottom w:val="single" w:sz="18" w:space="0" w:color="000000"/>
               <w:right w:val="nil"/>
             </w:tcBorders>
+            <w:vAlign w:val="center"/>
           </w:tcPr>
           <w:p>
             <w:pPr>
@@ -13767,6 +14019,7 @@
               <w:bottom w:val="single" w:sz="18" w:space="0" w:color="000000"/>
               <w:right w:val="nil"/>
             </w:tcBorders>
+            <w:vAlign w:val="center"/>
           </w:tcPr>
           <w:p>
             <w:pPr>
@@ -13880,6 +14133,7 @@
               <w:bottom w:val="single" w:sz="4" w:space="0" w:color="000000"/>
               <w:right w:val="nil"/>
             </w:tcBorders>
+            <w:vAlign w:val="center"/>
           </w:tcPr>
           <w:p>
             <w:pPr>
@@ -13909,6 +14163,7 @@
               <w:bottom w:val="single" w:sz="4" w:space="0" w:color="000000"/>
               <w:right w:val="nil"/>
             </w:tcBorders>
+            <w:vAlign w:val="center"/>
           </w:tcPr>
           <w:p>
             <w:pPr>
@@ -13938,6 +14193,7 @@
               <w:bottom w:val="single" w:sz="4" w:space="0" w:color="000000"/>
               <w:right w:val="nil"/>
             </w:tcBorders>
+            <w:vAlign w:val="center"/>
           </w:tcPr>
           <w:p>
             <w:pPr>
@@ -13967,6 +14223,7 @@
               <w:bottom w:val="single" w:sz="4" w:space="0" w:color="000000"/>
               <w:right w:val="nil"/>
             </w:tcBorders>
+            <w:vAlign w:val="center"/>
           </w:tcPr>
           <w:p>
             <w:pPr>
@@ -14001,6 +14258,7 @@
               <w:bottom w:val="nil"/>
               <w:right w:val="nil"/>
             </w:tcBorders>
+            <w:vAlign w:val="center"/>
           </w:tcPr>
           <w:p>
             <w:pPr>
@@ -14030,6 +14288,7 @@
               <w:bottom w:val="nil"/>
               <w:right w:val="nil"/>
             </w:tcBorders>
+            <w:vAlign w:val="center"/>
           </w:tcPr>
           <w:p>
             <w:pPr>
@@ -14059,6 +14318,7 @@
               <w:bottom w:val="nil"/>
               <w:right w:val="nil"/>
             </w:tcBorders>
+            <w:vAlign w:val="center"/>
           </w:tcPr>
           <w:p>
             <w:pPr>
@@ -14088,6 +14348,7 @@
               <w:bottom w:val="nil"/>
               <w:right w:val="nil"/>
             </w:tcBorders>
+            <w:vAlign w:val="center"/>
           </w:tcPr>
           <w:p>
             <w:pPr>
@@ -14122,6 +14383,7 @@
               <w:bottom w:val="nil"/>
               <w:right w:val="nil"/>
             </w:tcBorders>
+            <w:vAlign w:val="center"/>
           </w:tcPr>
           <w:p>
             <w:pPr>
@@ -14151,6 +14413,7 @@
               <w:bottom w:val="nil"/>
               <w:right w:val="nil"/>
             </w:tcBorders>
+            <w:vAlign w:val="center"/>
           </w:tcPr>
           <w:p>
             <w:pPr>
@@ -14180,6 +14443,7 @@
               <w:bottom w:val="nil"/>
               <w:right w:val="nil"/>
             </w:tcBorders>
+            <w:vAlign w:val="center"/>
           </w:tcPr>
           <w:p>
             <w:pPr>
@@ -14209,6 +14473,7 @@
               <w:bottom w:val="nil"/>
               <w:right w:val="nil"/>
             </w:tcBorders>
+            <w:vAlign w:val="center"/>
           </w:tcPr>
           <w:p>
             <w:pPr>
@@ -14243,6 +14508,7 @@
               <w:bottom w:val="nil"/>
               <w:right w:val="nil"/>
             </w:tcBorders>
+            <w:vAlign w:val="center"/>
           </w:tcPr>
           <w:p>
             <w:pPr>
@@ -14272,6 +14538,7 @@
               <w:bottom w:val="nil"/>
               <w:right w:val="nil"/>
             </w:tcBorders>
+            <w:vAlign w:val="center"/>
           </w:tcPr>
           <w:p>
             <w:pPr>
@@ -14301,6 +14568,7 @@
               <w:bottom w:val="nil"/>
               <w:right w:val="nil"/>
             </w:tcBorders>
+            <w:vAlign w:val="center"/>
           </w:tcPr>
           <w:p>
             <w:pPr>
@@ -14330,6 +14598,7 @@
               <w:bottom w:val="nil"/>
               <w:right w:val="nil"/>
             </w:tcBorders>
+            <w:vAlign w:val="center"/>
           </w:tcPr>
           <w:p>
             <w:pPr>
@@ -14364,6 +14633,7 @@
               <w:bottom w:val="nil"/>
               <w:right w:val="nil"/>
             </w:tcBorders>
+            <w:vAlign w:val="center"/>
           </w:tcPr>
           <w:p>
             <w:pPr>
@@ -14393,6 +14663,7 @@
               <w:bottom w:val="nil"/>
               <w:right w:val="nil"/>
             </w:tcBorders>
+            <w:vAlign w:val="center"/>
           </w:tcPr>
           <w:p>
             <w:pPr>
@@ -14422,6 +14693,7 @@
               <w:bottom w:val="nil"/>
               <w:right w:val="nil"/>
             </w:tcBorders>
+            <w:vAlign w:val="center"/>
           </w:tcPr>
           <w:p>
             <w:pPr>
@@ -14451,6 +14723,7 @@
               <w:bottom w:val="nil"/>
               <w:right w:val="nil"/>
             </w:tcBorders>
+            <w:vAlign w:val="center"/>
           </w:tcPr>
           <w:p>
             <w:pPr>
@@ -14485,6 +14758,7 @@
               <w:bottom w:val="nil"/>
               <w:right w:val="nil"/>
             </w:tcBorders>
+            <w:vAlign w:val="center"/>
           </w:tcPr>
           <w:p>
             <w:pPr>
@@ -14514,6 +14788,7 @@
               <w:bottom w:val="nil"/>
               <w:right w:val="nil"/>
             </w:tcBorders>
+            <w:vAlign w:val="center"/>
           </w:tcPr>
           <w:p>
             <w:pPr>
@@ -14543,6 +14818,7 @@
               <w:bottom w:val="nil"/>
               <w:right w:val="nil"/>
             </w:tcBorders>
+            <w:vAlign w:val="center"/>
           </w:tcPr>
           <w:p>
             <w:pPr>
@@ -14572,6 +14848,7 @@
               <w:bottom w:val="nil"/>
               <w:right w:val="nil"/>
             </w:tcBorders>
+            <w:vAlign w:val="center"/>
           </w:tcPr>
           <w:p>
             <w:pPr>
@@ -14606,6 +14883,7 @@
               <w:bottom w:val="single" w:sz="18" w:space="0" w:color="000000"/>
               <w:right w:val="nil"/>
             </w:tcBorders>
+            <w:vAlign w:val="center"/>
           </w:tcPr>
           <w:p>
             <w:pPr>
@@ -14635,6 +14913,7 @@
               <w:bottom w:val="single" w:sz="18" w:space="0" w:color="000000"/>
               <w:right w:val="nil"/>
             </w:tcBorders>
+            <w:vAlign w:val="center"/>
           </w:tcPr>
           <w:p>
             <w:pPr>
@@ -14664,6 +14943,7 @@
               <w:bottom w:val="single" w:sz="18" w:space="0" w:color="000000"/>
               <w:right w:val="nil"/>
             </w:tcBorders>
+            <w:vAlign w:val="center"/>
           </w:tcPr>
           <w:p>
             <w:pPr>
@@ -14693,6 +14973,7 @@
               <w:bottom w:val="single" w:sz="18" w:space="0" w:color="000000"/>
               <w:right w:val="nil"/>
             </w:tcBorders>
+            <w:vAlign w:val="center"/>
           </w:tcPr>
           <w:p>
             <w:pPr>
@@ -14914,6 +15195,7 @@
               <w:bottom w:val="single" w:sz="4" w:space="0" w:color="000000"/>
               <w:right w:val="nil"/>
             </w:tcBorders>
+            <w:vAlign w:val="center"/>
           </w:tcPr>
           <w:p>
             <w:pPr>
@@ -14959,6 +15241,7 @@
               <w:bottom w:val="single" w:sz="4" w:space="0" w:color="000000"/>
               <w:right w:val="nil"/>
             </w:tcBorders>
+            <w:vAlign w:val="center"/>
           </w:tcPr>
           <w:p>
             <w:pPr>
@@ -15004,6 +15287,7 @@
               <w:bottom w:val="single" w:sz="4" w:space="0" w:color="000000"/>
               <w:right w:val="nil"/>
             </w:tcBorders>
+            <w:vAlign w:val="center"/>
           </w:tcPr>
           <w:p>
             <w:pPr>
@@ -15049,6 +15333,7 @@
               <w:bottom w:val="single" w:sz="4" w:space="0" w:color="000000"/>
               <w:right w:val="nil"/>
             </w:tcBorders>
+            <w:vAlign w:val="center"/>
           </w:tcPr>
           <w:p>
             <w:pPr>
@@ -15094,6 +15379,7 @@
               <w:bottom w:val="single" w:sz="4" w:space="0" w:color="000000"/>
               <w:right w:val="nil"/>
             </w:tcBorders>
+            <w:vAlign w:val="center"/>
           </w:tcPr>
           <w:p>
             <w:pPr>
@@ -15144,6 +15430,7 @@
               <w:bottom w:val="nil"/>
               <w:right w:val="nil"/>
             </w:tcBorders>
+            <w:vAlign w:val="center"/>
           </w:tcPr>
           <w:p>
             <w:pPr>
@@ -15178,6 +15465,7 @@
               <w:bottom w:val="nil"/>
               <w:right w:val="nil"/>
             </w:tcBorders>
+            <w:vAlign w:val="center"/>
           </w:tcPr>
           <w:p>
             <w:pPr>
@@ -15212,6 +15500,7 @@
               <w:bottom w:val="nil"/>
               <w:right w:val="nil"/>
             </w:tcBorders>
+            <w:vAlign w:val="center"/>
           </w:tcPr>
           <w:p>
             <w:pPr>
@@ -15246,6 +15535,7 @@
               <w:bottom w:val="nil"/>
               <w:right w:val="nil"/>
             </w:tcBorders>
+            <w:vAlign w:val="center"/>
           </w:tcPr>
           <w:p>
             <w:pPr>
@@ -15280,6 +15570,7 @@
               <w:bottom w:val="nil"/>
               <w:right w:val="nil"/>
             </w:tcBorders>
+            <w:vAlign w:val="center"/>
           </w:tcPr>
           <w:p>
             <w:pPr>
@@ -15319,6 +15610,7 @@
               <w:bottom w:val="nil"/>
               <w:right w:val="nil"/>
             </w:tcBorders>
+            <w:vAlign w:val="center"/>
           </w:tcPr>
           <w:p>
             <w:pPr>
@@ -15353,6 +15645,7 @@
               <w:bottom w:val="nil"/>
               <w:right w:val="nil"/>
             </w:tcBorders>
+            <w:vAlign w:val="center"/>
           </w:tcPr>
           <w:p>
             <w:pPr>
@@ -15387,6 +15680,7 @@
               <w:bottom w:val="nil"/>
               <w:right w:val="nil"/>
             </w:tcBorders>
+            <w:vAlign w:val="center"/>
           </w:tcPr>
           <w:p>
             <w:pPr>
@@ -15421,6 +15715,7 @@
               <w:bottom w:val="nil"/>
               <w:right w:val="nil"/>
             </w:tcBorders>
+            <w:vAlign w:val="center"/>
           </w:tcPr>
           <w:p>
             <w:pPr>
@@ -15455,6 +15750,7 @@
               <w:bottom w:val="nil"/>
               <w:right w:val="nil"/>
             </w:tcBorders>
+            <w:vAlign w:val="center"/>
           </w:tcPr>
           <w:p>
             <w:pPr>
@@ -15494,6 +15790,7 @@
               <w:bottom w:val="nil"/>
               <w:right w:val="nil"/>
             </w:tcBorders>
+            <w:vAlign w:val="center"/>
           </w:tcPr>
           <w:p>
             <w:pPr>
@@ -15528,6 +15825,7 @@
               <w:bottom w:val="nil"/>
               <w:right w:val="nil"/>
             </w:tcBorders>
+            <w:vAlign w:val="center"/>
           </w:tcPr>
           <w:p>
             <w:pPr>
@@ -15562,6 +15860,7 @@
               <w:bottom w:val="nil"/>
               <w:right w:val="nil"/>
             </w:tcBorders>
+            <w:vAlign w:val="center"/>
           </w:tcPr>
           <w:p>
             <w:pPr>
@@ -15596,6 +15895,7 @@
               <w:bottom w:val="nil"/>
               <w:right w:val="nil"/>
             </w:tcBorders>
+            <w:vAlign w:val="center"/>
           </w:tcPr>
           <w:p>
             <w:pPr>
@@ -15630,6 +15930,7 @@
               <w:bottom w:val="nil"/>
               <w:right w:val="nil"/>
             </w:tcBorders>
+            <w:vAlign w:val="center"/>
           </w:tcPr>
           <w:p>
             <w:pPr>
@@ -15669,6 +15970,7 @@
               <w:bottom w:val="nil"/>
               <w:right w:val="nil"/>
             </w:tcBorders>
+            <w:vAlign w:val="center"/>
           </w:tcPr>
           <w:p>
             <w:pPr>
@@ -15703,6 +16005,7 @@
               <w:bottom w:val="nil"/>
               <w:right w:val="nil"/>
             </w:tcBorders>
+            <w:vAlign w:val="center"/>
           </w:tcPr>
           <w:p>
             <w:pPr>
@@ -15737,6 +16040,7 @@
               <w:bottom w:val="nil"/>
               <w:right w:val="nil"/>
             </w:tcBorders>
+            <w:vAlign w:val="center"/>
           </w:tcPr>
           <w:p>
             <w:pPr>
@@ -15771,6 +16075,7 @@
               <w:bottom w:val="nil"/>
               <w:right w:val="nil"/>
             </w:tcBorders>
+            <w:vAlign w:val="center"/>
           </w:tcPr>
           <w:p>
             <w:pPr>
@@ -15805,6 +16110,7 @@
               <w:bottom w:val="nil"/>
               <w:right w:val="nil"/>
             </w:tcBorders>
+            <w:vAlign w:val="center"/>
           </w:tcPr>
           <w:p>
             <w:pPr>
@@ -15844,6 +16150,7 @@
               <w:bottom w:val="nil"/>
               <w:right w:val="nil"/>
             </w:tcBorders>
+            <w:vAlign w:val="center"/>
           </w:tcPr>
           <w:p>
             <w:pPr>
@@ -15878,6 +16185,7 @@
               <w:bottom w:val="nil"/>
               <w:right w:val="nil"/>
             </w:tcBorders>
+            <w:vAlign w:val="center"/>
           </w:tcPr>
           <w:p>
             <w:pPr>
@@ -15912,6 +16220,7 @@
               <w:bottom w:val="nil"/>
               <w:right w:val="nil"/>
             </w:tcBorders>
+            <w:vAlign w:val="center"/>
           </w:tcPr>
           <w:p>
             <w:pPr>
@@ -15946,6 +16255,7 @@
               <w:bottom w:val="nil"/>
               <w:right w:val="nil"/>
             </w:tcBorders>
+            <w:vAlign w:val="center"/>
           </w:tcPr>
           <w:p>
             <w:pPr>
@@ -15980,6 +16290,7 @@
               <w:bottom w:val="nil"/>
               <w:right w:val="nil"/>
             </w:tcBorders>
+            <w:vAlign w:val="center"/>
           </w:tcPr>
           <w:p>
             <w:pPr>
@@ -16019,6 +16330,7 @@
               <w:bottom w:val="single" w:sz="18" w:space="0" w:color="000000"/>
               <w:right w:val="nil"/>
             </w:tcBorders>
+            <w:vAlign w:val="center"/>
           </w:tcPr>
           <w:p>
             <w:pPr>
@@ -16053,6 +16365,7 @@
               <w:bottom w:val="single" w:sz="18" w:space="0" w:color="000000"/>
               <w:right w:val="nil"/>
             </w:tcBorders>
+            <w:vAlign w:val="center"/>
           </w:tcPr>
           <w:p>
             <w:pPr>
@@ -16087,6 +16400,7 @@
               <w:bottom w:val="single" w:sz="18" w:space="0" w:color="000000"/>
               <w:right w:val="nil"/>
             </w:tcBorders>
+            <w:vAlign w:val="center"/>
           </w:tcPr>
           <w:p>
             <w:pPr>
@@ -16121,6 +16435,7 @@
               <w:bottom w:val="single" w:sz="18" w:space="0" w:color="000000"/>
               <w:right w:val="nil"/>
             </w:tcBorders>
+            <w:vAlign w:val="center"/>
           </w:tcPr>
           <w:p>
             <w:pPr>
@@ -16155,6 +16470,7 @@
               <w:bottom w:val="single" w:sz="18" w:space="0" w:color="000000"/>
               <w:right w:val="nil"/>
             </w:tcBorders>
+            <w:vAlign w:val="center"/>
           </w:tcPr>
           <w:p>
             <w:pPr>
@@ -16315,6 +16631,7 @@
               <w:bottom w:val="single" w:sz="4" w:space="0" w:color="000000"/>
               <w:right w:val="nil"/>
             </w:tcBorders>
+            <w:vAlign w:val="center"/>
           </w:tcPr>
           <w:p>
             <w:pPr>
@@ -16344,6 +16661,7 @@
               <w:bottom w:val="single" w:sz="4" w:space="0" w:color="000000"/>
               <w:right w:val="nil"/>
             </w:tcBorders>
+            <w:vAlign w:val="center"/>
           </w:tcPr>
           <w:p>
             <w:pPr>
@@ -16373,6 +16691,7 @@
               <w:bottom w:val="single" w:sz="4" w:space="0" w:color="000000"/>
               <w:right w:val="nil"/>
             </w:tcBorders>
+            <w:vAlign w:val="center"/>
           </w:tcPr>
           <w:p>
             <w:pPr>
@@ -16402,6 +16721,7 @@
               <w:bottom w:val="single" w:sz="4" w:space="0" w:color="000000"/>
               <w:right w:val="nil"/>
             </w:tcBorders>
+            <w:vAlign w:val="center"/>
           </w:tcPr>
           <w:p>
             <w:pPr>
@@ -16431,6 +16751,7 @@
               <w:bottom w:val="single" w:sz="4" w:space="0" w:color="000000"/>
               <w:right w:val="nil"/>
             </w:tcBorders>
+            <w:vAlign w:val="center"/>
           </w:tcPr>
           <w:p>
             <w:pPr>
@@ -16465,6 +16786,7 @@
               <w:bottom w:val="nil"/>
               <w:right w:val="nil"/>
             </w:tcBorders>
+            <w:vAlign w:val="center"/>
           </w:tcPr>
           <w:p>
             <w:pPr>
@@ -16494,6 +16816,7 @@
               <w:bottom w:val="nil"/>
               <w:right w:val="nil"/>
             </w:tcBorders>
+            <w:vAlign w:val="center"/>
           </w:tcPr>
           <w:p>
             <w:pPr>
@@ -16523,6 +16846,7 @@
               <w:bottom w:val="nil"/>
               <w:right w:val="nil"/>
             </w:tcBorders>
+            <w:vAlign w:val="center"/>
           </w:tcPr>
           <w:p>
             <w:pPr>
@@ -16552,6 +16876,7 @@
               <w:bottom w:val="nil"/>
               <w:right w:val="nil"/>
             </w:tcBorders>
+            <w:vAlign w:val="center"/>
           </w:tcPr>
           <w:p>
             <w:pPr>
@@ -16581,6 +16906,7 @@
               <w:bottom w:val="nil"/>
               <w:right w:val="nil"/>
             </w:tcBorders>
+            <w:vAlign w:val="center"/>
           </w:tcPr>
           <w:p>
             <w:pPr>
@@ -16615,6 +16941,7 @@
               <w:bottom w:val="nil"/>
               <w:right w:val="nil"/>
             </w:tcBorders>
+            <w:vAlign w:val="center"/>
           </w:tcPr>
           <w:p>
             <w:pPr>
@@ -16644,6 +16971,7 @@
               <w:bottom w:val="nil"/>
               <w:right w:val="nil"/>
             </w:tcBorders>
+            <w:vAlign w:val="center"/>
           </w:tcPr>
           <w:p>
             <w:pPr>
@@ -16673,6 +17001,7 @@
               <w:bottom w:val="nil"/>
               <w:right w:val="nil"/>
             </w:tcBorders>
+            <w:vAlign w:val="center"/>
           </w:tcPr>
           <w:p>
             <w:pPr>
@@ -16702,6 +17031,7 @@
               <w:bottom w:val="nil"/>
               <w:right w:val="nil"/>
             </w:tcBorders>
+            <w:vAlign w:val="center"/>
           </w:tcPr>
           <w:p>
             <w:pPr>
@@ -16731,6 +17061,7 @@
               <w:bottom w:val="nil"/>
               <w:right w:val="nil"/>
             </w:tcBorders>
+            <w:vAlign w:val="center"/>
           </w:tcPr>
           <w:p>
             <w:pPr>
@@ -16765,6 +17096,7 @@
               <w:bottom w:val="nil"/>
               <w:right w:val="nil"/>
             </w:tcBorders>
+            <w:vAlign w:val="center"/>
           </w:tcPr>
           <w:p>
             <w:pPr>
@@ -16794,6 +17126,7 @@
               <w:bottom w:val="nil"/>
               <w:right w:val="nil"/>
             </w:tcBorders>
+            <w:vAlign w:val="center"/>
           </w:tcPr>
           <w:p>
             <w:pPr>
@@ -16823,6 +17156,7 @@
               <w:bottom w:val="nil"/>
               <w:right w:val="nil"/>
             </w:tcBorders>
+            <w:vAlign w:val="center"/>
           </w:tcPr>
           <w:p>
             <w:pPr>
@@ -16852,6 +17186,7 @@
               <w:bottom w:val="nil"/>
               <w:right w:val="nil"/>
             </w:tcBorders>
+            <w:vAlign w:val="center"/>
           </w:tcPr>
           <w:p>
             <w:pPr>
@@ -16881,6 +17216,7 @@
               <w:bottom w:val="nil"/>
               <w:right w:val="nil"/>
             </w:tcBorders>
+            <w:vAlign w:val="center"/>
           </w:tcPr>
           <w:p>
             <w:pPr>
@@ -16915,6 +17251,7 @@
               <w:bottom w:val="nil"/>
               <w:right w:val="nil"/>
             </w:tcBorders>
+            <w:vAlign w:val="center"/>
           </w:tcPr>
           <w:p>
             <w:pPr>
@@ -16944,6 +17281,7 @@
               <w:bottom w:val="nil"/>
               <w:right w:val="nil"/>
             </w:tcBorders>
+            <w:vAlign w:val="center"/>
           </w:tcPr>
           <w:p>
             <w:pPr>
@@ -16973,6 +17311,7 @@
               <w:bottom w:val="nil"/>
               <w:right w:val="nil"/>
             </w:tcBorders>
+            <w:vAlign w:val="center"/>
           </w:tcPr>
           <w:p>
             <w:pPr>
@@ -17002,6 +17341,7 @@
               <w:bottom w:val="nil"/>
               <w:right w:val="nil"/>
             </w:tcBorders>
+            <w:vAlign w:val="center"/>
           </w:tcPr>
           <w:p>
             <w:pPr>
@@ -17031,6 +17371,7 @@
               <w:bottom w:val="nil"/>
               <w:right w:val="nil"/>
             </w:tcBorders>
+            <w:vAlign w:val="center"/>
           </w:tcPr>
           <w:p>
             <w:pPr>
@@ -17065,6 +17406,7 @@
               <w:bottom w:val="nil"/>
               <w:right w:val="nil"/>
             </w:tcBorders>
+            <w:vAlign w:val="center"/>
           </w:tcPr>
           <w:p>
             <w:pPr>
@@ -17094,6 +17436,7 @@
               <w:bottom w:val="nil"/>
               <w:right w:val="nil"/>
             </w:tcBorders>
+            <w:vAlign w:val="center"/>
           </w:tcPr>
           <w:p>
             <w:pPr>
@@ -17123,6 +17466,7 @@
               <w:bottom w:val="nil"/>
               <w:right w:val="nil"/>
             </w:tcBorders>
+            <w:vAlign w:val="center"/>
           </w:tcPr>
           <w:p>
             <w:pPr>
@@ -17152,6 +17496,7 @@
               <w:bottom w:val="nil"/>
               <w:right w:val="nil"/>
             </w:tcBorders>
+            <w:vAlign w:val="center"/>
           </w:tcPr>
           <w:p>
             <w:pPr>
@@ -17181,6 +17526,7 @@
               <w:bottom w:val="nil"/>
               <w:right w:val="nil"/>
             </w:tcBorders>
+            <w:vAlign w:val="center"/>
           </w:tcPr>
           <w:p>
             <w:pPr>
@@ -17215,6 +17561,7 @@
               <w:bottom w:val="single" w:sz="18" w:space="0" w:color="000000"/>
               <w:right w:val="nil"/>
             </w:tcBorders>
+            <w:vAlign w:val="center"/>
           </w:tcPr>
           <w:p>
             <w:pPr>
@@ -17244,6 +17591,7 @@
               <w:bottom w:val="single" w:sz="18" w:space="0" w:color="000000"/>
               <w:right w:val="nil"/>
             </w:tcBorders>
+            <w:vAlign w:val="center"/>
           </w:tcPr>
           <w:p>
             <w:pPr>
@@ -17273,6 +17621,7 @@
               <w:bottom w:val="single" w:sz="18" w:space="0" w:color="000000"/>
               <w:right w:val="nil"/>
             </w:tcBorders>
+            <w:vAlign w:val="center"/>
           </w:tcPr>
           <w:p>
             <w:pPr>
@@ -17302,6 +17651,7 @@
               <w:bottom w:val="single" w:sz="18" w:space="0" w:color="000000"/>
               <w:right w:val="nil"/>
             </w:tcBorders>
+            <w:vAlign w:val="center"/>
           </w:tcPr>
           <w:p>
             <w:pPr>
@@ -17331,6 +17681,7 @@
               <w:bottom w:val="single" w:sz="18" w:space="0" w:color="000000"/>
               <w:right w:val="nil"/>
             </w:tcBorders>
+            <w:vAlign w:val="center"/>
           </w:tcPr>
           <w:p>
             <w:pPr>

</xml_diff>

<commit_message>
Draft_124_body: space after every table before next para
before=240 on the paragraph following each table so body
does not stick to the table edge.
</commit_message>
<xml_diff>
--- a/thesis/003_ThesisProposal_Draft_124_body.docx
+++ b/thesis/003_ThesisProposal_Draft_124_body.docx
@@ -7757,7 +7757,7 @@
     </w:tbl>
     <w:p>
       <w:pPr>
-        <w:spacing w:after="0" w:before="0" w:line="480" w:lineRule="auto"/>
+        <w:spacing w:after="0" w:before="240" w:line="480" w:lineRule="auto"/>
         <w:jc w:val="both"/>
         <w:rPr/>
         <w:ind w:firstLine="720" w:left="0"/>
@@ -10676,7 +10676,7 @@
     </w:tbl>
     <w:p>
       <w:pPr>
-        <w:spacing w:after="0" w:before="0" w:line="480" w:lineRule="auto"/>
+        <w:spacing w:after="0" w:before="240" w:line="480" w:lineRule="auto"/>
         <w:jc w:val="both"/>
         <w:rPr/>
         <w:ind w:firstLine="720" w:left="0"/>
@@ -12351,7 +12351,7 @@
     </w:tbl>
     <w:p>
       <w:pPr>
-        <w:spacing w:after="0" w:before="0" w:line="480" w:lineRule="auto"/>
+        <w:spacing w:after="0" w:before="240" w:line="480" w:lineRule="auto"/>
         <w:jc w:val="both"/>
         <w:rPr/>
         <w:ind w:firstLine="720" w:left="0"/>
@@ -13394,7 +13394,7 @@
     </w:tbl>
     <w:p>
       <w:pPr>
-        <w:spacing w:line="480" w:lineRule="auto" w:before="0" w:after="0"/>
+        <w:spacing w:line="480" w:lineRule="auto" w:before="240" w:after="0"/>
         <w:jc w:val="both"/>
         <w:ind w:firstLine="720" w:left="0"/>
       </w:pPr>
@@ -14243,7 +14243,7 @@
     </w:tbl>
     <w:p>
       <w:pPr>
-        <w:spacing w:after="0" w:before="0" w:line="480" w:lineRule="auto"/>
+        <w:spacing w:after="0" w:before="240" w:line="480" w:lineRule="auto"/>
         <w:jc w:val="both"/>
         <w:rPr/>
         <w:ind w:firstLine="720" w:left="0"/>
@@ -15658,7 +15658,7 @@
     </w:tbl>
     <w:p>
       <w:pPr>
-        <w:spacing w:line="480" w:lineRule="auto" w:before="0" w:after="0"/>
+        <w:spacing w:line="480" w:lineRule="auto" w:before="240" w:after="0"/>
         <w:jc w:val="both"/>
         <w:ind w:firstLine="720" w:left="0"/>
       </w:pPr>
@@ -16780,7 +16780,7 @@
     </w:tbl>
     <w:p>
       <w:pPr>
-        <w:spacing w:after="0" w:before="0" w:line="480" w:lineRule="auto"/>
+        <w:spacing w:after="0" w:before="240" w:line="480" w:lineRule="auto"/>
         <w:jc w:val="both"/>
         <w:rPr/>
         <w:ind w:firstLine="720" w:left="0"/>

</xml_diff>

<commit_message>
Draft_124_body: spacer paragraph after every table
Word suppresses space-before after tables. Empty double-spaced
paragraph after each table creates a visible gap.
</commit_message>
<xml_diff>
--- a/thesis/003_ThesisProposal_Draft_124_body.docx
+++ b/thesis/003_ThesisProposal_Draft_124_body.docx
@@ -4276,6 +4276,12 @@
     </w:tbl>
     <w:p>
       <w:pPr>
+        <w:spacing w:before="0" w:after="0" w:line="480" w:lineRule="auto"/>
+        <w:ind w:left="0" w:right="0" w:firstLine="0" w:firstLineChars="0" w:hanging="0" w:hangingChars="0"/>
+      </w:pPr>
+    </w:p>
+    <w:p>
+      <w:pPr>
         <w:spacing w:after="0" w:before="240" w:line="480" w:lineRule="auto"/>
         <w:jc w:val="left"/>
         <w:rPr>
@@ -5407,6 +5413,12 @@
         </w:tc>
       </w:tr>
     </w:tbl>
+    <w:p>
+      <w:pPr>
+        <w:spacing w:before="0" w:after="0" w:line="480" w:lineRule="auto"/>
+        <w:ind w:left="0" w:right="0" w:firstLine="0" w:firstLineChars="0" w:hanging="0" w:hangingChars="0"/>
+      </w:pPr>
+    </w:p>
     <w:p>
       <w:pPr>
         <w:spacing w:after="0" w:before="240" w:line="480" w:lineRule="auto"/>
@@ -7757,6 +7769,12 @@
     </w:tbl>
     <w:p>
       <w:pPr>
+        <w:spacing w:before="0" w:after="0" w:line="480" w:lineRule="auto"/>
+        <w:ind w:left="0" w:right="0" w:firstLine="0" w:firstLineChars="0" w:hanging="0" w:hangingChars="0"/>
+      </w:pPr>
+    </w:p>
+    <w:p>
+      <w:pPr>
         <w:spacing w:after="0" w:before="240" w:line="480" w:lineRule="auto"/>
         <w:jc w:val="both"/>
         <w:rPr/>
@@ -10676,6 +10694,12 @@
     </w:tbl>
     <w:p>
       <w:pPr>
+        <w:spacing w:before="0" w:after="0" w:line="480" w:lineRule="auto"/>
+        <w:ind w:left="0" w:right="0" w:firstLine="0" w:firstLineChars="0" w:hanging="0" w:hangingChars="0"/>
+      </w:pPr>
+    </w:p>
+    <w:p>
+      <w:pPr>
         <w:spacing w:after="0" w:before="240" w:line="480" w:lineRule="auto"/>
         <w:jc w:val="both"/>
         <w:rPr/>
@@ -12351,6 +12375,12 @@
     </w:tbl>
     <w:p>
       <w:pPr>
+        <w:spacing w:before="0" w:after="0" w:line="480" w:lineRule="auto"/>
+        <w:ind w:left="0" w:right="0" w:firstLine="0" w:firstLineChars="0" w:hanging="0" w:hangingChars="0"/>
+      </w:pPr>
+    </w:p>
+    <w:p>
+      <w:pPr>
         <w:spacing w:after="0" w:before="240" w:line="480" w:lineRule="auto"/>
         <w:jc w:val="both"/>
         <w:rPr/>
@@ -13392,6 +13422,12 @@
         </w:tc>
       </w:tr>
     </w:tbl>
+    <w:p>
+      <w:pPr>
+        <w:spacing w:before="0" w:after="0" w:line="480" w:lineRule="auto"/>
+        <w:ind w:left="0" w:right="0" w:firstLine="0" w:firstLineChars="0" w:hanging="0" w:hangingChars="0"/>
+      </w:pPr>
+    </w:p>
     <w:p>
       <w:pPr>
         <w:spacing w:line="480" w:lineRule="auto" w:before="240" w:after="0"/>
@@ -14243,6 +14279,12 @@
     </w:tbl>
     <w:p>
       <w:pPr>
+        <w:spacing w:before="0" w:after="0" w:line="480" w:lineRule="auto"/>
+        <w:ind w:left="0" w:right="0" w:firstLine="0" w:firstLineChars="0" w:hanging="0" w:hangingChars="0"/>
+      </w:pPr>
+    </w:p>
+    <w:p>
+      <w:pPr>
         <w:spacing w:after="0" w:before="240" w:line="480" w:lineRule="auto"/>
         <w:jc w:val="both"/>
         <w:rPr/>
@@ -15658,6 +15700,12 @@
     </w:tbl>
     <w:p>
       <w:pPr>
+        <w:spacing w:before="0" w:after="0" w:line="480" w:lineRule="auto"/>
+        <w:ind w:left="0" w:right="0" w:firstLine="0" w:firstLineChars="0" w:hanging="0" w:hangingChars="0"/>
+      </w:pPr>
+    </w:p>
+    <w:p>
+      <w:pPr>
         <w:spacing w:line="480" w:lineRule="auto" w:before="240" w:after="0"/>
         <w:jc w:val="both"/>
         <w:ind w:firstLine="720" w:left="0"/>
@@ -16778,6 +16826,12 @@
         </w:tc>
       </w:tr>
     </w:tbl>
+    <w:p>
+      <w:pPr>
+        <w:spacing w:before="0" w:after="0" w:line="480" w:lineRule="auto"/>
+        <w:ind w:left="0" w:right="0" w:firstLine="0" w:firstLineChars="0" w:hanging="0" w:hangingChars="0"/>
+      </w:pPr>
+    </w:p>
     <w:p>
       <w:pPr>
         <w:spacing w:after="0" w:before="240" w:line="480" w:lineRule="auto"/>
@@ -18493,6 +18547,12 @@
     </w:tbl>
     <w:p>
       <w:pPr>
+        <w:spacing w:before="0" w:after="0" w:line="480" w:lineRule="auto"/>
+        <w:ind w:left="0" w:right="0" w:firstLine="0" w:firstLineChars="0" w:hanging="0" w:hangingChars="0"/>
+      </w:pPr>
+    </w:p>
+    <w:p>
+      <w:pPr>
         <w:spacing w:line="480" w:lineRule="auto" w:before="240" w:after="0"/>
         <w:jc w:val="left"/>
         <w:ind w:left="0" w:right="0" w:firstLine="0" w:firstLineChars="0" w:hanging="0" w:hangingChars="0"/>
@@ -19906,6 +19966,12 @@
         </w:tc>
       </w:tr>
     </w:tbl>
+    <w:p>
+      <w:pPr>
+        <w:spacing w:before="0" w:after="0" w:line="480" w:lineRule="auto"/>
+        <w:ind w:left="0" w:right="0" w:firstLine="0" w:firstLineChars="0" w:hanging="0" w:hangingChars="0"/>
+      </w:pPr>
+    </w:p>
     <w:p>
       <w:pPr>
         <w:spacing w:line="480" w:lineRule="auto" w:before="240" w:after="0"/>

</xml_diff>

<commit_message>
Draft_124_body: clear space-before after table spacers
Gap after tables is spacer paragraph only; no extra before.
</commit_message>
<xml_diff>
--- a/thesis/003_ThesisProposal_Draft_124_body.docx
+++ b/thesis/003_ThesisProposal_Draft_124_body.docx
@@ -4282,7 +4282,7 @@
     </w:p>
     <w:p>
       <w:pPr>
-        <w:spacing w:after="0" w:before="240" w:line="480" w:lineRule="auto"/>
+        <w:spacing w:after="0" w:before="0" w:line="480" w:lineRule="auto"/>
         <w:jc w:val="left"/>
         <w:rPr>
           <w:sz w:val="24"/>
@@ -5421,7 +5421,7 @@
     </w:p>
     <w:p>
       <w:pPr>
-        <w:spacing w:after="0" w:before="240" w:line="480" w:lineRule="auto"/>
+        <w:spacing w:after="0" w:before="0" w:line="480" w:lineRule="auto"/>
         <w:jc w:val="left"/>
         <w:rPr>
           <w:sz w:val="24"/>
@@ -7775,7 +7775,7 @@
     </w:p>
     <w:p>
       <w:pPr>
-        <w:spacing w:after="0" w:before="240" w:line="480" w:lineRule="auto"/>
+        <w:spacing w:after="0" w:before="0" w:line="480" w:lineRule="auto"/>
         <w:jc w:val="both"/>
         <w:rPr/>
         <w:ind w:firstLine="720" w:left="0"/>
@@ -10700,7 +10700,7 @@
     </w:p>
     <w:p>
       <w:pPr>
-        <w:spacing w:after="0" w:before="240" w:line="480" w:lineRule="auto"/>
+        <w:spacing w:after="0" w:before="0" w:line="480" w:lineRule="auto"/>
         <w:jc w:val="both"/>
         <w:rPr/>
         <w:ind w:firstLine="720" w:left="0"/>
@@ -12381,7 +12381,7 @@
     </w:p>
     <w:p>
       <w:pPr>
-        <w:spacing w:after="0" w:before="240" w:line="480" w:lineRule="auto"/>
+        <w:spacing w:after="0" w:before="0" w:line="480" w:lineRule="auto"/>
         <w:jc w:val="both"/>
         <w:rPr/>
         <w:ind w:firstLine="720" w:left="0"/>
@@ -13430,7 +13430,7 @@
     </w:p>
     <w:p>
       <w:pPr>
-        <w:spacing w:line="480" w:lineRule="auto" w:before="240" w:after="0"/>
+        <w:spacing w:line="480" w:lineRule="auto" w:before="0" w:after="0"/>
         <w:jc w:val="both"/>
         <w:ind w:firstLine="720" w:left="0"/>
       </w:pPr>
@@ -14285,7 +14285,7 @@
     </w:p>
     <w:p>
       <w:pPr>
-        <w:spacing w:after="0" w:before="240" w:line="480" w:lineRule="auto"/>
+        <w:spacing w:after="0" w:before="0" w:line="480" w:lineRule="auto"/>
         <w:jc w:val="both"/>
         <w:rPr/>
         <w:ind w:firstLine="720" w:left="0"/>
@@ -15706,7 +15706,7 @@
     </w:p>
     <w:p>
       <w:pPr>
-        <w:spacing w:line="480" w:lineRule="auto" w:before="240" w:after="0"/>
+        <w:spacing w:line="480" w:lineRule="auto" w:before="0" w:after="0"/>
         <w:jc w:val="both"/>
         <w:ind w:firstLine="720" w:left="0"/>
       </w:pPr>
@@ -16834,7 +16834,7 @@
     </w:p>
     <w:p>
       <w:pPr>
-        <w:spacing w:after="0" w:before="240" w:line="480" w:lineRule="auto"/>
+        <w:spacing w:after="0" w:before="0" w:line="480" w:lineRule="auto"/>
         <w:jc w:val="both"/>
         <w:rPr/>
         <w:ind w:firstLine="720" w:left="0"/>
@@ -18553,7 +18553,7 @@
     </w:p>
     <w:p>
       <w:pPr>
-        <w:spacing w:line="480" w:lineRule="auto" w:before="240" w:after="0"/>
+        <w:spacing w:line="480" w:lineRule="auto" w:before="0" w:after="0"/>
         <w:jc w:val="left"/>
         <w:ind w:left="0" w:right="0" w:firstLine="0" w:firstLineChars="0" w:hanging="0" w:hangingChars="0"/>
         <w:keepNext/>
@@ -19974,7 +19974,7 @@
     </w:p>
     <w:p>
       <w:pPr>
-        <w:spacing w:line="480" w:lineRule="auto" w:before="240" w:after="0"/>
+        <w:spacing w:line="480" w:lineRule="auto" w:before="0" w:after="0"/>
         <w:jc w:val="left"/>
         <w:ind w:left="0" w:right="0" w:firstLine="0" w:firstLineChars="0" w:hanging="0" w:hangingChars="0"/>
         <w:keepNext/>

</xml_diff>

<commit_message>
Draft_124_body: keepNext on all table labels; cantSplit confirmed
Universal caption keep-with-table; rows break between only.
</commit_message>
<xml_diff>
--- a/thesis/003_ThesisProposal_Draft_124_body.docx
+++ b/thesis/003_ThesisProposal_Draft_124_body.docx
@@ -4341,6 +4341,7 @@
         <w:spacing w:before="240" w:after="0" w:line="480" w:lineRule="auto"/>
         <w:jc w:val="left"/>
         <w:ind w:left="0" w:right="0" w:firstLine="0" w:firstLineChars="0" w:hanging="0" w:hangingChars="0"/>
+        <w:keepNext/>
       </w:pPr>
       <w:r>
         <w:rPr>
@@ -4359,6 +4360,7 @@
         <w:spacing w:line="480" w:lineRule="auto" w:before="0" w:after="240"/>
         <w:jc w:val="left"/>
         <w:ind w:left="0" w:right="0" w:firstLine="0" w:firstLineChars="0" w:hanging="0" w:hangingChars="0"/>
+        <w:keepNext/>
       </w:pPr>
       <w:r>
         <w:rPr>
@@ -5806,6 +5808,7 @@
         <w:jc w:val="left"/>
         <w:rPr/>
         <w:ind w:left="0" w:right="0" w:firstLine="0" w:firstLineChars="0" w:hanging="0" w:hangingChars="0"/>
+        <w:keepNext/>
       </w:pPr>
       <w:r>
         <w:rPr>
@@ -5825,6 +5828,7 @@
         <w:jc w:val="left"/>
         <w:rPr/>
         <w:ind w:left="0" w:right="0" w:firstLine="0" w:firstLineChars="0" w:hanging="0" w:hangingChars="0"/>
+        <w:keepNext/>
       </w:pPr>
       <w:r>
         <w:rPr>
@@ -7868,6 +7872,7 @@
         <w:jc w:val="left"/>
         <w:rPr/>
         <w:ind w:left="0" w:right="0" w:firstLine="0" w:firstLineChars="0" w:hanging="0" w:hangingChars="0"/>
+        <w:keepNext/>
       </w:pPr>
       <w:r>
         <w:rPr>
@@ -7887,6 +7892,7 @@
         <w:jc w:val="left"/>
         <w:rPr/>
         <w:ind w:left="0" w:right="0" w:firstLine="0" w:firstLineChars="0" w:hanging="0" w:hangingChars="0"/>
+        <w:keepNext/>
       </w:pPr>
       <w:r>
         <w:rPr>
@@ -10834,6 +10840,7 @@
         <w:jc w:val="left"/>
         <w:rPr/>
         <w:ind w:left="0" w:right="0" w:firstLine="0" w:firstLineChars="0" w:hanging="0" w:hangingChars="0"/>
+        <w:keepNext/>
       </w:pPr>
       <w:r>
         <w:rPr>
@@ -10853,6 +10860,7 @@
         <w:jc w:val="left"/>
         <w:rPr/>
         <w:ind w:left="0" w:right="0" w:firstLine="0" w:firstLineChars="0" w:hanging="0" w:hangingChars="0"/>
+        <w:keepNext/>
       </w:pPr>
       <w:r>
         <w:rPr>
@@ -12440,6 +12448,7 @@
         <w:spacing w:line="480" w:lineRule="auto" w:before="0" w:after="0"/>
         <w:jc w:val="both"/>
         <w:ind w:firstLine="720" w:left="0"/>
+        <w:keepNext/>
       </w:pPr>
       <w:r>
         <w:rPr>
@@ -12458,6 +12467,7 @@
         <w:spacing w:line="480" w:lineRule="auto" w:before="0" w:after="0"/>
         <w:jc w:val="both"/>
         <w:ind w:firstLine="720" w:left="0"/>
+        <w:keepNext/>
       </w:pPr>
       <w:r>
         <w:rPr>
@@ -13603,6 +13613,7 @@
         <w:jc w:val="left"/>
         <w:rPr/>
         <w:ind w:left="0" w:right="0" w:firstLine="0" w:firstLineChars="0" w:hanging="0" w:hangingChars="0"/>
+        <w:keepNext/>
       </w:pPr>
       <w:r>
         <w:rPr>
@@ -13622,6 +13633,7 @@
         <w:jc w:val="left"/>
         <w:rPr/>
         <w:ind w:left="0" w:right="0" w:firstLine="0" w:firstLineChars="0" w:hanging="0" w:hangingChars="0"/>
+        <w:keepNext/>
       </w:pPr>
       <w:r>
         <w:rPr>
@@ -14346,6 +14358,7 @@
         <w:spacing w:line="480" w:lineRule="auto" w:before="0" w:after="0"/>
         <w:jc w:val="both"/>
         <w:ind w:firstLine="720" w:left="0"/>
+        <w:keepNext/>
       </w:pPr>
       <w:r>
         <w:rPr>
@@ -14364,6 +14377,7 @@
         <w:spacing w:line="480" w:lineRule="auto" w:before="0" w:after="0"/>
         <w:jc w:val="both"/>
         <w:ind w:firstLine="720" w:left="0"/>
+        <w:keepNext/>
       </w:pPr>
       <w:r>
         <w:rPr>
@@ -15727,6 +15741,7 @@
         <w:spacing w:line="480" w:lineRule="auto" w:before="0" w:after="0"/>
         <w:jc w:val="both"/>
         <w:ind w:firstLine="720" w:left="0"/>
+        <w:keepNext/>
       </w:pPr>
       <w:r>
         <w:rPr>
@@ -15745,6 +15760,7 @@
         <w:spacing w:line="480" w:lineRule="auto" w:before="0" w:after="0"/>
         <w:jc w:val="both"/>
         <w:ind w:firstLine="720" w:left="0"/>
+        <w:keepNext/>
       </w:pPr>
       <w:r>
         <w:rPr>
@@ -16952,6 +16968,7 @@
         <w:jc w:val="left"/>
         <w:rPr/>
         <w:ind w:left="0" w:right="0" w:firstLine="0" w:firstLineChars="0" w:hanging="0" w:hangingChars="0"/>
+        <w:keepNext/>
       </w:pPr>
       <w:r>
         <w:rPr>
@@ -16971,6 +16988,7 @@
         <w:jc w:val="left"/>
         <w:rPr/>
         <w:ind w:left="0" w:right="0" w:firstLine="0" w:firstLineChars="0" w:hanging="0" w:hangingChars="0"/>
+        <w:keepNext/>
       </w:pPr>
       <w:r>
         <w:rPr>
@@ -18614,6 +18632,7 @@
         <w:spacing w:line="480" w:lineRule="auto" w:before="0" w:after="0"/>
         <w:jc w:val="both"/>
         <w:ind w:firstLine="720" w:left="0"/>
+        <w:keepNext/>
       </w:pPr>
       <w:r>
         <w:rPr>
@@ -18632,6 +18651,7 @@
         <w:spacing w:line="480" w:lineRule="auto" w:before="0" w:after="0"/>
         <w:jc w:val="both"/>
         <w:ind w:firstLine="720" w:left="0"/>
+        <w:keepNext/>
       </w:pPr>
       <w:r>
         <w:rPr>

</xml_diff>

<commit_message>
Draft_124_body: uniform table labels for whole and decimal IDs
Decimal captions match whole-number style; title regular not bold.
</commit_message>
<xml_diff>
--- a/thesis/003_ThesisProposal_Draft_124_body.docx
+++ b/thesis/003_ThesisProposal_Draft_124_body.docx
@@ -4340,17 +4340,18 @@
       <w:pPr>
         <w:spacing w:before="240" w:after="0" w:line="480" w:lineRule="auto"/>
         <w:jc w:val="left"/>
-        <w:ind w:left="0" w:right="0" w:firstLine="0" w:firstLineChars="0" w:hanging="0" w:hangingChars="0"/>
+        <w:ind w:left="0" w:right="0" w:firstLine="0" w:firstLineChars="0" w:hangingChars="0"/>
         <w:keepNext/>
       </w:pPr>
       <w:r>
         <w:rPr>
           <w:rFonts w:ascii="Georgia" w:hAnsi="Georgia" w:cs="Georgia" w:eastAsia="Georgia"/>
-          <w:sz w:val="22"/>
-          <w:b w:val="1"/>
+          <w:b/>
           <w:bCs w:val="1"/>
           <w:i w:val="0"/>
           <w:iCs w:val="0"/>
+          <w:sz w:val="22"/>
+          <w:szCs w:val="22"/>
         </w:rPr>
         <w:t>Table 1</w:t>
       </w:r>
@@ -4359,17 +4360,16 @@
       <w:pPr>
         <w:spacing w:line="480" w:lineRule="auto" w:before="0" w:after="240"/>
         <w:jc w:val="left"/>
-        <w:ind w:left="0" w:right="0" w:firstLine="0" w:firstLineChars="0" w:hanging="0" w:hangingChars="0"/>
+        <w:ind w:left="0" w:right="0" w:firstLine="0" w:firstLineChars="0" w:hangingChars="0"/>
         <w:keepNext/>
       </w:pPr>
       <w:r>
         <w:rPr>
           <w:rFonts w:ascii="Georgia" w:hAnsi="Georgia" w:cs="Georgia" w:eastAsia="Georgia"/>
-          <w:sz w:val="22"/>
-          <w:b w:val="0"/>
-          <w:bCs w:val="0"/>
-          <w:i w:val="0"/>
-          <w:iCs w:val="0"/>
+          <w:i w:val="0"/>
+          <w:iCs w:val="0"/>
+          <w:sz w:val="22"/>
+          <w:szCs w:val="22"/>
         </w:rPr>
         <w:t>Decision rules for ambiguous hedge forms.</w:t>
       </w:r>
@@ -5807,17 +5807,18 @@
         <w:spacing w:after="0" w:before="240" w:line="480" w:lineRule="auto"/>
         <w:jc w:val="left"/>
         <w:rPr/>
-        <w:ind w:left="0" w:right="0" w:firstLine="0" w:firstLineChars="0" w:hanging="0" w:hangingChars="0"/>
+        <w:ind w:left="0" w:right="0" w:firstLine="0" w:firstLineChars="0" w:hangingChars="0"/>
         <w:keepNext/>
       </w:pPr>
       <w:r>
         <w:rPr>
           <w:rFonts w:ascii="Georgia" w:hAnsi="Georgia" w:cs="Georgia" w:eastAsia="Georgia"/>
-          <w:sz w:val="22"/>
-          <w:b w:val="1"/>
+          <w:b/>
           <w:bCs w:val="1"/>
           <w:i w:val="0"/>
           <w:iCs w:val="0"/>
+          <w:sz w:val="22"/>
+          <w:szCs w:val="22"/>
         </w:rPr>
         <w:t>Table 2</w:t>
       </w:r>
@@ -5827,20 +5828,19 @@
         <w:spacing w:after="240" w:before="0" w:line="480" w:lineRule="auto"/>
         <w:jc w:val="left"/>
         <w:rPr/>
-        <w:ind w:left="0" w:right="0" w:firstLine="0" w:firstLineChars="0" w:hanging="0" w:hangingChars="0"/>
+        <w:ind w:left="0" w:right="0" w:firstLine="0" w:firstLineChars="0" w:hangingChars="0"/>
         <w:keepNext/>
       </w:pPr>
       <w:r>
         <w:rPr>
           <w:rFonts w:ascii="Georgia" w:hAnsi="Georgia" w:cs="Georgia" w:eastAsia="Georgia"/>
-          <w:sz w:val="22"/>
           <w:rtl w:val="0"/>
-          <w:b w:val="0"/>
-          <w:bCs w:val="0"/>
-          <w:i w:val="0"/>
-          <w:iCs w:val="0"/>
-        </w:rPr>
-        <w:t xml:space="preserve">PSAU Thesis Repository: Population and Sampling Summary</w:t>
+          <w:i w:val="0"/>
+          <w:iCs w:val="0"/>
+          <w:sz w:val="22"/>
+          <w:szCs w:val="22"/>
+        </w:rPr>
+        <w:t>PSAU Thesis Repository: Population and Sampling Summary</w:t>
       </w:r>
     </w:p>
     <w:tbl>
@@ -7871,17 +7871,18 @@
         <w:spacing w:after="0" w:before="240" w:line="480" w:lineRule="auto"/>
         <w:jc w:val="left"/>
         <w:rPr/>
-        <w:ind w:left="0" w:right="0" w:firstLine="0" w:firstLineChars="0" w:hanging="0" w:hangingChars="0"/>
+        <w:ind w:left="0" w:right="0" w:firstLine="0" w:firstLineChars="0" w:hangingChars="0"/>
         <w:keepNext/>
       </w:pPr>
       <w:r>
         <w:rPr>
           <w:rFonts w:ascii="Georgia" w:hAnsi="Georgia" w:cs="Georgia" w:eastAsia="Georgia"/>
-          <w:sz w:val="22"/>
-          <w:b w:val="1"/>
+          <w:b/>
           <w:bCs w:val="1"/>
           <w:i w:val="0"/>
           <w:iCs w:val="0"/>
+          <w:sz w:val="22"/>
+          <w:szCs w:val="22"/>
         </w:rPr>
         <w:t>Table 3</w:t>
       </w:r>
@@ -7891,18 +7892,17 @@
         <w:spacing w:after="240" w:before="0" w:line="480" w:lineRule="auto"/>
         <w:jc w:val="left"/>
         <w:rPr/>
-        <w:ind w:left="0" w:right="0" w:firstLine="0" w:firstLineChars="0" w:hanging="0" w:hangingChars="0"/>
+        <w:ind w:left="0" w:right="0" w:firstLine="0" w:firstLineChars="0" w:hangingChars="0"/>
         <w:keepNext/>
       </w:pPr>
       <w:r>
         <w:rPr>
           <w:rFonts w:ascii="Georgia" w:hAnsi="Georgia" w:cs="Georgia" w:eastAsia="Georgia"/>
-          <w:sz w:val="22"/>
           <w:rtl w:val="0"/>
-          <w:b w:val="0"/>
-          <w:bCs w:val="0"/>
-          <w:i w:val="0"/>
-          <w:iCs w:val="0"/>
+          <w:i w:val="0"/>
+          <w:iCs w:val="0"/>
+          <w:sz w:val="22"/>
+          <w:szCs w:val="22"/>
         </w:rPr>
         <w:t>Hedge Types by Count and Discipline</w:t>
       </w:r>
@@ -10839,17 +10839,18 @@
         <w:spacing w:after="0" w:before="240" w:line="480" w:lineRule="auto"/>
         <w:jc w:val="left"/>
         <w:rPr/>
-        <w:ind w:left="0" w:right="0" w:firstLine="0" w:firstLineChars="0" w:hanging="0" w:hangingChars="0"/>
+        <w:ind w:left="0" w:right="0" w:firstLine="0" w:firstLineChars="0" w:hangingChars="0"/>
         <w:keepNext/>
       </w:pPr>
       <w:r>
         <w:rPr>
           <w:rFonts w:ascii="Georgia" w:hAnsi="Georgia" w:cs="Georgia" w:eastAsia="Georgia"/>
-          <w:sz w:val="22"/>
-          <w:b w:val="1"/>
+          <w:b/>
           <w:bCs w:val="1"/>
           <w:i w:val="0"/>
           <w:iCs w:val="0"/>
+          <w:sz w:val="22"/>
+          <w:szCs w:val="22"/>
         </w:rPr>
         <w:t>Table 4</w:t>
       </w:r>
@@ -10859,20 +10860,19 @@
         <w:spacing w:after="240" w:before="0" w:line="480" w:lineRule="auto"/>
         <w:jc w:val="left"/>
         <w:rPr/>
-        <w:ind w:left="0" w:right="0" w:firstLine="0" w:firstLineChars="0" w:hanging="0" w:hangingChars="0"/>
+        <w:ind w:left="0" w:right="0" w:firstLine="0" w:firstLineChars="0" w:hangingChars="0"/>
         <w:keepNext/>
       </w:pPr>
       <w:r>
         <w:rPr>
           <w:rFonts w:ascii="Georgia" w:hAnsi="Georgia" w:cs="Georgia" w:eastAsia="Georgia"/>
-          <w:sz w:val="22"/>
           <w:rtl w:val="0"/>
-          <w:b w:val="0"/>
-          <w:bCs w:val="0"/>
-          <w:i w:val="0"/>
-          <w:iCs w:val="0"/>
-        </w:rPr>
-        <w:t xml:space="preserve">Hedge Frequency by Discipline</w:t>
+          <w:i w:val="0"/>
+          <w:iCs w:val="0"/>
+          <w:sz w:val="22"/>
+          <w:szCs w:val="22"/>
+        </w:rPr>
+        <w:t>Hedge Frequency by Discipline</w:t>
       </w:r>
     </w:p>
     <w:tbl>
@@ -12445,38 +12445,38 @@
     </w:p>
     <w:p>
       <w:pPr>
-        <w:spacing w:line="480" w:lineRule="auto" w:before="0" w:after="0"/>
-        <w:jc w:val="both"/>
-        <w:ind w:firstLine="720" w:left="0"/>
+        <w:spacing w:line="480" w:lineRule="auto" w:before="240" w:after="0"/>
+        <w:jc w:val="left"/>
+        <w:ind w:firstLine="0" w:left="0"/>
         <w:keepNext/>
       </w:pPr>
       <w:r>
         <w:rPr>
           <w:rFonts w:ascii="Georgia" w:hAnsi="Georgia" w:cs="Georgia" w:eastAsia="Georgia"/>
-          <w:sz w:val="22"/>
-          <w:b w:val="0"/>
-          <w:bCs w:val="0"/>
-          <w:i w:val="0"/>
-          <w:iCs w:val="0"/>
+          <w:b/>
+          <w:bCs w:val="0"/>
+          <w:i w:val="0"/>
+          <w:iCs w:val="0"/>
+          <w:sz w:val="22"/>
+          <w:szCs w:val="22"/>
         </w:rPr>
         <w:t>Table 4.1</w:t>
       </w:r>
     </w:p>
     <w:p>
       <w:pPr>
-        <w:spacing w:line="480" w:lineRule="auto" w:before="0" w:after="0"/>
-        <w:jc w:val="both"/>
-        <w:ind w:firstLine="720" w:left="0"/>
+        <w:spacing w:line="480" w:lineRule="auto" w:before="0" w:after="240"/>
+        <w:jc w:val="left"/>
+        <w:ind w:firstLine="0" w:left="0"/>
         <w:keepNext/>
       </w:pPr>
       <w:r>
         <w:rPr>
           <w:rFonts w:ascii="Georgia" w:hAnsi="Georgia" w:cs="Georgia" w:eastAsia="Georgia"/>
-          <w:sz w:val="22"/>
-          <w:b w:val="0"/>
-          <w:bCs w:val="0"/>
-          <w:i w:val="0"/>
-          <w:iCs w:val="0"/>
+          <w:i w:val="0"/>
+          <w:iCs w:val="0"/>
+          <w:sz w:val="22"/>
+          <w:szCs w:val="22"/>
         </w:rPr>
         <w:t>Illustrative Unhedged Claims</w:t>
       </w:r>
@@ -13612,17 +13612,18 @@
         <w:spacing w:after="0" w:before="240" w:line="480" w:lineRule="auto"/>
         <w:jc w:val="left"/>
         <w:rPr/>
-        <w:ind w:left="0" w:right="0" w:firstLine="0" w:firstLineChars="0" w:hanging="0" w:hangingChars="0"/>
+        <w:ind w:left="0" w:right="0" w:firstLine="0" w:firstLineChars="0" w:hangingChars="0"/>
         <w:keepNext/>
       </w:pPr>
       <w:r>
         <w:rPr>
           <w:rFonts w:ascii="Georgia" w:hAnsi="Georgia" w:cs="Georgia" w:eastAsia="Georgia"/>
-          <w:sz w:val="22"/>
-          <w:b w:val="1"/>
+          <w:b/>
           <w:bCs w:val="1"/>
           <w:i w:val="0"/>
           <w:iCs w:val="0"/>
+          <w:sz w:val="22"/>
+          <w:szCs w:val="22"/>
         </w:rPr>
         <w:t>Table 5</w:t>
       </w:r>
@@ -13632,18 +13633,17 @@
         <w:spacing w:after="240" w:before="0" w:line="480" w:lineRule="auto"/>
         <w:jc w:val="left"/>
         <w:rPr/>
-        <w:ind w:left="0" w:right="0" w:firstLine="0" w:firstLineChars="0" w:hanging="0" w:hangingChars="0"/>
+        <w:ind w:left="0" w:right="0" w:firstLine="0" w:firstLineChars="0" w:hangingChars="0"/>
         <w:keepNext/>
       </w:pPr>
       <w:r>
         <w:rPr>
           <w:rFonts w:ascii="Georgia" w:hAnsi="Georgia" w:cs="Georgia" w:eastAsia="Georgia"/>
-          <w:sz w:val="22"/>
           <w:rtl w:val="0"/>
-          <w:b w:val="0"/>
-          <w:bCs w:val="0"/>
-          <w:i w:val="0"/>
-          <w:iCs w:val="0"/>
+          <w:i w:val="0"/>
+          <w:iCs w:val="0"/>
+          <w:sz w:val="22"/>
+          <w:szCs w:val="22"/>
         </w:rPr>
         <w:t>Function Distribution among Candidate Tokens</w:t>
       </w:r>
@@ -14355,38 +14355,38 @@
     </w:p>
     <w:p>
       <w:pPr>
-        <w:spacing w:line="480" w:lineRule="auto" w:before="0" w:after="0"/>
-        <w:jc w:val="both"/>
-        <w:ind w:firstLine="720" w:left="0"/>
+        <w:spacing w:line="480" w:lineRule="auto" w:before="240" w:after="0"/>
+        <w:jc w:val="left"/>
+        <w:ind w:firstLine="0" w:left="0"/>
         <w:keepNext/>
       </w:pPr>
       <w:r>
         <w:rPr>
           <w:rFonts w:ascii="Georgia" w:hAnsi="Georgia" w:cs="Georgia" w:eastAsia="Georgia"/>
-          <w:sz w:val="22"/>
-          <w:b w:val="0"/>
-          <w:bCs w:val="0"/>
-          <w:i w:val="0"/>
-          <w:iCs w:val="0"/>
+          <w:b/>
+          <w:bCs w:val="0"/>
+          <w:i w:val="0"/>
+          <w:iCs w:val="0"/>
+          <w:sz w:val="22"/>
+          <w:szCs w:val="22"/>
         </w:rPr>
         <w:t>Table 5.1</w:t>
       </w:r>
     </w:p>
     <w:p>
       <w:pPr>
-        <w:spacing w:line="480" w:lineRule="auto" w:before="0" w:after="0"/>
-        <w:jc w:val="both"/>
-        <w:ind w:firstLine="720" w:left="0"/>
+        <w:spacing w:line="480" w:lineRule="auto" w:before="0" w:after="240"/>
+        <w:jc w:val="left"/>
+        <w:ind w:firstLine="0" w:left="0"/>
         <w:keepNext/>
       </w:pPr>
       <w:r>
         <w:rPr>
           <w:rFonts w:ascii="Georgia" w:hAnsi="Georgia" w:cs="Georgia" w:eastAsia="Georgia"/>
-          <w:sz w:val="22"/>
-          <w:b w:val="0"/>
-          <w:bCs w:val="0"/>
-          <w:i w:val="0"/>
-          <w:iCs w:val="0"/>
+          <w:i w:val="0"/>
+          <w:iCs w:val="0"/>
+          <w:sz w:val="22"/>
+          <w:szCs w:val="22"/>
         </w:rPr>
         <w:t>Retained Hedge versus False Positive: Coding Contrasts</w:t>
       </w:r>
@@ -15738,38 +15738,38 @@
     </w:p>
     <w:p>
       <w:pPr>
-        <w:spacing w:line="480" w:lineRule="auto" w:before="0" w:after="0"/>
-        <w:jc w:val="both"/>
-        <w:ind w:firstLine="720" w:left="0"/>
+        <w:spacing w:line="480" w:lineRule="auto" w:before="240" w:after="0"/>
+        <w:jc w:val="left"/>
+        <w:ind w:firstLine="0" w:left="0"/>
         <w:keepNext/>
       </w:pPr>
       <w:r>
         <w:rPr>
           <w:rFonts w:ascii="Georgia" w:hAnsi="Georgia" w:cs="Georgia" w:eastAsia="Georgia"/>
-          <w:sz w:val="22"/>
-          <w:b w:val="0"/>
-          <w:bCs w:val="0"/>
-          <w:i w:val="0"/>
-          <w:iCs w:val="0"/>
+          <w:b/>
+          <w:bCs w:val="0"/>
+          <w:i w:val="0"/>
+          <w:iCs w:val="0"/>
+          <w:sz w:val="22"/>
+          <w:szCs w:val="22"/>
         </w:rPr>
         <w:t>Table 5.2</w:t>
       </w:r>
     </w:p>
     <w:p>
       <w:pPr>
-        <w:spacing w:line="480" w:lineRule="auto" w:before="0" w:after="0"/>
-        <w:jc w:val="both"/>
-        <w:ind w:firstLine="720" w:left="0"/>
+        <w:spacing w:line="480" w:lineRule="auto" w:before="0" w:after="240"/>
+        <w:jc w:val="left"/>
+        <w:ind w:firstLine="0" w:left="0"/>
         <w:keepNext/>
       </w:pPr>
       <w:r>
         <w:rPr>
           <w:rFonts w:ascii="Georgia" w:hAnsi="Georgia" w:cs="Georgia" w:eastAsia="Georgia"/>
-          <w:sz w:val="22"/>
-          <w:b w:val="0"/>
-          <w:bCs w:val="0"/>
-          <w:i w:val="0"/>
-          <w:iCs w:val="0"/>
+          <w:i w:val="0"/>
+          <w:iCs w:val="0"/>
+          <w:sz w:val="22"/>
+          <w:szCs w:val="22"/>
         </w:rPr>
         <w:t>Illustrative Retained Hedges by Program</w:t>
       </w:r>
@@ -16967,17 +16967,18 @@
         <w:spacing w:after="0" w:before="240" w:line="480" w:lineRule="auto"/>
         <w:jc w:val="left"/>
         <w:rPr/>
-        <w:ind w:left="0" w:right="0" w:firstLine="0" w:firstLineChars="0" w:hanging="0" w:hangingChars="0"/>
+        <w:ind w:left="0" w:right="0" w:firstLine="0" w:firstLineChars="0" w:hangingChars="0"/>
         <w:keepNext/>
       </w:pPr>
       <w:r>
         <w:rPr>
           <w:rFonts w:ascii="Georgia" w:hAnsi="Georgia" w:cs="Georgia" w:eastAsia="Georgia"/>
-          <w:sz w:val="22"/>
-          <w:b w:val="1"/>
+          <w:b/>
           <w:bCs w:val="1"/>
           <w:i w:val="0"/>
           <w:iCs w:val="0"/>
+          <w:sz w:val="22"/>
+          <w:szCs w:val="22"/>
         </w:rPr>
         <w:t>Table 6</w:t>
       </w:r>
@@ -16987,20 +16988,19 @@
         <w:spacing w:after="240" w:before="0" w:line="480" w:lineRule="auto"/>
         <w:jc w:val="left"/>
         <w:rPr/>
-        <w:ind w:left="0" w:right="0" w:firstLine="0" w:firstLineChars="0" w:hanging="0" w:hangingChars="0"/>
+        <w:ind w:left="0" w:right="0" w:firstLine="0" w:firstLineChars="0" w:hangingChars="0"/>
         <w:keepNext/>
       </w:pPr>
       <w:r>
         <w:rPr>
           <w:rFonts w:ascii="Georgia" w:hAnsi="Georgia" w:cs="Georgia" w:eastAsia="Georgia"/>
-          <w:sz w:val="22"/>
           <w:rtl w:val="0"/>
-          <w:b w:val="0"/>
-          <w:bCs w:val="0"/>
-          <w:i w:val="0"/>
-          <w:iCs w:val="0"/>
-        </w:rPr>
-        <w:t xml:space="preserve">Outcome Type by Discipline</w:t>
+          <w:i w:val="0"/>
+          <w:iCs w:val="0"/>
+          <w:sz w:val="22"/>
+          <w:szCs w:val="22"/>
+        </w:rPr>
+        <w:t>Outcome Type by Discipline</w:t>
       </w:r>
     </w:p>
     <w:tbl>
@@ -18629,38 +18629,38 @@
     </w:p>
     <w:p>
       <w:pPr>
-        <w:spacing w:line="480" w:lineRule="auto" w:before="0" w:after="0"/>
-        <w:jc w:val="both"/>
-        <w:ind w:firstLine="720" w:left="0"/>
+        <w:spacing w:line="480" w:lineRule="auto" w:before="240" w:after="0"/>
+        <w:jc w:val="left"/>
+        <w:ind w:firstLine="0" w:left="0"/>
         <w:keepNext/>
       </w:pPr>
       <w:r>
         <w:rPr>
           <w:rFonts w:ascii="Georgia" w:hAnsi="Georgia" w:cs="Georgia" w:eastAsia="Georgia"/>
-          <w:sz w:val="22"/>
-          <w:b w:val="0"/>
-          <w:bCs w:val="0"/>
-          <w:i w:val="0"/>
-          <w:iCs w:val="0"/>
+          <w:b/>
+          <w:bCs w:val="0"/>
+          <w:i w:val="0"/>
+          <w:iCs w:val="0"/>
+          <w:sz w:val="22"/>
+          <w:szCs w:val="22"/>
         </w:rPr>
         <w:t>Table 6.1</w:t>
       </w:r>
     </w:p>
     <w:p>
       <w:pPr>
-        <w:spacing w:line="480" w:lineRule="auto" w:before="0" w:after="0"/>
-        <w:jc w:val="both"/>
-        <w:ind w:firstLine="720" w:left="0"/>
+        <w:spacing w:line="480" w:lineRule="auto" w:before="0" w:after="240"/>
+        <w:jc w:val="left"/>
+        <w:ind w:firstLine="0" w:left="0"/>
         <w:keepNext/>
       </w:pPr>
       <w:r>
         <w:rPr>
           <w:rFonts w:ascii="Georgia" w:hAnsi="Georgia" w:cs="Georgia" w:eastAsia="Georgia"/>
-          <w:sz w:val="22"/>
-          <w:b w:val="0"/>
-          <w:bCs w:val="0"/>
-          <w:i w:val="0"/>
-          <w:iCs w:val="0"/>
+          <w:i w:val="0"/>
+          <w:iCs w:val="0"/>
+          <w:sz w:val="22"/>
+          <w:szCs w:val="22"/>
         </w:rPr>
         <w:t>Program Contrast: Sample Excerpts</w:t>
       </w:r>

</xml_diff>